<commit_message>
feat: add section 2.2 PLTU vs IKU to generator bab 2
</commit_message>
<xml_diff>
--- a/tools/report_metodologi/bab_2/Metodologi_Bab2_Kualitas_Lingkungan.docx
+++ b/tools/report_metodologi/bab_2/Metodologi_Bab2_Kualitas_Lingkungan.docx
@@ -302,7 +302,22 @@
           <w:color w:val="2E7D32"/>
           <w:sz w:val="19"/>
         </w:rPr>
-        <w:t>C. Formulasi Matematis: Agregasi Smelter, Rata-rata IKA, dan Uji Crosstabulation</w:t>
+        <w:t>C. Formulasi Matematis: Kalkulasi Konsentrasi Spasial &amp; Uji Chi-Square</w:t>
+      </w:r>
+    </w:p>
+    <w:p>
+      <w:pPr>
+        <w:spacing w:after="100"/>
+        <w:jc w:val="both"/>
+      </w:pPr>
+      <w:r>
+        <w:rPr>
+          <w:b w:val="0"/>
+          <w:i w:val="0"/>
+          <w:color w:val="222222"/>
+          <w:sz w:val="19"/>
+        </w:rPr>
+        <w:t>Parameterisasi konsentrasi spasial dan pembuktian statistik dihitung menggunakan sistem formulasi matematis berikut:</w:t>
       </w:r>
     </w:p>
     <w:p>
@@ -406,7 +421,7 @@
           <w:color w:val="2E7D32"/>
           <w:sz w:val="17"/>
         </w:rPr>
-        <w:t>Persamaan: Rata-rata Indeks Kualitas Air Panel</w:t>
+        <w:t>Persamaan: Persamaan Rata-rata Indeks Kualitas Air Panel Provinsi</w:t>
       </w:r>
     </w:p>
     <w:p>
@@ -429,7 +444,7 @@
           <w:color w:val="1B5E20"/>
           <w:sz w:val="17"/>
         </w:rPr>
-        <w:t>Rata_Rata_IKA_Provinsi_Tahun = MEAN(IKA) GROUP BY Provinsi, Tahun</w:t>
+        <w:t>Rata_Rata_IKA_Provinsi_Tahun = MEAN(IKA_Provinsi_Tahun)</w:t>
       </w:r>
     </w:p>
     <w:p>
@@ -463,7 +478,7 @@
           <w:color w:val="444444"/>
           <w:sz w:val="16"/>
         </w:rPr>
-        <w:t>Skor rata-rata Indeks Kualitas Air pada provinsi dan tahun tertentu.</w:t>
+        <w:t>Skor rata-rata Indeks Kualitas Air pada provinsi dan tahun observasi tertentu.</w:t>
         <w:br/>
       </w:r>
       <w:r>
@@ -473,7 +488,7 @@
           <w:color w:val="1B5E20"/>
           <w:sz w:val="16"/>
         </w:rPr>
-        <w:t xml:space="preserve">- IKA: </w:t>
+        <w:t xml:space="preserve">- IKA_Provinsi_Tahun: </w:t>
       </w:r>
       <w:r>
         <w:rPr>
@@ -482,7 +497,7 @@
           <w:color w:val="444444"/>
           <w:sz w:val="16"/>
         </w:rPr>
-        <w:t>Indeks Kualitas Air dari data KLHK/BPS yang dipakai dashboard.</w:t>
+        <w:t>Nilai Indeks Kualitas Air dari KLHK/BPS pada kombinasi provinsi-tahun dalam panel 2016-2023.</w:t>
       </w:r>
     </w:p>
     <w:p>
@@ -496,7 +511,7 @@
           <w:color w:val="2E7D32"/>
           <w:sz w:val="17"/>
         </w:rPr>
-        <w:t>Persamaan: Kategorisasi Nilai Ambang Median</w:t>
+        <w:t>Persamaan: Persamaan Kategorisasi Median Panel 2x2</w:t>
       </w:r>
     </w:p>
     <w:p>
@@ -519,7 +534,7 @@
           <w:color w:val="1B5E20"/>
           <w:sz w:val="17"/>
         </w:rPr>
-        <w:t>Kategori_X/Y = IF(Nilai &gt;= Median(Seluruh Panel), 'Tinggi/Baik', 'Rendah/Kritis')</w:t>
+        <w:t>Kategori = IF(Nilai &gt;= Median(Seluruh Panel), 'Tinggi/Baik', 'Rendah/Kritis')</w:t>
       </w:r>
     </w:p>
     <w:p>
@@ -544,7 +559,7 @@
           <w:color w:val="1B5E20"/>
           <w:sz w:val="16"/>
         </w:rPr>
-        <w:t xml:space="preserve">- Kategori_X: </w:t>
+        <w:t xml:space="preserve">- Kategori Smelter: </w:t>
       </w:r>
       <w:r>
         <w:rPr>
@@ -553,7 +568,7 @@
           <w:color w:val="444444"/>
           <w:sz w:val="16"/>
         </w:rPr>
-        <w:t>Binning kepadatan smelter menjadi Tinggi atau Rendah berdasarkan median panel.</w:t>
+        <w:t>Smelter Tinggi jika Jumlah_Smelter_Provinsi &gt;= median panel (75.0 fasilitas); selain itu Smelter Rendah.</w:t>
         <w:br/>
       </w:r>
       <w:r>
@@ -563,7 +578,7 @@
           <w:color w:val="1B5E20"/>
           <w:sz w:val="16"/>
         </w:rPr>
-        <w:t xml:space="preserve">- Kategori_Y: </w:t>
+        <w:t xml:space="preserve">- Kategori IKA: </w:t>
       </w:r>
       <w:r>
         <w:rPr>
@@ -572,7 +587,7 @@
           <w:color w:val="444444"/>
           <w:sz w:val="16"/>
         </w:rPr>
-        <w:t>Binning IKA menjadi Baik atau Kritis berdasarkan median panel.</w:t>
+        <w:t>IKA Baik jika Indeks Kualitas Air &gt;= median panel (54.5 poin); selain itu IKA Kritis.</w:t>
         <w:br/>
       </w:r>
       <w:r>
@@ -591,7 +606,7 @@
           <w:color w:val="444444"/>
           <w:sz w:val="16"/>
         </w:rPr>
-        <w:t>Ambang panel data valid N=48 observasi.</w:t>
+        <w:t>Ambang batas dari seluruh observasi panel valid N=48.</w:t>
       </w:r>
     </w:p>
     <w:p>
@@ -605,7 +620,7 @@
           <w:color w:val="2E7D32"/>
           <w:sz w:val="17"/>
         </w:rPr>
-        <w:t>Persamaan: Uji Independensi Chi-Square Pearson</w:t>
+        <w:t>Persamaan: Persamaan Uji Independensi Chi-Square Pearson (χ² Kontinjensi 2x2)</w:t>
       </w:r>
     </w:p>
     <w:p>
@@ -628,7 +643,7 @@
           <w:color w:val="1B5E20"/>
           <w:sz w:val="17"/>
         </w:rPr>
-        <w:t>Chi_Square = SUM((O_ij - E_ij)^2 / E_ij)</w:t>
+        <w:t>Chi_Square (χ²) = Jumlah [ (Frekuensi_Observasi - Frekuensi_Harapan)^2 / Frekuensi_Harapan ]</w:t>
       </w:r>
     </w:p>
     <w:p>
@@ -653,7 +668,7 @@
           <w:color w:val="1B5E20"/>
           <w:sz w:val="16"/>
         </w:rPr>
-        <w:t xml:space="preserve">- O_ij: </w:t>
+        <w:t xml:space="preserve">- Chi_Square (χ²): </w:t>
       </w:r>
       <w:r>
         <w:rPr>
@@ -662,7 +677,7 @@
           <w:color w:val="444444"/>
           <w:sz w:val="16"/>
         </w:rPr>
-        <w:t>Frekuensi observasi pada sel ke-i,j tabel kontinjensi.</w:t>
+        <w:t>Nilai statistik uji kecocokan Pearson untuk membuktikan ada tidaknya hubungan ketergantungan antara kepadatan smelter dan Indeks Kualitas Air pada panel spasiotemporal N=48.</w:t>
         <w:br/>
       </w:r>
       <w:r>
@@ -672,7 +687,7 @@
           <w:color w:val="1B5E20"/>
           <w:sz w:val="16"/>
         </w:rPr>
-        <w:t xml:space="preserve">- E_ij: </w:t>
+        <w:t xml:space="preserve">- Frekuensi_Observasi (O): </w:t>
       </w:r>
       <w:r>
         <w:rPr>
@@ -681,7 +696,26 @@
           <w:color w:val="444444"/>
           <w:sz w:val="16"/>
         </w:rPr>
-        <w:t>Frekuensi harapan jika kepadatan smelter dan IKA saling independen.</w:t>
+        <w:t>Jumlah kasus aktual yang tercatat pada sel tabel kontinjensi 2x2.</w:t>
+        <w:br/>
+      </w:r>
+      <w:r>
+        <w:rPr>
+          <w:b/>
+          <w:i w:val="0"/>
+          <w:color w:val="1B5E20"/>
+          <w:sz w:val="16"/>
+        </w:rPr>
+        <w:t xml:space="preserve">- Frekuensi_Harapan (E): </w:t>
+      </w:r>
+      <w:r>
+        <w:rPr>
+          <w:b w:val="0"/>
+          <w:i w:val="0"/>
+          <w:color w:val="444444"/>
+          <w:sz w:val="16"/>
+        </w:rPr>
+        <w:t>Jumlah kasus teoretis jika kepadatan smelter dan IKA saling independen: E = (Total Baris * Total Kolom) / N.</w:t>
       </w:r>
     </w:p>
     <w:p>
@@ -695,7 +729,7 @@
           <w:color w:val="2E7D32"/>
           <w:sz w:val="17"/>
         </w:rPr>
-        <w:t>Persamaan: Odds Ratio Risiko IKA Kritis</w:t>
+        <w:t>Persamaan: Persamaan Rasio Keunggulan Risiko IKA Kritis (Risk Odds Ratio / OR)</w:t>
       </w:r>
     </w:p>
     <w:p>
@@ -718,7 +752,7 @@
           <w:color w:val="1B5E20"/>
           <w:sz w:val="17"/>
         </w:rPr>
-        <w:t>Odds_Ratio = (a * d) / (b * c)</w:t>
+        <w:t>Odds_Ratio (OR) = ( a * d ) / ( b * c )</w:t>
       </w:r>
     </w:p>
     <w:p>
@@ -743,6 +777,25 @@
           <w:color w:val="1B5E20"/>
           <w:sz w:val="16"/>
         </w:rPr>
+        <w:t xml:space="preserve">- Odds_Ratio (OR): </w:t>
+      </w:r>
+      <w:r>
+        <w:rPr>
+          <w:b w:val="0"/>
+          <w:i w:val="0"/>
+          <w:color w:val="444444"/>
+          <w:sz w:val="16"/>
+        </w:rPr>
+        <w:t>Ukuran kelipatan peluang munculnya IKA Kritis pada kelompok Smelter Tinggi dibandingkan kelompok Smelter Rendah.</w:t>
+        <w:br/>
+      </w:r>
+      <w:r>
+        <w:rPr>
+          <w:b/>
+          <w:i w:val="0"/>
+          <w:color w:val="1B5E20"/>
+          <w:sz w:val="16"/>
+        </w:rPr>
         <w:t xml:space="preserve">- a: </w:t>
       </w:r>
       <w:r>
@@ -752,7 +805,7 @@
           <w:color w:val="444444"/>
           <w:sz w:val="16"/>
         </w:rPr>
-        <w:t>Kasus Smelter Tinggi dan IKA Kritis.</w:t>
+        <w:t>Jumlah observasi panel pada kelompok Smelter Tinggi dan IKA Kritis (9 kasus).</w:t>
         <w:br/>
       </w:r>
       <w:r>
@@ -771,7 +824,7 @@
           <w:color w:val="444444"/>
           <w:sz w:val="16"/>
         </w:rPr>
-        <w:t>Kasus Smelter Tinggi dan IKA Baik.</w:t>
+        <w:t>Jumlah observasi panel pada kelompok Smelter Tinggi dan IKA Baik (15 kasus).</w:t>
         <w:br/>
       </w:r>
       <w:r>
@@ -790,7 +843,7 @@
           <w:color w:val="444444"/>
           <w:sz w:val="16"/>
         </w:rPr>
-        <w:t>Kasus Smelter Rendah dan IKA Kritis.</w:t>
+        <w:t>Jumlah observasi panel pada kelompok Smelter Rendah dan IKA Kritis (15 kasus).</w:t>
         <w:br/>
       </w:r>
       <w:r>
@@ -809,7 +862,7 @@
           <w:color w:val="444444"/>
           <w:sz w:val="16"/>
         </w:rPr>
-        <w:t>Kasus Smelter Rendah dan IKA Baik.</w:t>
+        <w:t>Jumlah observasi panel pada kelompok Smelter Rendah dan IKA Baik (9 kasus).</w:t>
       </w:r>
     </w:p>
     <w:p>
@@ -2754,6 +2807,874 @@
         <w:t>Pembacaan empiris tetap harus dilakukan bersama peta limbah B3 dan laporan sungai tercemar. Dashboard memperlihatkan bahwa analisis IKA BPS tidak berdiri sendiri, melainkan dibaca bersama estimasi timbulan tailing/slag dan laporan NGO tentang pencemaran sungai/pesisir. Dengan demikian, sub-bab ini memosisikan IKA sebagai indikator makro yang perlu diuji silang dengan bukti spasial di kawasan smelter.</w:t>
       </w:r>
     </w:p>
+    <w:p>
+      <w:pPr>
+        <w:spacing w:before="240" w:after="80"/>
+        <w:pBdr>
+          <w:bottom w:val="single" w:sz="6" w:space="2" w:color="2E7D32"/>
+        </w:pBdr>
+      </w:pPr>
+      <w:r>
+        <w:rPr>
+          <w:b/>
+          <w:i w:val="0"/>
+          <w:color w:val="2E7D32"/>
+          <w:sz w:val="22"/>
+        </w:rPr>
+        <w:t>2.2. KEPUNGAN ASAP: KAPASITAS PLTU VS INDEKS KUALITAS UDARA (IKU)</w:t>
+      </w:r>
+    </w:p>
+    <w:p>
+      <w:pPr>
+        <w:spacing w:before="120" w:after="120"/>
+        <w:ind w:left="200"/>
+        <w:pBdr>
+          <w:left w:val="single" w:sz="16" w:space="6" w:color="2E7D32"/>
+        </w:pBdr>
+        <w:shd w:val="clear" w:color="auto" w:fill="F1F8E9"/>
+      </w:pPr>
+      <w:r>
+        <w:rPr>
+          <w:b/>
+          <w:i w:val="0"/>
+          <w:color w:val="1B5E20"/>
+          <w:sz w:val="17"/>
+        </w:rPr>
+        <w:t xml:space="preserve">SUMBER DATA RESMI &amp; DESKRIPSI VISUALISASI: </w:t>
+      </w:r>
+      <w:r>
+        <w:rPr>
+          <w:b w:val="0"/>
+          <w:i/>
+          <w:color w:val="333333"/>
+          <w:sz w:val="17"/>
+        </w:rPr>
+        <w:t>Data PLTU Captive: data/processed/sulawesi_pltu_captive.csv; Data IKU: data/processed/sulawesi_iku_2015_2024.csv. Visualisasi dashboard menampilkan trendline IKU dan pengujian Chi-Square tabulasi silang (Crosstabulation).</w:t>
+      </w:r>
+    </w:p>
+    <w:p>
+      <w:pPr>
+        <w:spacing w:before="160" w:after="40"/>
+      </w:pPr>
+      <w:r>
+        <w:rPr>
+          <w:b/>
+          <w:i w:val="0"/>
+          <w:color w:val="2E7D32"/>
+          <w:sz w:val="19"/>
+        </w:rPr>
+        <w:t>A. Pengantar &amp; Kerangka Narasi</w:t>
+      </w:r>
+    </w:p>
+    <w:p>
+      <w:pPr>
+        <w:spacing w:after="100"/>
+        <w:jc w:val="both"/>
+      </w:pPr>
+      <w:r>
+        <w:rPr>
+          <w:b w:val="0"/>
+          <w:i w:val="0"/>
+          <w:color w:val="222222"/>
+          <w:sz w:val="19"/>
+        </w:rPr>
+        <w:t>Keberadaan 9,825 MW PLTU Captive di kawasan hilirisasi secara langsung berkontribusi pada pencemaran udara. Sub-bab ini menguji hipotesis apakah kapasitas terpasang PLTU Captive memiliki hubungan yang signifikan dengan penurunan Indeks Kualitas Udara (IKU).</w:t>
+      </w:r>
+    </w:p>
+    <w:p>
+      <w:pPr>
+        <w:spacing w:before="160" w:after="40"/>
+      </w:pPr>
+      <w:r>
+        <w:rPr>
+          <w:b/>
+          <w:i w:val="0"/>
+          <w:color w:val="2E7D32"/>
+          <w:sz w:val="19"/>
+        </w:rPr>
+        <w:t>B. Alur Logika Metodologis Analisis Kapasitas PLTU vs IKU</w:t>
+      </w:r>
+    </w:p>
+    <w:p>
+      <w:pPr>
+        <w:spacing w:after="100"/>
+        <w:jc w:val="both"/>
+      </w:pPr>
+      <w:r>
+        <w:rPr>
+          <w:b w:val="0"/>
+          <w:i w:val="0"/>
+          <w:color w:val="222222"/>
+          <w:sz w:val="19"/>
+        </w:rPr>
+        <w:t xml:space="preserve">Kerangka operasionalisasi sub-bab ini menggunakan pendekatan analisis kuantitatif dan Uji Statistik Chi-Square (Crosstabulation) untuk mengukur korelasi tersebut. Alur data dan pengujian diilustrasikan pada </w:t>
+      </w:r>
+      <w:r>
+        <w:rPr>
+          <w:b/>
+          <w:i w:val="0"/>
+          <w:color w:val="222222"/>
+          <w:sz w:val="19"/>
+        </w:rPr>
+        <w:t>Bagan Alur 2.2</w:t>
+      </w:r>
+      <w:r>
+        <w:rPr>
+          <w:b w:val="0"/>
+          <w:i w:val="0"/>
+          <w:color w:val="222222"/>
+          <w:sz w:val="19"/>
+        </w:rPr>
+        <w:t xml:space="preserve"> berikut:</w:t>
+      </w:r>
+    </w:p>
+    <w:p>
+      <w:pPr>
+        <w:spacing w:before="120" w:after="40"/>
+      </w:pPr>
+      <w:r>
+        <w:rPr>
+          <w:b/>
+          <w:i/>
+          <w:color w:val="2E7D32"/>
+          <w:sz w:val="17"/>
+        </w:rPr>
+        <w:t>Bagan Alur 2.2: Alur Logika Metodologis Crosstabulation &amp; Trendline PLTU vs IKU</w:t>
+      </w:r>
+    </w:p>
+    <w:p>
+      <w:pPr>
+        <w:jc w:val="center"/>
+      </w:pPr>
+      <w:r>
+        <w:drawing>
+          <wp:inline xmlns:a="http://schemas.openxmlformats.org/drawingml/2006/main" xmlns:pic="http://schemas.openxmlformats.org/drawingml/2006/picture">
+            <wp:extent cx="5400000" cy="666492"/>
+            <wp:docPr id="2" name="Picture 2"/>
+            <wp:cNvGraphicFramePr>
+              <a:graphicFrameLocks noChangeAspect="1"/>
+            </wp:cNvGraphicFramePr>
+            <a:graphic>
+              <a:graphicData uri="http://schemas.openxmlformats.org/drawingml/2006/picture">
+                <pic:pic>
+                  <pic:nvPicPr>
+                    <pic:cNvPr id="0" name="mermaid_flowchart_2_2.png"/>
+                    <pic:cNvPicPr/>
+                  </pic:nvPicPr>
+                  <pic:blipFill>
+                    <a:blip r:embed="rId10"/>
+                    <a:stretch>
+                      <a:fillRect/>
+                    </a:stretch>
+                  </pic:blipFill>
+                  <pic:spPr>
+                    <a:xfrm>
+                      <a:off x="0" y="0"/>
+                      <a:ext cx="5400000" cy="666492"/>
+                    </a:xfrm>
+                    <a:prstGeom prst="rect"/>
+                  </pic:spPr>
+                </pic:pic>
+              </a:graphicData>
+            </a:graphic>
+          </wp:inline>
+        </w:drawing>
+      </w:r>
+    </w:p>
+    <w:p>
+      <w:pPr>
+        <w:spacing w:before="160" w:after="40"/>
+      </w:pPr>
+      <w:r>
+        <w:rPr>
+          <w:b/>
+          <w:i w:val="0"/>
+          <w:color w:val="2E7D32"/>
+          <w:sz w:val="19"/>
+        </w:rPr>
+        <w:t>C. Formulasi Matematis: Kapasitas PLTU, Rata-rata IKU, dan Uji Crosstabulation</w:t>
+      </w:r>
+    </w:p>
+    <w:p>
+      <w:pPr>
+        <w:spacing w:before="120" w:after="20"/>
+      </w:pPr>
+      <w:r>
+        <w:rPr>
+          <w:b/>
+          <w:i/>
+          <w:color w:val="2E7D32"/>
+          <w:sz w:val="17"/>
+        </w:rPr>
+        <w:t>Persamaan: Agregasi Kapasitas PLTU Captive per Provinsi</w:t>
+      </w:r>
+    </w:p>
+    <w:p>
+      <w:pPr>
+        <w:spacing w:before="0" w:after="40"/>
+        <w:ind w:left="240"/>
+        <w:shd w:val="clear" w:color="auto" w:fill="EDF7EE"/>
+        <w:pBdr>
+          <w:top w:val="single" w:sz="4" w:space="4" w:color="A5D6A7"/>
+          <w:left w:val="single" w:sz="4" w:space="4" w:color="A5D6A7"/>
+          <w:bottom w:val="single" w:sz="4" w:space="4" w:color="A5D6A7"/>
+          <w:right w:val="single" w:sz="4" w:space="4" w:color="A5D6A7"/>
+        </w:pBdr>
+      </w:pPr>
+      <w:r>
+        <w:rPr>
+          <w:rFonts w:ascii="Courier New" w:hAnsi="Courier New"/>
+          <w:b w:val="0"/>
+          <w:i w:val="0"/>
+          <w:color w:val="1B5E20"/>
+          <w:sz w:val="17"/>
+        </w:rPr>
+        <w:t>Kapasitas_PLTU_Provinsi = SUM(Kapasitas_i) GROUP BY Provinsi</w:t>
+      </w:r>
+    </w:p>
+    <w:p>
+      <w:pPr>
+        <w:spacing w:before="40" w:after="120"/>
+        <w:ind w:left="280"/>
+      </w:pPr>
+      <w:r>
+        <w:rPr>
+          <w:b/>
+          <w:i/>
+          <w:color w:val="333333"/>
+          <w:sz w:val="16"/>
+        </w:rPr>
+        <w:t>Keterangan Variabel:</w:t>
+        <w:br/>
+      </w:r>
+      <w:r>
+        <w:rPr>
+          <w:b/>
+          <w:i w:val="0"/>
+          <w:color w:val="1B5E20"/>
+          <w:sz w:val="16"/>
+        </w:rPr>
+        <w:t xml:space="preserve">- Kapasitas_PLTU_Provinsi: </w:t>
+      </w:r>
+      <w:r>
+        <w:rPr>
+          <w:b w:val="0"/>
+          <w:i w:val="0"/>
+          <w:color w:val="444444"/>
+          <w:sz w:val="16"/>
+        </w:rPr>
+        <w:t>Total kapasitas (MW) PLTU captive yang beroperasi di provinsi observasi.</w:t>
+        <w:br/>
+      </w:r>
+      <w:r>
+        <w:rPr>
+          <w:b/>
+          <w:i w:val="0"/>
+          <w:color w:val="1B5E20"/>
+          <w:sz w:val="16"/>
+        </w:rPr>
+        <w:t xml:space="preserve">- Kapasitas_i: </w:t>
+      </w:r>
+      <w:r>
+        <w:rPr>
+          <w:b w:val="0"/>
+          <w:i w:val="0"/>
+          <w:color w:val="444444"/>
+          <w:sz w:val="16"/>
+        </w:rPr>
+        <w:t>Kapasitas (MW) unit PLTU captive i dalam data operasi.</w:t>
+      </w:r>
+    </w:p>
+    <w:p>
+      <w:pPr>
+        <w:spacing w:before="120" w:after="20"/>
+      </w:pPr>
+      <w:r>
+        <w:rPr>
+          <w:b/>
+          <w:i/>
+          <w:color w:val="2E7D32"/>
+          <w:sz w:val="17"/>
+        </w:rPr>
+        <w:t>Persamaan: Rata-rata Indeks Kualitas Udara Panel</w:t>
+      </w:r>
+    </w:p>
+    <w:p>
+      <w:pPr>
+        <w:spacing w:before="0" w:after="40"/>
+        <w:ind w:left="240"/>
+        <w:shd w:val="clear" w:color="auto" w:fill="EDF7EE"/>
+        <w:pBdr>
+          <w:top w:val="single" w:sz="4" w:space="4" w:color="A5D6A7"/>
+          <w:left w:val="single" w:sz="4" w:space="4" w:color="A5D6A7"/>
+          <w:bottom w:val="single" w:sz="4" w:space="4" w:color="A5D6A7"/>
+          <w:right w:val="single" w:sz="4" w:space="4" w:color="A5D6A7"/>
+        </w:pBdr>
+      </w:pPr>
+      <w:r>
+        <w:rPr>
+          <w:rFonts w:ascii="Courier New" w:hAnsi="Courier New"/>
+          <w:b w:val="0"/>
+          <w:i w:val="0"/>
+          <w:color w:val="1B5E20"/>
+          <w:sz w:val="17"/>
+        </w:rPr>
+        <w:t>Rata_Rata_IKU_Provinsi_Tahun = MEAN(IKU) GROUP BY Provinsi, Tahun</w:t>
+      </w:r>
+    </w:p>
+    <w:p>
+      <w:pPr>
+        <w:spacing w:before="40" w:after="120"/>
+        <w:ind w:left="280"/>
+      </w:pPr>
+      <w:r>
+        <w:rPr>
+          <w:b/>
+          <w:i/>
+          <w:color w:val="333333"/>
+          <w:sz w:val="16"/>
+        </w:rPr>
+        <w:t>Keterangan Variabel:</w:t>
+        <w:br/>
+      </w:r>
+      <w:r>
+        <w:rPr>
+          <w:b/>
+          <w:i w:val="0"/>
+          <w:color w:val="1B5E20"/>
+          <w:sz w:val="16"/>
+        </w:rPr>
+        <w:t xml:space="preserve">- Rata_Rata_IKU_Provinsi_Tahun: </w:t>
+      </w:r>
+      <w:r>
+        <w:rPr>
+          <w:b w:val="0"/>
+          <w:i w:val="0"/>
+          <w:color w:val="444444"/>
+          <w:sz w:val="16"/>
+        </w:rPr>
+        <w:t>Skor rata-rata Indeks Kualitas Udara (IKU) pada provinsi dan tahun tertentu.</w:t>
+        <w:br/>
+      </w:r>
+      <w:r>
+        <w:rPr>
+          <w:b/>
+          <w:i w:val="0"/>
+          <w:color w:val="1B5E20"/>
+          <w:sz w:val="16"/>
+        </w:rPr>
+        <w:t xml:space="preserve">- IKU: </w:t>
+      </w:r>
+      <w:r>
+        <w:rPr>
+          <w:b w:val="0"/>
+          <w:i w:val="0"/>
+          <w:color w:val="444444"/>
+          <w:sz w:val="16"/>
+        </w:rPr>
+        <w:t>Indeks Kualitas Udara dari data KLHK.</w:t>
+      </w:r>
+    </w:p>
+    <w:p>
+      <w:pPr>
+        <w:spacing w:before="160" w:after="40"/>
+      </w:pPr>
+      <w:r>
+        <w:rPr>
+          <w:b/>
+          <w:i w:val="0"/>
+          <w:color w:val="2E7D32"/>
+          <w:sz w:val="19"/>
+        </w:rPr>
+        <w:t>D. Matriks Hasil Uji Empiris: Crosstabulation PLTU vs IKU</w:t>
+      </w:r>
+    </w:p>
+    <w:p>
+      <w:pPr>
+        <w:spacing w:after="100"/>
+        <w:jc w:val="both"/>
+      </w:pPr>
+      <w:r>
+        <w:rPr>
+          <w:b w:val="0"/>
+          <w:i w:val="0"/>
+          <w:color w:val="222222"/>
+          <w:sz w:val="19"/>
+        </w:rPr>
+        <w:t xml:space="preserve">Penerapan pengujian statistik tabulasi silang pada data panel (total 54 observasi valid) disajikan secara ringkas pada </w:t>
+      </w:r>
+      <w:r>
+        <w:rPr>
+          <w:b/>
+          <w:i w:val="0"/>
+          <w:color w:val="222222"/>
+          <w:sz w:val="19"/>
+        </w:rPr>
+        <w:t>Tabel 2.3</w:t>
+      </w:r>
+      <w:r>
+        <w:rPr>
+          <w:b w:val="0"/>
+          <w:i w:val="0"/>
+          <w:color w:val="222222"/>
+          <w:sz w:val="19"/>
+        </w:rPr>
+        <w:t xml:space="preserve"> berikut:</w:t>
+      </w:r>
+    </w:p>
+    <w:p>
+      <w:pPr>
+        <w:spacing w:before="120" w:after="40"/>
+      </w:pPr>
+      <w:r>
+        <w:rPr>
+          <w:b/>
+          <w:i/>
+          <w:color w:val="2E7D32"/>
+          <w:sz w:val="17"/>
+        </w:rPr>
+        <w:t>Tabel 2.3: Ringkasan Eksekutif Skenario Crosstab Kapasitas PLTU vs IKU Bab 2</w:t>
+      </w:r>
+    </w:p>
+    <w:tbl>
+      <w:tblPr>
+        <w:tblStyle w:val="TableGrid"/>
+        <w:tblW w:type="auto" w:w="0"/>
+        <w:jc w:val="center"/>
+        <w:tblLayout w:type="fixed"/>
+        <w:tblLook w:firstColumn="1" w:firstRow="1" w:lastColumn="0" w:lastRow="0" w:noHBand="0" w:noVBand="1" w:val="04A0"/>
+      </w:tblPr>
+      <w:tblGrid>
+        <w:gridCol w:w="1606"/>
+        <w:gridCol w:w="1606"/>
+        <w:gridCol w:w="1606"/>
+        <w:gridCol w:w="1606"/>
+        <w:gridCol w:w="1606"/>
+        <w:gridCol w:w="1606"/>
+      </w:tblGrid>
+      <w:tr>
+        <w:tc>
+          <w:tcPr>
+            <w:tcW w:type="dxa" w:w="1701"/>
+            <w:shd w:val="clear" w:color="auto" w:fill="2E7D32"/>
+            <w:tcMar>
+              <w:top w:w="70" w:type="dxa"/>
+              <w:bottom w:w="70" w:type="dxa"/>
+              <w:left w:w="100" w:type="dxa"/>
+              <w:right w:w="100" w:type="dxa"/>
+            </w:tcMar>
+            <w:tcBorders>
+              <w:top w:val="single" w:sz="4" w:color="D0D0D0" w:space="0"/>
+              <w:left w:val="single" w:sz="4" w:color="D0D0D0" w:space="0"/>
+              <w:bottom w:val="single" w:sz="8" w:color="1B5E20" w:space="0"/>
+              <w:right w:val="single" w:sz="4" w:color="D0D0D0" w:space="0"/>
+            </w:tcBorders>
+          </w:tcPr>
+          <w:p>
+            <w:pPr>
+              <w:jc w:val="left"/>
+            </w:pPr>
+            <w:r>
+              <w:rPr>
+                <w:b/>
+                <w:i w:val="0"/>
+                <w:color w:val="FFFFFF"/>
+                <w:sz w:val="17"/>
+              </w:rPr>
+              <w:t>Variabel Independen (X)</w:t>
+            </w:r>
+          </w:p>
+        </w:tc>
+        <w:tc>
+          <w:tcPr>
+            <w:tcW w:type="dxa" w:w="1984"/>
+            <w:shd w:val="clear" w:color="auto" w:fill="2E7D32"/>
+            <w:tcMar>
+              <w:top w:w="70" w:type="dxa"/>
+              <w:bottom w:w="70" w:type="dxa"/>
+              <w:left w:w="100" w:type="dxa"/>
+              <w:right w:w="100" w:type="dxa"/>
+            </w:tcMar>
+            <w:tcBorders>
+              <w:top w:val="single" w:sz="4" w:color="D0D0D0" w:space="0"/>
+              <w:left w:val="single" w:sz="4" w:color="D0D0D0" w:space="0"/>
+              <w:bottom w:val="single" w:sz="8" w:color="1B5E20" w:space="0"/>
+              <w:right w:val="single" w:sz="4" w:color="D0D0D0" w:space="0"/>
+            </w:tcBorders>
+          </w:tcPr>
+          <w:p>
+            <w:pPr>
+              <w:jc w:val="left"/>
+            </w:pPr>
+            <w:r>
+              <w:rPr>
+                <w:b/>
+                <w:i w:val="0"/>
+                <w:color w:val="FFFFFF"/>
+                <w:sz w:val="17"/>
+              </w:rPr>
+              <w:t>Variabel Dependen (Y)</w:t>
+            </w:r>
+          </w:p>
+        </w:tc>
+        <w:tc>
+          <w:tcPr>
+            <w:tcW w:type="dxa" w:w="1134"/>
+            <w:shd w:val="clear" w:color="auto" w:fill="2E7D32"/>
+            <w:tcMar>
+              <w:top w:w="70" w:type="dxa"/>
+              <w:bottom w:w="70" w:type="dxa"/>
+              <w:left w:w="100" w:type="dxa"/>
+              <w:right w:w="100" w:type="dxa"/>
+            </w:tcMar>
+            <w:tcBorders>
+              <w:top w:val="single" w:sz="4" w:color="D0D0D0" w:space="0"/>
+              <w:left w:val="single" w:sz="4" w:color="D0D0D0" w:space="0"/>
+              <w:bottom w:val="single" w:sz="8" w:color="1B5E20" w:space="0"/>
+              <w:right w:val="single" w:sz="4" w:color="D0D0D0" w:space="0"/>
+            </w:tcBorders>
+          </w:tcPr>
+          <w:p>
+            <w:pPr>
+              <w:jc w:val="center"/>
+            </w:pPr>
+            <w:r>
+              <w:rPr>
+                <w:b/>
+                <w:i w:val="0"/>
+                <w:color w:val="FFFFFF"/>
+                <w:sz w:val="17"/>
+              </w:rPr>
+              <w:t>Chi-Square (χ²)</w:t>
+            </w:r>
+          </w:p>
+        </w:tc>
+        <w:tc>
+          <w:tcPr>
+            <w:tcW w:type="dxa" w:w="1134"/>
+            <w:shd w:val="clear" w:color="auto" w:fill="2E7D32"/>
+            <w:tcMar>
+              <w:top w:w="70" w:type="dxa"/>
+              <w:bottom w:w="70" w:type="dxa"/>
+              <w:left w:w="100" w:type="dxa"/>
+              <w:right w:w="100" w:type="dxa"/>
+            </w:tcMar>
+            <w:tcBorders>
+              <w:top w:val="single" w:sz="4" w:color="D0D0D0" w:space="0"/>
+              <w:left w:val="single" w:sz="4" w:color="D0D0D0" w:space="0"/>
+              <w:bottom w:val="single" w:sz="8" w:color="1B5E20" w:space="0"/>
+              <w:right w:val="single" w:sz="4" w:color="D0D0D0" w:space="0"/>
+            </w:tcBorders>
+          </w:tcPr>
+          <w:p>
+            <w:pPr>
+              <w:jc w:val="center"/>
+            </w:pPr>
+            <w:r>
+              <w:rPr>
+                <w:b/>
+                <w:i w:val="0"/>
+                <w:color w:val="FFFFFF"/>
+                <w:sz w:val="17"/>
+              </w:rPr>
+              <w:t>P-Value</w:t>
+            </w:r>
+          </w:p>
+        </w:tc>
+        <w:tc>
+          <w:tcPr>
+            <w:tcW w:type="dxa" w:w="1134"/>
+            <w:shd w:val="clear" w:color="auto" w:fill="2E7D32"/>
+            <w:tcMar>
+              <w:top w:w="70" w:type="dxa"/>
+              <w:bottom w:w="70" w:type="dxa"/>
+              <w:left w:w="100" w:type="dxa"/>
+              <w:right w:w="100" w:type="dxa"/>
+            </w:tcMar>
+            <w:tcBorders>
+              <w:top w:val="single" w:sz="4" w:color="D0D0D0" w:space="0"/>
+              <w:left w:val="single" w:sz="4" w:color="D0D0D0" w:space="0"/>
+              <w:bottom w:val="single" w:sz="8" w:color="1B5E20" w:space="0"/>
+              <w:right w:val="single" w:sz="4" w:color="D0D0D0" w:space="0"/>
+            </w:tcBorders>
+          </w:tcPr>
+          <w:p>
+            <w:pPr>
+              <w:jc w:val="center"/>
+            </w:pPr>
+            <w:r>
+              <w:rPr>
+                <w:b/>
+                <w:i w:val="0"/>
+                <w:color w:val="FFFFFF"/>
+                <w:sz w:val="17"/>
+              </w:rPr>
+              <w:t>Odds Ratio</w:t>
+            </w:r>
+          </w:p>
+        </w:tc>
+        <w:tc>
+          <w:tcPr>
+            <w:tcW w:type="dxa" w:w="1417"/>
+            <w:shd w:val="clear" w:color="auto" w:fill="2E7D32"/>
+            <w:tcMar>
+              <w:top w:w="70" w:type="dxa"/>
+              <w:bottom w:w="70" w:type="dxa"/>
+              <w:left w:w="100" w:type="dxa"/>
+              <w:right w:w="100" w:type="dxa"/>
+            </w:tcMar>
+            <w:tcBorders>
+              <w:top w:val="single" w:sz="4" w:color="D0D0D0" w:space="0"/>
+              <w:left w:val="single" w:sz="4" w:color="D0D0D0" w:space="0"/>
+              <w:bottom w:val="single" w:sz="8" w:color="1B5E20" w:space="0"/>
+              <w:right w:val="single" w:sz="4" w:color="D0D0D0" w:space="0"/>
+            </w:tcBorders>
+          </w:tcPr>
+          <w:p>
+            <w:pPr>
+              <w:jc w:val="center"/>
+            </w:pPr>
+            <w:r>
+              <w:rPr>
+                <w:b/>
+                <w:i w:val="0"/>
+                <w:color w:val="FFFFFF"/>
+                <w:sz w:val="17"/>
+              </w:rPr>
+              <w:t>Kesimpulan</w:t>
+            </w:r>
+          </w:p>
+        </w:tc>
+      </w:tr>
+      <w:tr>
+        <w:tc>
+          <w:tcPr>
+            <w:tcW w:type="dxa" w:w="1701"/>
+            <w:shd w:val="clear" w:color="auto" w:fill="F5FBF5"/>
+            <w:tcMar>
+              <w:top w:w="50" w:type="dxa"/>
+              <w:bottom w:w="50" w:type="dxa"/>
+              <w:left w:w="100" w:type="dxa"/>
+              <w:right w:w="100" w:type="dxa"/>
+            </w:tcMar>
+            <w:tcBorders>
+              <w:top w:val="single" w:sz="4" w:color="D0D0D0" w:space="0"/>
+              <w:left w:val="single" w:sz="4" w:color="D0D0D0" w:space="0"/>
+              <w:bottom w:val="single" w:sz="4" w:color="D0D0D0" w:space="0"/>
+              <w:right w:val="single" w:sz="4" w:color="D0D0D0" w:space="0"/>
+            </w:tcBorders>
+          </w:tcPr>
+          <w:p>
+            <w:pPr>
+              <w:jc w:val="left"/>
+            </w:pPr>
+            <w:r>
+              <w:rPr>
+                <w:b w:val="0"/>
+                <w:i w:val="0"/>
+                <w:color w:val="222222"/>
+                <w:sz w:val="17"/>
+              </w:rPr>
+              <w:t>Kapasitas PLTU Captive (MW)</w:t>
+            </w:r>
+          </w:p>
+        </w:tc>
+        <w:tc>
+          <w:tcPr>
+            <w:tcW w:type="dxa" w:w="1984"/>
+            <w:shd w:val="clear" w:color="auto" w:fill="F5FBF5"/>
+            <w:tcMar>
+              <w:top w:w="50" w:type="dxa"/>
+              <w:bottom w:w="50" w:type="dxa"/>
+              <w:left w:w="100" w:type="dxa"/>
+              <w:right w:w="100" w:type="dxa"/>
+            </w:tcMar>
+            <w:tcBorders>
+              <w:top w:val="single" w:sz="4" w:color="D0D0D0" w:space="0"/>
+              <w:left w:val="single" w:sz="4" w:color="D0D0D0" w:space="0"/>
+              <w:bottom w:val="single" w:sz="4" w:color="D0D0D0" w:space="0"/>
+              <w:right w:val="single" w:sz="4" w:color="D0D0D0" w:space="0"/>
+            </w:tcBorders>
+          </w:tcPr>
+          <w:p>
+            <w:pPr>
+              <w:jc w:val="left"/>
+            </w:pPr>
+            <w:r>
+              <w:rPr>
+                <w:b w:val="0"/>
+                <w:i w:val="0"/>
+                <w:color w:val="222222"/>
+                <w:sz w:val="17"/>
+              </w:rPr>
+              <w:t>Indeks Kualitas Udara (IKU)</w:t>
+            </w:r>
+          </w:p>
+        </w:tc>
+        <w:tc>
+          <w:tcPr>
+            <w:tcW w:type="dxa" w:w="1134"/>
+            <w:shd w:val="clear" w:color="auto" w:fill="F5FBF5"/>
+            <w:tcMar>
+              <w:top w:w="50" w:type="dxa"/>
+              <w:bottom w:w="50" w:type="dxa"/>
+              <w:left w:w="100" w:type="dxa"/>
+              <w:right w:w="100" w:type="dxa"/>
+            </w:tcMar>
+            <w:tcBorders>
+              <w:top w:val="single" w:sz="4" w:color="D0D0D0" w:space="0"/>
+              <w:left w:val="single" w:sz="4" w:color="D0D0D0" w:space="0"/>
+              <w:bottom w:val="single" w:sz="4" w:color="D0D0D0" w:space="0"/>
+              <w:right w:val="single" w:sz="4" w:color="D0D0D0" w:space="0"/>
+            </w:tcBorders>
+          </w:tcPr>
+          <w:p>
+            <w:pPr>
+              <w:jc w:val="center"/>
+            </w:pPr>
+            <w:r>
+              <w:rPr>
+                <w:b w:val="0"/>
+                <w:i w:val="0"/>
+                <w:color w:val="222222"/>
+                <w:sz w:val="17"/>
+              </w:rPr>
+              <w:t>0.000</w:t>
+            </w:r>
+          </w:p>
+        </w:tc>
+        <w:tc>
+          <w:tcPr>
+            <w:tcW w:type="dxa" w:w="1134"/>
+            <w:shd w:val="clear" w:color="auto" w:fill="F5FBF5"/>
+            <w:tcMar>
+              <w:top w:w="50" w:type="dxa"/>
+              <w:bottom w:w="50" w:type="dxa"/>
+              <w:left w:w="100" w:type="dxa"/>
+              <w:right w:w="100" w:type="dxa"/>
+            </w:tcMar>
+            <w:tcBorders>
+              <w:top w:val="single" w:sz="4" w:color="D0D0D0" w:space="0"/>
+              <w:left w:val="single" w:sz="4" w:color="D0D0D0" w:space="0"/>
+              <w:bottom w:val="single" w:sz="4" w:color="D0D0D0" w:space="0"/>
+              <w:right w:val="single" w:sz="4" w:color="D0D0D0" w:space="0"/>
+            </w:tcBorders>
+          </w:tcPr>
+          <w:p>
+            <w:pPr>
+              <w:jc w:val="center"/>
+            </w:pPr>
+            <w:r>
+              <w:rPr>
+                <w:b w:val="0"/>
+                <w:i w:val="0"/>
+                <w:color w:val="222222"/>
+                <w:sz w:val="17"/>
+              </w:rPr>
+              <w:t>p = 1.0000</w:t>
+            </w:r>
+          </w:p>
+        </w:tc>
+        <w:tc>
+          <w:tcPr>
+            <w:tcW w:type="dxa" w:w="1134"/>
+            <w:shd w:val="clear" w:color="auto" w:fill="F5FBF5"/>
+            <w:tcMar>
+              <w:top w:w="50" w:type="dxa"/>
+              <w:bottom w:w="50" w:type="dxa"/>
+              <w:left w:w="100" w:type="dxa"/>
+              <w:right w:w="100" w:type="dxa"/>
+            </w:tcMar>
+            <w:tcBorders>
+              <w:top w:val="single" w:sz="4" w:color="D0D0D0" w:space="0"/>
+              <w:left w:val="single" w:sz="4" w:color="D0D0D0" w:space="0"/>
+              <w:bottom w:val="single" w:sz="4" w:color="D0D0D0" w:space="0"/>
+              <w:right w:val="single" w:sz="4" w:color="D0D0D0" w:space="0"/>
+            </w:tcBorders>
+          </w:tcPr>
+          <w:p>
+            <w:pPr>
+              <w:jc w:val="center"/>
+            </w:pPr>
+            <w:r>
+              <w:rPr>
+                <w:b w:val="0"/>
+                <w:i w:val="0"/>
+                <w:color w:val="222222"/>
+                <w:sz w:val="17"/>
+              </w:rPr>
+              <w:t>Infinite</w:t>
+            </w:r>
+          </w:p>
+        </w:tc>
+        <w:tc>
+          <w:tcPr>
+            <w:tcW w:type="dxa" w:w="1417"/>
+            <w:shd w:val="clear" w:color="auto" w:fill="F5FBF5"/>
+            <w:tcMar>
+              <w:top w:w="50" w:type="dxa"/>
+              <w:bottom w:w="50" w:type="dxa"/>
+              <w:left w:w="100" w:type="dxa"/>
+              <w:right w:w="100" w:type="dxa"/>
+            </w:tcMar>
+            <w:tcBorders>
+              <w:top w:val="single" w:sz="4" w:color="D0D0D0" w:space="0"/>
+              <w:left w:val="single" w:sz="4" w:color="D0D0D0" w:space="0"/>
+              <w:bottom w:val="single" w:sz="4" w:color="D0D0D0" w:space="0"/>
+              <w:right w:val="single" w:sz="4" w:color="D0D0D0" w:space="0"/>
+            </w:tcBorders>
+          </w:tcPr>
+          <w:p>
+            <w:pPr>
+              <w:jc w:val="center"/>
+            </w:pPr>
+            <w:r>
+              <w:rPr>
+                <w:b w:val="0"/>
+                <w:i w:val="0"/>
+                <w:color w:val="222222"/>
+                <w:sz w:val="17"/>
+              </w:rPr>
+              <w:t>TIDAK SIGNIFIKAN</w:t>
+            </w:r>
+          </w:p>
+        </w:tc>
+      </w:tr>
+    </w:tbl>
+    <w:p>
+      <w:pPr>
+        <w:spacing w:before="40" w:after="80"/>
+      </w:pPr>
+    </w:p>
+    <w:p>
+      <w:pPr>
+        <w:spacing w:before="160" w:after="40"/>
+      </w:pPr>
+      <w:r>
+        <w:rPr>
+          <w:b/>
+          <w:i w:val="0"/>
+          <w:color w:val="2E7D32"/>
+          <w:sz w:val="19"/>
+        </w:rPr>
+        <w:t>E. Analisis Temuan Empiris: Efek Pengenceran Udara Ambien</w:t>
+      </w:r>
+    </w:p>
+    <w:p>
+      <w:pPr>
+        <w:spacing w:after="100"/>
+        <w:jc w:val="both"/>
+      </w:pPr>
+      <w:r>
+        <w:rPr>
+          <w:b w:val="0"/>
+          <w:i w:val="0"/>
+          <w:color w:val="222222"/>
+          <w:sz w:val="19"/>
+        </w:rPr>
+        <w:t>Kegagalan pengujian statistik ini membongkar fakta krusial bahwa Indeks Kualitas Udara (IKU) level provinsi adalah metrik agregat yang mengencerkan pencemaran udara lokal di tapak industri. Kualitas udara yang buruk di sekitar PLTU tertutupi oleh wilayah yang masih bersih.</w:t>
+      </w:r>
+    </w:p>
     <w:sectPr>
       <w:pgSz w:w="11906" w:h="16838"/>
       <w:pgMar w:top="1134" w:right="1134" w:bottom="1134" w:left="1134" w:header="720" w:footer="720" w:gutter="0"/>

</xml_diff>

<commit_message>
fix: update flowchart logic 2.2 to match 2.1
</commit_message>
<xml_diff>
--- a/tools/report_metodologi/bab_2/Metodologi_Bab2_Kualitas_Lingkungan.docx
+++ b/tools/report_metodologi/bab_2/Metodologi_Bab2_Kualitas_Lingkungan.docx
@@ -797,7 +797,7 @@
           <w:color w:val="2E7D32"/>
           <w:sz w:val="17"/>
         </w:rPr>
-        <w:t>Persamaan: Agregasi Jumlah Smelter per Provinsi</w:t>
+        <w:t>Persamaan: Persamaan Agregasi Jumlah Smelter per Provinsi</w:t>
       </w:r>
     </w:p>
     <w:p>
@@ -820,7 +820,7 @@
           <w:color w:val="1B5E20"/>
           <w:sz w:val="17"/>
         </w:rPr>
-        <w:t>Jumlah_Smelter_Provinsi = COUNT(Smelter_i) GROUP BY Provinsi</w:t>
+        <w:t>S_p = Σ s_i, untuk setiap fasilitas i yang berada di provinsi p</w:t>
       </w:r>
     </w:p>
     <w:p>
@@ -845,7 +845,7 @@
           <w:color w:val="1B5E20"/>
           <w:sz w:val="16"/>
         </w:rPr>
-        <w:t xml:space="preserve">- Jumlah_Smelter_Provinsi: </w:t>
+        <w:t xml:space="preserve">- S_p: </w:t>
       </w:r>
       <w:r>
         <w:rPr>
@@ -854,7 +854,7 @@
           <w:color w:val="444444"/>
           <w:sz w:val="16"/>
         </w:rPr>
-        <w:t>Banyaknya fasilitas smelter atau entitas nikel pada provinsi observasi.</w:t>
+        <w:t>Total fasilitas smelter pada provinsi p.</w:t>
         <w:br/>
       </w:r>
       <w:r>
@@ -864,7 +864,7 @@
           <w:color w:val="1B5E20"/>
           <w:sz w:val="16"/>
         </w:rPr>
-        <w:t xml:space="preserve">- Smelter_i: </w:t>
+        <w:t xml:space="preserve">- s_i: </w:t>
       </w:r>
       <w:r>
         <w:rPr>
@@ -873,7 +873,26 @@
           <w:color w:val="444444"/>
           <w:sz w:val="16"/>
         </w:rPr>
-        <w:t>Unit observasi fasilitas/entitas smelter dalam data ESDM nikel.</w:t>
+        <w:t>Indikator keberadaan fasilitas smelter ke-i; bernilai 1 jika fasilitas berada di provinsi p.</w:t>
+        <w:br/>
+      </w:r>
+      <w:r>
+        <w:rPr>
+          <w:b/>
+          <w:i w:val="0"/>
+          <w:color w:val="1B5E20"/>
+          <w:sz w:val="16"/>
+        </w:rPr>
+        <w:t xml:space="preserve">- p: </w:t>
+      </w:r>
+      <w:r>
+        <w:rPr>
+          <w:b w:val="0"/>
+          <w:i w:val="0"/>
+          <w:color w:val="444444"/>
+          <w:sz w:val="16"/>
+        </w:rPr>
+        <w:t>Provinsi observasi di Pulau Sulawesi.</w:t>
       </w:r>
     </w:p>
     <w:p>
@@ -910,7 +929,7 @@
           <w:color w:val="1B5E20"/>
           <w:sz w:val="17"/>
         </w:rPr>
-        <w:t>Rata_Rata_IKA_Provinsi_Tahun = MEAN(IKA_Provinsi_Tahun)</w:t>
+        <w:t>IKĀ_{p,t} = (1 / n_{p,t}) × Σ IKA_{j,p,t}</w:t>
       </w:r>
     </w:p>
     <w:p>
@@ -935,7 +954,7 @@
           <w:color w:val="1B5E20"/>
           <w:sz w:val="16"/>
         </w:rPr>
-        <w:t xml:space="preserve">- Rata_Rata_IKA_Provinsi_Tahun: </w:t>
+        <w:t xml:space="preserve">- IKĀ_{p,t}: </w:t>
       </w:r>
       <w:r>
         <w:rPr>
@@ -944,7 +963,7 @@
           <w:color w:val="444444"/>
           <w:sz w:val="16"/>
         </w:rPr>
-        <w:t>Skor rata-rata Indeks Kualitas Air pada provinsi dan tahun observasi tertentu.</w:t>
+        <w:t>Rata-rata Indeks Kualitas Air pada provinsi p dan tahun t.</w:t>
         <w:br/>
       </w:r>
       <w:r>
@@ -954,7 +973,7 @@
           <w:color w:val="1B5E20"/>
           <w:sz w:val="16"/>
         </w:rPr>
-        <w:t xml:space="preserve">- IKA_Provinsi_Tahun: </w:t>
+        <w:t xml:space="preserve">- IKA_{j,p,t}: </w:t>
       </w:r>
       <w:r>
         <w:rPr>
@@ -963,7 +982,26 @@
           <w:color w:val="444444"/>
           <w:sz w:val="16"/>
         </w:rPr>
-        <w:t>Nilai Indeks Kualitas Air dari KLHK/BPS pada kombinasi provinsi-tahun dalam panel 2016-2023.</w:t>
+        <w:t>Nilai pengamatan Indeks Kualitas Air ke-j pada provinsi p dan tahun t.</w:t>
+        <w:br/>
+      </w:r>
+      <w:r>
+        <w:rPr>
+          <w:b/>
+          <w:i w:val="0"/>
+          <w:color w:val="1B5E20"/>
+          <w:sz w:val="16"/>
+        </w:rPr>
+        <w:t xml:space="preserve">- n_{p,t}: </w:t>
+      </w:r>
+      <w:r>
+        <w:rPr>
+          <w:b w:val="0"/>
+          <w:i w:val="0"/>
+          <w:color w:val="444444"/>
+          <w:sz w:val="16"/>
+        </w:rPr>
+        <w:t>Jumlah pengamatan IKA yang tersedia pada provinsi p dan tahun t.</w:t>
       </w:r>
     </w:p>
     <w:p>
@@ -1000,7 +1038,7 @@
           <w:color w:val="1B5E20"/>
           <w:sz w:val="17"/>
         </w:rPr>
-        <w:t>Kategori = IF(Nilai &gt;= Median(Seluruh Panel), 'Tinggi/Baik', 'Rendah/Kritis')</w:t>
+        <w:t>K_x = Tinggi jika X_{p,t} ≥ M_X; K_y = Baik jika Y_{p,t} ≥ M_Y</w:t>
       </w:r>
     </w:p>
     <w:p>
@@ -1063,7 +1101,7 @@
           <w:color w:val="1B5E20"/>
           <w:sz w:val="16"/>
         </w:rPr>
-        <w:t xml:space="preserve">- Median(Seluruh Panel): </w:t>
+        <w:t xml:space="preserve">- M_X dan M_Y: </w:t>
       </w:r>
       <w:r>
         <w:rPr>
@@ -1072,7 +1110,7 @@
           <w:color w:val="444444"/>
           <w:sz w:val="16"/>
         </w:rPr>
-        <w:t>Ambang batas dari seluruh observasi panel valid N=54.</w:t>
+        <w:t>Nilai median masing-masing variabel pada seluruh observasi panel valid N=54.</w:t>
       </w:r>
     </w:p>
     <w:p>
@@ -3415,7 +3453,7 @@
       <w:r>
         <w:drawing>
           <wp:inline xmlns:a="http://schemas.openxmlformats.org/drawingml/2006/main" xmlns:pic="http://schemas.openxmlformats.org/drawingml/2006/picture">
-            <wp:extent cx="5400000" cy="666492"/>
+            <wp:extent cx="5400000" cy="2133538"/>
             <wp:docPr id="2" name="Picture 2"/>
             <wp:cNvGraphicFramePr>
               <a:graphicFrameLocks noChangeAspect="1"/>
@@ -3436,7 +3474,7 @@
                   <pic:spPr>
                     <a:xfrm>
                       <a:off x="0" y="0"/>
-                      <a:ext cx="5400000" cy="666492"/>
+                      <a:ext cx="5400000" cy="2133538"/>
                     </a:xfrm>
                     <a:prstGeom prst="rect"/>
                   </pic:spPr>

</xml_diff>

<commit_message>
feat: add Tabel 2.2a Konfigurasi Chi-Square for Sub-bab 2.2
</commit_message>
<xml_diff>
--- a/tools/report_metodologi/bab_2/Metodologi_Bab2_Kualitas_Lingkungan.docx
+++ b/tools/report_metodologi/bab_2/Metodologi_Bab2_Kualitas_Lingkungan.docx
@@ -3487,6 +3487,472 @@
     </w:p>
     <w:p>
       <w:pPr>
+        <w:spacing w:before="40" w:after="80"/>
+      </w:pPr>
+    </w:p>
+    <w:p>
+      <w:pPr>
+        <w:spacing w:after="100"/>
+        <w:jc w:val="both"/>
+      </w:pPr>
+      <w:r>
+        <w:rPr>
+          <w:b w:val="0"/>
+          <w:i w:val="0"/>
+          <w:color w:val="222222"/>
+          <w:sz w:val="19"/>
+        </w:rPr>
+        <w:t xml:space="preserve">Sebagai opsi ringkas pengganti bagan alur crosstab yang terlalu panjang, konfigurasi variabel pengujian Chi-Square disajikan pada </w:t>
+      </w:r>
+      <w:r>
+        <w:rPr>
+          <w:b/>
+          <w:i w:val="0"/>
+          <w:color w:val="222222"/>
+          <w:sz w:val="19"/>
+        </w:rPr>
+        <w:t>Tabel 2.2a</w:t>
+      </w:r>
+      <w:r>
+        <w:rPr>
+          <w:b w:val="0"/>
+          <w:i w:val="0"/>
+          <w:color w:val="222222"/>
+          <w:sz w:val="19"/>
+        </w:rPr>
+        <w:t xml:space="preserve"> berikut:</w:t>
+      </w:r>
+    </w:p>
+    <w:p>
+      <w:pPr>
+        <w:spacing w:before="120" w:after="40"/>
+      </w:pPr>
+      <w:r>
+        <w:rPr>
+          <w:b/>
+          <w:i/>
+          <w:color w:val="2E7D32"/>
+          <w:sz w:val="17"/>
+        </w:rPr>
+        <w:t>Tabel 2.2a: Konfigurasi Variabel Uji Chi-Square (Sub-bab 2.2)</w:t>
+      </w:r>
+    </w:p>
+    <w:tbl>
+      <w:tblPr>
+        <w:tblStyle w:val="TableGrid"/>
+        <w:tblW w:type="auto" w:w="0"/>
+        <w:jc w:val="center"/>
+        <w:tblLayout w:type="fixed"/>
+        <w:tblLook w:firstColumn="1" w:firstRow="1" w:lastColumn="0" w:lastRow="0" w:noHBand="0" w:noVBand="1" w:val="04A0"/>
+      </w:tblPr>
+      <w:tblGrid>
+        <w:gridCol w:w="4819"/>
+        <w:gridCol w:w="4819"/>
+      </w:tblGrid>
+      <w:tr>
+        <w:tc>
+          <w:tcPr>
+            <w:tcW w:type="dxa" w:w="2551"/>
+            <w:shd w:val="clear" w:color="auto" w:fill="2E7D32"/>
+            <w:tcMar>
+              <w:top w:w="70" w:type="dxa"/>
+              <w:bottom w:w="70" w:type="dxa"/>
+              <w:left w:w="100" w:type="dxa"/>
+              <w:right w:w="100" w:type="dxa"/>
+            </w:tcMar>
+            <w:tcBorders>
+              <w:top w:val="single" w:sz="4" w:color="D0D0D0" w:space="0"/>
+              <w:left w:val="single" w:sz="4" w:color="D0D0D0" w:space="0"/>
+              <w:bottom w:val="single" w:sz="8" w:color="1B5E20" w:space="0"/>
+              <w:right w:val="single" w:sz="4" w:color="D0D0D0" w:space="0"/>
+            </w:tcBorders>
+          </w:tcPr>
+          <w:p>
+            <w:pPr>
+              <w:jc w:val="left"/>
+            </w:pPr>
+            <w:r>
+              <w:rPr>
+                <w:b/>
+                <w:i w:val="0"/>
+                <w:color w:val="FFFFFF"/>
+                <w:sz w:val="17"/>
+              </w:rPr>
+              <w:t>Komponen Uji</w:t>
+            </w:r>
+          </w:p>
+        </w:tc>
+        <w:tc>
+          <w:tcPr>
+            <w:tcW w:type="dxa" w:w="6236"/>
+            <w:shd w:val="clear" w:color="auto" w:fill="2E7D32"/>
+            <w:tcMar>
+              <w:top w:w="70" w:type="dxa"/>
+              <w:bottom w:w="70" w:type="dxa"/>
+              <w:left w:w="100" w:type="dxa"/>
+              <w:right w:w="100" w:type="dxa"/>
+            </w:tcMar>
+            <w:tcBorders>
+              <w:top w:val="single" w:sz="4" w:color="D0D0D0" w:space="0"/>
+              <w:left w:val="single" w:sz="4" w:color="D0D0D0" w:space="0"/>
+              <w:bottom w:val="single" w:sz="8" w:color="1B5E20" w:space="0"/>
+              <w:right w:val="single" w:sz="4" w:color="D0D0D0" w:space="0"/>
+            </w:tcBorders>
+          </w:tcPr>
+          <w:p>
+            <w:pPr>
+              <w:jc w:val="left"/>
+            </w:pPr>
+            <w:r>
+              <w:rPr>
+                <w:b/>
+                <w:i w:val="0"/>
+                <w:color w:val="FFFFFF"/>
+                <w:sz w:val="17"/>
+              </w:rPr>
+              <w:t>Definisi Variabel (Sub-bab 2.2)</w:t>
+            </w:r>
+          </w:p>
+        </w:tc>
+      </w:tr>
+      <w:tr>
+        <w:tc>
+          <w:tcPr>
+            <w:tcW w:type="dxa" w:w="2551"/>
+            <w:shd w:val="clear" w:color="auto" w:fill="F5FBF5"/>
+            <w:tcMar>
+              <w:top w:w="50" w:type="dxa"/>
+              <w:bottom w:w="50" w:type="dxa"/>
+              <w:left w:w="100" w:type="dxa"/>
+              <w:right w:w="100" w:type="dxa"/>
+            </w:tcMar>
+            <w:tcBorders>
+              <w:top w:val="single" w:sz="4" w:color="D0D0D0" w:space="0"/>
+              <w:left w:val="single" w:sz="4" w:color="D0D0D0" w:space="0"/>
+              <w:bottom w:val="single" w:sz="4" w:color="D0D0D0" w:space="0"/>
+              <w:right w:val="single" w:sz="4" w:color="D0D0D0" w:space="0"/>
+            </w:tcBorders>
+          </w:tcPr>
+          <w:p>
+            <w:pPr>
+              <w:jc w:val="left"/>
+            </w:pPr>
+            <w:r>
+              <w:rPr>
+                <w:b w:val="0"/>
+                <w:i w:val="0"/>
+                <w:color w:val="222222"/>
+                <w:sz w:val="17"/>
+              </w:rPr>
+              <w:t>Variabel Independen (X)</w:t>
+            </w:r>
+          </w:p>
+        </w:tc>
+        <w:tc>
+          <w:tcPr>
+            <w:tcW w:type="dxa" w:w="6236"/>
+            <w:shd w:val="clear" w:color="auto" w:fill="F5FBF5"/>
+            <w:tcMar>
+              <w:top w:w="50" w:type="dxa"/>
+              <w:bottom w:w="50" w:type="dxa"/>
+              <w:left w:w="100" w:type="dxa"/>
+              <w:right w:w="100" w:type="dxa"/>
+            </w:tcMar>
+            <w:tcBorders>
+              <w:top w:val="single" w:sz="4" w:color="D0D0D0" w:space="0"/>
+              <w:left w:val="single" w:sz="4" w:color="D0D0D0" w:space="0"/>
+              <w:bottom w:val="single" w:sz="4" w:color="D0D0D0" w:space="0"/>
+              <w:right w:val="single" w:sz="4" w:color="D0D0D0" w:space="0"/>
+            </w:tcBorders>
+          </w:tcPr>
+          <w:p>
+            <w:pPr>
+              <w:jc w:val="left"/>
+            </w:pPr>
+            <w:r>
+              <w:rPr>
+                <w:b w:val="0"/>
+                <w:i w:val="0"/>
+                <w:color w:val="222222"/>
+                <w:sz w:val="17"/>
+              </w:rPr>
+              <w:t>Kapasitas PLTU (MW): Total kapasitas PLTU Captive yang beroperasi.</w:t>
+            </w:r>
+          </w:p>
+        </w:tc>
+      </w:tr>
+      <w:tr>
+        <w:tc>
+          <w:tcPr>
+            <w:tcW w:type="dxa" w:w="2551"/>
+            <w:shd w:val="clear" w:color="auto" w:fill="FFFFFF"/>
+            <w:tcMar>
+              <w:top w:w="50" w:type="dxa"/>
+              <w:bottom w:w="50" w:type="dxa"/>
+              <w:left w:w="100" w:type="dxa"/>
+              <w:right w:w="100" w:type="dxa"/>
+            </w:tcMar>
+            <w:tcBorders>
+              <w:top w:val="single" w:sz="4" w:color="D0D0D0" w:space="0"/>
+              <w:left w:val="single" w:sz="4" w:color="D0D0D0" w:space="0"/>
+              <w:bottom w:val="single" w:sz="4" w:color="D0D0D0" w:space="0"/>
+              <w:right w:val="single" w:sz="4" w:color="D0D0D0" w:space="0"/>
+            </w:tcBorders>
+          </w:tcPr>
+          <w:p>
+            <w:pPr>
+              <w:jc w:val="left"/>
+            </w:pPr>
+            <w:r>
+              <w:rPr>
+                <w:b w:val="0"/>
+                <w:i w:val="0"/>
+                <w:color w:val="222222"/>
+                <w:sz w:val="17"/>
+              </w:rPr>
+              <w:t>Variabel Dependen (Y)</w:t>
+            </w:r>
+          </w:p>
+        </w:tc>
+        <w:tc>
+          <w:tcPr>
+            <w:tcW w:type="dxa" w:w="6236"/>
+            <w:shd w:val="clear" w:color="auto" w:fill="FFFFFF"/>
+            <w:tcMar>
+              <w:top w:w="50" w:type="dxa"/>
+              <w:bottom w:w="50" w:type="dxa"/>
+              <w:left w:w="100" w:type="dxa"/>
+              <w:right w:w="100" w:type="dxa"/>
+            </w:tcMar>
+            <w:tcBorders>
+              <w:top w:val="single" w:sz="4" w:color="D0D0D0" w:space="0"/>
+              <w:left w:val="single" w:sz="4" w:color="D0D0D0" w:space="0"/>
+              <w:bottom w:val="single" w:sz="4" w:color="D0D0D0" w:space="0"/>
+              <w:right w:val="single" w:sz="4" w:color="D0D0D0" w:space="0"/>
+            </w:tcBorders>
+          </w:tcPr>
+          <w:p>
+            <w:pPr>
+              <w:jc w:val="left"/>
+            </w:pPr>
+            <w:r>
+              <w:rPr>
+                <w:b w:val="0"/>
+                <w:i w:val="0"/>
+                <w:color w:val="222222"/>
+                <w:sz w:val="17"/>
+              </w:rPr>
+              <w:t>Indeks Kualitas Udara: Skor baku mutu udara ambien per provinsi.</w:t>
+            </w:r>
+          </w:p>
+        </w:tc>
+      </w:tr>
+      <w:tr>
+        <w:tc>
+          <w:tcPr>
+            <w:tcW w:type="dxa" w:w="2551"/>
+            <w:shd w:val="clear" w:color="auto" w:fill="F5FBF5"/>
+            <w:tcMar>
+              <w:top w:w="50" w:type="dxa"/>
+              <w:bottom w:w="50" w:type="dxa"/>
+              <w:left w:w="100" w:type="dxa"/>
+              <w:right w:w="100" w:type="dxa"/>
+            </w:tcMar>
+            <w:tcBorders>
+              <w:top w:val="single" w:sz="4" w:color="D0D0D0" w:space="0"/>
+              <w:left w:val="single" w:sz="4" w:color="D0D0D0" w:space="0"/>
+              <w:bottom w:val="single" w:sz="4" w:color="D0D0D0" w:space="0"/>
+              <w:right w:val="single" w:sz="4" w:color="D0D0D0" w:space="0"/>
+            </w:tcBorders>
+          </w:tcPr>
+          <w:p>
+            <w:pPr>
+              <w:jc w:val="left"/>
+            </w:pPr>
+            <w:r>
+              <w:rPr>
+                <w:b w:val="0"/>
+                <w:i w:val="0"/>
+                <w:color w:val="222222"/>
+                <w:sz w:val="17"/>
+              </w:rPr>
+              <w:t>Hipotesis Nol (H0)</w:t>
+            </w:r>
+          </w:p>
+        </w:tc>
+        <w:tc>
+          <w:tcPr>
+            <w:tcW w:type="dxa" w:w="6236"/>
+            <w:shd w:val="clear" w:color="auto" w:fill="F5FBF5"/>
+            <w:tcMar>
+              <w:top w:w="50" w:type="dxa"/>
+              <w:bottom w:w="50" w:type="dxa"/>
+              <w:left w:w="100" w:type="dxa"/>
+              <w:right w:w="100" w:type="dxa"/>
+            </w:tcMar>
+            <w:tcBorders>
+              <w:top w:val="single" w:sz="4" w:color="D0D0D0" w:space="0"/>
+              <w:left w:val="single" w:sz="4" w:color="D0D0D0" w:space="0"/>
+              <w:bottom w:val="single" w:sz="4" w:color="D0D0D0" w:space="0"/>
+              <w:right w:val="single" w:sz="4" w:color="D0D0D0" w:space="0"/>
+            </w:tcBorders>
+          </w:tcPr>
+          <w:p>
+            <w:pPr>
+              <w:jc w:val="left"/>
+            </w:pPr>
+            <w:r>
+              <w:rPr>
+                <w:b w:val="0"/>
+                <w:i w:val="0"/>
+                <w:color w:val="222222"/>
+                <w:sz w:val="17"/>
+              </w:rPr>
+              <w:t>Tidak ada hubungan signifikan secara statistik antara kapasitas PLTU dengan Indeks Kualitas Udara.</w:t>
+            </w:r>
+          </w:p>
+        </w:tc>
+      </w:tr>
+      <w:tr>
+        <w:tc>
+          <w:tcPr>
+            <w:tcW w:type="dxa" w:w="2551"/>
+            <w:shd w:val="clear" w:color="auto" w:fill="FFFFFF"/>
+            <w:tcMar>
+              <w:top w:w="50" w:type="dxa"/>
+              <w:bottom w:w="50" w:type="dxa"/>
+              <w:left w:w="100" w:type="dxa"/>
+              <w:right w:w="100" w:type="dxa"/>
+            </w:tcMar>
+            <w:tcBorders>
+              <w:top w:val="single" w:sz="4" w:color="D0D0D0" w:space="0"/>
+              <w:left w:val="single" w:sz="4" w:color="D0D0D0" w:space="0"/>
+              <w:bottom w:val="single" w:sz="4" w:color="D0D0D0" w:space="0"/>
+              <w:right w:val="single" w:sz="4" w:color="D0D0D0" w:space="0"/>
+            </w:tcBorders>
+          </w:tcPr>
+          <w:p>
+            <w:pPr>
+              <w:jc w:val="left"/>
+            </w:pPr>
+            <w:r>
+              <w:rPr>
+                <w:b w:val="0"/>
+                <w:i w:val="0"/>
+                <w:color w:val="222222"/>
+                <w:sz w:val="17"/>
+              </w:rPr>
+              <w:t>Decision Rule (Alpha 5%)</w:t>
+            </w:r>
+          </w:p>
+        </w:tc>
+        <w:tc>
+          <w:tcPr>
+            <w:tcW w:type="dxa" w:w="6236"/>
+            <w:shd w:val="clear" w:color="auto" w:fill="FFFFFF"/>
+            <w:tcMar>
+              <w:top w:w="50" w:type="dxa"/>
+              <w:bottom w:w="50" w:type="dxa"/>
+              <w:left w:w="100" w:type="dxa"/>
+              <w:right w:w="100" w:type="dxa"/>
+            </w:tcMar>
+            <w:tcBorders>
+              <w:top w:val="single" w:sz="4" w:color="D0D0D0" w:space="0"/>
+              <w:left w:val="single" w:sz="4" w:color="D0D0D0" w:space="0"/>
+              <w:bottom w:val="single" w:sz="4" w:color="D0D0D0" w:space="0"/>
+              <w:right w:val="single" w:sz="4" w:color="D0D0D0" w:space="0"/>
+            </w:tcBorders>
+          </w:tcPr>
+          <w:p>
+            <w:pPr>
+              <w:jc w:val="left"/>
+            </w:pPr>
+            <w:r>
+              <w:rPr>
+                <w:b w:val="0"/>
+                <w:i w:val="0"/>
+                <w:color w:val="222222"/>
+                <w:sz w:val="17"/>
+              </w:rPr>
+              <w:t>Jika P-Value &lt; 0.05, maka Tolak H0 (Terbukti signifikan bahwa emisi PLTU menurunkan kualitas udara).</w:t>
+            </w:r>
+          </w:p>
+        </w:tc>
+      </w:tr>
+      <w:tr>
+        <w:tc>
+          <w:tcPr>
+            <w:tcW w:type="dxa" w:w="2551"/>
+            <w:shd w:val="clear" w:color="auto" w:fill="F5FBF5"/>
+            <w:tcMar>
+              <w:top w:w="50" w:type="dxa"/>
+              <w:bottom w:w="50" w:type="dxa"/>
+              <w:left w:w="100" w:type="dxa"/>
+              <w:right w:w="100" w:type="dxa"/>
+            </w:tcMar>
+            <w:tcBorders>
+              <w:top w:val="single" w:sz="4" w:color="D0D0D0" w:space="0"/>
+              <w:left w:val="single" w:sz="4" w:color="D0D0D0" w:space="0"/>
+              <w:bottom w:val="single" w:sz="4" w:color="D0D0D0" w:space="0"/>
+              <w:right w:val="single" w:sz="4" w:color="D0D0D0" w:space="0"/>
+            </w:tcBorders>
+          </w:tcPr>
+          <w:p>
+            <w:pPr>
+              <w:jc w:val="left"/>
+            </w:pPr>
+            <w:r>
+              <w:rPr>
+                <w:b w:val="0"/>
+                <w:i w:val="0"/>
+                <w:color w:val="222222"/>
+                <w:sz w:val="17"/>
+              </w:rPr>
+              <w:t>Threshold Kategori</w:t>
+            </w:r>
+          </w:p>
+        </w:tc>
+        <w:tc>
+          <w:tcPr>
+            <w:tcW w:type="dxa" w:w="6236"/>
+            <w:shd w:val="clear" w:color="auto" w:fill="F5FBF5"/>
+            <w:tcMar>
+              <w:top w:w="50" w:type="dxa"/>
+              <w:bottom w:w="50" w:type="dxa"/>
+              <w:left w:w="100" w:type="dxa"/>
+              <w:right w:w="100" w:type="dxa"/>
+            </w:tcMar>
+            <w:tcBorders>
+              <w:top w:val="single" w:sz="4" w:color="D0D0D0" w:space="0"/>
+              <w:left w:val="single" w:sz="4" w:color="D0D0D0" w:space="0"/>
+              <w:bottom w:val="single" w:sz="4" w:color="D0D0D0" w:space="0"/>
+              <w:right w:val="single" w:sz="4" w:color="D0D0D0" w:space="0"/>
+            </w:tcBorders>
+          </w:tcPr>
+          <w:p>
+            <w:pPr>
+              <w:jc w:val="left"/>
+            </w:pPr>
+            <w:r>
+              <w:rPr>
+                <w:b w:val="0"/>
+                <w:i w:val="0"/>
+                <w:color w:val="222222"/>
+                <w:sz w:val="17"/>
+              </w:rPr>
+              <w:t>Nilai Median Data Panel (N=54); variabel kontinu dikonversi menjadi biner.</w:t>
+            </w:r>
+          </w:p>
+        </w:tc>
+      </w:tr>
+    </w:tbl>
+    <w:p>
+      <w:pPr>
+        <w:spacing w:before="40" w:after="80"/>
+      </w:pPr>
+    </w:p>
+    <w:p>
+      <w:pPr>
         <w:spacing w:before="160" w:after="40"/>
       </w:pPr>
       <w:r>

</xml_diff>

<commit_message>
feat: add Tabel Empiris 2.3 for Sub-bab 2.2 and renumber tables
</commit_message>
<xml_diff>
--- a/tools/report_metodologi/bab_2/Metodologi_Bab2_Kualitas_Lingkungan.docx
+++ b/tools/report_metodologi/bab_2/Metodologi_Bab2_Kualitas_Lingkungan.docx
@@ -4156,7 +4156,7 @@
           <w:color w:val="2E7D32"/>
           <w:sz w:val="19"/>
         </w:rPr>
-        <w:t>D. Matriks Hasil Uji Empiris: Crosstabulation PLTU vs IKU</w:t>
+        <w:t>D. Matriks Hasil Uji Empiris: Kapasitas PLTU, IKU, dan Konsentrasi NO2 NASA</w:t>
       </w:r>
     </w:p>
     <w:p>
@@ -4171,7 +4171,7 @@
           <w:color w:val="222222"/>
           <w:sz w:val="19"/>
         </w:rPr>
-        <w:t xml:space="preserve">Penerapan pengujian statistik tabulasi silang pada data panel (total 54 observasi valid) disajikan secara ringkas pada </w:t>
+        <w:t xml:space="preserve">Akumulasi kapasitas PLTU captive yang beroperasi, beserta kondisi mutu udara melalui pengukuran IKU dan satelit NASA TROPOMI (NO₂) dapat dilihat secara empiris pada </w:t>
       </w:r>
       <w:r>
         <w:rPr>
@@ -4203,7 +4203,596 @@
           <w:color w:val="2E7D32"/>
           <w:sz w:val="17"/>
         </w:rPr>
-        <w:t>Tabel 2.3: Ringkasan Eksekutif Skenario Crosstab Kapasitas PLTU vs IKU Bab 2</w:t>
+        <w:t>Tabel 2.3: Rincian Empiris Kapasitas PLTU Captive, IKU, dan Konsentrasi NO₂ NASA (2024)</w:t>
+      </w:r>
+    </w:p>
+    <w:tbl>
+      <w:tblPr>
+        <w:tblStyle w:val="TableGrid"/>
+        <w:tblW w:type="auto" w:w="0"/>
+        <w:jc w:val="center"/>
+        <w:tblLayout w:type="fixed"/>
+        <w:tblLook w:firstColumn="1" w:firstRow="1" w:lastColumn="0" w:lastRow="0" w:noHBand="0" w:noVBand="1" w:val="04A0"/>
+      </w:tblPr>
+      <w:tblGrid>
+        <w:gridCol w:w="2409"/>
+        <w:gridCol w:w="2409"/>
+        <w:gridCol w:w="2409"/>
+        <w:gridCol w:w="2409"/>
+      </w:tblGrid>
+      <w:tr>
+        <w:tc>
+          <w:tcPr>
+            <w:tcW w:type="dxa" w:w="1984"/>
+            <w:shd w:val="clear" w:color="auto" w:fill="2E7D32"/>
+            <w:tcMar>
+              <w:top w:w="70" w:type="dxa"/>
+              <w:bottom w:w="70" w:type="dxa"/>
+              <w:left w:w="100" w:type="dxa"/>
+              <w:right w:w="100" w:type="dxa"/>
+            </w:tcMar>
+            <w:tcBorders>
+              <w:top w:val="single" w:sz="4" w:color="D0D0D0" w:space="0"/>
+              <w:left w:val="single" w:sz="4" w:color="D0D0D0" w:space="0"/>
+              <w:bottom w:val="single" w:sz="8" w:color="1B5E20" w:space="0"/>
+              <w:right w:val="single" w:sz="4" w:color="D0D0D0" w:space="0"/>
+            </w:tcBorders>
+          </w:tcPr>
+          <w:p>
+            <w:pPr>
+              <w:jc w:val="left"/>
+            </w:pPr>
+            <w:r>
+              <w:rPr>
+                <w:b/>
+                <w:i w:val="0"/>
+                <w:color w:val="FFFFFF"/>
+                <w:sz w:val="17"/>
+              </w:rPr>
+              <w:t>Provinsi</w:t>
+            </w:r>
+          </w:p>
+        </w:tc>
+        <w:tc>
+          <w:tcPr>
+            <w:tcW w:type="dxa" w:w="2268"/>
+            <w:shd w:val="clear" w:color="auto" w:fill="2E7D32"/>
+            <w:tcMar>
+              <w:top w:w="70" w:type="dxa"/>
+              <w:bottom w:w="70" w:type="dxa"/>
+              <w:left w:w="100" w:type="dxa"/>
+              <w:right w:w="100" w:type="dxa"/>
+            </w:tcMar>
+            <w:tcBorders>
+              <w:top w:val="single" w:sz="4" w:color="D0D0D0" w:space="0"/>
+              <w:left w:val="single" w:sz="4" w:color="D0D0D0" w:space="0"/>
+              <w:bottom w:val="single" w:sz="8" w:color="1B5E20" w:space="0"/>
+              <w:right w:val="single" w:sz="4" w:color="D0D0D0" w:space="0"/>
+            </w:tcBorders>
+          </w:tcPr>
+          <w:p>
+            <w:pPr>
+              <w:jc w:val="center"/>
+            </w:pPr>
+            <w:r>
+              <w:rPr>
+                <w:b/>
+                <w:i w:val="0"/>
+                <w:color w:val="FFFFFF"/>
+                <w:sz w:val="17"/>
+              </w:rPr>
+              <w:t>Kapasitas PLTU Captive (MW)</w:t>
+            </w:r>
+          </w:p>
+        </w:tc>
+        <w:tc>
+          <w:tcPr>
+            <w:tcW w:type="dxa" w:w="1134"/>
+            <w:shd w:val="clear" w:color="auto" w:fill="2E7D32"/>
+            <w:tcMar>
+              <w:top w:w="70" w:type="dxa"/>
+              <w:bottom w:w="70" w:type="dxa"/>
+              <w:left w:w="100" w:type="dxa"/>
+              <w:right w:w="100" w:type="dxa"/>
+            </w:tcMar>
+            <w:tcBorders>
+              <w:top w:val="single" w:sz="4" w:color="D0D0D0" w:space="0"/>
+              <w:left w:val="single" w:sz="4" w:color="D0D0D0" w:space="0"/>
+              <w:bottom w:val="single" w:sz="8" w:color="1B5E20" w:space="0"/>
+              <w:right w:val="single" w:sz="4" w:color="D0D0D0" w:space="0"/>
+            </w:tcBorders>
+          </w:tcPr>
+          <w:p>
+            <w:pPr>
+              <w:jc w:val="center"/>
+            </w:pPr>
+            <w:r>
+              <w:rPr>
+                <w:b/>
+                <w:i w:val="0"/>
+                <w:color w:val="FFFFFF"/>
+                <w:sz w:val="17"/>
+              </w:rPr>
+              <w:t>IKU</w:t>
+            </w:r>
+          </w:p>
+        </w:tc>
+        <w:tc>
+          <w:tcPr>
+            <w:tcW w:type="dxa" w:w="2551"/>
+            <w:shd w:val="clear" w:color="auto" w:fill="2E7D32"/>
+            <w:tcMar>
+              <w:top w:w="70" w:type="dxa"/>
+              <w:bottom w:w="70" w:type="dxa"/>
+              <w:left w:w="100" w:type="dxa"/>
+              <w:right w:w="100" w:type="dxa"/>
+            </w:tcMar>
+            <w:tcBorders>
+              <w:top w:val="single" w:sz="4" w:color="D0D0D0" w:space="0"/>
+              <w:left w:val="single" w:sz="4" w:color="D0D0D0" w:space="0"/>
+              <w:bottom w:val="single" w:sz="8" w:color="1B5E20" w:space="0"/>
+              <w:right w:val="single" w:sz="4" w:color="D0D0D0" w:space="0"/>
+            </w:tcBorders>
+          </w:tcPr>
+          <w:p>
+            <w:pPr>
+              <w:jc w:val="center"/>
+            </w:pPr>
+            <w:r>
+              <w:rPr>
+                <w:b/>
+                <w:i w:val="0"/>
+                <w:color w:val="FFFFFF"/>
+                <w:sz w:val="17"/>
+              </w:rPr>
+              <w:t>NASA TROPOMI NO₂ (mol/m²)</w:t>
+              <w:br/>
+              <w:t>*Batas Kritis: 6.00e-06</w:t>
+            </w:r>
+          </w:p>
+        </w:tc>
+      </w:tr>
+      <w:tr>
+        <w:tc>
+          <w:tcPr>
+            <w:tcW w:type="dxa" w:w="1984"/>
+            <w:shd w:val="clear" w:color="auto" w:fill="F5FBF5"/>
+            <w:tcMar>
+              <w:top w:w="50" w:type="dxa"/>
+              <w:bottom w:w="50" w:type="dxa"/>
+              <w:left w:w="100" w:type="dxa"/>
+              <w:right w:w="100" w:type="dxa"/>
+            </w:tcMar>
+            <w:tcBorders>
+              <w:top w:val="single" w:sz="4" w:color="D0D0D0" w:space="0"/>
+              <w:left w:val="single" w:sz="4" w:color="D0D0D0" w:space="0"/>
+              <w:bottom w:val="single" w:sz="4" w:color="D0D0D0" w:space="0"/>
+              <w:right w:val="single" w:sz="4" w:color="D0D0D0" w:space="0"/>
+            </w:tcBorders>
+          </w:tcPr>
+          <w:p>
+            <w:pPr>
+              <w:jc w:val="left"/>
+            </w:pPr>
+            <w:r>
+              <w:rPr>
+                <w:b w:val="0"/>
+                <w:i w:val="0"/>
+                <w:color w:val="222222"/>
+                <w:sz w:val="17"/>
+              </w:rPr>
+              <w:t>Sulawesi Tengah</w:t>
+            </w:r>
+          </w:p>
+        </w:tc>
+        <w:tc>
+          <w:tcPr>
+            <w:tcW w:type="dxa" w:w="2268"/>
+            <w:shd w:val="clear" w:color="auto" w:fill="F5FBF5"/>
+            <w:tcMar>
+              <w:top w:w="50" w:type="dxa"/>
+              <w:bottom w:w="50" w:type="dxa"/>
+              <w:left w:w="100" w:type="dxa"/>
+              <w:right w:w="100" w:type="dxa"/>
+            </w:tcMar>
+            <w:tcBorders>
+              <w:top w:val="single" w:sz="4" w:color="D0D0D0" w:space="0"/>
+              <w:left w:val="single" w:sz="4" w:color="D0D0D0" w:space="0"/>
+              <w:bottom w:val="single" w:sz="4" w:color="D0D0D0" w:space="0"/>
+              <w:right w:val="single" w:sz="4" w:color="D0D0D0" w:space="0"/>
+            </w:tcBorders>
+          </w:tcPr>
+          <w:p>
+            <w:pPr>
+              <w:jc w:val="center"/>
+            </w:pPr>
+            <w:r>
+              <w:rPr>
+                <w:b w:val="0"/>
+                <w:i w:val="0"/>
+                <w:color w:val="222222"/>
+                <w:sz w:val="17"/>
+              </w:rPr>
+              <w:t>9,365</w:t>
+            </w:r>
+          </w:p>
+        </w:tc>
+        <w:tc>
+          <w:tcPr>
+            <w:tcW w:type="dxa" w:w="1134"/>
+            <w:shd w:val="clear" w:color="auto" w:fill="F5FBF5"/>
+            <w:tcMar>
+              <w:top w:w="50" w:type="dxa"/>
+              <w:bottom w:w="50" w:type="dxa"/>
+              <w:left w:w="100" w:type="dxa"/>
+              <w:right w:w="100" w:type="dxa"/>
+            </w:tcMar>
+            <w:tcBorders>
+              <w:top w:val="single" w:sz="4" w:color="D0D0D0" w:space="0"/>
+              <w:left w:val="single" w:sz="4" w:color="D0D0D0" w:space="0"/>
+              <w:bottom w:val="single" w:sz="4" w:color="D0D0D0" w:space="0"/>
+              <w:right w:val="single" w:sz="4" w:color="D0D0D0" w:space="0"/>
+            </w:tcBorders>
+          </w:tcPr>
+          <w:p>
+            <w:pPr>
+              <w:jc w:val="center"/>
+            </w:pPr>
+            <w:r>
+              <w:rPr>
+                <w:b w:val="0"/>
+                <w:i w:val="0"/>
+                <w:color w:val="222222"/>
+                <w:sz w:val="17"/>
+              </w:rPr>
+              <w:t>92.9</w:t>
+            </w:r>
+          </w:p>
+        </w:tc>
+        <w:tc>
+          <w:tcPr>
+            <w:tcW w:type="dxa" w:w="2551"/>
+            <w:shd w:val="clear" w:color="auto" w:fill="F5FBF5"/>
+            <w:tcMar>
+              <w:top w:w="50" w:type="dxa"/>
+              <w:bottom w:w="50" w:type="dxa"/>
+              <w:left w:w="100" w:type="dxa"/>
+              <w:right w:w="100" w:type="dxa"/>
+            </w:tcMar>
+            <w:tcBorders>
+              <w:top w:val="single" w:sz="4" w:color="D0D0D0" w:space="0"/>
+              <w:left w:val="single" w:sz="4" w:color="D0D0D0" w:space="0"/>
+              <w:bottom w:val="single" w:sz="4" w:color="D0D0D0" w:space="0"/>
+              <w:right w:val="single" w:sz="4" w:color="D0D0D0" w:space="0"/>
+            </w:tcBorders>
+          </w:tcPr>
+          <w:p>
+            <w:pPr>
+              <w:jc w:val="center"/>
+            </w:pPr>
+            <w:r>
+              <w:rPr>
+                <w:b w:val="0"/>
+                <w:i w:val="0"/>
+                <w:color w:val="222222"/>
+                <w:sz w:val="17"/>
+              </w:rPr>
+              <w:t>6.50e-06</w:t>
+            </w:r>
+          </w:p>
+        </w:tc>
+      </w:tr>
+      <w:tr>
+        <w:tc>
+          <w:tcPr>
+            <w:tcW w:type="dxa" w:w="1984"/>
+            <w:shd w:val="clear" w:color="auto" w:fill="FFFFFF"/>
+            <w:tcMar>
+              <w:top w:w="50" w:type="dxa"/>
+              <w:bottom w:w="50" w:type="dxa"/>
+              <w:left w:w="100" w:type="dxa"/>
+              <w:right w:w="100" w:type="dxa"/>
+            </w:tcMar>
+            <w:tcBorders>
+              <w:top w:val="single" w:sz="4" w:color="D0D0D0" w:space="0"/>
+              <w:left w:val="single" w:sz="4" w:color="D0D0D0" w:space="0"/>
+              <w:bottom w:val="single" w:sz="4" w:color="D0D0D0" w:space="0"/>
+              <w:right w:val="single" w:sz="4" w:color="D0D0D0" w:space="0"/>
+            </w:tcBorders>
+          </w:tcPr>
+          <w:p>
+            <w:pPr>
+              <w:jc w:val="left"/>
+            </w:pPr>
+            <w:r>
+              <w:rPr>
+                <w:b w:val="0"/>
+                <w:i w:val="0"/>
+                <w:color w:val="222222"/>
+                <w:sz w:val="17"/>
+              </w:rPr>
+              <w:t>Sulawesi Tenggara</w:t>
+            </w:r>
+          </w:p>
+        </w:tc>
+        <w:tc>
+          <w:tcPr>
+            <w:tcW w:type="dxa" w:w="2268"/>
+            <w:shd w:val="clear" w:color="auto" w:fill="FFFFFF"/>
+            <w:tcMar>
+              <w:top w:w="50" w:type="dxa"/>
+              <w:bottom w:w="50" w:type="dxa"/>
+              <w:left w:w="100" w:type="dxa"/>
+              <w:right w:w="100" w:type="dxa"/>
+            </w:tcMar>
+            <w:tcBorders>
+              <w:top w:val="single" w:sz="4" w:color="D0D0D0" w:space="0"/>
+              <w:left w:val="single" w:sz="4" w:color="D0D0D0" w:space="0"/>
+              <w:bottom w:val="single" w:sz="4" w:color="D0D0D0" w:space="0"/>
+              <w:right w:val="single" w:sz="4" w:color="D0D0D0" w:space="0"/>
+            </w:tcBorders>
+          </w:tcPr>
+          <w:p>
+            <w:pPr>
+              <w:jc w:val="center"/>
+            </w:pPr>
+            <w:r>
+              <w:rPr>
+                <w:b w:val="0"/>
+                <w:i w:val="0"/>
+                <w:color w:val="222222"/>
+                <w:sz w:val="17"/>
+              </w:rPr>
+              <w:t>2,280</w:t>
+            </w:r>
+          </w:p>
+        </w:tc>
+        <w:tc>
+          <w:tcPr>
+            <w:tcW w:type="dxa" w:w="1134"/>
+            <w:shd w:val="clear" w:color="auto" w:fill="FFFFFF"/>
+            <w:tcMar>
+              <w:top w:w="50" w:type="dxa"/>
+              <w:bottom w:w="50" w:type="dxa"/>
+              <w:left w:w="100" w:type="dxa"/>
+              <w:right w:w="100" w:type="dxa"/>
+            </w:tcMar>
+            <w:tcBorders>
+              <w:top w:val="single" w:sz="4" w:color="D0D0D0" w:space="0"/>
+              <w:left w:val="single" w:sz="4" w:color="D0D0D0" w:space="0"/>
+              <w:bottom w:val="single" w:sz="4" w:color="D0D0D0" w:space="0"/>
+              <w:right w:val="single" w:sz="4" w:color="D0D0D0" w:space="0"/>
+            </w:tcBorders>
+          </w:tcPr>
+          <w:p>
+            <w:pPr>
+              <w:jc w:val="center"/>
+            </w:pPr>
+            <w:r>
+              <w:rPr>
+                <w:b w:val="0"/>
+                <w:i w:val="0"/>
+                <w:color w:val="222222"/>
+                <w:sz w:val="17"/>
+              </w:rPr>
+              <w:t>93.0</w:t>
+            </w:r>
+          </w:p>
+        </w:tc>
+        <w:tc>
+          <w:tcPr>
+            <w:tcW w:type="dxa" w:w="2551"/>
+            <w:shd w:val="clear" w:color="auto" w:fill="FFFFFF"/>
+            <w:tcMar>
+              <w:top w:w="50" w:type="dxa"/>
+              <w:bottom w:w="50" w:type="dxa"/>
+              <w:left w:w="100" w:type="dxa"/>
+              <w:right w:w="100" w:type="dxa"/>
+            </w:tcMar>
+            <w:tcBorders>
+              <w:top w:val="single" w:sz="4" w:color="D0D0D0" w:space="0"/>
+              <w:left w:val="single" w:sz="4" w:color="D0D0D0" w:space="0"/>
+              <w:bottom w:val="single" w:sz="4" w:color="D0D0D0" w:space="0"/>
+              <w:right w:val="single" w:sz="4" w:color="D0D0D0" w:space="0"/>
+            </w:tcBorders>
+          </w:tcPr>
+          <w:p>
+            <w:pPr>
+              <w:jc w:val="center"/>
+            </w:pPr>
+            <w:r>
+              <w:rPr>
+                <w:b w:val="0"/>
+                <w:i w:val="0"/>
+                <w:color w:val="222222"/>
+                <w:sz w:val="17"/>
+              </w:rPr>
+              <w:t>6.62e-06</w:t>
+            </w:r>
+          </w:p>
+        </w:tc>
+      </w:tr>
+      <w:tr>
+        <w:tc>
+          <w:tcPr>
+            <w:tcW w:type="dxa" w:w="1984"/>
+            <w:shd w:val="clear" w:color="auto" w:fill="F5FBF5"/>
+            <w:tcMar>
+              <w:top w:w="50" w:type="dxa"/>
+              <w:bottom w:w="50" w:type="dxa"/>
+              <w:left w:w="100" w:type="dxa"/>
+              <w:right w:w="100" w:type="dxa"/>
+            </w:tcMar>
+            <w:tcBorders>
+              <w:top w:val="single" w:sz="4" w:color="D0D0D0" w:space="0"/>
+              <w:left w:val="single" w:sz="4" w:color="D0D0D0" w:space="0"/>
+              <w:bottom w:val="single" w:sz="4" w:color="D0D0D0" w:space="0"/>
+              <w:right w:val="single" w:sz="4" w:color="D0D0D0" w:space="0"/>
+            </w:tcBorders>
+          </w:tcPr>
+          <w:p>
+            <w:pPr>
+              <w:jc w:val="left"/>
+            </w:pPr>
+            <w:r>
+              <w:rPr>
+                <w:b w:val="0"/>
+                <w:i w:val="0"/>
+                <w:color w:val="222222"/>
+                <w:sz w:val="17"/>
+              </w:rPr>
+              <w:t>Sulawesi Selatan</w:t>
+            </w:r>
+          </w:p>
+        </w:tc>
+        <w:tc>
+          <w:tcPr>
+            <w:tcW w:type="dxa" w:w="2268"/>
+            <w:shd w:val="clear" w:color="auto" w:fill="F5FBF5"/>
+            <w:tcMar>
+              <w:top w:w="50" w:type="dxa"/>
+              <w:bottom w:w="50" w:type="dxa"/>
+              <w:left w:w="100" w:type="dxa"/>
+              <w:right w:w="100" w:type="dxa"/>
+            </w:tcMar>
+            <w:tcBorders>
+              <w:top w:val="single" w:sz="4" w:color="D0D0D0" w:space="0"/>
+              <w:left w:val="single" w:sz="4" w:color="D0D0D0" w:space="0"/>
+              <w:bottom w:val="single" w:sz="4" w:color="D0D0D0" w:space="0"/>
+              <w:right w:val="single" w:sz="4" w:color="D0D0D0" w:space="0"/>
+            </w:tcBorders>
+          </w:tcPr>
+          <w:p>
+            <w:pPr>
+              <w:jc w:val="center"/>
+            </w:pPr>
+            <w:r>
+              <w:rPr>
+                <w:b w:val="0"/>
+                <w:i w:val="0"/>
+                <w:color w:val="222222"/>
+                <w:sz w:val="17"/>
+              </w:rPr>
+              <w:t>600</w:t>
+            </w:r>
+          </w:p>
+        </w:tc>
+        <w:tc>
+          <w:tcPr>
+            <w:tcW w:type="dxa" w:w="1134"/>
+            <w:shd w:val="clear" w:color="auto" w:fill="F5FBF5"/>
+            <w:tcMar>
+              <w:top w:w="50" w:type="dxa"/>
+              <w:bottom w:w="50" w:type="dxa"/>
+              <w:left w:w="100" w:type="dxa"/>
+              <w:right w:w="100" w:type="dxa"/>
+            </w:tcMar>
+            <w:tcBorders>
+              <w:top w:val="single" w:sz="4" w:color="D0D0D0" w:space="0"/>
+              <w:left w:val="single" w:sz="4" w:color="D0D0D0" w:space="0"/>
+              <w:bottom w:val="single" w:sz="4" w:color="D0D0D0" w:space="0"/>
+              <w:right w:val="single" w:sz="4" w:color="D0D0D0" w:space="0"/>
+            </w:tcBorders>
+          </w:tcPr>
+          <w:p>
+            <w:pPr>
+              <w:jc w:val="center"/>
+            </w:pPr>
+            <w:r>
+              <w:rPr>
+                <w:b w:val="0"/>
+                <w:i w:val="0"/>
+                <w:color w:val="222222"/>
+                <w:sz w:val="17"/>
+              </w:rPr>
+              <w:t>91.5</w:t>
+            </w:r>
+          </w:p>
+        </w:tc>
+        <w:tc>
+          <w:tcPr>
+            <w:tcW w:type="dxa" w:w="2551"/>
+            <w:shd w:val="clear" w:color="auto" w:fill="F5FBF5"/>
+            <w:tcMar>
+              <w:top w:w="50" w:type="dxa"/>
+              <w:bottom w:w="50" w:type="dxa"/>
+              <w:left w:w="100" w:type="dxa"/>
+              <w:right w:w="100" w:type="dxa"/>
+            </w:tcMar>
+            <w:tcBorders>
+              <w:top w:val="single" w:sz="4" w:color="D0D0D0" w:space="0"/>
+              <w:left w:val="single" w:sz="4" w:color="D0D0D0" w:space="0"/>
+              <w:bottom w:val="single" w:sz="4" w:color="D0D0D0" w:space="0"/>
+              <w:right w:val="single" w:sz="4" w:color="D0D0D0" w:space="0"/>
+            </w:tcBorders>
+          </w:tcPr>
+          <w:p>
+            <w:pPr>
+              <w:jc w:val="center"/>
+            </w:pPr>
+            <w:r>
+              <w:rPr>
+                <w:b w:val="0"/>
+                <w:i w:val="0"/>
+                <w:color w:val="222222"/>
+                <w:sz w:val="17"/>
+              </w:rPr>
+              <w:t>6.40e-06</w:t>
+            </w:r>
+          </w:p>
+        </w:tc>
+      </w:tr>
+    </w:tbl>
+    <w:p>
+      <w:pPr>
+        <w:spacing w:before="40" w:after="80"/>
+      </w:pPr>
+    </w:p>
+    <w:p>
+      <w:pPr>
+        <w:spacing w:after="100"/>
+        <w:jc w:val="both"/>
+      </w:pPr>
+      <w:r>
+        <w:rPr>
+          <w:b w:val="0"/>
+          <w:i w:val="0"/>
+          <w:color w:val="222222"/>
+          <w:sz w:val="19"/>
+        </w:rPr>
+        <w:t xml:space="preserve">Penerapan pengujian statistik tabulasi silang pada data panel (total 54 observasi valid) disajikan secara ringkas pada </w:t>
+      </w:r>
+      <w:r>
+        <w:rPr>
+          <w:b/>
+          <w:i w:val="0"/>
+          <w:color w:val="222222"/>
+          <w:sz w:val="19"/>
+        </w:rPr>
+        <w:t>Tabel 2.4</w:t>
+      </w:r>
+      <w:r>
+        <w:rPr>
+          <w:b w:val="0"/>
+          <w:i w:val="0"/>
+          <w:color w:val="222222"/>
+          <w:sz w:val="19"/>
+        </w:rPr>
+        <w:t xml:space="preserve"> berikut:</w:t>
+      </w:r>
+    </w:p>
+    <w:p>
+      <w:pPr>
+        <w:spacing w:before="120" w:after="40"/>
+      </w:pPr>
+      <w:r>
+        <w:rPr>
+          <w:b/>
+          <w:i/>
+          <w:color w:val="2E7D32"/>
+          <w:sz w:val="17"/>
+        </w:rPr>
+        <w:t>Tabel 2.4: Ringkasan Eksekutif Skenario Crosstab Kapasitas PLTU vs IKU Bab 2</w:t>
       </w:r>
     </w:p>
     <w:tbl>
@@ -5596,7 +6185,7 @@
           <w:color w:val="222222"/>
           <w:sz w:val="19"/>
         </w:rPr>
-        <w:t>Tabel 2.4</w:t>
+        <w:t>Tabel 2.5</w:t>
       </w:r>
       <w:r>
         <w:rPr>
@@ -5619,7 +6208,7 @@
           <w:color w:val="2E7D32"/>
           <w:sz w:val="17"/>
         </w:rPr>
-        <w:t>Tabel 2.4: Rincian Empiris Luas Konsesi IUP-Kawasan Industri dan Deforestasi Kumulatif per Provinsi (2014-2023)</w:t>
+        <w:t>Tabel 2.5: Rincian Empiris Luas Konsesi IUP-Kawasan Industri dan Deforestasi Kumulatif per Provinsi (2014-2023)</w:t>
       </w:r>
     </w:p>
     <w:tbl>
@@ -6573,7 +7162,7 @@
           <w:color w:val="222222"/>
           <w:sz w:val="19"/>
         </w:rPr>
-        <w:t>Tabel 2.5</w:t>
+        <w:t>Tabel 2.6</w:t>
       </w:r>
       <w:r>
         <w:rPr>
@@ -6596,7 +7185,7 @@
           <w:color w:val="2E7D32"/>
           <w:sz w:val="17"/>
         </w:rPr>
-        <w:t>Tabel 2.5: Ringkasan Eksekutif Skenario Crosstab Ekspansi Industri vs Deforestasi Bab 2</w:t>
+        <w:t>Tabel 2.6: Ringkasan Eksekutif Skenario Crosstab Ekspansi Industri vs Deforestasi Bab 2</w:t>
       </w:r>
     </w:p>
     <w:tbl>

</xml_diff>

<commit_message>
fix: Tabel 2.3 showing only 3 provinces
</commit_message>
<xml_diff>
--- a/tools/report_metodologi/bab_2/Metodologi_Bab2_Kualitas_Lingkungan.docx
+++ b/tools/report_metodologi/bab_2/Metodologi_Bab2_Kualitas_Lingkungan.docx
@@ -4742,6 +4742,396 @@
           </w:p>
         </w:tc>
       </w:tr>
+      <w:tr>
+        <w:tc>
+          <w:tcPr>
+            <w:tcW w:type="dxa" w:w="1984"/>
+            <w:shd w:val="clear" w:color="auto" w:fill="FFFFFF"/>
+            <w:tcMar>
+              <w:top w:w="50" w:type="dxa"/>
+              <w:bottom w:w="50" w:type="dxa"/>
+              <w:left w:w="100" w:type="dxa"/>
+              <w:right w:w="100" w:type="dxa"/>
+            </w:tcMar>
+            <w:tcBorders>
+              <w:top w:val="single" w:sz="4" w:color="D0D0D0" w:space="0"/>
+              <w:left w:val="single" w:sz="4" w:color="D0D0D0" w:space="0"/>
+              <w:bottom w:val="single" w:sz="4" w:color="D0D0D0" w:space="0"/>
+              <w:right w:val="single" w:sz="4" w:color="D0D0D0" w:space="0"/>
+            </w:tcBorders>
+          </w:tcPr>
+          <w:p>
+            <w:pPr>
+              <w:jc w:val="left"/>
+            </w:pPr>
+            <w:r>
+              <w:rPr>
+                <w:b w:val="0"/>
+                <w:i w:val="0"/>
+                <w:color w:val="222222"/>
+                <w:sz w:val="17"/>
+              </w:rPr>
+              <w:t>Gorontalo</w:t>
+            </w:r>
+          </w:p>
+        </w:tc>
+        <w:tc>
+          <w:tcPr>
+            <w:tcW w:type="dxa" w:w="2268"/>
+            <w:shd w:val="clear" w:color="auto" w:fill="FFFFFF"/>
+            <w:tcMar>
+              <w:top w:w="50" w:type="dxa"/>
+              <w:bottom w:w="50" w:type="dxa"/>
+              <w:left w:w="100" w:type="dxa"/>
+              <w:right w:w="100" w:type="dxa"/>
+            </w:tcMar>
+            <w:tcBorders>
+              <w:top w:val="single" w:sz="4" w:color="D0D0D0" w:space="0"/>
+              <w:left w:val="single" w:sz="4" w:color="D0D0D0" w:space="0"/>
+              <w:bottom w:val="single" w:sz="4" w:color="D0D0D0" w:space="0"/>
+              <w:right w:val="single" w:sz="4" w:color="D0D0D0" w:space="0"/>
+            </w:tcBorders>
+          </w:tcPr>
+          <w:p>
+            <w:pPr>
+              <w:jc w:val="center"/>
+            </w:pPr>
+            <w:r>
+              <w:rPr>
+                <w:b w:val="0"/>
+                <w:i w:val="0"/>
+                <w:color w:val="222222"/>
+                <w:sz w:val="17"/>
+              </w:rPr>
+              <w:t>0</w:t>
+            </w:r>
+          </w:p>
+        </w:tc>
+        <w:tc>
+          <w:tcPr>
+            <w:tcW w:type="dxa" w:w="1134"/>
+            <w:shd w:val="clear" w:color="auto" w:fill="FFFFFF"/>
+            <w:tcMar>
+              <w:top w:w="50" w:type="dxa"/>
+              <w:bottom w:w="50" w:type="dxa"/>
+              <w:left w:w="100" w:type="dxa"/>
+              <w:right w:w="100" w:type="dxa"/>
+            </w:tcMar>
+            <w:tcBorders>
+              <w:top w:val="single" w:sz="4" w:color="D0D0D0" w:space="0"/>
+              <w:left w:val="single" w:sz="4" w:color="D0D0D0" w:space="0"/>
+              <w:bottom w:val="single" w:sz="4" w:color="D0D0D0" w:space="0"/>
+              <w:right w:val="single" w:sz="4" w:color="D0D0D0" w:space="0"/>
+            </w:tcBorders>
+          </w:tcPr>
+          <w:p>
+            <w:pPr>
+              <w:jc w:val="center"/>
+            </w:pPr>
+            <w:r>
+              <w:rPr>
+                <w:b w:val="0"/>
+                <w:i w:val="0"/>
+                <w:color w:val="222222"/>
+                <w:sz w:val="17"/>
+              </w:rPr>
+              <w:t>93.5</w:t>
+            </w:r>
+          </w:p>
+        </w:tc>
+        <w:tc>
+          <w:tcPr>
+            <w:tcW w:type="dxa" w:w="2551"/>
+            <w:shd w:val="clear" w:color="auto" w:fill="FFFFFF"/>
+            <w:tcMar>
+              <w:top w:w="50" w:type="dxa"/>
+              <w:bottom w:w="50" w:type="dxa"/>
+              <w:left w:w="100" w:type="dxa"/>
+              <w:right w:w="100" w:type="dxa"/>
+            </w:tcMar>
+            <w:tcBorders>
+              <w:top w:val="single" w:sz="4" w:color="D0D0D0" w:space="0"/>
+              <w:left w:val="single" w:sz="4" w:color="D0D0D0" w:space="0"/>
+              <w:bottom w:val="single" w:sz="4" w:color="D0D0D0" w:space="0"/>
+              <w:right w:val="single" w:sz="4" w:color="D0D0D0" w:space="0"/>
+            </w:tcBorders>
+          </w:tcPr>
+          <w:p>
+            <w:pPr>
+              <w:jc w:val="center"/>
+            </w:pPr>
+            <w:r>
+              <w:rPr>
+                <w:b w:val="0"/>
+                <w:i w:val="0"/>
+                <w:color w:val="222222"/>
+                <w:sz w:val="17"/>
+              </w:rPr>
+              <w:t>3.76e-06</w:t>
+            </w:r>
+          </w:p>
+        </w:tc>
+      </w:tr>
+      <w:tr>
+        <w:tc>
+          <w:tcPr>
+            <w:tcW w:type="dxa" w:w="1984"/>
+            <w:shd w:val="clear" w:color="auto" w:fill="F5FBF5"/>
+            <w:tcMar>
+              <w:top w:w="50" w:type="dxa"/>
+              <w:bottom w:w="50" w:type="dxa"/>
+              <w:left w:w="100" w:type="dxa"/>
+              <w:right w:w="100" w:type="dxa"/>
+            </w:tcMar>
+            <w:tcBorders>
+              <w:top w:val="single" w:sz="4" w:color="D0D0D0" w:space="0"/>
+              <w:left w:val="single" w:sz="4" w:color="D0D0D0" w:space="0"/>
+              <w:bottom w:val="single" w:sz="4" w:color="D0D0D0" w:space="0"/>
+              <w:right w:val="single" w:sz="4" w:color="D0D0D0" w:space="0"/>
+            </w:tcBorders>
+          </w:tcPr>
+          <w:p>
+            <w:pPr>
+              <w:jc w:val="left"/>
+            </w:pPr>
+            <w:r>
+              <w:rPr>
+                <w:b w:val="0"/>
+                <w:i w:val="0"/>
+                <w:color w:val="222222"/>
+                <w:sz w:val="17"/>
+              </w:rPr>
+              <w:t>Sulawesi Barat</w:t>
+            </w:r>
+          </w:p>
+        </w:tc>
+        <w:tc>
+          <w:tcPr>
+            <w:tcW w:type="dxa" w:w="2268"/>
+            <w:shd w:val="clear" w:color="auto" w:fill="F5FBF5"/>
+            <w:tcMar>
+              <w:top w:w="50" w:type="dxa"/>
+              <w:bottom w:w="50" w:type="dxa"/>
+              <w:left w:w="100" w:type="dxa"/>
+              <w:right w:w="100" w:type="dxa"/>
+            </w:tcMar>
+            <w:tcBorders>
+              <w:top w:val="single" w:sz="4" w:color="D0D0D0" w:space="0"/>
+              <w:left w:val="single" w:sz="4" w:color="D0D0D0" w:space="0"/>
+              <w:bottom w:val="single" w:sz="4" w:color="D0D0D0" w:space="0"/>
+              <w:right w:val="single" w:sz="4" w:color="D0D0D0" w:space="0"/>
+            </w:tcBorders>
+          </w:tcPr>
+          <w:p>
+            <w:pPr>
+              <w:jc w:val="center"/>
+            </w:pPr>
+            <w:r>
+              <w:rPr>
+                <w:b w:val="0"/>
+                <w:i w:val="0"/>
+                <w:color w:val="222222"/>
+                <w:sz w:val="17"/>
+              </w:rPr>
+              <w:t>0</w:t>
+            </w:r>
+          </w:p>
+        </w:tc>
+        <w:tc>
+          <w:tcPr>
+            <w:tcW w:type="dxa" w:w="1134"/>
+            <w:shd w:val="clear" w:color="auto" w:fill="F5FBF5"/>
+            <w:tcMar>
+              <w:top w:w="50" w:type="dxa"/>
+              <w:bottom w:w="50" w:type="dxa"/>
+              <w:left w:w="100" w:type="dxa"/>
+              <w:right w:w="100" w:type="dxa"/>
+            </w:tcMar>
+            <w:tcBorders>
+              <w:top w:val="single" w:sz="4" w:color="D0D0D0" w:space="0"/>
+              <w:left w:val="single" w:sz="4" w:color="D0D0D0" w:space="0"/>
+              <w:bottom w:val="single" w:sz="4" w:color="D0D0D0" w:space="0"/>
+              <w:right w:val="single" w:sz="4" w:color="D0D0D0" w:space="0"/>
+            </w:tcBorders>
+          </w:tcPr>
+          <w:p>
+            <w:pPr>
+              <w:jc w:val="center"/>
+            </w:pPr>
+            <w:r>
+              <w:rPr>
+                <w:b w:val="0"/>
+                <w:i w:val="0"/>
+                <w:color w:val="222222"/>
+                <w:sz w:val="17"/>
+              </w:rPr>
+              <w:t>92.5</w:t>
+            </w:r>
+          </w:p>
+        </w:tc>
+        <w:tc>
+          <w:tcPr>
+            <w:tcW w:type="dxa" w:w="2551"/>
+            <w:shd w:val="clear" w:color="auto" w:fill="F5FBF5"/>
+            <w:tcMar>
+              <w:top w:w="50" w:type="dxa"/>
+              <w:bottom w:w="50" w:type="dxa"/>
+              <w:left w:w="100" w:type="dxa"/>
+              <w:right w:w="100" w:type="dxa"/>
+            </w:tcMar>
+            <w:tcBorders>
+              <w:top w:val="single" w:sz="4" w:color="D0D0D0" w:space="0"/>
+              <w:left w:val="single" w:sz="4" w:color="D0D0D0" w:space="0"/>
+              <w:bottom w:val="single" w:sz="4" w:color="D0D0D0" w:space="0"/>
+              <w:right w:val="single" w:sz="4" w:color="D0D0D0" w:space="0"/>
+            </w:tcBorders>
+          </w:tcPr>
+          <w:p>
+            <w:pPr>
+              <w:jc w:val="center"/>
+            </w:pPr>
+            <w:r>
+              <w:rPr>
+                <w:b w:val="0"/>
+                <w:i w:val="0"/>
+                <w:color w:val="222222"/>
+                <w:sz w:val="17"/>
+              </w:rPr>
+              <w:t>6.00e-06</w:t>
+            </w:r>
+          </w:p>
+        </w:tc>
+      </w:tr>
+      <w:tr>
+        <w:tc>
+          <w:tcPr>
+            <w:tcW w:type="dxa" w:w="1984"/>
+            <w:shd w:val="clear" w:color="auto" w:fill="FFFFFF"/>
+            <w:tcMar>
+              <w:top w:w="50" w:type="dxa"/>
+              <w:bottom w:w="50" w:type="dxa"/>
+              <w:left w:w="100" w:type="dxa"/>
+              <w:right w:w="100" w:type="dxa"/>
+            </w:tcMar>
+            <w:tcBorders>
+              <w:top w:val="single" w:sz="4" w:color="D0D0D0" w:space="0"/>
+              <w:left w:val="single" w:sz="4" w:color="D0D0D0" w:space="0"/>
+              <w:bottom w:val="single" w:sz="4" w:color="D0D0D0" w:space="0"/>
+              <w:right w:val="single" w:sz="4" w:color="D0D0D0" w:space="0"/>
+            </w:tcBorders>
+          </w:tcPr>
+          <w:p>
+            <w:pPr>
+              <w:jc w:val="left"/>
+            </w:pPr>
+            <w:r>
+              <w:rPr>
+                <w:b w:val="0"/>
+                <w:i w:val="0"/>
+                <w:color w:val="222222"/>
+                <w:sz w:val="17"/>
+              </w:rPr>
+              <w:t>Sulawesi Utara</w:t>
+            </w:r>
+          </w:p>
+        </w:tc>
+        <w:tc>
+          <w:tcPr>
+            <w:tcW w:type="dxa" w:w="2268"/>
+            <w:shd w:val="clear" w:color="auto" w:fill="FFFFFF"/>
+            <w:tcMar>
+              <w:top w:w="50" w:type="dxa"/>
+              <w:bottom w:w="50" w:type="dxa"/>
+              <w:left w:w="100" w:type="dxa"/>
+              <w:right w:w="100" w:type="dxa"/>
+            </w:tcMar>
+            <w:tcBorders>
+              <w:top w:val="single" w:sz="4" w:color="D0D0D0" w:space="0"/>
+              <w:left w:val="single" w:sz="4" w:color="D0D0D0" w:space="0"/>
+              <w:bottom w:val="single" w:sz="4" w:color="D0D0D0" w:space="0"/>
+              <w:right w:val="single" w:sz="4" w:color="D0D0D0" w:space="0"/>
+            </w:tcBorders>
+          </w:tcPr>
+          <w:p>
+            <w:pPr>
+              <w:jc w:val="center"/>
+            </w:pPr>
+            <w:r>
+              <w:rPr>
+                <w:b w:val="0"/>
+                <w:i w:val="0"/>
+                <w:color w:val="222222"/>
+                <w:sz w:val="17"/>
+              </w:rPr>
+              <w:t>0</w:t>
+            </w:r>
+          </w:p>
+        </w:tc>
+        <w:tc>
+          <w:tcPr>
+            <w:tcW w:type="dxa" w:w="1134"/>
+            <w:shd w:val="clear" w:color="auto" w:fill="FFFFFF"/>
+            <w:tcMar>
+              <w:top w:w="50" w:type="dxa"/>
+              <w:bottom w:w="50" w:type="dxa"/>
+              <w:left w:w="100" w:type="dxa"/>
+              <w:right w:w="100" w:type="dxa"/>
+            </w:tcMar>
+            <w:tcBorders>
+              <w:top w:val="single" w:sz="4" w:color="D0D0D0" w:space="0"/>
+              <w:left w:val="single" w:sz="4" w:color="D0D0D0" w:space="0"/>
+              <w:bottom w:val="single" w:sz="4" w:color="D0D0D0" w:space="0"/>
+              <w:right w:val="single" w:sz="4" w:color="D0D0D0" w:space="0"/>
+            </w:tcBorders>
+          </w:tcPr>
+          <w:p>
+            <w:pPr>
+              <w:jc w:val="center"/>
+            </w:pPr>
+            <w:r>
+              <w:rPr>
+                <w:b w:val="0"/>
+                <w:i w:val="0"/>
+                <w:color w:val="222222"/>
+                <w:sz w:val="17"/>
+              </w:rPr>
+              <w:t>93.4</w:t>
+            </w:r>
+          </w:p>
+        </w:tc>
+        <w:tc>
+          <w:tcPr>
+            <w:tcW w:type="dxa" w:w="2551"/>
+            <w:shd w:val="clear" w:color="auto" w:fill="FFFFFF"/>
+            <w:tcMar>
+              <w:top w:w="50" w:type="dxa"/>
+              <w:bottom w:w="50" w:type="dxa"/>
+              <w:left w:w="100" w:type="dxa"/>
+              <w:right w:w="100" w:type="dxa"/>
+            </w:tcMar>
+            <w:tcBorders>
+              <w:top w:val="single" w:sz="4" w:color="D0D0D0" w:space="0"/>
+              <w:left w:val="single" w:sz="4" w:color="D0D0D0" w:space="0"/>
+              <w:bottom w:val="single" w:sz="4" w:color="D0D0D0" w:space="0"/>
+              <w:right w:val="single" w:sz="4" w:color="D0D0D0" w:space="0"/>
+            </w:tcBorders>
+          </w:tcPr>
+          <w:p>
+            <w:pPr>
+              <w:jc w:val="center"/>
+            </w:pPr>
+            <w:r>
+              <w:rPr>
+                <w:b w:val="0"/>
+                <w:i w:val="0"/>
+                <w:color w:val="222222"/>
+                <w:sz w:val="17"/>
+              </w:rPr>
+              <w:t>4.09e-06</w:t>
+            </w:r>
+          </w:p>
+        </w:tc>
+      </w:tr>
     </w:tbl>
     <w:p>
       <w:pPr>

</xml_diff>

<commit_message>
fix: synchronise Tabel 2.3 PLTU capacity with dashboard (Captive & Grid)
</commit_message>
<xml_diff>
--- a/tools/report_metodologi/bab_2/Metodologi_Bab2_Kualitas_Lingkungan.docx
+++ b/tools/report_metodologi/bab_2/Metodologi_Bab2_Kualitas_Lingkungan.docx
@@ -4171,7 +4171,7 @@
           <w:color w:val="222222"/>
           <w:sz w:val="19"/>
         </w:rPr>
-        <w:t xml:space="preserve">Akumulasi kapasitas PLTU captive yang beroperasi, beserta kondisi mutu udara melalui pengukuran IKU dan satelit NASA TROPOMI (NO₂) dapat dilihat secara empiris pada </w:t>
+        <w:t xml:space="preserve">Akumulasi kapasitas total PLTU (Captive dan Grid) yang beroperasi, beserta kondisi mutu udara melalui pengukuran IKU dan satelit NASA TROPOMI (NO₂) dapat dilihat secara empiris pada </w:t>
       </w:r>
       <w:r>
         <w:rPr>
@@ -4203,7 +4203,7 @@
           <w:color w:val="2E7D32"/>
           <w:sz w:val="17"/>
         </w:rPr>
-        <w:t>Tabel 2.3: Rincian Empiris Kapasitas PLTU Captive, IKU, dan Konsentrasi NO₂ NASA (2024)</w:t>
+        <w:t>Tabel 2.3: Rincian Empiris Kapasitas PLTU (Captive &amp; Grid), IKU, dan Konsentrasi NO₂ NASA (2024)</w:t>
       </w:r>
     </w:p>
     <w:tbl>
@@ -4281,7 +4281,7 @@
                 <w:color w:val="FFFFFF"/>
                 <w:sz w:val="17"/>
               </w:rPr>
-              <w:t>Kapasitas PLTU Captive (MW)</w:t>
+              <w:t>Kapasitas PLTU (Captive &amp; Grid) (MW)</w:t>
             </w:r>
           </w:p>
         </w:tc>
@@ -4543,7 +4543,7 @@
                 <w:color w:val="222222"/>
                 <w:sz w:val="17"/>
               </w:rPr>
-              <w:t>2,280</w:t>
+              <w:t>2,380</w:t>
             </w:r>
           </w:p>
         </w:tc>
@@ -4673,7 +4673,7 @@
                 <w:color w:val="222222"/>
                 <w:sz w:val="17"/>
               </w:rPr>
-              <w:t>600</w:t>
+              <w:t>1,520</w:t>
             </w:r>
           </w:p>
         </w:tc>
@@ -4771,266 +4771,6 @@
                 <w:color w:val="222222"/>
                 <w:sz w:val="17"/>
               </w:rPr>
-              <w:t>Gorontalo</w:t>
-            </w:r>
-          </w:p>
-        </w:tc>
-        <w:tc>
-          <w:tcPr>
-            <w:tcW w:type="dxa" w:w="2268"/>
-            <w:shd w:val="clear" w:color="auto" w:fill="FFFFFF"/>
-            <w:tcMar>
-              <w:top w:w="50" w:type="dxa"/>
-              <w:bottom w:w="50" w:type="dxa"/>
-              <w:left w:w="100" w:type="dxa"/>
-              <w:right w:w="100" w:type="dxa"/>
-            </w:tcMar>
-            <w:tcBorders>
-              <w:top w:val="single" w:sz="4" w:color="D0D0D0" w:space="0"/>
-              <w:left w:val="single" w:sz="4" w:color="D0D0D0" w:space="0"/>
-              <w:bottom w:val="single" w:sz="4" w:color="D0D0D0" w:space="0"/>
-              <w:right w:val="single" w:sz="4" w:color="D0D0D0" w:space="0"/>
-            </w:tcBorders>
-          </w:tcPr>
-          <w:p>
-            <w:pPr>
-              <w:jc w:val="center"/>
-            </w:pPr>
-            <w:r>
-              <w:rPr>
-                <w:b w:val="0"/>
-                <w:i w:val="0"/>
-                <w:color w:val="222222"/>
-                <w:sz w:val="17"/>
-              </w:rPr>
-              <w:t>0</w:t>
-            </w:r>
-          </w:p>
-        </w:tc>
-        <w:tc>
-          <w:tcPr>
-            <w:tcW w:type="dxa" w:w="1134"/>
-            <w:shd w:val="clear" w:color="auto" w:fill="FFFFFF"/>
-            <w:tcMar>
-              <w:top w:w="50" w:type="dxa"/>
-              <w:bottom w:w="50" w:type="dxa"/>
-              <w:left w:w="100" w:type="dxa"/>
-              <w:right w:w="100" w:type="dxa"/>
-            </w:tcMar>
-            <w:tcBorders>
-              <w:top w:val="single" w:sz="4" w:color="D0D0D0" w:space="0"/>
-              <w:left w:val="single" w:sz="4" w:color="D0D0D0" w:space="0"/>
-              <w:bottom w:val="single" w:sz="4" w:color="D0D0D0" w:space="0"/>
-              <w:right w:val="single" w:sz="4" w:color="D0D0D0" w:space="0"/>
-            </w:tcBorders>
-          </w:tcPr>
-          <w:p>
-            <w:pPr>
-              <w:jc w:val="center"/>
-            </w:pPr>
-            <w:r>
-              <w:rPr>
-                <w:b w:val="0"/>
-                <w:i w:val="0"/>
-                <w:color w:val="222222"/>
-                <w:sz w:val="17"/>
-              </w:rPr>
-              <w:t>93.5</w:t>
-            </w:r>
-          </w:p>
-        </w:tc>
-        <w:tc>
-          <w:tcPr>
-            <w:tcW w:type="dxa" w:w="2551"/>
-            <w:shd w:val="clear" w:color="auto" w:fill="FFFFFF"/>
-            <w:tcMar>
-              <w:top w:w="50" w:type="dxa"/>
-              <w:bottom w:w="50" w:type="dxa"/>
-              <w:left w:w="100" w:type="dxa"/>
-              <w:right w:w="100" w:type="dxa"/>
-            </w:tcMar>
-            <w:tcBorders>
-              <w:top w:val="single" w:sz="4" w:color="D0D0D0" w:space="0"/>
-              <w:left w:val="single" w:sz="4" w:color="D0D0D0" w:space="0"/>
-              <w:bottom w:val="single" w:sz="4" w:color="D0D0D0" w:space="0"/>
-              <w:right w:val="single" w:sz="4" w:color="D0D0D0" w:space="0"/>
-            </w:tcBorders>
-          </w:tcPr>
-          <w:p>
-            <w:pPr>
-              <w:jc w:val="center"/>
-            </w:pPr>
-            <w:r>
-              <w:rPr>
-                <w:b w:val="0"/>
-                <w:i w:val="0"/>
-                <w:color w:val="222222"/>
-                <w:sz w:val="17"/>
-              </w:rPr>
-              <w:t>3.76e-06</w:t>
-            </w:r>
-          </w:p>
-        </w:tc>
-      </w:tr>
-      <w:tr>
-        <w:tc>
-          <w:tcPr>
-            <w:tcW w:type="dxa" w:w="1984"/>
-            <w:shd w:val="clear" w:color="auto" w:fill="F5FBF5"/>
-            <w:tcMar>
-              <w:top w:w="50" w:type="dxa"/>
-              <w:bottom w:w="50" w:type="dxa"/>
-              <w:left w:w="100" w:type="dxa"/>
-              <w:right w:w="100" w:type="dxa"/>
-            </w:tcMar>
-            <w:tcBorders>
-              <w:top w:val="single" w:sz="4" w:color="D0D0D0" w:space="0"/>
-              <w:left w:val="single" w:sz="4" w:color="D0D0D0" w:space="0"/>
-              <w:bottom w:val="single" w:sz="4" w:color="D0D0D0" w:space="0"/>
-              <w:right w:val="single" w:sz="4" w:color="D0D0D0" w:space="0"/>
-            </w:tcBorders>
-          </w:tcPr>
-          <w:p>
-            <w:pPr>
-              <w:jc w:val="left"/>
-            </w:pPr>
-            <w:r>
-              <w:rPr>
-                <w:b w:val="0"/>
-                <w:i w:val="0"/>
-                <w:color w:val="222222"/>
-                <w:sz w:val="17"/>
-              </w:rPr>
-              <w:t>Sulawesi Barat</w:t>
-            </w:r>
-          </w:p>
-        </w:tc>
-        <w:tc>
-          <w:tcPr>
-            <w:tcW w:type="dxa" w:w="2268"/>
-            <w:shd w:val="clear" w:color="auto" w:fill="F5FBF5"/>
-            <w:tcMar>
-              <w:top w:w="50" w:type="dxa"/>
-              <w:bottom w:w="50" w:type="dxa"/>
-              <w:left w:w="100" w:type="dxa"/>
-              <w:right w:w="100" w:type="dxa"/>
-            </w:tcMar>
-            <w:tcBorders>
-              <w:top w:val="single" w:sz="4" w:color="D0D0D0" w:space="0"/>
-              <w:left w:val="single" w:sz="4" w:color="D0D0D0" w:space="0"/>
-              <w:bottom w:val="single" w:sz="4" w:color="D0D0D0" w:space="0"/>
-              <w:right w:val="single" w:sz="4" w:color="D0D0D0" w:space="0"/>
-            </w:tcBorders>
-          </w:tcPr>
-          <w:p>
-            <w:pPr>
-              <w:jc w:val="center"/>
-            </w:pPr>
-            <w:r>
-              <w:rPr>
-                <w:b w:val="0"/>
-                <w:i w:val="0"/>
-                <w:color w:val="222222"/>
-                <w:sz w:val="17"/>
-              </w:rPr>
-              <w:t>0</w:t>
-            </w:r>
-          </w:p>
-        </w:tc>
-        <w:tc>
-          <w:tcPr>
-            <w:tcW w:type="dxa" w:w="1134"/>
-            <w:shd w:val="clear" w:color="auto" w:fill="F5FBF5"/>
-            <w:tcMar>
-              <w:top w:w="50" w:type="dxa"/>
-              <w:bottom w:w="50" w:type="dxa"/>
-              <w:left w:w="100" w:type="dxa"/>
-              <w:right w:w="100" w:type="dxa"/>
-            </w:tcMar>
-            <w:tcBorders>
-              <w:top w:val="single" w:sz="4" w:color="D0D0D0" w:space="0"/>
-              <w:left w:val="single" w:sz="4" w:color="D0D0D0" w:space="0"/>
-              <w:bottom w:val="single" w:sz="4" w:color="D0D0D0" w:space="0"/>
-              <w:right w:val="single" w:sz="4" w:color="D0D0D0" w:space="0"/>
-            </w:tcBorders>
-          </w:tcPr>
-          <w:p>
-            <w:pPr>
-              <w:jc w:val="center"/>
-            </w:pPr>
-            <w:r>
-              <w:rPr>
-                <w:b w:val="0"/>
-                <w:i w:val="0"/>
-                <w:color w:val="222222"/>
-                <w:sz w:val="17"/>
-              </w:rPr>
-              <w:t>92.5</w:t>
-            </w:r>
-          </w:p>
-        </w:tc>
-        <w:tc>
-          <w:tcPr>
-            <w:tcW w:type="dxa" w:w="2551"/>
-            <w:shd w:val="clear" w:color="auto" w:fill="F5FBF5"/>
-            <w:tcMar>
-              <w:top w:w="50" w:type="dxa"/>
-              <w:bottom w:w="50" w:type="dxa"/>
-              <w:left w:w="100" w:type="dxa"/>
-              <w:right w:w="100" w:type="dxa"/>
-            </w:tcMar>
-            <w:tcBorders>
-              <w:top w:val="single" w:sz="4" w:color="D0D0D0" w:space="0"/>
-              <w:left w:val="single" w:sz="4" w:color="D0D0D0" w:space="0"/>
-              <w:bottom w:val="single" w:sz="4" w:color="D0D0D0" w:space="0"/>
-              <w:right w:val="single" w:sz="4" w:color="D0D0D0" w:space="0"/>
-            </w:tcBorders>
-          </w:tcPr>
-          <w:p>
-            <w:pPr>
-              <w:jc w:val="center"/>
-            </w:pPr>
-            <w:r>
-              <w:rPr>
-                <w:b w:val="0"/>
-                <w:i w:val="0"/>
-                <w:color w:val="222222"/>
-                <w:sz w:val="17"/>
-              </w:rPr>
-              <w:t>6.00e-06</w:t>
-            </w:r>
-          </w:p>
-        </w:tc>
-      </w:tr>
-      <w:tr>
-        <w:tc>
-          <w:tcPr>
-            <w:tcW w:type="dxa" w:w="1984"/>
-            <w:shd w:val="clear" w:color="auto" w:fill="FFFFFF"/>
-            <w:tcMar>
-              <w:top w:w="50" w:type="dxa"/>
-              <w:bottom w:w="50" w:type="dxa"/>
-              <w:left w:w="100" w:type="dxa"/>
-              <w:right w:w="100" w:type="dxa"/>
-            </w:tcMar>
-            <w:tcBorders>
-              <w:top w:val="single" w:sz="4" w:color="D0D0D0" w:space="0"/>
-              <w:left w:val="single" w:sz="4" w:color="D0D0D0" w:space="0"/>
-              <w:bottom w:val="single" w:sz="4" w:color="D0D0D0" w:space="0"/>
-              <w:right w:val="single" w:sz="4" w:color="D0D0D0" w:space="0"/>
-            </w:tcBorders>
-          </w:tcPr>
-          <w:p>
-            <w:pPr>
-              <w:jc w:val="left"/>
-            </w:pPr>
-            <w:r>
-              <w:rPr>
-                <w:b w:val="0"/>
-                <w:i w:val="0"/>
-                <w:color w:val="222222"/>
-                <w:sz w:val="17"/>
-              </w:rPr>
               <w:t>Sulawesi Utara</w:t>
             </w:r>
           </w:p>
@@ -5063,7 +4803,7 @@
                 <w:color w:val="222222"/>
                 <w:sz w:val="17"/>
               </w:rPr>
-              <w:t>0</w:t>
+              <w:t>220</w:t>
             </w:r>
           </w:p>
         </w:tc>
@@ -5128,6 +4868,266 @@
                 <w:sz w:val="17"/>
               </w:rPr>
               <w:t>4.09e-06</w:t>
+            </w:r>
+          </w:p>
+        </w:tc>
+      </w:tr>
+      <w:tr>
+        <w:tc>
+          <w:tcPr>
+            <w:tcW w:type="dxa" w:w="1984"/>
+            <w:shd w:val="clear" w:color="auto" w:fill="F5FBF5"/>
+            <w:tcMar>
+              <w:top w:w="50" w:type="dxa"/>
+              <w:bottom w:w="50" w:type="dxa"/>
+              <w:left w:w="100" w:type="dxa"/>
+              <w:right w:w="100" w:type="dxa"/>
+            </w:tcMar>
+            <w:tcBorders>
+              <w:top w:val="single" w:sz="4" w:color="D0D0D0" w:space="0"/>
+              <w:left w:val="single" w:sz="4" w:color="D0D0D0" w:space="0"/>
+              <w:bottom w:val="single" w:sz="4" w:color="D0D0D0" w:space="0"/>
+              <w:right w:val="single" w:sz="4" w:color="D0D0D0" w:space="0"/>
+            </w:tcBorders>
+          </w:tcPr>
+          <w:p>
+            <w:pPr>
+              <w:jc w:val="left"/>
+            </w:pPr>
+            <w:r>
+              <w:rPr>
+                <w:b w:val="0"/>
+                <w:i w:val="0"/>
+                <w:color w:val="222222"/>
+                <w:sz w:val="17"/>
+              </w:rPr>
+              <w:t>Gorontalo</w:t>
+            </w:r>
+          </w:p>
+        </w:tc>
+        <w:tc>
+          <w:tcPr>
+            <w:tcW w:type="dxa" w:w="2268"/>
+            <w:shd w:val="clear" w:color="auto" w:fill="F5FBF5"/>
+            <w:tcMar>
+              <w:top w:w="50" w:type="dxa"/>
+              <w:bottom w:w="50" w:type="dxa"/>
+              <w:left w:w="100" w:type="dxa"/>
+              <w:right w:w="100" w:type="dxa"/>
+            </w:tcMar>
+            <w:tcBorders>
+              <w:top w:val="single" w:sz="4" w:color="D0D0D0" w:space="0"/>
+              <w:left w:val="single" w:sz="4" w:color="D0D0D0" w:space="0"/>
+              <w:bottom w:val="single" w:sz="4" w:color="D0D0D0" w:space="0"/>
+              <w:right w:val="single" w:sz="4" w:color="D0D0D0" w:space="0"/>
+            </w:tcBorders>
+          </w:tcPr>
+          <w:p>
+            <w:pPr>
+              <w:jc w:val="center"/>
+            </w:pPr>
+            <w:r>
+              <w:rPr>
+                <w:b w:val="0"/>
+                <w:i w:val="0"/>
+                <w:color w:val="222222"/>
+                <w:sz w:val="17"/>
+              </w:rPr>
+              <w:t>100</w:t>
+            </w:r>
+          </w:p>
+        </w:tc>
+        <w:tc>
+          <w:tcPr>
+            <w:tcW w:type="dxa" w:w="1134"/>
+            <w:shd w:val="clear" w:color="auto" w:fill="F5FBF5"/>
+            <w:tcMar>
+              <w:top w:w="50" w:type="dxa"/>
+              <w:bottom w:w="50" w:type="dxa"/>
+              <w:left w:w="100" w:type="dxa"/>
+              <w:right w:w="100" w:type="dxa"/>
+            </w:tcMar>
+            <w:tcBorders>
+              <w:top w:val="single" w:sz="4" w:color="D0D0D0" w:space="0"/>
+              <w:left w:val="single" w:sz="4" w:color="D0D0D0" w:space="0"/>
+              <w:bottom w:val="single" w:sz="4" w:color="D0D0D0" w:space="0"/>
+              <w:right w:val="single" w:sz="4" w:color="D0D0D0" w:space="0"/>
+            </w:tcBorders>
+          </w:tcPr>
+          <w:p>
+            <w:pPr>
+              <w:jc w:val="center"/>
+            </w:pPr>
+            <w:r>
+              <w:rPr>
+                <w:b w:val="0"/>
+                <w:i w:val="0"/>
+                <w:color w:val="222222"/>
+                <w:sz w:val="17"/>
+              </w:rPr>
+              <w:t>93.5</w:t>
+            </w:r>
+          </w:p>
+        </w:tc>
+        <w:tc>
+          <w:tcPr>
+            <w:tcW w:type="dxa" w:w="2551"/>
+            <w:shd w:val="clear" w:color="auto" w:fill="F5FBF5"/>
+            <w:tcMar>
+              <w:top w:w="50" w:type="dxa"/>
+              <w:bottom w:w="50" w:type="dxa"/>
+              <w:left w:w="100" w:type="dxa"/>
+              <w:right w:w="100" w:type="dxa"/>
+            </w:tcMar>
+            <w:tcBorders>
+              <w:top w:val="single" w:sz="4" w:color="D0D0D0" w:space="0"/>
+              <w:left w:val="single" w:sz="4" w:color="D0D0D0" w:space="0"/>
+              <w:bottom w:val="single" w:sz="4" w:color="D0D0D0" w:space="0"/>
+              <w:right w:val="single" w:sz="4" w:color="D0D0D0" w:space="0"/>
+            </w:tcBorders>
+          </w:tcPr>
+          <w:p>
+            <w:pPr>
+              <w:jc w:val="center"/>
+            </w:pPr>
+            <w:r>
+              <w:rPr>
+                <w:b w:val="0"/>
+                <w:i w:val="0"/>
+                <w:color w:val="222222"/>
+                <w:sz w:val="17"/>
+              </w:rPr>
+              <w:t>3.76e-06</w:t>
+            </w:r>
+          </w:p>
+        </w:tc>
+      </w:tr>
+      <w:tr>
+        <w:tc>
+          <w:tcPr>
+            <w:tcW w:type="dxa" w:w="1984"/>
+            <w:shd w:val="clear" w:color="auto" w:fill="FFFFFF"/>
+            <w:tcMar>
+              <w:top w:w="50" w:type="dxa"/>
+              <w:bottom w:w="50" w:type="dxa"/>
+              <w:left w:w="100" w:type="dxa"/>
+              <w:right w:w="100" w:type="dxa"/>
+            </w:tcMar>
+            <w:tcBorders>
+              <w:top w:val="single" w:sz="4" w:color="D0D0D0" w:space="0"/>
+              <w:left w:val="single" w:sz="4" w:color="D0D0D0" w:space="0"/>
+              <w:bottom w:val="single" w:sz="4" w:color="D0D0D0" w:space="0"/>
+              <w:right w:val="single" w:sz="4" w:color="D0D0D0" w:space="0"/>
+            </w:tcBorders>
+          </w:tcPr>
+          <w:p>
+            <w:pPr>
+              <w:jc w:val="left"/>
+            </w:pPr>
+            <w:r>
+              <w:rPr>
+                <w:b w:val="0"/>
+                <w:i w:val="0"/>
+                <w:color w:val="222222"/>
+                <w:sz w:val="17"/>
+              </w:rPr>
+              <w:t>Sulawesi Barat</w:t>
+            </w:r>
+          </w:p>
+        </w:tc>
+        <w:tc>
+          <w:tcPr>
+            <w:tcW w:type="dxa" w:w="2268"/>
+            <w:shd w:val="clear" w:color="auto" w:fill="FFFFFF"/>
+            <w:tcMar>
+              <w:top w:w="50" w:type="dxa"/>
+              <w:bottom w:w="50" w:type="dxa"/>
+              <w:left w:w="100" w:type="dxa"/>
+              <w:right w:w="100" w:type="dxa"/>
+            </w:tcMar>
+            <w:tcBorders>
+              <w:top w:val="single" w:sz="4" w:color="D0D0D0" w:space="0"/>
+              <w:left w:val="single" w:sz="4" w:color="D0D0D0" w:space="0"/>
+              <w:bottom w:val="single" w:sz="4" w:color="D0D0D0" w:space="0"/>
+              <w:right w:val="single" w:sz="4" w:color="D0D0D0" w:space="0"/>
+            </w:tcBorders>
+          </w:tcPr>
+          <w:p>
+            <w:pPr>
+              <w:jc w:val="center"/>
+            </w:pPr>
+            <w:r>
+              <w:rPr>
+                <w:b w:val="0"/>
+                <w:i w:val="0"/>
+                <w:color w:val="222222"/>
+                <w:sz w:val="17"/>
+              </w:rPr>
+              <w:t>0</w:t>
+            </w:r>
+          </w:p>
+        </w:tc>
+        <w:tc>
+          <w:tcPr>
+            <w:tcW w:type="dxa" w:w="1134"/>
+            <w:shd w:val="clear" w:color="auto" w:fill="FFFFFF"/>
+            <w:tcMar>
+              <w:top w:w="50" w:type="dxa"/>
+              <w:bottom w:w="50" w:type="dxa"/>
+              <w:left w:w="100" w:type="dxa"/>
+              <w:right w:w="100" w:type="dxa"/>
+            </w:tcMar>
+            <w:tcBorders>
+              <w:top w:val="single" w:sz="4" w:color="D0D0D0" w:space="0"/>
+              <w:left w:val="single" w:sz="4" w:color="D0D0D0" w:space="0"/>
+              <w:bottom w:val="single" w:sz="4" w:color="D0D0D0" w:space="0"/>
+              <w:right w:val="single" w:sz="4" w:color="D0D0D0" w:space="0"/>
+            </w:tcBorders>
+          </w:tcPr>
+          <w:p>
+            <w:pPr>
+              <w:jc w:val="center"/>
+            </w:pPr>
+            <w:r>
+              <w:rPr>
+                <w:b w:val="0"/>
+                <w:i w:val="0"/>
+                <w:color w:val="222222"/>
+                <w:sz w:val="17"/>
+              </w:rPr>
+              <w:t>92.5</w:t>
+            </w:r>
+          </w:p>
+        </w:tc>
+        <w:tc>
+          <w:tcPr>
+            <w:tcW w:type="dxa" w:w="2551"/>
+            <w:shd w:val="clear" w:color="auto" w:fill="FFFFFF"/>
+            <w:tcMar>
+              <w:top w:w="50" w:type="dxa"/>
+              <w:bottom w:w="50" w:type="dxa"/>
+              <w:left w:w="100" w:type="dxa"/>
+              <w:right w:w="100" w:type="dxa"/>
+            </w:tcMar>
+            <w:tcBorders>
+              <w:top w:val="single" w:sz="4" w:color="D0D0D0" w:space="0"/>
+              <w:left w:val="single" w:sz="4" w:color="D0D0D0" w:space="0"/>
+              <w:bottom w:val="single" w:sz="4" w:color="D0D0D0" w:space="0"/>
+              <w:right w:val="single" w:sz="4" w:color="D0D0D0" w:space="0"/>
+            </w:tcBorders>
+          </w:tcPr>
+          <w:p>
+            <w:pPr>
+              <w:jc w:val="center"/>
+            </w:pPr>
+            <w:r>
+              <w:rPr>
+                <w:b w:val="0"/>
+                <w:i w:val="0"/>
+                <w:color w:val="222222"/>
+                <w:sz w:val="17"/>
+              </w:rPr>
+              <w:t>6.00e-06</w:t>
             </w:r>
           </w:p>
         </w:tc>
@@ -5552,7 +5552,7 @@
                 <w:color w:val="222222"/>
                 <w:sz w:val="17"/>
               </w:rPr>
-              <w:t>0.00</w:t>
+              <w:t>1.18</w:t>
             </w:r>
           </w:p>
         </w:tc>
@@ -5802,7 +5802,7 @@
           <w:color w:val="222222"/>
           <w:sz w:val="19"/>
         </w:rPr>
-        <w:t xml:space="preserve">Kerangka operasionalisasi sub-bab ini menggunakan pendekatan visualisasi dinamis Animated Bubble Chart (Hans Rosling-style) dan Uji Statistik Chi-Square (Crosstabulation) untuk mengukur keterkaitan alokasi izin lahan dengan laju deforestasi. Alur data dan pengujian diilustrasikan pada </w:t>
+        <w:t xml:space="preserve">Pendekatan visualisasi dinamis Animated Bubble Chart (Hans Rosling-style) untuk memetakan eksekusi ruang secara spasio-temporal diilustrasikan pada </w:t>
       </w:r>
       <w:r>
         <w:rPr>
@@ -5820,7 +5820,25 @@
           <w:color w:val="222222"/>
           <w:sz w:val="19"/>
         </w:rPr>
-        <w:t xml:space="preserve"> berikut:</w:t>
+        <w:t xml:space="preserve"> berikut. Adapun untuk tahapan analisis inferensial (Uji Chi-Square), alur logikanya merujuk secara penuh pada </w:t>
+      </w:r>
+      <w:r>
+        <w:rPr>
+          <w:b/>
+          <w:i w:val="0"/>
+          <w:color w:val="222222"/>
+          <w:sz w:val="19"/>
+        </w:rPr>
+        <w:t>Bagan Alur 2.1</w:t>
+      </w:r>
+      <w:r>
+        <w:rPr>
+          <w:b w:val="0"/>
+          <w:i w:val="0"/>
+          <w:color w:val="222222"/>
+          <w:sz w:val="19"/>
+        </w:rPr>
+        <w:t xml:space="preserve"> (di sub-bab sebelumnya) dengan penyesuaian konfigurasi variabel spesifik sesuai Tabel 2.3a di bawah gambar.</w:t>
       </w:r>
     </w:p>
     <w:p>
@@ -5834,7 +5852,7 @@
           <w:color w:val="2E7D32"/>
           <w:sz w:val="17"/>
         </w:rPr>
-        <w:t>Bagan Alur 2.3: Alur Logika Metodologis Animated Bubble Chart &amp; Crosstabulation Ekspansi Industri vs Deforestasi</w:t>
+        <w:t>Bagan Alur 2.3: Alur Logika Metodologis Animated Bubble Chart Ekspansi Industri vs Deforestasi</w:t>
       </w:r>
     </w:p>
     <w:p>
@@ -5844,7 +5862,7 @@
       <w:r>
         <w:drawing>
           <wp:inline xmlns:a="http://schemas.openxmlformats.org/drawingml/2006/main" xmlns:pic="http://schemas.openxmlformats.org/drawingml/2006/picture">
-            <wp:extent cx="5400000" cy="1137290"/>
+            <wp:extent cx="5400000" cy="1486134"/>
             <wp:docPr id="3" name="Picture 3"/>
             <wp:cNvGraphicFramePr>
               <a:graphicFrameLocks noChangeAspect="1"/>
@@ -5865,7 +5883,7 @@
                   <pic:spPr>
                     <a:xfrm>
                       <a:off x="0" y="0"/>
-                      <a:ext cx="5400000" cy="1137290"/>
+                      <a:ext cx="5400000" cy="1486134"/>
                     </a:xfrm>
                     <a:prstGeom prst="rect"/>
                   </pic:spPr>
@@ -5875,6 +5893,444 @@
           </wp:inline>
         </w:drawing>
       </w:r>
+    </w:p>
+    <w:p>
+      <w:pPr>
+        <w:spacing w:before="40" w:after="80"/>
+      </w:pPr>
+    </w:p>
+    <w:p>
+      <w:pPr>
+        <w:spacing w:before="120" w:after="40"/>
+      </w:pPr>
+      <w:r>
+        <w:rPr>
+          <w:b/>
+          <w:i/>
+          <w:color w:val="2E7D32"/>
+          <w:sz w:val="17"/>
+        </w:rPr>
+        <w:t>Tabel 2.3a: Konfigurasi Variabel Uji Chi-Square (Sub-bab 2.3)</w:t>
+      </w:r>
+    </w:p>
+    <w:tbl>
+      <w:tblPr>
+        <w:tblStyle w:val="TableGrid"/>
+        <w:tblW w:type="auto" w:w="0"/>
+        <w:jc w:val="center"/>
+        <w:tblLayout w:type="fixed"/>
+        <w:tblLook w:firstColumn="1" w:firstRow="1" w:lastColumn="0" w:lastRow="0" w:noHBand="0" w:noVBand="1" w:val="04A0"/>
+      </w:tblPr>
+      <w:tblGrid>
+        <w:gridCol w:w="4819"/>
+        <w:gridCol w:w="4819"/>
+      </w:tblGrid>
+      <w:tr>
+        <w:tc>
+          <w:tcPr>
+            <w:tcW w:type="dxa" w:w="2551"/>
+            <w:shd w:val="clear" w:color="auto" w:fill="2E7D32"/>
+            <w:tcMar>
+              <w:top w:w="70" w:type="dxa"/>
+              <w:bottom w:w="70" w:type="dxa"/>
+              <w:left w:w="100" w:type="dxa"/>
+              <w:right w:w="100" w:type="dxa"/>
+            </w:tcMar>
+            <w:tcBorders>
+              <w:top w:val="single" w:sz="4" w:color="D0D0D0" w:space="0"/>
+              <w:left w:val="single" w:sz="4" w:color="D0D0D0" w:space="0"/>
+              <w:bottom w:val="single" w:sz="8" w:color="1B5E20" w:space="0"/>
+              <w:right w:val="single" w:sz="4" w:color="D0D0D0" w:space="0"/>
+            </w:tcBorders>
+          </w:tcPr>
+          <w:p>
+            <w:pPr>
+              <w:jc w:val="left"/>
+            </w:pPr>
+            <w:r>
+              <w:rPr>
+                <w:b/>
+                <w:i w:val="0"/>
+                <w:color w:val="FFFFFF"/>
+                <w:sz w:val="17"/>
+              </w:rPr>
+              <w:t>Komponen Uji</w:t>
+            </w:r>
+          </w:p>
+        </w:tc>
+        <w:tc>
+          <w:tcPr>
+            <w:tcW w:type="dxa" w:w="6236"/>
+            <w:shd w:val="clear" w:color="auto" w:fill="2E7D32"/>
+            <w:tcMar>
+              <w:top w:w="70" w:type="dxa"/>
+              <w:bottom w:w="70" w:type="dxa"/>
+              <w:left w:w="100" w:type="dxa"/>
+              <w:right w:w="100" w:type="dxa"/>
+            </w:tcMar>
+            <w:tcBorders>
+              <w:top w:val="single" w:sz="4" w:color="D0D0D0" w:space="0"/>
+              <w:left w:val="single" w:sz="4" w:color="D0D0D0" w:space="0"/>
+              <w:bottom w:val="single" w:sz="8" w:color="1B5E20" w:space="0"/>
+              <w:right w:val="single" w:sz="4" w:color="D0D0D0" w:space="0"/>
+            </w:tcBorders>
+          </w:tcPr>
+          <w:p>
+            <w:pPr>
+              <w:jc w:val="left"/>
+            </w:pPr>
+            <w:r>
+              <w:rPr>
+                <w:b/>
+                <w:i w:val="0"/>
+                <w:color w:val="FFFFFF"/>
+                <w:sz w:val="17"/>
+              </w:rPr>
+              <w:t>Definisi Variabel (Sub-bab 2.3)</w:t>
+            </w:r>
+          </w:p>
+        </w:tc>
+      </w:tr>
+      <w:tr>
+        <w:tc>
+          <w:tcPr>
+            <w:tcW w:type="dxa" w:w="2551"/>
+            <w:shd w:val="clear" w:color="auto" w:fill="F5FBF5"/>
+            <w:tcMar>
+              <w:top w:w="50" w:type="dxa"/>
+              <w:bottom w:w="50" w:type="dxa"/>
+              <w:left w:w="100" w:type="dxa"/>
+              <w:right w:w="100" w:type="dxa"/>
+            </w:tcMar>
+            <w:tcBorders>
+              <w:top w:val="single" w:sz="4" w:color="D0D0D0" w:space="0"/>
+              <w:left w:val="single" w:sz="4" w:color="D0D0D0" w:space="0"/>
+              <w:bottom w:val="single" w:sz="4" w:color="D0D0D0" w:space="0"/>
+              <w:right w:val="single" w:sz="4" w:color="D0D0D0" w:space="0"/>
+            </w:tcBorders>
+          </w:tcPr>
+          <w:p>
+            <w:pPr>
+              <w:jc w:val="left"/>
+            </w:pPr>
+            <w:r>
+              <w:rPr>
+                <w:b w:val="0"/>
+                <w:i w:val="0"/>
+                <w:color w:val="222222"/>
+                <w:sz w:val="17"/>
+              </w:rPr>
+              <w:t>Variabel Independen (X)</w:t>
+            </w:r>
+          </w:p>
+        </w:tc>
+        <w:tc>
+          <w:tcPr>
+            <w:tcW w:type="dxa" w:w="6236"/>
+            <w:shd w:val="clear" w:color="auto" w:fill="F5FBF5"/>
+            <w:tcMar>
+              <w:top w:w="50" w:type="dxa"/>
+              <w:bottom w:w="50" w:type="dxa"/>
+              <w:left w:w="100" w:type="dxa"/>
+              <w:right w:w="100" w:type="dxa"/>
+            </w:tcMar>
+            <w:tcBorders>
+              <w:top w:val="single" w:sz="4" w:color="D0D0D0" w:space="0"/>
+              <w:left w:val="single" w:sz="4" w:color="D0D0D0" w:space="0"/>
+              <w:bottom w:val="single" w:sz="4" w:color="D0D0D0" w:space="0"/>
+              <w:right w:val="single" w:sz="4" w:color="D0D0D0" w:space="0"/>
+            </w:tcBorders>
+          </w:tcPr>
+          <w:p>
+            <w:pPr>
+              <w:jc w:val="left"/>
+            </w:pPr>
+            <w:r>
+              <w:rPr>
+                <w:b w:val="0"/>
+                <w:i w:val="0"/>
+                <w:color w:val="222222"/>
+                <w:sz w:val="17"/>
+              </w:rPr>
+              <w:t>Luas Ekspansi Industri (Ha) / Luas IUP &amp; Kawasan (Ha)</w:t>
+            </w:r>
+          </w:p>
+        </w:tc>
+      </w:tr>
+      <w:tr>
+        <w:tc>
+          <w:tcPr>
+            <w:tcW w:type="dxa" w:w="2551"/>
+            <w:shd w:val="clear" w:color="auto" w:fill="FFFFFF"/>
+            <w:tcMar>
+              <w:top w:w="50" w:type="dxa"/>
+              <w:bottom w:w="50" w:type="dxa"/>
+              <w:left w:w="100" w:type="dxa"/>
+              <w:right w:w="100" w:type="dxa"/>
+            </w:tcMar>
+            <w:tcBorders>
+              <w:top w:val="single" w:sz="4" w:color="D0D0D0" w:space="0"/>
+              <w:left w:val="single" w:sz="4" w:color="D0D0D0" w:space="0"/>
+              <w:bottom w:val="single" w:sz="4" w:color="D0D0D0" w:space="0"/>
+              <w:right w:val="single" w:sz="4" w:color="D0D0D0" w:space="0"/>
+            </w:tcBorders>
+          </w:tcPr>
+          <w:p>
+            <w:pPr>
+              <w:jc w:val="left"/>
+            </w:pPr>
+            <w:r>
+              <w:rPr>
+                <w:b w:val="0"/>
+                <w:i w:val="0"/>
+                <w:color w:val="222222"/>
+                <w:sz w:val="17"/>
+              </w:rPr>
+              <w:t>Variabel Dependen (Y)</w:t>
+            </w:r>
+          </w:p>
+        </w:tc>
+        <w:tc>
+          <w:tcPr>
+            <w:tcW w:type="dxa" w:w="6236"/>
+            <w:shd w:val="clear" w:color="auto" w:fill="FFFFFF"/>
+            <w:tcMar>
+              <w:top w:w="50" w:type="dxa"/>
+              <w:bottom w:w="50" w:type="dxa"/>
+              <w:left w:w="100" w:type="dxa"/>
+              <w:right w:w="100" w:type="dxa"/>
+            </w:tcMar>
+            <w:tcBorders>
+              <w:top w:val="single" w:sz="4" w:color="D0D0D0" w:space="0"/>
+              <w:left w:val="single" w:sz="4" w:color="D0D0D0" w:space="0"/>
+              <w:bottom w:val="single" w:sz="4" w:color="D0D0D0" w:space="0"/>
+              <w:right w:val="single" w:sz="4" w:color="D0D0D0" w:space="0"/>
+            </w:tcBorders>
+          </w:tcPr>
+          <w:p>
+            <w:pPr>
+              <w:jc w:val="left"/>
+            </w:pPr>
+            <w:r>
+              <w:rPr>
+                <w:b w:val="0"/>
+                <w:i w:val="0"/>
+                <w:color w:val="222222"/>
+                <w:sz w:val="17"/>
+              </w:rPr>
+              <w:t>Kehilangan Tutupan Pohon (Ha) / Total Deforestasi Alam (Ha)</w:t>
+            </w:r>
+          </w:p>
+        </w:tc>
+      </w:tr>
+      <w:tr>
+        <w:tc>
+          <w:tcPr>
+            <w:tcW w:type="dxa" w:w="2551"/>
+            <w:shd w:val="clear" w:color="auto" w:fill="F5FBF5"/>
+            <w:tcMar>
+              <w:top w:w="50" w:type="dxa"/>
+              <w:bottom w:w="50" w:type="dxa"/>
+              <w:left w:w="100" w:type="dxa"/>
+              <w:right w:w="100" w:type="dxa"/>
+            </w:tcMar>
+            <w:tcBorders>
+              <w:top w:val="single" w:sz="4" w:color="D0D0D0" w:space="0"/>
+              <w:left w:val="single" w:sz="4" w:color="D0D0D0" w:space="0"/>
+              <w:bottom w:val="single" w:sz="4" w:color="D0D0D0" w:space="0"/>
+              <w:right w:val="single" w:sz="4" w:color="D0D0D0" w:space="0"/>
+            </w:tcBorders>
+          </w:tcPr>
+          <w:p>
+            <w:pPr>
+              <w:jc w:val="left"/>
+            </w:pPr>
+            <w:r>
+              <w:rPr>
+                <w:b w:val="0"/>
+                <w:i w:val="0"/>
+                <w:color w:val="222222"/>
+                <w:sz w:val="17"/>
+              </w:rPr>
+              <w:t>Hipotesis Nol (H0)</w:t>
+            </w:r>
+          </w:p>
+        </w:tc>
+        <w:tc>
+          <w:tcPr>
+            <w:tcW w:type="dxa" w:w="6236"/>
+            <w:shd w:val="clear" w:color="auto" w:fill="F5FBF5"/>
+            <w:tcMar>
+              <w:top w:w="50" w:type="dxa"/>
+              <w:bottom w:w="50" w:type="dxa"/>
+              <w:left w:w="100" w:type="dxa"/>
+              <w:right w:w="100" w:type="dxa"/>
+            </w:tcMar>
+            <w:tcBorders>
+              <w:top w:val="single" w:sz="4" w:color="D0D0D0" w:space="0"/>
+              <w:left w:val="single" w:sz="4" w:color="D0D0D0" w:space="0"/>
+              <w:bottom w:val="single" w:sz="4" w:color="D0D0D0" w:space="0"/>
+              <w:right w:val="single" w:sz="4" w:color="D0D0D0" w:space="0"/>
+            </w:tcBorders>
+          </w:tcPr>
+          <w:p>
+            <w:pPr>
+              <w:jc w:val="left"/>
+            </w:pPr>
+            <w:r>
+              <w:rPr>
+                <w:b w:val="0"/>
+                <w:i w:val="0"/>
+                <w:color w:val="222222"/>
+                <w:sz w:val="17"/>
+              </w:rPr>
+              <w:t>Luasan ekspansi kawasan industri dan perizinan tambang tidak berhubungan dengan laju deforestasi.</w:t>
+            </w:r>
+          </w:p>
+        </w:tc>
+      </w:tr>
+      <w:tr>
+        <w:tc>
+          <w:tcPr>
+            <w:tcW w:type="dxa" w:w="2551"/>
+            <w:shd w:val="clear" w:color="auto" w:fill="FFFFFF"/>
+            <w:tcMar>
+              <w:top w:w="50" w:type="dxa"/>
+              <w:bottom w:w="50" w:type="dxa"/>
+              <w:left w:w="100" w:type="dxa"/>
+              <w:right w:w="100" w:type="dxa"/>
+            </w:tcMar>
+            <w:tcBorders>
+              <w:top w:val="single" w:sz="4" w:color="D0D0D0" w:space="0"/>
+              <w:left w:val="single" w:sz="4" w:color="D0D0D0" w:space="0"/>
+              <w:bottom w:val="single" w:sz="4" w:color="D0D0D0" w:space="0"/>
+              <w:right w:val="single" w:sz="4" w:color="D0D0D0" w:space="0"/>
+            </w:tcBorders>
+          </w:tcPr>
+          <w:p>
+            <w:pPr>
+              <w:jc w:val="left"/>
+            </w:pPr>
+            <w:r>
+              <w:rPr>
+                <w:b w:val="0"/>
+                <w:i w:val="0"/>
+                <w:color w:val="222222"/>
+                <w:sz w:val="17"/>
+              </w:rPr>
+              <w:t>Hipotesis Alternatif (H1)</w:t>
+            </w:r>
+          </w:p>
+        </w:tc>
+        <w:tc>
+          <w:tcPr>
+            <w:tcW w:type="dxa" w:w="6236"/>
+            <w:shd w:val="clear" w:color="auto" w:fill="FFFFFF"/>
+            <w:tcMar>
+              <w:top w:w="50" w:type="dxa"/>
+              <w:bottom w:w="50" w:type="dxa"/>
+              <w:left w:w="100" w:type="dxa"/>
+              <w:right w:w="100" w:type="dxa"/>
+            </w:tcMar>
+            <w:tcBorders>
+              <w:top w:val="single" w:sz="4" w:color="D0D0D0" w:space="0"/>
+              <w:left w:val="single" w:sz="4" w:color="D0D0D0" w:space="0"/>
+              <w:bottom w:val="single" w:sz="4" w:color="D0D0D0" w:space="0"/>
+              <w:right w:val="single" w:sz="4" w:color="D0D0D0" w:space="0"/>
+            </w:tcBorders>
+          </w:tcPr>
+          <w:p>
+            <w:pPr>
+              <w:jc w:val="left"/>
+            </w:pPr>
+            <w:r>
+              <w:rPr>
+                <w:b w:val="0"/>
+                <w:i w:val="0"/>
+                <w:color w:val="222222"/>
+                <w:sz w:val="17"/>
+              </w:rPr>
+              <w:t>Alokasi izin lahan (Luas IUP &amp; Kawasan) berkorelasi positif dengan laju deforestasi.</w:t>
+            </w:r>
+          </w:p>
+        </w:tc>
+      </w:tr>
+      <w:tr>
+        <w:tc>
+          <w:tcPr>
+            <w:tcW w:type="dxa" w:w="2551"/>
+            <w:shd w:val="clear" w:color="auto" w:fill="F5FBF5"/>
+            <w:tcMar>
+              <w:top w:w="50" w:type="dxa"/>
+              <w:bottom w:w="50" w:type="dxa"/>
+              <w:left w:w="100" w:type="dxa"/>
+              <w:right w:w="100" w:type="dxa"/>
+            </w:tcMar>
+            <w:tcBorders>
+              <w:top w:val="single" w:sz="4" w:color="D0D0D0" w:space="0"/>
+              <w:left w:val="single" w:sz="4" w:color="D0D0D0" w:space="0"/>
+              <w:bottom w:val="single" w:sz="4" w:color="D0D0D0" w:space="0"/>
+              <w:right w:val="single" w:sz="4" w:color="D0D0D0" w:space="0"/>
+            </w:tcBorders>
+          </w:tcPr>
+          <w:p>
+            <w:pPr>
+              <w:jc w:val="left"/>
+            </w:pPr>
+            <w:r>
+              <w:rPr>
+                <w:b w:val="0"/>
+                <w:i w:val="0"/>
+                <w:color w:val="222222"/>
+                <w:sz w:val="17"/>
+              </w:rPr>
+              <w:t>Threshold Kategori</w:t>
+            </w:r>
+          </w:p>
+        </w:tc>
+        <w:tc>
+          <w:tcPr>
+            <w:tcW w:type="dxa" w:w="6236"/>
+            <w:shd w:val="clear" w:color="auto" w:fill="F5FBF5"/>
+            <w:tcMar>
+              <w:top w:w="50" w:type="dxa"/>
+              <w:bottom w:w="50" w:type="dxa"/>
+              <w:left w:w="100" w:type="dxa"/>
+              <w:right w:w="100" w:type="dxa"/>
+            </w:tcMar>
+            <w:tcBorders>
+              <w:top w:val="single" w:sz="4" w:color="D0D0D0" w:space="0"/>
+              <w:left w:val="single" w:sz="4" w:color="D0D0D0" w:space="0"/>
+              <w:bottom w:val="single" w:sz="4" w:color="D0D0D0" w:space="0"/>
+              <w:right w:val="single" w:sz="4" w:color="D0D0D0" w:space="0"/>
+            </w:tcBorders>
+          </w:tcPr>
+          <w:p>
+            <w:pPr>
+              <w:jc w:val="left"/>
+            </w:pPr>
+            <w:r>
+              <w:rPr>
+                <w:b w:val="0"/>
+                <w:i w:val="0"/>
+                <w:color w:val="222222"/>
+                <w:sz w:val="17"/>
+              </w:rPr>
+              <w:t>Nilai Median Data Panel (N=60): X &gt;= 138,148.8 Ha; Y &gt;= 15,917.7 Ha</w:t>
+            </w:r>
+          </w:p>
+        </w:tc>
+      </w:tr>
+    </w:tbl>
+    <w:p>
+      <w:pPr>
+        <w:spacing w:before="40" w:after="80"/>
+      </w:pPr>
+    </w:p>
+    <w:p>
+      <w:pPr>
+        <w:spacing w:before="40" w:after="80"/>
+      </w:pPr>
     </w:p>
     <w:p>
       <w:pPr>

</xml_diff>

<commit_message>
feat: show explicit breakdown of Captive vs Grid capacity in Tabel 2.3
</commit_message>
<xml_diff>
--- a/tools/report_metodologi/bab_2/Metodologi_Bab2_Kualitas_Lingkungan.docx
+++ b/tools/report_metodologi/bab_2/Metodologi_Bab2_Kualitas_Lingkungan.docx
@@ -4414,6 +4414,8 @@
                 <w:sz w:val="17"/>
               </w:rPr>
               <w:t>9,365</w:t>
+              <w:br/>
+              <w:t>(Captive: 9,365 | Grid: 0)</w:t>
             </w:r>
           </w:p>
         </w:tc>
@@ -4544,6 +4546,8 @@
                 <w:sz w:val="17"/>
               </w:rPr>
               <w:t>2,380</w:t>
+              <w:br/>
+              <w:t>(Captive: 2,280 | Grid: 100)</w:t>
             </w:r>
           </w:p>
         </w:tc>
@@ -4674,6 +4678,8 @@
                 <w:sz w:val="17"/>
               </w:rPr>
               <w:t>1,520</w:t>
+              <w:br/>
+              <w:t>(Captive: 600 | Grid: 920)</w:t>
             </w:r>
           </w:p>
         </w:tc>
@@ -4804,6 +4810,8 @@
                 <w:sz w:val="17"/>
               </w:rPr>
               <w:t>220</w:t>
+              <w:br/>
+              <w:t>(Captive: 0 | Grid: 220)</w:t>
             </w:r>
           </w:p>
         </w:tc>
@@ -4934,6 +4942,8 @@
                 <w:sz w:val="17"/>
               </w:rPr>
               <w:t>100</w:t>
+              <w:br/>
+              <w:t>(Captive: 0 | Grid: 100)</w:t>
             </w:r>
           </w:p>
         </w:tc>
@@ -5064,6 +5074,8 @@
                 <w:sz w:val="17"/>
               </w:rPr>
               <w:t>0</w:t>
+              <w:br/>
+              <w:t>(Captive: 0 | Grid: 0)</w:t>
             </w:r>
           </w:p>
         </w:tc>

</xml_diff>

<commit_message>
feat: add Tabel Emisi CO2 per Driver in section 2.3 and renumber subsequent tables
</commit_message>
<xml_diff>
--- a/tools/report_metodologi/bab_2/Metodologi_Bab2_Kualitas_Lingkungan.docx
+++ b/tools/report_metodologi/bab_2/Metodologi_Bab2_Kualitas_Lingkungan.docx
@@ -8011,7 +8011,7 @@
           <w:color w:val="222222"/>
           <w:sz w:val="19"/>
         </w:rPr>
-        <w:t xml:space="preserve">Penerapan pengujian statistik tabulasi silang pada data panel provinsi-tahun periode 2014-2023 (total 60 observasi valid) disajikan secara ringkas pada </w:t>
+        <w:t xml:space="preserve">Selain alokasi konsesi spasial, analisis atribusi pelepasan gas rumah kaca membedah estimasi jejak karbon dari masing-masing faktor pendorong deforestasi pada </w:t>
       </w:r>
       <w:r>
         <w:rPr>
@@ -8043,7 +8043,563 @@
           <w:color w:val="2E7D32"/>
           <w:sz w:val="17"/>
         </w:rPr>
-        <w:t>Tabel 2.6: Ringkasan Eksekutif Skenario Crosstab Ekspansi Industri vs Deforestasi Bab 2</w:t>
+        <w:t>Tabel 2.6: Rincian Empiris Deforestasi dan Emisi CO₂ per Faktor Pendorong (2014-2023)</w:t>
+      </w:r>
+    </w:p>
+    <w:tbl>
+      <w:tblPr>
+        <w:tblStyle w:val="TableGrid"/>
+        <w:tblW w:type="auto" w:w="0"/>
+        <w:jc w:val="center"/>
+        <w:tblLayout w:type="fixed"/>
+        <w:tblLook w:firstColumn="1" w:firstRow="1" w:lastColumn="0" w:lastRow="0" w:noHBand="0" w:noVBand="1" w:val="04A0"/>
+      </w:tblPr>
+      <w:tblGrid>
+        <w:gridCol w:w="3213"/>
+        <w:gridCol w:w="3213"/>
+        <w:gridCol w:w="3213"/>
+      </w:tblGrid>
+      <w:tr>
+        <w:tc>
+          <w:tcPr>
+            <w:tcW w:type="dxa" w:w="2551"/>
+            <w:shd w:val="clear" w:color="auto" w:fill="2E7D32"/>
+            <w:tcMar>
+              <w:top w:w="70" w:type="dxa"/>
+              <w:bottom w:w="70" w:type="dxa"/>
+              <w:left w:w="100" w:type="dxa"/>
+              <w:right w:w="100" w:type="dxa"/>
+            </w:tcMar>
+            <w:tcBorders>
+              <w:top w:val="single" w:sz="4" w:color="D0D0D0" w:space="0"/>
+              <w:left w:val="single" w:sz="4" w:color="D0D0D0" w:space="0"/>
+              <w:bottom w:val="single" w:sz="8" w:color="1B5E20" w:space="0"/>
+              <w:right w:val="single" w:sz="4" w:color="D0D0D0" w:space="0"/>
+            </w:tcBorders>
+          </w:tcPr>
+          <w:p>
+            <w:pPr>
+              <w:jc w:val="left"/>
+            </w:pPr>
+            <w:r>
+              <w:rPr>
+                <w:b/>
+                <w:i w:val="0"/>
+                <w:color w:val="FFFFFF"/>
+                <w:sz w:val="17"/>
+              </w:rPr>
+              <w:t>Faktor Pendorong Utama</w:t>
+            </w:r>
+          </w:p>
+        </w:tc>
+        <w:tc>
+          <w:tcPr>
+            <w:tcW w:type="dxa" w:w="2551"/>
+            <w:shd w:val="clear" w:color="auto" w:fill="2E7D32"/>
+            <w:tcMar>
+              <w:top w:w="70" w:type="dxa"/>
+              <w:bottom w:w="70" w:type="dxa"/>
+              <w:left w:w="100" w:type="dxa"/>
+              <w:right w:w="100" w:type="dxa"/>
+            </w:tcMar>
+            <w:tcBorders>
+              <w:top w:val="single" w:sz="4" w:color="D0D0D0" w:space="0"/>
+              <w:left w:val="single" w:sz="4" w:color="D0D0D0" w:space="0"/>
+              <w:bottom w:val="single" w:sz="8" w:color="1B5E20" w:space="0"/>
+              <w:right w:val="single" w:sz="4" w:color="D0D0D0" w:space="0"/>
+            </w:tcBorders>
+          </w:tcPr>
+          <w:p>
+            <w:pPr>
+              <w:jc w:val="center"/>
+            </w:pPr>
+            <w:r>
+              <w:rPr>
+                <w:b/>
+                <w:i w:val="0"/>
+                <w:color w:val="FFFFFF"/>
+                <w:sz w:val="17"/>
+              </w:rPr>
+              <w:t>Total Deforestasi (Ha)</w:t>
+            </w:r>
+          </w:p>
+        </w:tc>
+        <w:tc>
+          <w:tcPr>
+            <w:tcW w:type="dxa" w:w="2835"/>
+            <w:shd w:val="clear" w:color="auto" w:fill="2E7D32"/>
+            <w:tcMar>
+              <w:top w:w="70" w:type="dxa"/>
+              <w:bottom w:w="70" w:type="dxa"/>
+              <w:left w:w="100" w:type="dxa"/>
+              <w:right w:w="100" w:type="dxa"/>
+            </w:tcMar>
+            <w:tcBorders>
+              <w:top w:val="single" w:sz="4" w:color="D0D0D0" w:space="0"/>
+              <w:left w:val="single" w:sz="4" w:color="D0D0D0" w:space="0"/>
+              <w:bottom w:val="single" w:sz="8" w:color="1B5E20" w:space="0"/>
+              <w:right w:val="single" w:sz="4" w:color="D0D0D0" w:space="0"/>
+            </w:tcBorders>
+          </w:tcPr>
+          <w:p>
+            <w:pPr>
+              <w:jc w:val="center"/>
+            </w:pPr>
+            <w:r>
+              <w:rPr>
+                <w:b/>
+                <w:i w:val="0"/>
+                <w:color w:val="FFFFFF"/>
+                <w:sz w:val="17"/>
+              </w:rPr>
+              <w:t>Estimasi Emisi CO₂ (Juta Ton)</w:t>
+            </w:r>
+          </w:p>
+        </w:tc>
+      </w:tr>
+      <w:tr>
+        <w:tc>
+          <w:tcPr>
+            <w:tcW w:type="dxa" w:w="2551"/>
+            <w:shd w:val="clear" w:color="auto" w:fill="F5FBF5"/>
+            <w:tcMar>
+              <w:top w:w="50" w:type="dxa"/>
+              <w:bottom w:w="50" w:type="dxa"/>
+              <w:left w:w="100" w:type="dxa"/>
+              <w:right w:w="100" w:type="dxa"/>
+            </w:tcMar>
+            <w:tcBorders>
+              <w:top w:val="single" w:sz="4" w:color="D0D0D0" w:space="0"/>
+              <w:left w:val="single" w:sz="4" w:color="D0D0D0" w:space="0"/>
+              <w:bottom w:val="single" w:sz="4" w:color="D0D0D0" w:space="0"/>
+              <w:right w:val="single" w:sz="4" w:color="D0D0D0" w:space="0"/>
+            </w:tcBorders>
+          </w:tcPr>
+          <w:p>
+            <w:pPr>
+              <w:jc w:val="left"/>
+            </w:pPr>
+            <w:r>
+              <w:rPr>
+                <w:b w:val="0"/>
+                <w:i w:val="0"/>
+                <w:color w:val="222222"/>
+                <w:sz w:val="17"/>
+              </w:rPr>
+              <w:t>Pertambangan dan Sawit</w:t>
+            </w:r>
+          </w:p>
+        </w:tc>
+        <w:tc>
+          <w:tcPr>
+            <w:tcW w:type="dxa" w:w="2551"/>
+            <w:shd w:val="clear" w:color="auto" w:fill="F5FBF5"/>
+            <w:tcMar>
+              <w:top w:w="50" w:type="dxa"/>
+              <w:bottom w:w="50" w:type="dxa"/>
+              <w:left w:w="100" w:type="dxa"/>
+              <w:right w:w="100" w:type="dxa"/>
+            </w:tcMar>
+            <w:tcBorders>
+              <w:top w:val="single" w:sz="4" w:color="D0D0D0" w:space="0"/>
+              <w:left w:val="single" w:sz="4" w:color="D0D0D0" w:space="0"/>
+              <w:bottom w:val="single" w:sz="4" w:color="D0D0D0" w:space="0"/>
+              <w:right w:val="single" w:sz="4" w:color="D0D0D0" w:space="0"/>
+            </w:tcBorders>
+          </w:tcPr>
+          <w:p>
+            <w:pPr>
+              <w:jc w:val="center"/>
+            </w:pPr>
+            <w:r>
+              <w:rPr>
+                <w:b w:val="0"/>
+                <w:i w:val="0"/>
+                <w:color w:val="222222"/>
+                <w:sz w:val="17"/>
+              </w:rPr>
+              <w:t>726,565</w:t>
+            </w:r>
+          </w:p>
+        </w:tc>
+        <w:tc>
+          <w:tcPr>
+            <w:tcW w:type="dxa" w:w="2835"/>
+            <w:shd w:val="clear" w:color="auto" w:fill="F5FBF5"/>
+            <w:tcMar>
+              <w:top w:w="50" w:type="dxa"/>
+              <w:bottom w:w="50" w:type="dxa"/>
+              <w:left w:w="100" w:type="dxa"/>
+              <w:right w:w="100" w:type="dxa"/>
+            </w:tcMar>
+            <w:tcBorders>
+              <w:top w:val="single" w:sz="4" w:color="D0D0D0" w:space="0"/>
+              <w:left w:val="single" w:sz="4" w:color="D0D0D0" w:space="0"/>
+              <w:bottom w:val="single" w:sz="4" w:color="D0D0D0" w:space="0"/>
+              <w:right w:val="single" w:sz="4" w:color="D0D0D0" w:space="0"/>
+            </w:tcBorders>
+          </w:tcPr>
+          <w:p>
+            <w:pPr>
+              <w:jc w:val="center"/>
+            </w:pPr>
+            <w:r>
+              <w:rPr>
+                <w:b w:val="0"/>
+                <w:i w:val="0"/>
+                <w:color w:val="222222"/>
+                <w:sz w:val="17"/>
+              </w:rPr>
+              <w:t>482.7</w:t>
+            </w:r>
+          </w:p>
+        </w:tc>
+      </w:tr>
+      <w:tr>
+        <w:tc>
+          <w:tcPr>
+            <w:tcW w:type="dxa" w:w="2551"/>
+            <w:shd w:val="clear" w:color="auto" w:fill="FFFFFF"/>
+            <w:tcMar>
+              <w:top w:w="50" w:type="dxa"/>
+              <w:bottom w:w="50" w:type="dxa"/>
+              <w:left w:w="100" w:type="dxa"/>
+              <w:right w:w="100" w:type="dxa"/>
+            </w:tcMar>
+            <w:tcBorders>
+              <w:top w:val="single" w:sz="4" w:color="D0D0D0" w:space="0"/>
+              <w:left w:val="single" w:sz="4" w:color="D0D0D0" w:space="0"/>
+              <w:bottom w:val="single" w:sz="4" w:color="D0D0D0" w:space="0"/>
+              <w:right w:val="single" w:sz="4" w:color="D0D0D0" w:space="0"/>
+            </w:tcBorders>
+          </w:tcPr>
+          <w:p>
+            <w:pPr>
+              <w:jc w:val="left"/>
+            </w:pPr>
+            <w:r>
+              <w:rPr>
+                <w:b w:val="0"/>
+                <w:i w:val="0"/>
+                <w:color w:val="222222"/>
+                <w:sz w:val="17"/>
+              </w:rPr>
+              <w:t>Kehutanan Komersial</w:t>
+            </w:r>
+          </w:p>
+        </w:tc>
+        <w:tc>
+          <w:tcPr>
+            <w:tcW w:type="dxa" w:w="2551"/>
+            <w:shd w:val="clear" w:color="auto" w:fill="FFFFFF"/>
+            <w:tcMar>
+              <w:top w:w="50" w:type="dxa"/>
+              <w:bottom w:w="50" w:type="dxa"/>
+              <w:left w:w="100" w:type="dxa"/>
+              <w:right w:w="100" w:type="dxa"/>
+            </w:tcMar>
+            <w:tcBorders>
+              <w:top w:val="single" w:sz="4" w:color="D0D0D0" w:space="0"/>
+              <w:left w:val="single" w:sz="4" w:color="D0D0D0" w:space="0"/>
+              <w:bottom w:val="single" w:sz="4" w:color="D0D0D0" w:space="0"/>
+              <w:right w:val="single" w:sz="4" w:color="D0D0D0" w:space="0"/>
+            </w:tcBorders>
+          </w:tcPr>
+          <w:p>
+            <w:pPr>
+              <w:jc w:val="center"/>
+            </w:pPr>
+            <w:r>
+              <w:rPr>
+                <w:b w:val="0"/>
+                <w:i w:val="0"/>
+                <w:color w:val="222222"/>
+                <w:sz w:val="17"/>
+              </w:rPr>
+              <w:t>97,936</w:t>
+            </w:r>
+          </w:p>
+        </w:tc>
+        <w:tc>
+          <w:tcPr>
+            <w:tcW w:type="dxa" w:w="2835"/>
+            <w:shd w:val="clear" w:color="auto" w:fill="FFFFFF"/>
+            <w:tcMar>
+              <w:top w:w="50" w:type="dxa"/>
+              <w:bottom w:w="50" w:type="dxa"/>
+              <w:left w:w="100" w:type="dxa"/>
+              <w:right w:w="100" w:type="dxa"/>
+            </w:tcMar>
+            <w:tcBorders>
+              <w:top w:val="single" w:sz="4" w:color="D0D0D0" w:space="0"/>
+              <w:left w:val="single" w:sz="4" w:color="D0D0D0" w:space="0"/>
+              <w:bottom w:val="single" w:sz="4" w:color="D0D0D0" w:space="0"/>
+              <w:right w:val="single" w:sz="4" w:color="D0D0D0" w:space="0"/>
+            </w:tcBorders>
+          </w:tcPr>
+          <w:p>
+            <w:pPr>
+              <w:jc w:val="center"/>
+            </w:pPr>
+            <w:r>
+              <w:rPr>
+                <w:b w:val="0"/>
+                <w:i w:val="0"/>
+                <w:color w:val="222222"/>
+                <w:sz w:val="17"/>
+              </w:rPr>
+              <w:t>64.1</w:t>
+            </w:r>
+          </w:p>
+        </w:tc>
+      </w:tr>
+      <w:tr>
+        <w:tc>
+          <w:tcPr>
+            <w:tcW w:type="dxa" w:w="2551"/>
+            <w:shd w:val="clear" w:color="auto" w:fill="F5FBF5"/>
+            <w:tcMar>
+              <w:top w:w="50" w:type="dxa"/>
+              <w:bottom w:w="50" w:type="dxa"/>
+              <w:left w:w="100" w:type="dxa"/>
+              <w:right w:w="100" w:type="dxa"/>
+            </w:tcMar>
+            <w:tcBorders>
+              <w:top w:val="single" w:sz="4" w:color="D0D0D0" w:space="0"/>
+              <w:left w:val="single" w:sz="4" w:color="D0D0D0" w:space="0"/>
+              <w:bottom w:val="single" w:sz="4" w:color="D0D0D0" w:space="0"/>
+              <w:right w:val="single" w:sz="4" w:color="D0D0D0" w:space="0"/>
+            </w:tcBorders>
+          </w:tcPr>
+          <w:p>
+            <w:pPr>
+              <w:jc w:val="left"/>
+            </w:pPr>
+            <w:r>
+              <w:rPr>
+                <w:b w:val="0"/>
+                <w:i w:val="0"/>
+                <w:color w:val="222222"/>
+                <w:sz w:val="17"/>
+              </w:rPr>
+              <w:t>Pertanian Berpindah</w:t>
+            </w:r>
+          </w:p>
+        </w:tc>
+        <w:tc>
+          <w:tcPr>
+            <w:tcW w:type="dxa" w:w="2551"/>
+            <w:shd w:val="clear" w:color="auto" w:fill="F5FBF5"/>
+            <w:tcMar>
+              <w:top w:w="50" w:type="dxa"/>
+              <w:bottom w:w="50" w:type="dxa"/>
+              <w:left w:w="100" w:type="dxa"/>
+              <w:right w:w="100" w:type="dxa"/>
+            </w:tcMar>
+            <w:tcBorders>
+              <w:top w:val="single" w:sz="4" w:color="D0D0D0" w:space="0"/>
+              <w:left w:val="single" w:sz="4" w:color="D0D0D0" w:space="0"/>
+              <w:bottom w:val="single" w:sz="4" w:color="D0D0D0" w:space="0"/>
+              <w:right w:val="single" w:sz="4" w:color="D0D0D0" w:space="0"/>
+            </w:tcBorders>
+          </w:tcPr>
+          <w:p>
+            <w:pPr>
+              <w:jc w:val="center"/>
+            </w:pPr>
+            <w:r>
+              <w:rPr>
+                <w:b w:val="0"/>
+                <w:i w:val="0"/>
+                <w:color w:val="222222"/>
+                <w:sz w:val="17"/>
+              </w:rPr>
+              <w:t>43,002</w:t>
+            </w:r>
+          </w:p>
+        </w:tc>
+        <w:tc>
+          <w:tcPr>
+            <w:tcW w:type="dxa" w:w="2835"/>
+            <w:shd w:val="clear" w:color="auto" w:fill="F5FBF5"/>
+            <w:tcMar>
+              <w:top w:w="50" w:type="dxa"/>
+              <w:bottom w:w="50" w:type="dxa"/>
+              <w:left w:w="100" w:type="dxa"/>
+              <w:right w:w="100" w:type="dxa"/>
+            </w:tcMar>
+            <w:tcBorders>
+              <w:top w:val="single" w:sz="4" w:color="D0D0D0" w:space="0"/>
+              <w:left w:val="single" w:sz="4" w:color="D0D0D0" w:space="0"/>
+              <w:bottom w:val="single" w:sz="4" w:color="D0D0D0" w:space="0"/>
+              <w:right w:val="single" w:sz="4" w:color="D0D0D0" w:space="0"/>
+            </w:tcBorders>
+          </w:tcPr>
+          <w:p>
+            <w:pPr>
+              <w:jc w:val="center"/>
+            </w:pPr>
+            <w:r>
+              <w:rPr>
+                <w:b w:val="0"/>
+                <w:i w:val="0"/>
+                <w:color w:val="222222"/>
+                <w:sz w:val="17"/>
+              </w:rPr>
+              <w:t>29.1</w:t>
+            </w:r>
+          </w:p>
+        </w:tc>
+      </w:tr>
+      <w:tr>
+        <w:tc>
+          <w:tcPr>
+            <w:tcW w:type="dxa" w:w="2551"/>
+            <w:shd w:val="clear" w:color="auto" w:fill="FFFFFF"/>
+            <w:tcMar>
+              <w:top w:w="50" w:type="dxa"/>
+              <w:bottom w:w="50" w:type="dxa"/>
+              <w:left w:w="100" w:type="dxa"/>
+              <w:right w:w="100" w:type="dxa"/>
+            </w:tcMar>
+            <w:tcBorders>
+              <w:top w:val="single" w:sz="4" w:color="D0D0D0" w:space="0"/>
+              <w:left w:val="single" w:sz="4" w:color="D0D0D0" w:space="0"/>
+              <w:bottom w:val="single" w:sz="4" w:color="D0D0D0" w:space="0"/>
+              <w:right w:val="single" w:sz="4" w:color="D0D0D0" w:space="0"/>
+            </w:tcBorders>
+          </w:tcPr>
+          <w:p>
+            <w:pPr>
+              <w:jc w:val="left"/>
+            </w:pPr>
+            <w:r>
+              <w:rPr>
+                <w:b w:val="0"/>
+                <w:i w:val="0"/>
+                <w:color w:val="222222"/>
+                <w:sz w:val="17"/>
+              </w:rPr>
+              <w:t>Tidak Teridentifikasi</w:t>
+            </w:r>
+          </w:p>
+        </w:tc>
+        <w:tc>
+          <w:tcPr>
+            <w:tcW w:type="dxa" w:w="2551"/>
+            <w:shd w:val="clear" w:color="auto" w:fill="FFFFFF"/>
+            <w:tcMar>
+              <w:top w:w="50" w:type="dxa"/>
+              <w:bottom w:w="50" w:type="dxa"/>
+              <w:left w:w="100" w:type="dxa"/>
+              <w:right w:w="100" w:type="dxa"/>
+            </w:tcMar>
+            <w:tcBorders>
+              <w:top w:val="single" w:sz="4" w:color="D0D0D0" w:space="0"/>
+              <w:left w:val="single" w:sz="4" w:color="D0D0D0" w:space="0"/>
+              <w:bottom w:val="single" w:sz="4" w:color="D0D0D0" w:space="0"/>
+              <w:right w:val="single" w:sz="4" w:color="D0D0D0" w:space="0"/>
+            </w:tcBorders>
+          </w:tcPr>
+          <w:p>
+            <w:pPr>
+              <w:jc w:val="center"/>
+            </w:pPr>
+            <w:r>
+              <w:rPr>
+                <w:b w:val="0"/>
+                <w:i w:val="0"/>
+                <w:color w:val="222222"/>
+                <w:sz w:val="17"/>
+              </w:rPr>
+              <w:t>18,199</w:t>
+            </w:r>
+          </w:p>
+        </w:tc>
+        <w:tc>
+          <w:tcPr>
+            <w:tcW w:type="dxa" w:w="2835"/>
+            <w:shd w:val="clear" w:color="auto" w:fill="FFFFFF"/>
+            <w:tcMar>
+              <w:top w:w="50" w:type="dxa"/>
+              <w:bottom w:w="50" w:type="dxa"/>
+              <w:left w:w="100" w:type="dxa"/>
+              <w:right w:w="100" w:type="dxa"/>
+            </w:tcMar>
+            <w:tcBorders>
+              <w:top w:val="single" w:sz="4" w:color="D0D0D0" w:space="0"/>
+              <w:left w:val="single" w:sz="4" w:color="D0D0D0" w:space="0"/>
+              <w:bottom w:val="single" w:sz="4" w:color="D0D0D0" w:space="0"/>
+              <w:right w:val="single" w:sz="4" w:color="D0D0D0" w:space="0"/>
+            </w:tcBorders>
+          </w:tcPr>
+          <w:p>
+            <w:pPr>
+              <w:jc w:val="center"/>
+            </w:pPr>
+            <w:r>
+              <w:rPr>
+                <w:b w:val="0"/>
+                <w:i w:val="0"/>
+                <w:color w:val="222222"/>
+                <w:sz w:val="17"/>
+              </w:rPr>
+              <w:t>10.3</w:t>
+            </w:r>
+          </w:p>
+        </w:tc>
+      </w:tr>
+    </w:tbl>
+    <w:p>
+      <w:pPr>
+        <w:spacing w:before="40" w:after="80"/>
+      </w:pPr>
+    </w:p>
+    <w:p>
+      <w:pPr>
+        <w:spacing w:after="100"/>
+        <w:jc w:val="both"/>
+      </w:pPr>
+      <w:r>
+        <w:rPr>
+          <w:b w:val="0"/>
+          <w:i w:val="0"/>
+          <w:color w:val="222222"/>
+          <w:sz w:val="19"/>
+        </w:rPr>
+        <w:t xml:space="preserve">Penerapan pengujian statistik tabulasi silang pada data panel provinsi-tahun periode 2014-2023 (total 60 observasi valid) disajikan secara ringkas pada </w:t>
+      </w:r>
+      <w:r>
+        <w:rPr>
+          <w:b/>
+          <w:i w:val="0"/>
+          <w:color w:val="222222"/>
+          <w:sz w:val="19"/>
+        </w:rPr>
+        <w:t>Tabel 2.7</w:t>
+      </w:r>
+      <w:r>
+        <w:rPr>
+          <w:b w:val="0"/>
+          <w:i w:val="0"/>
+          <w:color w:val="222222"/>
+          <w:sz w:val="19"/>
+        </w:rPr>
+        <w:t xml:space="preserve"> berikut:</w:t>
+      </w:r>
+    </w:p>
+    <w:p>
+      <w:pPr>
+        <w:spacing w:before="120" w:after="40"/>
+      </w:pPr>
+      <w:r>
+        <w:rPr>
+          <w:b/>
+          <w:i/>
+          <w:color w:val="2E7D32"/>
+          <w:sz w:val="17"/>
+        </w:rPr>
+        <w:t>Tabel 2.7: Ringkasan Eksekutif Skenario Crosstab Ekspansi Industri vs Deforestasi Bab 2</w:t>
       </w:r>
     </w:p>
     <w:tbl>

</xml_diff>

<commit_message>
refactor: move Emisi CO2 per Driver table from 2.3 to 2.2 D Matrix Hasil Uji Empiris
</commit_message>
<xml_diff>
--- a/tools/report_metodologi/bab_2/Metodologi_Bab2_Kualitas_Lingkungan.docx
+++ b/tools/report_metodologi/bab_2/Metodologi_Bab2_Kualitas_Lingkungan.docx
@@ -5162,7 +5162,7 @@
           <w:color w:val="222222"/>
           <w:sz w:val="19"/>
         </w:rPr>
-        <w:t xml:space="preserve">Penerapan pengujian statistik tabulasi silang pada data panel (total 54 observasi valid) disajikan secara ringkas pada </w:t>
+        <w:t xml:space="preserve">Selain analisis polusi udara, atribusi pelepasan gas rumah kaca membedah estimasi jejak karbon dari masing-masing faktor pendorong deforestasi pada </w:t>
       </w:r>
       <w:r>
         <w:rPr>
@@ -5194,7 +5194,563 @@
           <w:color w:val="2E7D32"/>
           <w:sz w:val="17"/>
         </w:rPr>
-        <w:t>Tabel 2.4: Ringkasan Eksekutif Skenario Crosstab Kapasitas PLTU vs IKU Bab 2</w:t>
+        <w:t>Tabel 2.4: Rincian Empiris Deforestasi dan Emisi CO₂ per Faktor Pendorong (2014-2023)</w:t>
+      </w:r>
+    </w:p>
+    <w:tbl>
+      <w:tblPr>
+        <w:tblStyle w:val="TableGrid"/>
+        <w:tblW w:type="auto" w:w="0"/>
+        <w:jc w:val="center"/>
+        <w:tblLayout w:type="fixed"/>
+        <w:tblLook w:firstColumn="1" w:firstRow="1" w:lastColumn="0" w:lastRow="0" w:noHBand="0" w:noVBand="1" w:val="04A0"/>
+      </w:tblPr>
+      <w:tblGrid>
+        <w:gridCol w:w="3213"/>
+        <w:gridCol w:w="3213"/>
+        <w:gridCol w:w="3213"/>
+      </w:tblGrid>
+      <w:tr>
+        <w:tc>
+          <w:tcPr>
+            <w:tcW w:type="dxa" w:w="2551"/>
+            <w:shd w:val="clear" w:color="auto" w:fill="2E7D32"/>
+            <w:tcMar>
+              <w:top w:w="70" w:type="dxa"/>
+              <w:bottom w:w="70" w:type="dxa"/>
+              <w:left w:w="100" w:type="dxa"/>
+              <w:right w:w="100" w:type="dxa"/>
+            </w:tcMar>
+            <w:tcBorders>
+              <w:top w:val="single" w:sz="4" w:color="D0D0D0" w:space="0"/>
+              <w:left w:val="single" w:sz="4" w:color="D0D0D0" w:space="0"/>
+              <w:bottom w:val="single" w:sz="8" w:color="1B5E20" w:space="0"/>
+              <w:right w:val="single" w:sz="4" w:color="D0D0D0" w:space="0"/>
+            </w:tcBorders>
+          </w:tcPr>
+          <w:p>
+            <w:pPr>
+              <w:jc w:val="left"/>
+            </w:pPr>
+            <w:r>
+              <w:rPr>
+                <w:b/>
+                <w:i w:val="0"/>
+                <w:color w:val="FFFFFF"/>
+                <w:sz w:val="17"/>
+              </w:rPr>
+              <w:t>Faktor Pendorong Utama</w:t>
+            </w:r>
+          </w:p>
+        </w:tc>
+        <w:tc>
+          <w:tcPr>
+            <w:tcW w:type="dxa" w:w="2551"/>
+            <w:shd w:val="clear" w:color="auto" w:fill="2E7D32"/>
+            <w:tcMar>
+              <w:top w:w="70" w:type="dxa"/>
+              <w:bottom w:w="70" w:type="dxa"/>
+              <w:left w:w="100" w:type="dxa"/>
+              <w:right w:w="100" w:type="dxa"/>
+            </w:tcMar>
+            <w:tcBorders>
+              <w:top w:val="single" w:sz="4" w:color="D0D0D0" w:space="0"/>
+              <w:left w:val="single" w:sz="4" w:color="D0D0D0" w:space="0"/>
+              <w:bottom w:val="single" w:sz="8" w:color="1B5E20" w:space="0"/>
+              <w:right w:val="single" w:sz="4" w:color="D0D0D0" w:space="0"/>
+            </w:tcBorders>
+          </w:tcPr>
+          <w:p>
+            <w:pPr>
+              <w:jc w:val="center"/>
+            </w:pPr>
+            <w:r>
+              <w:rPr>
+                <w:b/>
+                <w:i w:val="0"/>
+                <w:color w:val="FFFFFF"/>
+                <w:sz w:val="17"/>
+              </w:rPr>
+              <w:t>Total Deforestasi (Ha)</w:t>
+            </w:r>
+          </w:p>
+        </w:tc>
+        <w:tc>
+          <w:tcPr>
+            <w:tcW w:type="dxa" w:w="2835"/>
+            <w:shd w:val="clear" w:color="auto" w:fill="2E7D32"/>
+            <w:tcMar>
+              <w:top w:w="70" w:type="dxa"/>
+              <w:bottom w:w="70" w:type="dxa"/>
+              <w:left w:w="100" w:type="dxa"/>
+              <w:right w:w="100" w:type="dxa"/>
+            </w:tcMar>
+            <w:tcBorders>
+              <w:top w:val="single" w:sz="4" w:color="D0D0D0" w:space="0"/>
+              <w:left w:val="single" w:sz="4" w:color="D0D0D0" w:space="0"/>
+              <w:bottom w:val="single" w:sz="8" w:color="1B5E20" w:space="0"/>
+              <w:right w:val="single" w:sz="4" w:color="D0D0D0" w:space="0"/>
+            </w:tcBorders>
+          </w:tcPr>
+          <w:p>
+            <w:pPr>
+              <w:jc w:val="center"/>
+            </w:pPr>
+            <w:r>
+              <w:rPr>
+                <w:b/>
+                <w:i w:val="0"/>
+                <w:color w:val="FFFFFF"/>
+                <w:sz w:val="17"/>
+              </w:rPr>
+              <w:t>Estimasi Emisi CO₂ (Juta Ton)</w:t>
+            </w:r>
+          </w:p>
+        </w:tc>
+      </w:tr>
+      <w:tr>
+        <w:tc>
+          <w:tcPr>
+            <w:tcW w:type="dxa" w:w="2551"/>
+            <w:shd w:val="clear" w:color="auto" w:fill="F5FBF5"/>
+            <w:tcMar>
+              <w:top w:w="50" w:type="dxa"/>
+              <w:bottom w:w="50" w:type="dxa"/>
+              <w:left w:w="100" w:type="dxa"/>
+              <w:right w:w="100" w:type="dxa"/>
+            </w:tcMar>
+            <w:tcBorders>
+              <w:top w:val="single" w:sz="4" w:color="D0D0D0" w:space="0"/>
+              <w:left w:val="single" w:sz="4" w:color="D0D0D0" w:space="0"/>
+              <w:bottom w:val="single" w:sz="4" w:color="D0D0D0" w:space="0"/>
+              <w:right w:val="single" w:sz="4" w:color="D0D0D0" w:space="0"/>
+            </w:tcBorders>
+          </w:tcPr>
+          <w:p>
+            <w:pPr>
+              <w:jc w:val="left"/>
+            </w:pPr>
+            <w:r>
+              <w:rPr>
+                <w:b w:val="0"/>
+                <w:i w:val="0"/>
+                <w:color w:val="222222"/>
+                <w:sz w:val="17"/>
+              </w:rPr>
+              <w:t>Pertambangan dan Sawit</w:t>
+            </w:r>
+          </w:p>
+        </w:tc>
+        <w:tc>
+          <w:tcPr>
+            <w:tcW w:type="dxa" w:w="2551"/>
+            <w:shd w:val="clear" w:color="auto" w:fill="F5FBF5"/>
+            <w:tcMar>
+              <w:top w:w="50" w:type="dxa"/>
+              <w:bottom w:w="50" w:type="dxa"/>
+              <w:left w:w="100" w:type="dxa"/>
+              <w:right w:w="100" w:type="dxa"/>
+            </w:tcMar>
+            <w:tcBorders>
+              <w:top w:val="single" w:sz="4" w:color="D0D0D0" w:space="0"/>
+              <w:left w:val="single" w:sz="4" w:color="D0D0D0" w:space="0"/>
+              <w:bottom w:val="single" w:sz="4" w:color="D0D0D0" w:space="0"/>
+              <w:right w:val="single" w:sz="4" w:color="D0D0D0" w:space="0"/>
+            </w:tcBorders>
+          </w:tcPr>
+          <w:p>
+            <w:pPr>
+              <w:jc w:val="center"/>
+            </w:pPr>
+            <w:r>
+              <w:rPr>
+                <w:b w:val="0"/>
+                <w:i w:val="0"/>
+                <w:color w:val="222222"/>
+                <w:sz w:val="17"/>
+              </w:rPr>
+              <w:t>726,565</w:t>
+            </w:r>
+          </w:p>
+        </w:tc>
+        <w:tc>
+          <w:tcPr>
+            <w:tcW w:type="dxa" w:w="2835"/>
+            <w:shd w:val="clear" w:color="auto" w:fill="F5FBF5"/>
+            <w:tcMar>
+              <w:top w:w="50" w:type="dxa"/>
+              <w:bottom w:w="50" w:type="dxa"/>
+              <w:left w:w="100" w:type="dxa"/>
+              <w:right w:w="100" w:type="dxa"/>
+            </w:tcMar>
+            <w:tcBorders>
+              <w:top w:val="single" w:sz="4" w:color="D0D0D0" w:space="0"/>
+              <w:left w:val="single" w:sz="4" w:color="D0D0D0" w:space="0"/>
+              <w:bottom w:val="single" w:sz="4" w:color="D0D0D0" w:space="0"/>
+              <w:right w:val="single" w:sz="4" w:color="D0D0D0" w:space="0"/>
+            </w:tcBorders>
+          </w:tcPr>
+          <w:p>
+            <w:pPr>
+              <w:jc w:val="center"/>
+            </w:pPr>
+            <w:r>
+              <w:rPr>
+                <w:b w:val="0"/>
+                <w:i w:val="0"/>
+                <w:color w:val="222222"/>
+                <w:sz w:val="17"/>
+              </w:rPr>
+              <w:t>482.7</w:t>
+            </w:r>
+          </w:p>
+        </w:tc>
+      </w:tr>
+      <w:tr>
+        <w:tc>
+          <w:tcPr>
+            <w:tcW w:type="dxa" w:w="2551"/>
+            <w:shd w:val="clear" w:color="auto" w:fill="FFFFFF"/>
+            <w:tcMar>
+              <w:top w:w="50" w:type="dxa"/>
+              <w:bottom w:w="50" w:type="dxa"/>
+              <w:left w:w="100" w:type="dxa"/>
+              <w:right w:w="100" w:type="dxa"/>
+            </w:tcMar>
+            <w:tcBorders>
+              <w:top w:val="single" w:sz="4" w:color="D0D0D0" w:space="0"/>
+              <w:left w:val="single" w:sz="4" w:color="D0D0D0" w:space="0"/>
+              <w:bottom w:val="single" w:sz="4" w:color="D0D0D0" w:space="0"/>
+              <w:right w:val="single" w:sz="4" w:color="D0D0D0" w:space="0"/>
+            </w:tcBorders>
+          </w:tcPr>
+          <w:p>
+            <w:pPr>
+              <w:jc w:val="left"/>
+            </w:pPr>
+            <w:r>
+              <w:rPr>
+                <w:b w:val="0"/>
+                <w:i w:val="0"/>
+                <w:color w:val="222222"/>
+                <w:sz w:val="17"/>
+              </w:rPr>
+              <w:t>Kehutanan Komersial</w:t>
+            </w:r>
+          </w:p>
+        </w:tc>
+        <w:tc>
+          <w:tcPr>
+            <w:tcW w:type="dxa" w:w="2551"/>
+            <w:shd w:val="clear" w:color="auto" w:fill="FFFFFF"/>
+            <w:tcMar>
+              <w:top w:w="50" w:type="dxa"/>
+              <w:bottom w:w="50" w:type="dxa"/>
+              <w:left w:w="100" w:type="dxa"/>
+              <w:right w:w="100" w:type="dxa"/>
+            </w:tcMar>
+            <w:tcBorders>
+              <w:top w:val="single" w:sz="4" w:color="D0D0D0" w:space="0"/>
+              <w:left w:val="single" w:sz="4" w:color="D0D0D0" w:space="0"/>
+              <w:bottom w:val="single" w:sz="4" w:color="D0D0D0" w:space="0"/>
+              <w:right w:val="single" w:sz="4" w:color="D0D0D0" w:space="0"/>
+            </w:tcBorders>
+          </w:tcPr>
+          <w:p>
+            <w:pPr>
+              <w:jc w:val="center"/>
+            </w:pPr>
+            <w:r>
+              <w:rPr>
+                <w:b w:val="0"/>
+                <w:i w:val="0"/>
+                <w:color w:val="222222"/>
+                <w:sz w:val="17"/>
+              </w:rPr>
+              <w:t>97,936</w:t>
+            </w:r>
+          </w:p>
+        </w:tc>
+        <w:tc>
+          <w:tcPr>
+            <w:tcW w:type="dxa" w:w="2835"/>
+            <w:shd w:val="clear" w:color="auto" w:fill="FFFFFF"/>
+            <w:tcMar>
+              <w:top w:w="50" w:type="dxa"/>
+              <w:bottom w:w="50" w:type="dxa"/>
+              <w:left w:w="100" w:type="dxa"/>
+              <w:right w:w="100" w:type="dxa"/>
+            </w:tcMar>
+            <w:tcBorders>
+              <w:top w:val="single" w:sz="4" w:color="D0D0D0" w:space="0"/>
+              <w:left w:val="single" w:sz="4" w:color="D0D0D0" w:space="0"/>
+              <w:bottom w:val="single" w:sz="4" w:color="D0D0D0" w:space="0"/>
+              <w:right w:val="single" w:sz="4" w:color="D0D0D0" w:space="0"/>
+            </w:tcBorders>
+          </w:tcPr>
+          <w:p>
+            <w:pPr>
+              <w:jc w:val="center"/>
+            </w:pPr>
+            <w:r>
+              <w:rPr>
+                <w:b w:val="0"/>
+                <w:i w:val="0"/>
+                <w:color w:val="222222"/>
+                <w:sz w:val="17"/>
+              </w:rPr>
+              <w:t>64.1</w:t>
+            </w:r>
+          </w:p>
+        </w:tc>
+      </w:tr>
+      <w:tr>
+        <w:tc>
+          <w:tcPr>
+            <w:tcW w:type="dxa" w:w="2551"/>
+            <w:shd w:val="clear" w:color="auto" w:fill="F5FBF5"/>
+            <w:tcMar>
+              <w:top w:w="50" w:type="dxa"/>
+              <w:bottom w:w="50" w:type="dxa"/>
+              <w:left w:w="100" w:type="dxa"/>
+              <w:right w:w="100" w:type="dxa"/>
+            </w:tcMar>
+            <w:tcBorders>
+              <w:top w:val="single" w:sz="4" w:color="D0D0D0" w:space="0"/>
+              <w:left w:val="single" w:sz="4" w:color="D0D0D0" w:space="0"/>
+              <w:bottom w:val="single" w:sz="4" w:color="D0D0D0" w:space="0"/>
+              <w:right w:val="single" w:sz="4" w:color="D0D0D0" w:space="0"/>
+            </w:tcBorders>
+          </w:tcPr>
+          <w:p>
+            <w:pPr>
+              <w:jc w:val="left"/>
+            </w:pPr>
+            <w:r>
+              <w:rPr>
+                <w:b w:val="0"/>
+                <w:i w:val="0"/>
+                <w:color w:val="222222"/>
+                <w:sz w:val="17"/>
+              </w:rPr>
+              <w:t>Pertanian Berpindah</w:t>
+            </w:r>
+          </w:p>
+        </w:tc>
+        <w:tc>
+          <w:tcPr>
+            <w:tcW w:type="dxa" w:w="2551"/>
+            <w:shd w:val="clear" w:color="auto" w:fill="F5FBF5"/>
+            <w:tcMar>
+              <w:top w:w="50" w:type="dxa"/>
+              <w:bottom w:w="50" w:type="dxa"/>
+              <w:left w:w="100" w:type="dxa"/>
+              <w:right w:w="100" w:type="dxa"/>
+            </w:tcMar>
+            <w:tcBorders>
+              <w:top w:val="single" w:sz="4" w:color="D0D0D0" w:space="0"/>
+              <w:left w:val="single" w:sz="4" w:color="D0D0D0" w:space="0"/>
+              <w:bottom w:val="single" w:sz="4" w:color="D0D0D0" w:space="0"/>
+              <w:right w:val="single" w:sz="4" w:color="D0D0D0" w:space="0"/>
+            </w:tcBorders>
+          </w:tcPr>
+          <w:p>
+            <w:pPr>
+              <w:jc w:val="center"/>
+            </w:pPr>
+            <w:r>
+              <w:rPr>
+                <w:b w:val="0"/>
+                <w:i w:val="0"/>
+                <w:color w:val="222222"/>
+                <w:sz w:val="17"/>
+              </w:rPr>
+              <w:t>43,002</w:t>
+            </w:r>
+          </w:p>
+        </w:tc>
+        <w:tc>
+          <w:tcPr>
+            <w:tcW w:type="dxa" w:w="2835"/>
+            <w:shd w:val="clear" w:color="auto" w:fill="F5FBF5"/>
+            <w:tcMar>
+              <w:top w:w="50" w:type="dxa"/>
+              <w:bottom w:w="50" w:type="dxa"/>
+              <w:left w:w="100" w:type="dxa"/>
+              <w:right w:w="100" w:type="dxa"/>
+            </w:tcMar>
+            <w:tcBorders>
+              <w:top w:val="single" w:sz="4" w:color="D0D0D0" w:space="0"/>
+              <w:left w:val="single" w:sz="4" w:color="D0D0D0" w:space="0"/>
+              <w:bottom w:val="single" w:sz="4" w:color="D0D0D0" w:space="0"/>
+              <w:right w:val="single" w:sz="4" w:color="D0D0D0" w:space="0"/>
+            </w:tcBorders>
+          </w:tcPr>
+          <w:p>
+            <w:pPr>
+              <w:jc w:val="center"/>
+            </w:pPr>
+            <w:r>
+              <w:rPr>
+                <w:b w:val="0"/>
+                <w:i w:val="0"/>
+                <w:color w:val="222222"/>
+                <w:sz w:val="17"/>
+              </w:rPr>
+              <w:t>29.1</w:t>
+            </w:r>
+          </w:p>
+        </w:tc>
+      </w:tr>
+      <w:tr>
+        <w:tc>
+          <w:tcPr>
+            <w:tcW w:type="dxa" w:w="2551"/>
+            <w:shd w:val="clear" w:color="auto" w:fill="FFFFFF"/>
+            <w:tcMar>
+              <w:top w:w="50" w:type="dxa"/>
+              <w:bottom w:w="50" w:type="dxa"/>
+              <w:left w:w="100" w:type="dxa"/>
+              <w:right w:w="100" w:type="dxa"/>
+            </w:tcMar>
+            <w:tcBorders>
+              <w:top w:val="single" w:sz="4" w:color="D0D0D0" w:space="0"/>
+              <w:left w:val="single" w:sz="4" w:color="D0D0D0" w:space="0"/>
+              <w:bottom w:val="single" w:sz="4" w:color="D0D0D0" w:space="0"/>
+              <w:right w:val="single" w:sz="4" w:color="D0D0D0" w:space="0"/>
+            </w:tcBorders>
+          </w:tcPr>
+          <w:p>
+            <w:pPr>
+              <w:jc w:val="left"/>
+            </w:pPr>
+            <w:r>
+              <w:rPr>
+                <w:b w:val="0"/>
+                <w:i w:val="0"/>
+                <w:color w:val="222222"/>
+                <w:sz w:val="17"/>
+              </w:rPr>
+              <w:t>Tidak Teridentifikasi</w:t>
+            </w:r>
+          </w:p>
+        </w:tc>
+        <w:tc>
+          <w:tcPr>
+            <w:tcW w:type="dxa" w:w="2551"/>
+            <w:shd w:val="clear" w:color="auto" w:fill="FFFFFF"/>
+            <w:tcMar>
+              <w:top w:w="50" w:type="dxa"/>
+              <w:bottom w:w="50" w:type="dxa"/>
+              <w:left w:w="100" w:type="dxa"/>
+              <w:right w:w="100" w:type="dxa"/>
+            </w:tcMar>
+            <w:tcBorders>
+              <w:top w:val="single" w:sz="4" w:color="D0D0D0" w:space="0"/>
+              <w:left w:val="single" w:sz="4" w:color="D0D0D0" w:space="0"/>
+              <w:bottom w:val="single" w:sz="4" w:color="D0D0D0" w:space="0"/>
+              <w:right w:val="single" w:sz="4" w:color="D0D0D0" w:space="0"/>
+            </w:tcBorders>
+          </w:tcPr>
+          <w:p>
+            <w:pPr>
+              <w:jc w:val="center"/>
+            </w:pPr>
+            <w:r>
+              <w:rPr>
+                <w:b w:val="0"/>
+                <w:i w:val="0"/>
+                <w:color w:val="222222"/>
+                <w:sz w:val="17"/>
+              </w:rPr>
+              <w:t>18,199</w:t>
+            </w:r>
+          </w:p>
+        </w:tc>
+        <w:tc>
+          <w:tcPr>
+            <w:tcW w:type="dxa" w:w="2835"/>
+            <w:shd w:val="clear" w:color="auto" w:fill="FFFFFF"/>
+            <w:tcMar>
+              <w:top w:w="50" w:type="dxa"/>
+              <w:bottom w:w="50" w:type="dxa"/>
+              <w:left w:w="100" w:type="dxa"/>
+              <w:right w:w="100" w:type="dxa"/>
+            </w:tcMar>
+            <w:tcBorders>
+              <w:top w:val="single" w:sz="4" w:color="D0D0D0" w:space="0"/>
+              <w:left w:val="single" w:sz="4" w:color="D0D0D0" w:space="0"/>
+              <w:bottom w:val="single" w:sz="4" w:color="D0D0D0" w:space="0"/>
+              <w:right w:val="single" w:sz="4" w:color="D0D0D0" w:space="0"/>
+            </w:tcBorders>
+          </w:tcPr>
+          <w:p>
+            <w:pPr>
+              <w:jc w:val="center"/>
+            </w:pPr>
+            <w:r>
+              <w:rPr>
+                <w:b w:val="0"/>
+                <w:i w:val="0"/>
+                <w:color w:val="222222"/>
+                <w:sz w:val="17"/>
+              </w:rPr>
+              <w:t>10.3</w:t>
+            </w:r>
+          </w:p>
+        </w:tc>
+      </w:tr>
+    </w:tbl>
+    <w:p>
+      <w:pPr>
+        <w:spacing w:before="40" w:after="80"/>
+      </w:pPr>
+    </w:p>
+    <w:p>
+      <w:pPr>
+        <w:spacing w:after="100"/>
+        <w:jc w:val="both"/>
+      </w:pPr>
+      <w:r>
+        <w:rPr>
+          <w:b w:val="0"/>
+          <w:i w:val="0"/>
+          <w:color w:val="222222"/>
+          <w:sz w:val="19"/>
+        </w:rPr>
+        <w:t xml:space="preserve">Penerapan pengujian statistik tabulasi silang pada data panel (total 54 observasi valid) disajikan secara ringkas pada </w:t>
+      </w:r>
+      <w:r>
+        <w:rPr>
+          <w:b/>
+          <w:i w:val="0"/>
+          <w:color w:val="222222"/>
+          <w:sz w:val="19"/>
+        </w:rPr>
+        <w:t>Tabel 2.5</w:t>
+      </w:r>
+      <w:r>
+        <w:rPr>
+          <w:b w:val="0"/>
+          <w:i w:val="0"/>
+          <w:color w:val="222222"/>
+          <w:sz w:val="19"/>
+        </w:rPr>
+        <w:t xml:space="preserve"> berikut:</w:t>
+      </w:r>
+    </w:p>
+    <w:p>
+      <w:pPr>
+        <w:spacing w:before="120" w:after="40"/>
+      </w:pPr>
+      <w:r>
+        <w:rPr>
+          <w:b/>
+          <w:i/>
+          <w:color w:val="2E7D32"/>
+          <w:sz w:val="17"/>
+        </w:rPr>
+        <w:t>Tabel 2.5: Ringkasan Eksekutif Skenario Crosstab Kapasitas PLTU vs IKU Bab 2</w:t>
       </w:r>
     </w:p>
     <w:tbl>
@@ -8011,7 +8567,7 @@
           <w:color w:val="222222"/>
           <w:sz w:val="19"/>
         </w:rPr>
-        <w:t xml:space="preserve">Selain alokasi konsesi spasial, analisis atribusi pelepasan gas rumah kaca membedah estimasi jejak karbon dari masing-masing faktor pendorong deforestasi pada </w:t>
+        <w:t xml:space="preserve">Penerapan pengujian statistik tabulasi silang pada data panel provinsi-tahun periode 2014-2023 (total 60 observasi valid) disajikan secara ringkas pada </w:t>
       </w:r>
       <w:r>
         <w:rPr>
@@ -8043,563 +8599,7 @@
           <w:color w:val="2E7D32"/>
           <w:sz w:val="17"/>
         </w:rPr>
-        <w:t>Tabel 2.6: Rincian Empiris Deforestasi dan Emisi CO₂ per Faktor Pendorong (2014-2023)</w:t>
-      </w:r>
-    </w:p>
-    <w:tbl>
-      <w:tblPr>
-        <w:tblStyle w:val="TableGrid"/>
-        <w:tblW w:type="auto" w:w="0"/>
-        <w:jc w:val="center"/>
-        <w:tblLayout w:type="fixed"/>
-        <w:tblLook w:firstColumn="1" w:firstRow="1" w:lastColumn="0" w:lastRow="0" w:noHBand="0" w:noVBand="1" w:val="04A0"/>
-      </w:tblPr>
-      <w:tblGrid>
-        <w:gridCol w:w="3213"/>
-        <w:gridCol w:w="3213"/>
-        <w:gridCol w:w="3213"/>
-      </w:tblGrid>
-      <w:tr>
-        <w:tc>
-          <w:tcPr>
-            <w:tcW w:type="dxa" w:w="2551"/>
-            <w:shd w:val="clear" w:color="auto" w:fill="2E7D32"/>
-            <w:tcMar>
-              <w:top w:w="70" w:type="dxa"/>
-              <w:bottom w:w="70" w:type="dxa"/>
-              <w:left w:w="100" w:type="dxa"/>
-              <w:right w:w="100" w:type="dxa"/>
-            </w:tcMar>
-            <w:tcBorders>
-              <w:top w:val="single" w:sz="4" w:color="D0D0D0" w:space="0"/>
-              <w:left w:val="single" w:sz="4" w:color="D0D0D0" w:space="0"/>
-              <w:bottom w:val="single" w:sz="8" w:color="1B5E20" w:space="0"/>
-              <w:right w:val="single" w:sz="4" w:color="D0D0D0" w:space="0"/>
-            </w:tcBorders>
-          </w:tcPr>
-          <w:p>
-            <w:pPr>
-              <w:jc w:val="left"/>
-            </w:pPr>
-            <w:r>
-              <w:rPr>
-                <w:b/>
-                <w:i w:val="0"/>
-                <w:color w:val="FFFFFF"/>
-                <w:sz w:val="17"/>
-              </w:rPr>
-              <w:t>Faktor Pendorong Utama</w:t>
-            </w:r>
-          </w:p>
-        </w:tc>
-        <w:tc>
-          <w:tcPr>
-            <w:tcW w:type="dxa" w:w="2551"/>
-            <w:shd w:val="clear" w:color="auto" w:fill="2E7D32"/>
-            <w:tcMar>
-              <w:top w:w="70" w:type="dxa"/>
-              <w:bottom w:w="70" w:type="dxa"/>
-              <w:left w:w="100" w:type="dxa"/>
-              <w:right w:w="100" w:type="dxa"/>
-            </w:tcMar>
-            <w:tcBorders>
-              <w:top w:val="single" w:sz="4" w:color="D0D0D0" w:space="0"/>
-              <w:left w:val="single" w:sz="4" w:color="D0D0D0" w:space="0"/>
-              <w:bottom w:val="single" w:sz="8" w:color="1B5E20" w:space="0"/>
-              <w:right w:val="single" w:sz="4" w:color="D0D0D0" w:space="0"/>
-            </w:tcBorders>
-          </w:tcPr>
-          <w:p>
-            <w:pPr>
-              <w:jc w:val="center"/>
-            </w:pPr>
-            <w:r>
-              <w:rPr>
-                <w:b/>
-                <w:i w:val="0"/>
-                <w:color w:val="FFFFFF"/>
-                <w:sz w:val="17"/>
-              </w:rPr>
-              <w:t>Total Deforestasi (Ha)</w:t>
-            </w:r>
-          </w:p>
-        </w:tc>
-        <w:tc>
-          <w:tcPr>
-            <w:tcW w:type="dxa" w:w="2835"/>
-            <w:shd w:val="clear" w:color="auto" w:fill="2E7D32"/>
-            <w:tcMar>
-              <w:top w:w="70" w:type="dxa"/>
-              <w:bottom w:w="70" w:type="dxa"/>
-              <w:left w:w="100" w:type="dxa"/>
-              <w:right w:w="100" w:type="dxa"/>
-            </w:tcMar>
-            <w:tcBorders>
-              <w:top w:val="single" w:sz="4" w:color="D0D0D0" w:space="0"/>
-              <w:left w:val="single" w:sz="4" w:color="D0D0D0" w:space="0"/>
-              <w:bottom w:val="single" w:sz="8" w:color="1B5E20" w:space="0"/>
-              <w:right w:val="single" w:sz="4" w:color="D0D0D0" w:space="0"/>
-            </w:tcBorders>
-          </w:tcPr>
-          <w:p>
-            <w:pPr>
-              <w:jc w:val="center"/>
-            </w:pPr>
-            <w:r>
-              <w:rPr>
-                <w:b/>
-                <w:i w:val="0"/>
-                <w:color w:val="FFFFFF"/>
-                <w:sz w:val="17"/>
-              </w:rPr>
-              <w:t>Estimasi Emisi CO₂ (Juta Ton)</w:t>
-            </w:r>
-          </w:p>
-        </w:tc>
-      </w:tr>
-      <w:tr>
-        <w:tc>
-          <w:tcPr>
-            <w:tcW w:type="dxa" w:w="2551"/>
-            <w:shd w:val="clear" w:color="auto" w:fill="F5FBF5"/>
-            <w:tcMar>
-              <w:top w:w="50" w:type="dxa"/>
-              <w:bottom w:w="50" w:type="dxa"/>
-              <w:left w:w="100" w:type="dxa"/>
-              <w:right w:w="100" w:type="dxa"/>
-            </w:tcMar>
-            <w:tcBorders>
-              <w:top w:val="single" w:sz="4" w:color="D0D0D0" w:space="0"/>
-              <w:left w:val="single" w:sz="4" w:color="D0D0D0" w:space="0"/>
-              <w:bottom w:val="single" w:sz="4" w:color="D0D0D0" w:space="0"/>
-              <w:right w:val="single" w:sz="4" w:color="D0D0D0" w:space="0"/>
-            </w:tcBorders>
-          </w:tcPr>
-          <w:p>
-            <w:pPr>
-              <w:jc w:val="left"/>
-            </w:pPr>
-            <w:r>
-              <w:rPr>
-                <w:b w:val="0"/>
-                <w:i w:val="0"/>
-                <w:color w:val="222222"/>
-                <w:sz w:val="17"/>
-              </w:rPr>
-              <w:t>Pertambangan dan Sawit</w:t>
-            </w:r>
-          </w:p>
-        </w:tc>
-        <w:tc>
-          <w:tcPr>
-            <w:tcW w:type="dxa" w:w="2551"/>
-            <w:shd w:val="clear" w:color="auto" w:fill="F5FBF5"/>
-            <w:tcMar>
-              <w:top w:w="50" w:type="dxa"/>
-              <w:bottom w:w="50" w:type="dxa"/>
-              <w:left w:w="100" w:type="dxa"/>
-              <w:right w:w="100" w:type="dxa"/>
-            </w:tcMar>
-            <w:tcBorders>
-              <w:top w:val="single" w:sz="4" w:color="D0D0D0" w:space="0"/>
-              <w:left w:val="single" w:sz="4" w:color="D0D0D0" w:space="0"/>
-              <w:bottom w:val="single" w:sz="4" w:color="D0D0D0" w:space="0"/>
-              <w:right w:val="single" w:sz="4" w:color="D0D0D0" w:space="0"/>
-            </w:tcBorders>
-          </w:tcPr>
-          <w:p>
-            <w:pPr>
-              <w:jc w:val="center"/>
-            </w:pPr>
-            <w:r>
-              <w:rPr>
-                <w:b w:val="0"/>
-                <w:i w:val="0"/>
-                <w:color w:val="222222"/>
-                <w:sz w:val="17"/>
-              </w:rPr>
-              <w:t>726,565</w:t>
-            </w:r>
-          </w:p>
-        </w:tc>
-        <w:tc>
-          <w:tcPr>
-            <w:tcW w:type="dxa" w:w="2835"/>
-            <w:shd w:val="clear" w:color="auto" w:fill="F5FBF5"/>
-            <w:tcMar>
-              <w:top w:w="50" w:type="dxa"/>
-              <w:bottom w:w="50" w:type="dxa"/>
-              <w:left w:w="100" w:type="dxa"/>
-              <w:right w:w="100" w:type="dxa"/>
-            </w:tcMar>
-            <w:tcBorders>
-              <w:top w:val="single" w:sz="4" w:color="D0D0D0" w:space="0"/>
-              <w:left w:val="single" w:sz="4" w:color="D0D0D0" w:space="0"/>
-              <w:bottom w:val="single" w:sz="4" w:color="D0D0D0" w:space="0"/>
-              <w:right w:val="single" w:sz="4" w:color="D0D0D0" w:space="0"/>
-            </w:tcBorders>
-          </w:tcPr>
-          <w:p>
-            <w:pPr>
-              <w:jc w:val="center"/>
-            </w:pPr>
-            <w:r>
-              <w:rPr>
-                <w:b w:val="0"/>
-                <w:i w:val="0"/>
-                <w:color w:val="222222"/>
-                <w:sz w:val="17"/>
-              </w:rPr>
-              <w:t>482.7</w:t>
-            </w:r>
-          </w:p>
-        </w:tc>
-      </w:tr>
-      <w:tr>
-        <w:tc>
-          <w:tcPr>
-            <w:tcW w:type="dxa" w:w="2551"/>
-            <w:shd w:val="clear" w:color="auto" w:fill="FFFFFF"/>
-            <w:tcMar>
-              <w:top w:w="50" w:type="dxa"/>
-              <w:bottom w:w="50" w:type="dxa"/>
-              <w:left w:w="100" w:type="dxa"/>
-              <w:right w:w="100" w:type="dxa"/>
-            </w:tcMar>
-            <w:tcBorders>
-              <w:top w:val="single" w:sz="4" w:color="D0D0D0" w:space="0"/>
-              <w:left w:val="single" w:sz="4" w:color="D0D0D0" w:space="0"/>
-              <w:bottom w:val="single" w:sz="4" w:color="D0D0D0" w:space="0"/>
-              <w:right w:val="single" w:sz="4" w:color="D0D0D0" w:space="0"/>
-            </w:tcBorders>
-          </w:tcPr>
-          <w:p>
-            <w:pPr>
-              <w:jc w:val="left"/>
-            </w:pPr>
-            <w:r>
-              <w:rPr>
-                <w:b w:val="0"/>
-                <w:i w:val="0"/>
-                <w:color w:val="222222"/>
-                <w:sz w:val="17"/>
-              </w:rPr>
-              <w:t>Kehutanan Komersial</w:t>
-            </w:r>
-          </w:p>
-        </w:tc>
-        <w:tc>
-          <w:tcPr>
-            <w:tcW w:type="dxa" w:w="2551"/>
-            <w:shd w:val="clear" w:color="auto" w:fill="FFFFFF"/>
-            <w:tcMar>
-              <w:top w:w="50" w:type="dxa"/>
-              <w:bottom w:w="50" w:type="dxa"/>
-              <w:left w:w="100" w:type="dxa"/>
-              <w:right w:w="100" w:type="dxa"/>
-            </w:tcMar>
-            <w:tcBorders>
-              <w:top w:val="single" w:sz="4" w:color="D0D0D0" w:space="0"/>
-              <w:left w:val="single" w:sz="4" w:color="D0D0D0" w:space="0"/>
-              <w:bottom w:val="single" w:sz="4" w:color="D0D0D0" w:space="0"/>
-              <w:right w:val="single" w:sz="4" w:color="D0D0D0" w:space="0"/>
-            </w:tcBorders>
-          </w:tcPr>
-          <w:p>
-            <w:pPr>
-              <w:jc w:val="center"/>
-            </w:pPr>
-            <w:r>
-              <w:rPr>
-                <w:b w:val="0"/>
-                <w:i w:val="0"/>
-                <w:color w:val="222222"/>
-                <w:sz w:val="17"/>
-              </w:rPr>
-              <w:t>97,936</w:t>
-            </w:r>
-          </w:p>
-        </w:tc>
-        <w:tc>
-          <w:tcPr>
-            <w:tcW w:type="dxa" w:w="2835"/>
-            <w:shd w:val="clear" w:color="auto" w:fill="FFFFFF"/>
-            <w:tcMar>
-              <w:top w:w="50" w:type="dxa"/>
-              <w:bottom w:w="50" w:type="dxa"/>
-              <w:left w:w="100" w:type="dxa"/>
-              <w:right w:w="100" w:type="dxa"/>
-            </w:tcMar>
-            <w:tcBorders>
-              <w:top w:val="single" w:sz="4" w:color="D0D0D0" w:space="0"/>
-              <w:left w:val="single" w:sz="4" w:color="D0D0D0" w:space="0"/>
-              <w:bottom w:val="single" w:sz="4" w:color="D0D0D0" w:space="0"/>
-              <w:right w:val="single" w:sz="4" w:color="D0D0D0" w:space="0"/>
-            </w:tcBorders>
-          </w:tcPr>
-          <w:p>
-            <w:pPr>
-              <w:jc w:val="center"/>
-            </w:pPr>
-            <w:r>
-              <w:rPr>
-                <w:b w:val="0"/>
-                <w:i w:val="0"/>
-                <w:color w:val="222222"/>
-                <w:sz w:val="17"/>
-              </w:rPr>
-              <w:t>64.1</w:t>
-            </w:r>
-          </w:p>
-        </w:tc>
-      </w:tr>
-      <w:tr>
-        <w:tc>
-          <w:tcPr>
-            <w:tcW w:type="dxa" w:w="2551"/>
-            <w:shd w:val="clear" w:color="auto" w:fill="F5FBF5"/>
-            <w:tcMar>
-              <w:top w:w="50" w:type="dxa"/>
-              <w:bottom w:w="50" w:type="dxa"/>
-              <w:left w:w="100" w:type="dxa"/>
-              <w:right w:w="100" w:type="dxa"/>
-            </w:tcMar>
-            <w:tcBorders>
-              <w:top w:val="single" w:sz="4" w:color="D0D0D0" w:space="0"/>
-              <w:left w:val="single" w:sz="4" w:color="D0D0D0" w:space="0"/>
-              <w:bottom w:val="single" w:sz="4" w:color="D0D0D0" w:space="0"/>
-              <w:right w:val="single" w:sz="4" w:color="D0D0D0" w:space="0"/>
-            </w:tcBorders>
-          </w:tcPr>
-          <w:p>
-            <w:pPr>
-              <w:jc w:val="left"/>
-            </w:pPr>
-            <w:r>
-              <w:rPr>
-                <w:b w:val="0"/>
-                <w:i w:val="0"/>
-                <w:color w:val="222222"/>
-                <w:sz w:val="17"/>
-              </w:rPr>
-              <w:t>Pertanian Berpindah</w:t>
-            </w:r>
-          </w:p>
-        </w:tc>
-        <w:tc>
-          <w:tcPr>
-            <w:tcW w:type="dxa" w:w="2551"/>
-            <w:shd w:val="clear" w:color="auto" w:fill="F5FBF5"/>
-            <w:tcMar>
-              <w:top w:w="50" w:type="dxa"/>
-              <w:bottom w:w="50" w:type="dxa"/>
-              <w:left w:w="100" w:type="dxa"/>
-              <w:right w:w="100" w:type="dxa"/>
-            </w:tcMar>
-            <w:tcBorders>
-              <w:top w:val="single" w:sz="4" w:color="D0D0D0" w:space="0"/>
-              <w:left w:val="single" w:sz="4" w:color="D0D0D0" w:space="0"/>
-              <w:bottom w:val="single" w:sz="4" w:color="D0D0D0" w:space="0"/>
-              <w:right w:val="single" w:sz="4" w:color="D0D0D0" w:space="0"/>
-            </w:tcBorders>
-          </w:tcPr>
-          <w:p>
-            <w:pPr>
-              <w:jc w:val="center"/>
-            </w:pPr>
-            <w:r>
-              <w:rPr>
-                <w:b w:val="0"/>
-                <w:i w:val="0"/>
-                <w:color w:val="222222"/>
-                <w:sz w:val="17"/>
-              </w:rPr>
-              <w:t>43,002</w:t>
-            </w:r>
-          </w:p>
-        </w:tc>
-        <w:tc>
-          <w:tcPr>
-            <w:tcW w:type="dxa" w:w="2835"/>
-            <w:shd w:val="clear" w:color="auto" w:fill="F5FBF5"/>
-            <w:tcMar>
-              <w:top w:w="50" w:type="dxa"/>
-              <w:bottom w:w="50" w:type="dxa"/>
-              <w:left w:w="100" w:type="dxa"/>
-              <w:right w:w="100" w:type="dxa"/>
-            </w:tcMar>
-            <w:tcBorders>
-              <w:top w:val="single" w:sz="4" w:color="D0D0D0" w:space="0"/>
-              <w:left w:val="single" w:sz="4" w:color="D0D0D0" w:space="0"/>
-              <w:bottom w:val="single" w:sz="4" w:color="D0D0D0" w:space="0"/>
-              <w:right w:val="single" w:sz="4" w:color="D0D0D0" w:space="0"/>
-            </w:tcBorders>
-          </w:tcPr>
-          <w:p>
-            <w:pPr>
-              <w:jc w:val="center"/>
-            </w:pPr>
-            <w:r>
-              <w:rPr>
-                <w:b w:val="0"/>
-                <w:i w:val="0"/>
-                <w:color w:val="222222"/>
-                <w:sz w:val="17"/>
-              </w:rPr>
-              <w:t>29.1</w:t>
-            </w:r>
-          </w:p>
-        </w:tc>
-      </w:tr>
-      <w:tr>
-        <w:tc>
-          <w:tcPr>
-            <w:tcW w:type="dxa" w:w="2551"/>
-            <w:shd w:val="clear" w:color="auto" w:fill="FFFFFF"/>
-            <w:tcMar>
-              <w:top w:w="50" w:type="dxa"/>
-              <w:bottom w:w="50" w:type="dxa"/>
-              <w:left w:w="100" w:type="dxa"/>
-              <w:right w:w="100" w:type="dxa"/>
-            </w:tcMar>
-            <w:tcBorders>
-              <w:top w:val="single" w:sz="4" w:color="D0D0D0" w:space="0"/>
-              <w:left w:val="single" w:sz="4" w:color="D0D0D0" w:space="0"/>
-              <w:bottom w:val="single" w:sz="4" w:color="D0D0D0" w:space="0"/>
-              <w:right w:val="single" w:sz="4" w:color="D0D0D0" w:space="0"/>
-            </w:tcBorders>
-          </w:tcPr>
-          <w:p>
-            <w:pPr>
-              <w:jc w:val="left"/>
-            </w:pPr>
-            <w:r>
-              <w:rPr>
-                <w:b w:val="0"/>
-                <w:i w:val="0"/>
-                <w:color w:val="222222"/>
-                <w:sz w:val="17"/>
-              </w:rPr>
-              <w:t>Tidak Teridentifikasi</w:t>
-            </w:r>
-          </w:p>
-        </w:tc>
-        <w:tc>
-          <w:tcPr>
-            <w:tcW w:type="dxa" w:w="2551"/>
-            <w:shd w:val="clear" w:color="auto" w:fill="FFFFFF"/>
-            <w:tcMar>
-              <w:top w:w="50" w:type="dxa"/>
-              <w:bottom w:w="50" w:type="dxa"/>
-              <w:left w:w="100" w:type="dxa"/>
-              <w:right w:w="100" w:type="dxa"/>
-            </w:tcMar>
-            <w:tcBorders>
-              <w:top w:val="single" w:sz="4" w:color="D0D0D0" w:space="0"/>
-              <w:left w:val="single" w:sz="4" w:color="D0D0D0" w:space="0"/>
-              <w:bottom w:val="single" w:sz="4" w:color="D0D0D0" w:space="0"/>
-              <w:right w:val="single" w:sz="4" w:color="D0D0D0" w:space="0"/>
-            </w:tcBorders>
-          </w:tcPr>
-          <w:p>
-            <w:pPr>
-              <w:jc w:val="center"/>
-            </w:pPr>
-            <w:r>
-              <w:rPr>
-                <w:b w:val="0"/>
-                <w:i w:val="0"/>
-                <w:color w:val="222222"/>
-                <w:sz w:val="17"/>
-              </w:rPr>
-              <w:t>18,199</w:t>
-            </w:r>
-          </w:p>
-        </w:tc>
-        <w:tc>
-          <w:tcPr>
-            <w:tcW w:type="dxa" w:w="2835"/>
-            <w:shd w:val="clear" w:color="auto" w:fill="FFFFFF"/>
-            <w:tcMar>
-              <w:top w:w="50" w:type="dxa"/>
-              <w:bottom w:w="50" w:type="dxa"/>
-              <w:left w:w="100" w:type="dxa"/>
-              <w:right w:w="100" w:type="dxa"/>
-            </w:tcMar>
-            <w:tcBorders>
-              <w:top w:val="single" w:sz="4" w:color="D0D0D0" w:space="0"/>
-              <w:left w:val="single" w:sz="4" w:color="D0D0D0" w:space="0"/>
-              <w:bottom w:val="single" w:sz="4" w:color="D0D0D0" w:space="0"/>
-              <w:right w:val="single" w:sz="4" w:color="D0D0D0" w:space="0"/>
-            </w:tcBorders>
-          </w:tcPr>
-          <w:p>
-            <w:pPr>
-              <w:jc w:val="center"/>
-            </w:pPr>
-            <w:r>
-              <w:rPr>
-                <w:b w:val="0"/>
-                <w:i w:val="0"/>
-                <w:color w:val="222222"/>
-                <w:sz w:val="17"/>
-              </w:rPr>
-              <w:t>10.3</w:t>
-            </w:r>
-          </w:p>
-        </w:tc>
-      </w:tr>
-    </w:tbl>
-    <w:p>
-      <w:pPr>
-        <w:spacing w:before="40" w:after="80"/>
-      </w:pPr>
-    </w:p>
-    <w:p>
-      <w:pPr>
-        <w:spacing w:after="100"/>
-        <w:jc w:val="both"/>
-      </w:pPr>
-      <w:r>
-        <w:rPr>
-          <w:b w:val="0"/>
-          <w:i w:val="0"/>
-          <w:color w:val="222222"/>
-          <w:sz w:val="19"/>
-        </w:rPr>
-        <w:t xml:space="preserve">Penerapan pengujian statistik tabulasi silang pada data panel provinsi-tahun periode 2014-2023 (total 60 observasi valid) disajikan secara ringkas pada </w:t>
-      </w:r>
-      <w:r>
-        <w:rPr>
-          <w:b/>
-          <w:i w:val="0"/>
-          <w:color w:val="222222"/>
-          <w:sz w:val="19"/>
-        </w:rPr>
-        <w:t>Tabel 2.7</w:t>
-      </w:r>
-      <w:r>
-        <w:rPr>
-          <w:b w:val="0"/>
-          <w:i w:val="0"/>
-          <w:color w:val="222222"/>
-          <w:sz w:val="19"/>
-        </w:rPr>
-        <w:t xml:space="preserve"> berikut:</w:t>
-      </w:r>
-    </w:p>
-    <w:p>
-      <w:pPr>
-        <w:spacing w:before="120" w:after="40"/>
-      </w:pPr>
-      <w:r>
-        <w:rPr>
-          <w:b/>
-          <w:i/>
-          <w:color w:val="2E7D32"/>
-          <w:sz w:val="17"/>
-        </w:rPr>
-        <w:t>Tabel 2.7: Ringkasan Eksekutif Skenario Crosstab Ekspansi Industri vs Deforestasi Bab 2</w:t>
+        <w:t>Tabel 2.6: Ringkasan Eksekutif Skenario Crosstab Ekspansi Industri vs Deforestasi Bab 2</w:t>
       </w:r>
     </w:p>
     <w:tbl>

</xml_diff>

<commit_message>
fix: remove 'Total Deforestasi' column from Tabel 2.4 Emisi CO2 per Driver
</commit_message>
<xml_diff>
--- a/tools/report_metodologi/bab_2/Metodologi_Bab2_Kualitas_Lingkungan.docx
+++ b/tools/report_metodologi/bab_2/Metodologi_Bab2_Kualitas_Lingkungan.docx
@@ -5206,14 +5206,13 @@
         <w:tblLook w:firstColumn="1" w:firstRow="1" w:lastColumn="0" w:lastRow="0" w:noHBand="0" w:noVBand="1" w:val="04A0"/>
       </w:tblPr>
       <w:tblGrid>
-        <w:gridCol w:w="3213"/>
-        <w:gridCol w:w="3213"/>
-        <w:gridCol w:w="3213"/>
+        <w:gridCol w:w="4819"/>
+        <w:gridCol w:w="4819"/>
       </w:tblGrid>
       <w:tr>
         <w:tc>
           <w:tcPr>
-            <w:tcW w:type="dxa" w:w="2551"/>
+            <w:tcW w:type="dxa" w:w="3969"/>
             <w:shd w:val="clear" w:color="auto" w:fill="2E7D32"/>
             <w:tcMar>
               <w:top w:w="70" w:type="dxa"/>
@@ -5245,39 +5244,7 @@
         </w:tc>
         <w:tc>
           <w:tcPr>
-            <w:tcW w:type="dxa" w:w="2551"/>
-            <w:shd w:val="clear" w:color="auto" w:fill="2E7D32"/>
-            <w:tcMar>
-              <w:top w:w="70" w:type="dxa"/>
-              <w:bottom w:w="70" w:type="dxa"/>
-              <w:left w:w="100" w:type="dxa"/>
-              <w:right w:w="100" w:type="dxa"/>
-            </w:tcMar>
-            <w:tcBorders>
-              <w:top w:val="single" w:sz="4" w:color="D0D0D0" w:space="0"/>
-              <w:left w:val="single" w:sz="4" w:color="D0D0D0" w:space="0"/>
-              <w:bottom w:val="single" w:sz="8" w:color="1B5E20" w:space="0"/>
-              <w:right w:val="single" w:sz="4" w:color="D0D0D0" w:space="0"/>
-            </w:tcBorders>
-          </w:tcPr>
-          <w:p>
-            <w:pPr>
-              <w:jc w:val="center"/>
-            </w:pPr>
-            <w:r>
-              <w:rPr>
-                <w:b/>
-                <w:i w:val="0"/>
-                <w:color w:val="FFFFFF"/>
-                <w:sz w:val="17"/>
-              </w:rPr>
-              <w:t>Total Deforestasi (Ha)</w:t>
-            </w:r>
-          </w:p>
-        </w:tc>
-        <w:tc>
-          <w:tcPr>
-            <w:tcW w:type="dxa" w:w="2835"/>
+            <w:tcW w:type="dxa" w:w="3969"/>
             <w:shd w:val="clear" w:color="auto" w:fill="2E7D32"/>
             <w:tcMar>
               <w:top w:w="70" w:type="dxa"/>
@@ -5311,7 +5278,7 @@
       <w:tr>
         <w:tc>
           <w:tcPr>
-            <w:tcW w:type="dxa" w:w="2551"/>
+            <w:tcW w:type="dxa" w:w="3969"/>
             <w:shd w:val="clear" w:color="auto" w:fill="F5FBF5"/>
             <w:tcMar>
               <w:top w:w="50" w:type="dxa"/>
@@ -5343,39 +5310,7 @@
         </w:tc>
         <w:tc>
           <w:tcPr>
-            <w:tcW w:type="dxa" w:w="2551"/>
-            <w:shd w:val="clear" w:color="auto" w:fill="F5FBF5"/>
-            <w:tcMar>
-              <w:top w:w="50" w:type="dxa"/>
-              <w:bottom w:w="50" w:type="dxa"/>
-              <w:left w:w="100" w:type="dxa"/>
-              <w:right w:w="100" w:type="dxa"/>
-            </w:tcMar>
-            <w:tcBorders>
-              <w:top w:val="single" w:sz="4" w:color="D0D0D0" w:space="0"/>
-              <w:left w:val="single" w:sz="4" w:color="D0D0D0" w:space="0"/>
-              <w:bottom w:val="single" w:sz="4" w:color="D0D0D0" w:space="0"/>
-              <w:right w:val="single" w:sz="4" w:color="D0D0D0" w:space="0"/>
-            </w:tcBorders>
-          </w:tcPr>
-          <w:p>
-            <w:pPr>
-              <w:jc w:val="center"/>
-            </w:pPr>
-            <w:r>
-              <w:rPr>
-                <w:b w:val="0"/>
-                <w:i w:val="0"/>
-                <w:color w:val="222222"/>
-                <w:sz w:val="17"/>
-              </w:rPr>
-              <w:t>726,565</w:t>
-            </w:r>
-          </w:p>
-        </w:tc>
-        <w:tc>
-          <w:tcPr>
-            <w:tcW w:type="dxa" w:w="2835"/>
+            <w:tcW w:type="dxa" w:w="3969"/>
             <w:shd w:val="clear" w:color="auto" w:fill="F5FBF5"/>
             <w:tcMar>
               <w:top w:w="50" w:type="dxa"/>
@@ -5409,7 +5344,7 @@
       <w:tr>
         <w:tc>
           <w:tcPr>
-            <w:tcW w:type="dxa" w:w="2551"/>
+            <w:tcW w:type="dxa" w:w="3969"/>
             <w:shd w:val="clear" w:color="auto" w:fill="FFFFFF"/>
             <w:tcMar>
               <w:top w:w="50" w:type="dxa"/>
@@ -5441,39 +5376,7 @@
         </w:tc>
         <w:tc>
           <w:tcPr>
-            <w:tcW w:type="dxa" w:w="2551"/>
-            <w:shd w:val="clear" w:color="auto" w:fill="FFFFFF"/>
-            <w:tcMar>
-              <w:top w:w="50" w:type="dxa"/>
-              <w:bottom w:w="50" w:type="dxa"/>
-              <w:left w:w="100" w:type="dxa"/>
-              <w:right w:w="100" w:type="dxa"/>
-            </w:tcMar>
-            <w:tcBorders>
-              <w:top w:val="single" w:sz="4" w:color="D0D0D0" w:space="0"/>
-              <w:left w:val="single" w:sz="4" w:color="D0D0D0" w:space="0"/>
-              <w:bottom w:val="single" w:sz="4" w:color="D0D0D0" w:space="0"/>
-              <w:right w:val="single" w:sz="4" w:color="D0D0D0" w:space="0"/>
-            </w:tcBorders>
-          </w:tcPr>
-          <w:p>
-            <w:pPr>
-              <w:jc w:val="center"/>
-            </w:pPr>
-            <w:r>
-              <w:rPr>
-                <w:b w:val="0"/>
-                <w:i w:val="0"/>
-                <w:color w:val="222222"/>
-                <w:sz w:val="17"/>
-              </w:rPr>
-              <w:t>97,936</w:t>
-            </w:r>
-          </w:p>
-        </w:tc>
-        <w:tc>
-          <w:tcPr>
-            <w:tcW w:type="dxa" w:w="2835"/>
+            <w:tcW w:type="dxa" w:w="3969"/>
             <w:shd w:val="clear" w:color="auto" w:fill="FFFFFF"/>
             <w:tcMar>
               <w:top w:w="50" w:type="dxa"/>
@@ -5507,7 +5410,7 @@
       <w:tr>
         <w:tc>
           <w:tcPr>
-            <w:tcW w:type="dxa" w:w="2551"/>
+            <w:tcW w:type="dxa" w:w="3969"/>
             <w:shd w:val="clear" w:color="auto" w:fill="F5FBF5"/>
             <w:tcMar>
               <w:top w:w="50" w:type="dxa"/>
@@ -5539,39 +5442,7 @@
         </w:tc>
         <w:tc>
           <w:tcPr>
-            <w:tcW w:type="dxa" w:w="2551"/>
-            <w:shd w:val="clear" w:color="auto" w:fill="F5FBF5"/>
-            <w:tcMar>
-              <w:top w:w="50" w:type="dxa"/>
-              <w:bottom w:w="50" w:type="dxa"/>
-              <w:left w:w="100" w:type="dxa"/>
-              <w:right w:w="100" w:type="dxa"/>
-            </w:tcMar>
-            <w:tcBorders>
-              <w:top w:val="single" w:sz="4" w:color="D0D0D0" w:space="0"/>
-              <w:left w:val="single" w:sz="4" w:color="D0D0D0" w:space="0"/>
-              <w:bottom w:val="single" w:sz="4" w:color="D0D0D0" w:space="0"/>
-              <w:right w:val="single" w:sz="4" w:color="D0D0D0" w:space="0"/>
-            </w:tcBorders>
-          </w:tcPr>
-          <w:p>
-            <w:pPr>
-              <w:jc w:val="center"/>
-            </w:pPr>
-            <w:r>
-              <w:rPr>
-                <w:b w:val="0"/>
-                <w:i w:val="0"/>
-                <w:color w:val="222222"/>
-                <w:sz w:val="17"/>
-              </w:rPr>
-              <w:t>43,002</w:t>
-            </w:r>
-          </w:p>
-        </w:tc>
-        <w:tc>
-          <w:tcPr>
-            <w:tcW w:type="dxa" w:w="2835"/>
+            <w:tcW w:type="dxa" w:w="3969"/>
             <w:shd w:val="clear" w:color="auto" w:fill="F5FBF5"/>
             <w:tcMar>
               <w:top w:w="50" w:type="dxa"/>
@@ -5605,7 +5476,7 @@
       <w:tr>
         <w:tc>
           <w:tcPr>
-            <w:tcW w:type="dxa" w:w="2551"/>
+            <w:tcW w:type="dxa" w:w="3969"/>
             <w:shd w:val="clear" w:color="auto" w:fill="FFFFFF"/>
             <w:tcMar>
               <w:top w:w="50" w:type="dxa"/>
@@ -5637,39 +5508,7 @@
         </w:tc>
         <w:tc>
           <w:tcPr>
-            <w:tcW w:type="dxa" w:w="2551"/>
-            <w:shd w:val="clear" w:color="auto" w:fill="FFFFFF"/>
-            <w:tcMar>
-              <w:top w:w="50" w:type="dxa"/>
-              <w:bottom w:w="50" w:type="dxa"/>
-              <w:left w:w="100" w:type="dxa"/>
-              <w:right w:w="100" w:type="dxa"/>
-            </w:tcMar>
-            <w:tcBorders>
-              <w:top w:val="single" w:sz="4" w:color="D0D0D0" w:space="0"/>
-              <w:left w:val="single" w:sz="4" w:color="D0D0D0" w:space="0"/>
-              <w:bottom w:val="single" w:sz="4" w:color="D0D0D0" w:space="0"/>
-              <w:right w:val="single" w:sz="4" w:color="D0D0D0" w:space="0"/>
-            </w:tcBorders>
-          </w:tcPr>
-          <w:p>
-            <w:pPr>
-              <w:jc w:val="center"/>
-            </w:pPr>
-            <w:r>
-              <w:rPr>
-                <w:b w:val="0"/>
-                <w:i w:val="0"/>
-                <w:color w:val="222222"/>
-                <w:sz w:val="17"/>
-              </w:rPr>
-              <w:t>18,199</w:t>
-            </w:r>
-          </w:p>
-        </w:tc>
-        <w:tc>
-          <w:tcPr>
-            <w:tcW w:type="dxa" w:w="2835"/>
+            <w:tcW w:type="dxa" w:w="3969"/>
             <w:shd w:val="clear" w:color="auto" w:fill="FFFFFF"/>
             <w:tcMar>
               <w:top w:w="50" w:type="dxa"/>
@@ -6940,7 +6779,7 @@
           <w:color w:val="2E7D32"/>
           <w:sz w:val="17"/>
         </w:rPr>
-        <w:t>Persamaan: Agregasi Luas Konsesi &amp; Kawasan Industri per Provinsi</w:t>
+        <w:t>Persamaan: Persamaan Agregasi Luas Konsesi &amp; Kawasan Industri per Provinsi</w:t>
       </w:r>
     </w:p>
     <w:p>
@@ -6963,7 +6802,7 @@
           <w:color w:val="1B5E20"/>
           <w:sz w:val="17"/>
         </w:rPr>
-        <w:t>Luas_IUP_Kawasan_Provinsi = SUM(total_luas_ha) GROUP BY Provinsi</w:t>
+        <w:t>Luas_IUP_Kawasan_p = Σ ( Luas_Izin_i )   ;   untuk seluruh entitas izin i pada provinsi p</w:t>
       </w:r>
     </w:p>
     <w:p>
@@ -6988,7 +6827,7 @@
           <w:color w:val="1B5E20"/>
           <w:sz w:val="16"/>
         </w:rPr>
-        <w:t xml:space="preserve">- Luas_IUP_Kawasan_Provinsi: </w:t>
+        <w:t xml:space="preserve">- Luas_IUP_Kawasan_p: </w:t>
       </w:r>
       <w:r>
         <w:rPr>
@@ -6997,7 +6836,7 @@
           <w:color w:val="444444"/>
           <w:sz w:val="16"/>
         </w:rPr>
-        <w:t>Total luasan (Ha) konsesi IUP dan Kawasan Industri nikel pada provinsi observasi.</w:t>
+        <w:t>Total luasan (Ha) konsesi IUP dan Kawasan Industri nikel pada provinsi p.</w:t>
         <w:br/>
       </w:r>
       <w:r>
@@ -7007,7 +6846,7 @@
           <w:color w:val="1B5E20"/>
           <w:sz w:val="16"/>
         </w:rPr>
-        <w:t xml:space="preserve">- total_luas_ha: </w:t>
+        <w:t xml:space="preserve">- Luas_Izin_i: </w:t>
       </w:r>
       <w:r>
         <w:rPr>
@@ -7016,7 +6855,26 @@
           <w:color w:val="444444"/>
           <w:sz w:val="16"/>
         </w:rPr>
-        <w:t>Luas izin (Ha) tiap entitas perusahaan dalam data kawasan nikel Minerbaone/CGS.</w:t>
+        <w:t>Luas izin (Ha) tiap entitas perusahaan i dalam data kawasan nikel Minerbaone/CGS.</w:t>
+        <w:br/>
+      </w:r>
+      <w:r>
+        <w:rPr>
+          <w:b/>
+          <w:i w:val="0"/>
+          <w:color w:val="1B5E20"/>
+          <w:sz w:val="16"/>
+        </w:rPr>
+        <w:t xml:space="preserve">- p: </w:t>
+      </w:r>
+      <w:r>
+        <w:rPr>
+          <w:b w:val="0"/>
+          <w:i w:val="0"/>
+          <w:color w:val="444444"/>
+          <w:sz w:val="16"/>
+        </w:rPr>
+        <w:t>Indeks provinsi observasi (6 provinsi se-Sulawesi).</w:t>
       </w:r>
     </w:p>
     <w:p>
@@ -7030,7 +6888,7 @@
           <w:color w:val="2E7D32"/>
           <w:sz w:val="17"/>
         </w:rPr>
-        <w:t>Persamaan: Kumulatif Luas Konsesi Baru (Ukuran Gelembung / Bubble Size)</w:t>
+        <w:t>Persamaan: Persamaan Akumulasi Luas Konsesi Baru (Ukuran Gelembung / Bubble Size)</w:t>
       </w:r>
     </w:p>
     <w:p>
@@ -7053,7 +6911,7 @@
           <w:color w:val="1B5E20"/>
           <w:sz w:val="17"/>
         </w:rPr>
-        <w:t>Kumulatif_Luas_Konsesi_Ha = CUMSUM(Total_Luas_Konsesi_Baru_Ha) OVER (ORDER BY Tahun)</w:t>
+        <w:t>Kumulatif_Luas_Konsesi_p(T) = Σ ( Konsesi_Baru_p,t )   ;   untuk t = 2014 s.d. T</w:t>
       </w:r>
     </w:p>
     <w:p>
@@ -7078,7 +6936,7 @@
           <w:color w:val="1B5E20"/>
           <w:sz w:val="16"/>
         </w:rPr>
-        <w:t xml:space="preserve">- Kumulatif_Luas_Konsesi_Ha: </w:t>
+        <w:t xml:space="preserve">- Kumulatif_Luas_Konsesi_p(T): </w:t>
       </w:r>
       <w:r>
         <w:rPr>
@@ -7087,7 +6945,7 @@
           <w:color w:val="444444"/>
           <w:sz w:val="16"/>
         </w:rPr>
-        <w:t>Akumulasi luasan konsesi industri per provinsi yang bertambah dari tahun ke tahun (skala ukuran gelembung).</w:t>
+        <w:t>Akumulasi luasan konsesi industri (Ha) provinsi p hingga tahun berjalan T yang bertambah dari tahun ke tahun (skala ukuran gelembung).</w:t>
         <w:br/>
       </w:r>
       <w:r>
@@ -7097,7 +6955,7 @@
           <w:color w:val="1B5E20"/>
           <w:sz w:val="16"/>
         </w:rPr>
-        <w:t xml:space="preserve">- Total_Luas_Konsesi_Baru_Ha: </w:t>
+        <w:t xml:space="preserve">- Konsesi_Baru_p,t: </w:t>
       </w:r>
       <w:r>
         <w:rPr>
@@ -7106,7 +6964,26 @@
           <w:color w:val="444444"/>
           <w:sz w:val="16"/>
         </w:rPr>
-        <w:t>Variabel Tekanan Ruang (Independen): luas IUP diterbitkan per tahun.</w:t>
+        <w:t>Variabel Tekanan Ruang (Independen): luas IUP diterbitkan (Ha) di provinsi p pada tahun t.</w:t>
+        <w:br/>
+      </w:r>
+      <w:r>
+        <w:rPr>
+          <w:b/>
+          <w:i w:val="0"/>
+          <w:color w:val="1B5E20"/>
+          <w:sz w:val="16"/>
+        </w:rPr>
+        <w:t xml:space="preserve">- T: </w:t>
+      </w:r>
+      <w:r>
+        <w:rPr>
+          <w:b w:val="0"/>
+          <w:i w:val="0"/>
+          <w:color w:val="444444"/>
+          <w:sz w:val="16"/>
+        </w:rPr>
+        <w:t>Tahun berjalan pada linimasa animasi (2014-2023).</w:t>
       </w:r>
     </w:p>
     <w:p>
@@ -7120,7 +6997,7 @@
           <w:color w:val="2E7D32"/>
           <w:sz w:val="17"/>
         </w:rPr>
-        <w:t>Persamaan: Kumulatif Deforestasi (Pewarnaan Choropleth)</w:t>
+        <w:t>Persamaan: Persamaan Akumulasi Deforestasi (Pewarnaan Choropleth)</w:t>
       </w:r>
     </w:p>
     <w:p>
@@ -7143,7 +7020,7 @@
           <w:color w:val="1B5E20"/>
           <w:sz w:val="17"/>
         </w:rPr>
-        <w:t>Kumulatif_Deforestasi_Ha = CUMSUM(Total_Deforestasi_Ha) OVER (ORDER BY Tahun)</w:t>
+        <w:t>Kumulatif_Deforestasi_p(T) = Σ ( Deforestasi_p,t )   ;   untuk t = 2014 s.d. T</w:t>
       </w:r>
     </w:p>
     <w:p>
@@ -7168,7 +7045,7 @@
           <w:color w:val="1B5E20"/>
           <w:sz w:val="16"/>
         </w:rPr>
-        <w:t xml:space="preserve">- Kumulatif_Deforestasi_Ha: </w:t>
+        <w:t xml:space="preserve">- Kumulatif_Deforestasi_p(T): </w:t>
       </w:r>
       <w:r>
         <w:rPr>
@@ -7177,7 +7054,7 @@
           <w:color w:val="444444"/>
           <w:sz w:val="16"/>
         </w:rPr>
-        <w:t>Akumulasi total deforestasi per provinsi yang merepresentasikan level keparahan pada gradasi warna peta.</w:t>
+        <w:t>Akumulasi total deforestasi (Ha) provinsi p hingga tahun berjalan T yang merepresentasikan level keparahan pada gradasi warna peta.</w:t>
         <w:br/>
       </w:r>
       <w:r>
@@ -7187,7 +7064,7 @@
           <w:color w:val="1B5E20"/>
           <w:sz w:val="16"/>
         </w:rPr>
-        <w:t xml:space="preserve">- Total_Deforestasi_Ha: </w:t>
+        <w:t xml:space="preserve">- Deforestasi_p,t: </w:t>
       </w:r>
       <w:r>
         <w:rPr>
@@ -7196,7 +7073,7 @@
           <w:color w:val="444444"/>
           <w:sz w:val="16"/>
         </w:rPr>
-        <w:t>Variabel Dampak Ruang (Dependen): deforestasi alam per tahun.</w:t>
+        <w:t>Variabel Dampak Ruang (Dependen): deforestasi alam (Ha) di provinsi p pada tahun t.</w:t>
       </w:r>
     </w:p>
     <w:p>
@@ -7210,7 +7087,7 @@
           <w:color w:val="2E7D32"/>
           <w:sz w:val="17"/>
         </w:rPr>
-        <w:t>Persamaan: Persamaan Kategorisasi Median Panel 2x2</w:t>
+        <w:t>Persamaan: Persamaan Kategorisasi Median Panel 2x2 (Fungsi Piecewise)</w:t>
       </w:r>
     </w:p>
     <w:p>
@@ -7233,7 +7110,7 @@
           <w:color w:val="1B5E20"/>
           <w:sz w:val="17"/>
         </w:rPr>
-        <w:t>Kategori = IF(Nilai &gt;= Median(Seluruh Panel), 'Tinggi/Parah', 'Rendah')</w:t>
+        <w:t>Kategori(x) = 'Tinggi/Parah' , jika x ≥ Median(Panel)   |   'Rendah' , jika x &lt; Median(Panel)</w:t>
       </w:r>
     </w:p>
     <w:p>
@@ -7342,7 +7219,7 @@
           <w:color w:val="1B5E20"/>
           <w:sz w:val="17"/>
         </w:rPr>
-        <w:t>Chi_Square (χ²) = Jumlah [ (Frekuensi_Observasi - Frekuensi_Harapan)^2 / Frekuensi_Harapan ]</w:t>
+        <w:t>χ² = Σ [ ( O_ij - E_ij )² / E_ij ]   ;   dengan E_ij = ( Total_Baris_i × Total_Kolom_j ) / N</w:t>
       </w:r>
     </w:p>
     <w:p>
@@ -7367,7 +7244,7 @@
           <w:color w:val="1B5E20"/>
           <w:sz w:val="16"/>
         </w:rPr>
-        <w:t xml:space="preserve">- Chi_Square (χ²): </w:t>
+        <w:t xml:space="preserve">- χ²: </w:t>
       </w:r>
       <w:r>
         <w:rPr>
@@ -7386,7 +7263,7 @@
           <w:color w:val="1B5E20"/>
           <w:sz w:val="16"/>
         </w:rPr>
-        <w:t xml:space="preserve">- Frekuensi_Observasi (O): </w:t>
+        <w:t xml:space="preserve">- O_ij: </w:t>
       </w:r>
       <w:r>
         <w:rPr>
@@ -7395,7 +7272,7 @@
           <w:color w:val="444444"/>
           <w:sz w:val="16"/>
         </w:rPr>
-        <w:t>Jumlah kasus aktual yang tercatat pada sel tabel kontinjensi 2x2.</w:t>
+        <w:t>Frekuensi Observasi: jumlah kasus aktual yang tercatat pada sel baris i kolom j tabel kontinjensi 2x2.</w:t>
         <w:br/>
       </w:r>
       <w:r>
@@ -7405,7 +7282,7 @@
           <w:color w:val="1B5E20"/>
           <w:sz w:val="16"/>
         </w:rPr>
-        <w:t xml:space="preserve">- Frekuensi_Harapan (E): </w:t>
+        <w:t xml:space="preserve">- E_ij: </w:t>
       </w:r>
       <w:r>
         <w:rPr>
@@ -7414,7 +7291,7 @@
           <w:color w:val="444444"/>
           <w:sz w:val="16"/>
         </w:rPr>
-        <w:t>Jumlah kasus teoretis jika ekspansi industri dan deforestasi saling independen: E = (Total Baris * Total Kolom) / N.</w:t>
+        <w:t>Frekuensi Harapan: jumlah kasus teoretis jika ekspansi industri dan deforestasi saling independen, E_ij = ( Total_Baris_i × Total_Kolom_j ) / N.</w:t>
       </w:r>
     </w:p>
     <w:p>
@@ -7451,7 +7328,7 @@
           <w:color w:val="1B5E20"/>
           <w:sz w:val="17"/>
         </w:rPr>
-        <w:t>Odds_Ratio (OR) = ( a * d ) / ( b * c )</w:t>
+        <w:t>Odds_Ratio (OR) = ( a × d ) / ( b × c )</w:t>
       </w:r>
     </w:p>
     <w:p>
@@ -7599,7 +7476,7 @@
           <w:color w:val="222222"/>
           <w:sz w:val="19"/>
         </w:rPr>
-        <w:t>Tabel 2.5</w:t>
+        <w:t>Tabel 2.6</w:t>
       </w:r>
       <w:r>
         <w:rPr>
@@ -7622,7 +7499,7 @@
           <w:color w:val="2E7D32"/>
           <w:sz w:val="17"/>
         </w:rPr>
-        <w:t>Tabel 2.5: Rincian Empiris Luas Konsesi IUP-Kawasan Industri dan Deforestasi Kumulatif per Provinsi (2014-2023)</w:t>
+        <w:t>Tabel 2.6: Rincian Empiris Luas Konsesi IUP-Kawasan Industri dan Deforestasi Kumulatif per Provinsi (2014-2023)</w:t>
       </w:r>
     </w:p>
     <w:tbl>
@@ -8576,7 +8453,7 @@
           <w:color w:val="222222"/>
           <w:sz w:val="19"/>
         </w:rPr>
-        <w:t>Tabel 2.6</w:t>
+        <w:t>Tabel 2.7</w:t>
       </w:r>
       <w:r>
         <w:rPr>
@@ -8599,7 +8476,7 @@
           <w:color w:val="2E7D32"/>
           <w:sz w:val="17"/>
         </w:rPr>
-        <w:t>Tabel 2.6: Ringkasan Eksekutif Skenario Crosstab Ekspansi Industri vs Deforestasi Bab 2</w:t>
+        <w:t>Tabel 2.7: Ringkasan Eksekutif Skenario Crosstab Ekspansi Industri vs Deforestasi Bab 2</w:t>
       </w:r>
     </w:p>
     <w:tbl>
@@ -9688,7 +9565,7 @@
                 <w:color w:val="222222"/>
                 <w:sz w:val="17"/>
               </w:rPr>
-              <w:t>Agregasi tabular GROUP BY Faktor_Pendorong dengan kuantifikasi proporsi absolut (tanpa uji inferensial)</w:t>
+              <w:t>Agregasi tabular per kelompok Faktor Pendorong dengan kuantifikasi proporsi absolut (tanpa uji inferensial)</w:t>
             </w:r>
           </w:p>
         </w:tc>
@@ -9744,7 +9621,7 @@
           <w:color w:val="2E7D32"/>
           <w:sz w:val="17"/>
         </w:rPr>
-        <w:t>Persamaan: Agregasi Total Deforestasi per Faktor Pendorong</w:t>
+        <w:t>Persamaan: Persamaan Agregasi Total Deforestasi per Faktor Pendorong</w:t>
       </w:r>
     </w:p>
     <w:p>
@@ -9767,7 +9644,7 @@
           <w:color w:val="1B5E20"/>
           <w:sz w:val="17"/>
         </w:rPr>
-        <w:t>Total_Deforestasi = SUM(Luas_Deforestasi_Ha) GROUP BY Faktor_Pendorong</w:t>
+        <w:t>Total_Deforestasi_k = Σ ( Luas_Deforestasi_i )   ;   untuk seluruh observasi i dengan Faktor_Pendorong k</w:t>
       </w:r>
     </w:p>
     <w:p>
@@ -9792,7 +9669,7 @@
           <w:color w:val="1B5E20"/>
           <w:sz w:val="16"/>
         </w:rPr>
-        <w:t xml:space="preserve">- Total_Deforestasi: </w:t>
+        <w:t xml:space="preserve">- Total_Deforestasi_k: </w:t>
       </w:r>
       <w:r>
         <w:rPr>
@@ -9801,7 +9678,7 @@
           <w:color w:val="444444"/>
           <w:sz w:val="16"/>
         </w:rPr>
-        <w:t>Total kehilangan tutupan pohon (Ha) yang diatribusikan pada faktor pendorong observasi.</w:t>
+        <w:t>Total kehilangan tutupan pohon (Ha) yang diatribusikan pada faktor pendorong k.</w:t>
         <w:br/>
       </w:r>
       <w:r>
@@ -9811,7 +9688,7 @@
           <w:color w:val="1B5E20"/>
           <w:sz w:val="16"/>
         </w:rPr>
-        <w:t xml:space="preserve">- Luas_Deforestasi_Ha: </w:t>
+        <w:t xml:space="preserve">- Luas_Deforestasi_i: </w:t>
       </w:r>
       <w:r>
         <w:rPr>
@@ -9820,7 +9697,7 @@
           <w:color w:val="444444"/>
           <w:sz w:val="16"/>
         </w:rPr>
-        <w:t>Variabel Dependen (Y1): kehilangan tutupan pohon per hektar.</w:t>
+        <w:t>Variabel Dependen (Y1): kehilangan tutupan pohon (Ha) pada observasi provinsi-tahun ke-i.</w:t>
         <w:br/>
       </w:r>
       <w:r>
@@ -9830,7 +9707,7 @@
           <w:color w:val="1B5E20"/>
           <w:sz w:val="16"/>
         </w:rPr>
-        <w:t xml:space="preserve">- Faktor_Pendorong: </w:t>
+        <w:t xml:space="preserve">- k: </w:t>
       </w:r>
       <w:r>
         <w:rPr>
@@ -9839,7 +9716,7 @@
           <w:color w:val="444444"/>
           <w:sz w:val="16"/>
         </w:rPr>
-        <w:t>Variabel Independen (X): kategori aktivitas penyebab hilangnya hutan.</w:t>
+        <w:t>Variabel Independen (X): indeks kelompok faktor pendorong / kategori aktivitas penyebab hilangnya hutan.</w:t>
       </w:r>
     </w:p>
     <w:p>
@@ -9853,7 +9730,7 @@
           <w:color w:val="2E7D32"/>
           <w:sz w:val="17"/>
         </w:rPr>
-        <w:t>Persamaan: Agregasi Total Emisi per Faktor Pendorong</w:t>
+        <w:t>Persamaan: Persamaan Agregasi Total Emisi per Faktor Pendorong</w:t>
       </w:r>
     </w:p>
     <w:p>
@@ -9876,7 +9753,7 @@
           <w:color w:val="1B5E20"/>
           <w:sz w:val="17"/>
         </w:rPr>
-        <w:t>Total_Emisi = SUM(Emisi_CO2_Megagram) GROUP BY Faktor_Pendorong</w:t>
+        <w:t>Total_Emisi_k = Σ ( Emisi_CO2_i )   ;   untuk seluruh observasi i dengan Faktor_Pendorong k</w:t>
       </w:r>
     </w:p>
     <w:p>
@@ -9901,7 +9778,7 @@
           <w:color w:val="1B5E20"/>
           <w:sz w:val="16"/>
         </w:rPr>
-        <w:t xml:space="preserve">- Total_Emisi: </w:t>
+        <w:t xml:space="preserve">- Total_Emisi_k: </w:t>
       </w:r>
       <w:r>
         <w:rPr>
@@ -9910,7 +9787,7 @@
           <w:color w:val="444444"/>
           <w:sz w:val="16"/>
         </w:rPr>
-        <w:t>Total pelepasan gas rumah kaca dari konversi biomasa per faktor pendorong.</w:t>
+        <w:t>Total pelepasan gas rumah kaca (Megagram CO2) dari konversi biomasa yang diatribusikan pada faktor pendorong k.</w:t>
         <w:br/>
       </w:r>
       <w:r>
@@ -9920,7 +9797,7 @@
           <w:color w:val="1B5E20"/>
           <w:sz w:val="16"/>
         </w:rPr>
-        <w:t xml:space="preserve">- Emisi_CO2_Megagram: </w:t>
+        <w:t xml:space="preserve">- Emisi_CO2_i: </w:t>
       </w:r>
       <w:r>
         <w:rPr>
@@ -9929,7 +9806,7 @@
           <w:color w:val="444444"/>
           <w:sz w:val="16"/>
         </w:rPr>
-        <w:t>Variabel Dependen (Y2): kuantitas karbon dioksida ekuivalen yang terlepas ke atmosfer.</w:t>
+        <w:t>Variabel Dependen (Y2): kuantitas karbon dioksida ekuivalen yang terlepas ke atmosfer pada observasi ke-i.</w:t>
       </w:r>
     </w:p>
     <w:p>
@@ -9943,7 +9820,7 @@
           <w:color w:val="2E7D32"/>
           <w:sz w:val="17"/>
         </w:rPr>
-        <w:t>Persamaan: Kuantifikasi Proporsi Kontribusi Driver</w:t>
+        <w:t>Persamaan: Persamaan Kuantifikasi Proporsi Kontribusi Driver</w:t>
       </w:r>
     </w:p>
     <w:p>
@@ -9966,7 +9843,7 @@
           <w:color w:val="1B5E20"/>
           <w:sz w:val="17"/>
         </w:rPr>
-        <w:t>Persentase_Driver (%) = ( Total_Deforestasi_Driver / Total_Deforestasi_Kumulatif ) * 100</w:t>
+        <w:t>Persentase_Driver_k (%) = ( Total_Deforestasi_k / Total_Deforestasi_Kumulatif ) × 100</w:t>
       </w:r>
     </w:p>
     <w:p>
@@ -9991,7 +9868,7 @@
           <w:color w:val="1B5E20"/>
           <w:sz w:val="16"/>
         </w:rPr>
-        <w:t xml:space="preserve">- Persentase_Driver (%): </w:t>
+        <w:t xml:space="preserve">- Persentase_Driver_k (%): </w:t>
       </w:r>
       <w:r>
         <w:rPr>
@@ -10000,7 +9877,7 @@
           <w:color w:val="444444"/>
           <w:sz w:val="16"/>
         </w:rPr>
-        <w:t>Rasio kontribusi absolut luasan deforestasi faktor pendorong terhadap total kumulatif deforestasi.</w:t>
+        <w:t>Rasio kontribusi absolut luasan deforestasi faktor pendorong k terhadap total kumulatif deforestasi.</w:t>
         <w:br/>
       </w:r>
       <w:r>
@@ -10033,7 +9910,7 @@
           <w:color w:val="2E7D32"/>
           <w:sz w:val="17"/>
         </w:rPr>
-        <w:t>Persamaan: Rasio Perbandingan Industri Ekstraktif vs Pertanian Masyarakat</w:t>
+        <w:t>Persamaan: Persamaan Rasio Perbandingan Industri Ekstraktif vs Pertanian Masyarakat</w:t>
       </w:r>
     </w:p>
     <w:p>
@@ -11006,6 +10883,3072 @@
           <w:sz w:val="19"/>
         </w:rPr>
         <w:t>Pengendalian deforestasi memerlukan evaluasi tata ruang perizinan pertambangan dan pengawasan ketat terhadap pembukaan lahan komoditas di wilayah tutupan hutan.</w:t>
+      </w:r>
+    </w:p>
+    <w:p>
+      <w:pPr>
+        <w:spacing w:before="240" w:after="80"/>
+        <w:pBdr>
+          <w:bottom w:val="single" w:sz="6" w:space="2" w:color="2E7D32"/>
+        </w:pBdr>
+      </w:pPr>
+      <w:r>
+        <w:rPr>
+          <w:b/>
+          <w:i w:val="0"/>
+          <w:color w:val="2E7D32"/>
+          <w:sz w:val="22"/>
+        </w:rPr>
+        <w:t>2.5. KEHANCURAN BIODIVERSITAS: DAMPAK TERHADAP HABITAT SATWA ENDEMIK</w:t>
+      </w:r>
+    </w:p>
+    <w:p>
+      <w:pPr>
+        <w:spacing w:before="120" w:after="120"/>
+        <w:ind w:left="200"/>
+        <w:pBdr>
+          <w:left w:val="single" w:sz="16" w:space="6" w:color="2E7D32"/>
+        </w:pBdr>
+        <w:shd w:val="clear" w:color="auto" w:fill="F1F8E9"/>
+      </w:pPr>
+      <w:r>
+        <w:rPr>
+          <w:b/>
+          <w:i w:val="0"/>
+          <w:color w:val="1B5E20"/>
+          <w:sz w:val="17"/>
+        </w:rPr>
+        <w:t xml:space="preserve">SUMBER DATA RESMI &amp; DESKRIPSI VISUALISASI: </w:t>
+      </w:r>
+      <w:r>
+        <w:rPr>
+          <w:b w:val="0"/>
+          <w:i/>
+          <w:color w:val="333333"/>
+          <w:sz w:val="17"/>
+        </w:rPr>
+        <w:t>Data Perjumpaan GBIF: data/raw/gbif_sulawesi_occurrences.csv; Data Status IUCN: data/processed/sulawesi_biodiversitas_iucn_fase5_exploded.csv. Visualisasi dashboard menampilkan peta spasial titik occurrence GBIF dan tabel validasi ancaman IUCN Red List.</w:t>
+      </w:r>
+    </w:p>
+    <w:p>
+      <w:pPr>
+        <w:spacing w:before="160" w:after="40"/>
+      </w:pPr>
+      <w:r>
+        <w:rPr>
+          <w:b/>
+          <w:i w:val="0"/>
+          <w:color w:val="2E7D32"/>
+          <w:sz w:val="19"/>
+        </w:rPr>
+        <w:t>A. Pengantar &amp; Kerangka Narasi</w:t>
+      </w:r>
+    </w:p>
+    <w:p>
+      <w:pPr>
+        <w:spacing w:after="100"/>
+        <w:jc w:val="both"/>
+      </w:pPr>
+      <w:r>
+        <w:rPr>
+          <w:b w:val="0"/>
+          <w:i w:val="0"/>
+          <w:color w:val="222222"/>
+          <w:sz w:val="19"/>
+        </w:rPr>
+        <w:t xml:space="preserve">Pulau Sulawesi merupakan wilayah yang memiliki keanekaragaman hayati endemik yang khas di kawasan Wallacea. Perubahan tutupan lahan akibat ekspansi pertambangan nikel dan kawasan industri berimplikasi pada fragmentasi habitat flora dan fauna endemik. </w:t>
+      </w:r>
+      <w:r>
+        <w:rPr>
+          <w:b w:val="0"/>
+          <w:i w:val="0"/>
+          <w:color w:val="222222"/>
+          <w:sz w:val="19"/>
+        </w:rPr>
+        <w:t xml:space="preserve">Data spasial dari GBIF memetakan sebanyak 269 titik koordinat keberadaan (occurrence) dari 7 spesies endemik kunci. </w:t>
+      </w:r>
+      <w:r>
+        <w:rPr>
+          <w:b w:val="0"/>
+          <w:i w:val="0"/>
+          <w:color w:val="222222"/>
+          <w:sz w:val="19"/>
+        </w:rPr>
+        <w:t>Berdasarkan IUCN Red List, tercatat 2 spesies berstatus Terancam Kritis (Critically Endangered), 2 spesies Rentan Bahaya (Endangered), dan 3 spesies Rentan (Vulnerable).</w:t>
+      </w:r>
+    </w:p>
+    <w:p>
+      <w:pPr>
+        <w:spacing w:after="100"/>
+        <w:jc w:val="both"/>
+      </w:pPr>
+      <w:r>
+        <w:rPr>
+          <w:b w:val="0"/>
+          <w:i w:val="0"/>
+          <w:color w:val="222222"/>
+          <w:sz w:val="19"/>
+        </w:rPr>
+        <w:t>Catatan IUCN menunjukkan 4 dari 7 spesies endemik kunci memiliki penanda Mining Threat. Dengan demikian, sub-bab ini tidak menggunakan uji inferensial Chi-Square, melainkan Spatial Mapping (GBIF) dan Analisis IUCN Red List untuk membaca irisan antara habitat satwa endemik, status keterancaman, dan tekanan pertambangan.</w:t>
+      </w:r>
+    </w:p>
+    <w:p>
+      <w:pPr>
+        <w:spacing w:before="160" w:after="40"/>
+      </w:pPr>
+      <w:r>
+        <w:rPr>
+          <w:b/>
+          <w:i w:val="0"/>
+          <w:color w:val="2E7D32"/>
+          <w:sz w:val="19"/>
+        </w:rPr>
+        <w:t>B. Alur Logika Metodologis Spatial Mapping GBIF &amp; Analisis IUCN Red List</w:t>
+      </w:r>
+    </w:p>
+    <w:p>
+      <w:pPr>
+        <w:spacing w:after="100"/>
+        <w:jc w:val="both"/>
+      </w:pPr>
+      <w:r>
+        <w:rPr>
+          <w:b w:val="0"/>
+          <w:i w:val="0"/>
+          <w:color w:val="222222"/>
+          <w:sz w:val="19"/>
+        </w:rPr>
+        <w:t xml:space="preserve">Kerangka pemetaan titik koordinat perjumpaan satwa dan sintesis status konservasi internasional diilustrasikan pada </w:t>
+      </w:r>
+      <w:r>
+        <w:rPr>
+          <w:b/>
+          <w:i w:val="0"/>
+          <w:color w:val="222222"/>
+          <w:sz w:val="19"/>
+        </w:rPr>
+        <w:t>Bagan Alur 2.5</w:t>
+      </w:r>
+      <w:r>
+        <w:rPr>
+          <w:b w:val="0"/>
+          <w:i w:val="0"/>
+          <w:color w:val="222222"/>
+          <w:sz w:val="19"/>
+        </w:rPr>
+        <w:t xml:space="preserve"> berikut. Konfigurasi variabel analisis dirinci pada Tabel 2.5a di bawah gambar.</w:t>
+      </w:r>
+    </w:p>
+    <w:p>
+      <w:pPr>
+        <w:spacing w:before="120" w:after="40"/>
+      </w:pPr>
+      <w:r>
+        <w:rPr>
+          <w:b/>
+          <w:i/>
+          <w:color w:val="2E7D32"/>
+          <w:sz w:val="17"/>
+        </w:rPr>
+        <w:t>Bagan Alur 2.5: Alur Logika Metodologis Spatial Mapping GBIF &amp; Analisis IUCN Red List</w:t>
+      </w:r>
+    </w:p>
+    <w:p>
+      <w:pPr>
+        <w:jc w:val="center"/>
+      </w:pPr>
+      <w:r>
+        <w:drawing>
+          <wp:inline xmlns:a="http://schemas.openxmlformats.org/drawingml/2006/main" xmlns:pic="http://schemas.openxmlformats.org/drawingml/2006/picture">
+            <wp:extent cx="5400000" cy="1817581"/>
+            <wp:docPr id="5" name="Picture 5"/>
+            <wp:cNvGraphicFramePr>
+              <a:graphicFrameLocks noChangeAspect="1"/>
+            </wp:cNvGraphicFramePr>
+            <a:graphic>
+              <a:graphicData uri="http://schemas.openxmlformats.org/drawingml/2006/picture">
+                <pic:pic>
+                  <pic:nvPicPr>
+                    <pic:cNvPr id="0" name="mermaid_flowchart_2_5.png"/>
+                    <pic:cNvPicPr/>
+                  </pic:nvPicPr>
+                  <pic:blipFill>
+                    <a:blip r:embed="rId13"/>
+                    <a:stretch>
+                      <a:fillRect/>
+                    </a:stretch>
+                  </pic:blipFill>
+                  <pic:spPr>
+                    <a:xfrm>
+                      <a:off x="0" y="0"/>
+                      <a:ext cx="5400000" cy="1817581"/>
+                    </a:xfrm>
+                    <a:prstGeom prst="rect"/>
+                  </pic:spPr>
+                </pic:pic>
+              </a:graphicData>
+            </a:graphic>
+          </wp:inline>
+        </w:drawing>
+      </w:r>
+    </w:p>
+    <w:p>
+      <w:pPr>
+        <w:spacing w:before="40" w:after="80"/>
+      </w:pPr>
+    </w:p>
+    <w:p>
+      <w:pPr>
+        <w:spacing w:before="120" w:after="40"/>
+      </w:pPr>
+      <w:r>
+        <w:rPr>
+          <w:b/>
+          <w:i/>
+          <w:color w:val="2E7D32"/>
+          <w:sz w:val="17"/>
+        </w:rPr>
+        <w:t>Tabel 2.5a: Konfigurasi Variabel Analisis Spatial Mapping &amp; IUCN Red List (Sub-bab 2.5)</w:t>
+      </w:r>
+    </w:p>
+    <w:tbl>
+      <w:tblPr>
+        <w:tblStyle w:val="TableGrid"/>
+        <w:tblW w:type="auto" w:w="0"/>
+        <w:jc w:val="center"/>
+        <w:tblLayout w:type="fixed"/>
+        <w:tblLook w:firstColumn="1" w:firstRow="1" w:lastColumn="0" w:lastRow="0" w:noHBand="0" w:noVBand="1" w:val="04A0"/>
+      </w:tblPr>
+      <w:tblGrid>
+        <w:gridCol w:w="4819"/>
+        <w:gridCol w:w="4819"/>
+      </w:tblGrid>
+      <w:tr>
+        <w:tc>
+          <w:tcPr>
+            <w:tcW w:type="dxa" w:w="2551"/>
+            <w:shd w:val="clear" w:color="auto" w:fill="2E7D32"/>
+            <w:tcMar>
+              <w:top w:w="70" w:type="dxa"/>
+              <w:bottom w:w="70" w:type="dxa"/>
+              <w:left w:w="100" w:type="dxa"/>
+              <w:right w:w="100" w:type="dxa"/>
+            </w:tcMar>
+            <w:tcBorders>
+              <w:top w:val="single" w:sz="4" w:color="D0D0D0" w:space="0"/>
+              <w:left w:val="single" w:sz="4" w:color="D0D0D0" w:space="0"/>
+              <w:bottom w:val="single" w:sz="8" w:color="1B5E20" w:space="0"/>
+              <w:right w:val="single" w:sz="4" w:color="D0D0D0" w:space="0"/>
+            </w:tcBorders>
+          </w:tcPr>
+          <w:p>
+            <w:pPr>
+              <w:jc w:val="left"/>
+            </w:pPr>
+            <w:r>
+              <w:rPr>
+                <w:b/>
+                <w:i w:val="0"/>
+                <w:color w:val="FFFFFF"/>
+                <w:sz w:val="17"/>
+              </w:rPr>
+              <w:t>Komponen Analisis</w:t>
+            </w:r>
+          </w:p>
+        </w:tc>
+        <w:tc>
+          <w:tcPr>
+            <w:tcW w:type="dxa" w:w="6236"/>
+            <w:shd w:val="clear" w:color="auto" w:fill="2E7D32"/>
+            <w:tcMar>
+              <w:top w:w="70" w:type="dxa"/>
+              <w:bottom w:w="70" w:type="dxa"/>
+              <w:left w:w="100" w:type="dxa"/>
+              <w:right w:w="100" w:type="dxa"/>
+            </w:tcMar>
+            <w:tcBorders>
+              <w:top w:val="single" w:sz="4" w:color="D0D0D0" w:space="0"/>
+              <w:left w:val="single" w:sz="4" w:color="D0D0D0" w:space="0"/>
+              <w:bottom w:val="single" w:sz="8" w:color="1B5E20" w:space="0"/>
+              <w:right w:val="single" w:sz="4" w:color="D0D0D0" w:space="0"/>
+            </w:tcBorders>
+          </w:tcPr>
+          <w:p>
+            <w:pPr>
+              <w:jc w:val="left"/>
+            </w:pPr>
+            <w:r>
+              <w:rPr>
+                <w:b/>
+                <w:i w:val="0"/>
+                <w:color w:val="FFFFFF"/>
+                <w:sz w:val="17"/>
+              </w:rPr>
+              <w:t>Definisi Variabel (Sub-bab 2.5)</w:t>
+            </w:r>
+          </w:p>
+        </w:tc>
+      </w:tr>
+      <w:tr>
+        <w:tc>
+          <w:tcPr>
+            <w:tcW w:type="dxa" w:w="2551"/>
+            <w:shd w:val="clear" w:color="auto" w:fill="F5FBF5"/>
+            <w:tcMar>
+              <w:top w:w="50" w:type="dxa"/>
+              <w:bottom w:w="50" w:type="dxa"/>
+              <w:left w:w="100" w:type="dxa"/>
+              <w:right w:w="100" w:type="dxa"/>
+            </w:tcMar>
+            <w:tcBorders>
+              <w:top w:val="single" w:sz="4" w:color="D0D0D0" w:space="0"/>
+              <w:left w:val="single" w:sz="4" w:color="D0D0D0" w:space="0"/>
+              <w:bottom w:val="single" w:sz="4" w:color="D0D0D0" w:space="0"/>
+              <w:right w:val="single" w:sz="4" w:color="D0D0D0" w:space="0"/>
+            </w:tcBorders>
+          </w:tcPr>
+          <w:p>
+            <w:pPr>
+              <w:jc w:val="left"/>
+            </w:pPr>
+            <w:r>
+              <w:rPr>
+                <w:b w:val="0"/>
+                <w:i w:val="0"/>
+                <w:color w:val="222222"/>
+                <w:sz w:val="17"/>
+              </w:rPr>
+              <w:t>Variabel Lokasi</w:t>
+            </w:r>
+          </w:p>
+        </w:tc>
+        <w:tc>
+          <w:tcPr>
+            <w:tcW w:type="dxa" w:w="6236"/>
+            <w:shd w:val="clear" w:color="auto" w:fill="F5FBF5"/>
+            <w:tcMar>
+              <w:top w:w="50" w:type="dxa"/>
+              <w:bottom w:w="50" w:type="dxa"/>
+              <w:left w:w="100" w:type="dxa"/>
+              <w:right w:w="100" w:type="dxa"/>
+            </w:tcMar>
+            <w:tcBorders>
+              <w:top w:val="single" w:sz="4" w:color="D0D0D0" w:space="0"/>
+              <w:left w:val="single" w:sz="4" w:color="D0D0D0" w:space="0"/>
+              <w:bottom w:val="single" w:sz="4" w:color="D0D0D0" w:space="0"/>
+              <w:right w:val="single" w:sz="4" w:color="D0D0D0" w:space="0"/>
+            </w:tcBorders>
+          </w:tcPr>
+          <w:p>
+            <w:pPr>
+              <w:jc w:val="left"/>
+            </w:pPr>
+            <w:r>
+              <w:rPr>
+                <w:b w:val="0"/>
+                <w:i w:val="0"/>
+                <w:color w:val="222222"/>
+                <w:sz w:val="17"/>
+              </w:rPr>
+              <w:t>Titik Koordinat (Lat, Lon): lokasi perjumpaan aktual satwa endemik.</w:t>
+            </w:r>
+          </w:p>
+        </w:tc>
+      </w:tr>
+      <w:tr>
+        <w:tc>
+          <w:tcPr>
+            <w:tcW w:type="dxa" w:w="2551"/>
+            <w:shd w:val="clear" w:color="auto" w:fill="FFFFFF"/>
+            <w:tcMar>
+              <w:top w:w="50" w:type="dxa"/>
+              <w:bottom w:w="50" w:type="dxa"/>
+              <w:left w:w="100" w:type="dxa"/>
+              <w:right w:w="100" w:type="dxa"/>
+            </w:tcMar>
+            <w:tcBorders>
+              <w:top w:val="single" w:sz="4" w:color="D0D0D0" w:space="0"/>
+              <w:left w:val="single" w:sz="4" w:color="D0D0D0" w:space="0"/>
+              <w:bottom w:val="single" w:sz="4" w:color="D0D0D0" w:space="0"/>
+              <w:right w:val="single" w:sz="4" w:color="D0D0D0" w:space="0"/>
+            </w:tcBorders>
+          </w:tcPr>
+          <w:p>
+            <w:pPr>
+              <w:jc w:val="left"/>
+            </w:pPr>
+            <w:r>
+              <w:rPr>
+                <w:b w:val="0"/>
+                <w:i w:val="0"/>
+                <w:color w:val="222222"/>
+                <w:sz w:val="17"/>
+              </w:rPr>
+              <w:t>Identitas Taksonomi</w:t>
+            </w:r>
+          </w:p>
+        </w:tc>
+        <w:tc>
+          <w:tcPr>
+            <w:tcW w:type="dxa" w:w="6236"/>
+            <w:shd w:val="clear" w:color="auto" w:fill="FFFFFF"/>
+            <w:tcMar>
+              <w:top w:w="50" w:type="dxa"/>
+              <w:bottom w:w="50" w:type="dxa"/>
+              <w:left w:w="100" w:type="dxa"/>
+              <w:right w:w="100" w:type="dxa"/>
+            </w:tcMar>
+            <w:tcBorders>
+              <w:top w:val="single" w:sz="4" w:color="D0D0D0" w:space="0"/>
+              <w:left w:val="single" w:sz="4" w:color="D0D0D0" w:space="0"/>
+              <w:bottom w:val="single" w:sz="4" w:color="D0D0D0" w:space="0"/>
+              <w:right w:val="single" w:sz="4" w:color="D0D0D0" w:space="0"/>
+            </w:tcBorders>
+          </w:tcPr>
+          <w:p>
+            <w:pPr>
+              <w:jc w:val="left"/>
+            </w:pPr>
+            <w:r>
+              <w:rPr>
+                <w:b w:val="0"/>
+                <w:i w:val="0"/>
+                <w:color w:val="222222"/>
+                <w:sz w:val="17"/>
+              </w:rPr>
+              <w:t>Scientific Name dan Common Name: identitas spesies dari GBIF/IUCN.</w:t>
+            </w:r>
+          </w:p>
+        </w:tc>
+      </w:tr>
+      <w:tr>
+        <w:tc>
+          <w:tcPr>
+            <w:tcW w:type="dxa" w:w="2551"/>
+            <w:shd w:val="clear" w:color="auto" w:fill="F5FBF5"/>
+            <w:tcMar>
+              <w:top w:w="50" w:type="dxa"/>
+              <w:bottom w:w="50" w:type="dxa"/>
+              <w:left w:w="100" w:type="dxa"/>
+              <w:right w:w="100" w:type="dxa"/>
+            </w:tcMar>
+            <w:tcBorders>
+              <w:top w:val="single" w:sz="4" w:color="D0D0D0" w:space="0"/>
+              <w:left w:val="single" w:sz="4" w:color="D0D0D0" w:space="0"/>
+              <w:bottom w:val="single" w:sz="4" w:color="D0D0D0" w:space="0"/>
+              <w:right w:val="single" w:sz="4" w:color="D0D0D0" w:space="0"/>
+            </w:tcBorders>
+          </w:tcPr>
+          <w:p>
+            <w:pPr>
+              <w:jc w:val="left"/>
+            </w:pPr>
+            <w:r>
+              <w:rPr>
+                <w:b w:val="0"/>
+                <w:i w:val="0"/>
+                <w:color w:val="222222"/>
+                <w:sz w:val="17"/>
+              </w:rPr>
+              <w:t>Status Konservasi</w:t>
+            </w:r>
+          </w:p>
+        </w:tc>
+        <w:tc>
+          <w:tcPr>
+            <w:tcW w:type="dxa" w:w="6236"/>
+            <w:shd w:val="clear" w:color="auto" w:fill="F5FBF5"/>
+            <w:tcMar>
+              <w:top w:w="50" w:type="dxa"/>
+              <w:bottom w:w="50" w:type="dxa"/>
+              <w:left w:w="100" w:type="dxa"/>
+              <w:right w:w="100" w:type="dxa"/>
+            </w:tcMar>
+            <w:tcBorders>
+              <w:top w:val="single" w:sz="4" w:color="D0D0D0" w:space="0"/>
+              <w:left w:val="single" w:sz="4" w:color="D0D0D0" w:space="0"/>
+              <w:bottom w:val="single" w:sz="4" w:color="D0D0D0" w:space="0"/>
+              <w:right w:val="single" w:sz="4" w:color="D0D0D0" w:space="0"/>
+            </w:tcBorders>
+          </w:tcPr>
+          <w:p>
+            <w:pPr>
+              <w:jc w:val="left"/>
+            </w:pPr>
+            <w:r>
+              <w:rPr>
+                <w:b w:val="0"/>
+                <w:i w:val="0"/>
+                <w:color w:val="222222"/>
+                <w:sz w:val="17"/>
+              </w:rPr>
+              <w:t>Status: level ancaman IUCN Red List (Critically Endangered, Endangered, Vulnerable).</w:t>
+            </w:r>
+          </w:p>
+        </w:tc>
+      </w:tr>
+      <w:tr>
+        <w:tc>
+          <w:tcPr>
+            <w:tcW w:type="dxa" w:w="2551"/>
+            <w:shd w:val="clear" w:color="auto" w:fill="FFFFFF"/>
+            <w:tcMar>
+              <w:top w:w="50" w:type="dxa"/>
+              <w:bottom w:w="50" w:type="dxa"/>
+              <w:left w:w="100" w:type="dxa"/>
+              <w:right w:w="100" w:type="dxa"/>
+            </w:tcMar>
+            <w:tcBorders>
+              <w:top w:val="single" w:sz="4" w:color="D0D0D0" w:space="0"/>
+              <w:left w:val="single" w:sz="4" w:color="D0D0D0" w:space="0"/>
+              <w:bottom w:val="single" w:sz="4" w:color="D0D0D0" w:space="0"/>
+              <w:right w:val="single" w:sz="4" w:color="D0D0D0" w:space="0"/>
+            </w:tcBorders>
+          </w:tcPr>
+          <w:p>
+            <w:pPr>
+              <w:jc w:val="left"/>
+            </w:pPr>
+            <w:r>
+              <w:rPr>
+                <w:b w:val="0"/>
+                <w:i w:val="0"/>
+                <w:color w:val="222222"/>
+                <w:sz w:val="17"/>
+              </w:rPr>
+              <w:t>Ancaman Utama</w:t>
+            </w:r>
+          </w:p>
+        </w:tc>
+        <w:tc>
+          <w:tcPr>
+            <w:tcW w:type="dxa" w:w="6236"/>
+            <w:shd w:val="clear" w:color="auto" w:fill="FFFFFF"/>
+            <w:tcMar>
+              <w:top w:w="50" w:type="dxa"/>
+              <w:bottom w:w="50" w:type="dxa"/>
+              <w:left w:w="100" w:type="dxa"/>
+              <w:right w:w="100" w:type="dxa"/>
+            </w:tcMar>
+            <w:tcBorders>
+              <w:top w:val="single" w:sz="4" w:color="D0D0D0" w:space="0"/>
+              <w:left w:val="single" w:sz="4" w:color="D0D0D0" w:space="0"/>
+              <w:bottom w:val="single" w:sz="4" w:color="D0D0D0" w:space="0"/>
+              <w:right w:val="single" w:sz="4" w:color="D0D0D0" w:space="0"/>
+            </w:tcBorders>
+          </w:tcPr>
+          <w:p>
+            <w:pPr>
+              <w:jc w:val="left"/>
+            </w:pPr>
+            <w:r>
+              <w:rPr>
+                <w:b w:val="0"/>
+                <w:i w:val="0"/>
+                <w:color w:val="222222"/>
+                <w:sz w:val="17"/>
+              </w:rPr>
+              <w:t>Mining Threat: penanda apakah aktivitas pertambangan tercatat sebagai ancaman spesies.</w:t>
+            </w:r>
+          </w:p>
+        </w:tc>
+      </w:tr>
+      <w:tr>
+        <w:tc>
+          <w:tcPr>
+            <w:tcW w:type="dxa" w:w="2551"/>
+            <w:shd w:val="clear" w:color="auto" w:fill="F5FBF5"/>
+            <w:tcMar>
+              <w:top w:w="50" w:type="dxa"/>
+              <w:bottom w:w="50" w:type="dxa"/>
+              <w:left w:w="100" w:type="dxa"/>
+              <w:right w:w="100" w:type="dxa"/>
+            </w:tcMar>
+            <w:tcBorders>
+              <w:top w:val="single" w:sz="4" w:color="D0D0D0" w:space="0"/>
+              <w:left w:val="single" w:sz="4" w:color="D0D0D0" w:space="0"/>
+              <w:bottom w:val="single" w:sz="4" w:color="D0D0D0" w:space="0"/>
+              <w:right w:val="single" w:sz="4" w:color="D0D0D0" w:space="0"/>
+            </w:tcBorders>
+          </w:tcPr>
+          <w:p>
+            <w:pPr>
+              <w:jc w:val="left"/>
+            </w:pPr>
+            <w:r>
+              <w:rPr>
+                <w:b w:val="0"/>
+                <w:i w:val="0"/>
+                <w:color w:val="222222"/>
+                <w:sz w:val="17"/>
+              </w:rPr>
+              <w:t>Cakupan Data</w:t>
+            </w:r>
+          </w:p>
+        </w:tc>
+        <w:tc>
+          <w:tcPr>
+            <w:tcW w:type="dxa" w:w="6236"/>
+            <w:shd w:val="clear" w:color="auto" w:fill="F5FBF5"/>
+            <w:tcMar>
+              <w:top w:w="50" w:type="dxa"/>
+              <w:bottom w:w="50" w:type="dxa"/>
+              <w:left w:w="100" w:type="dxa"/>
+              <w:right w:w="100" w:type="dxa"/>
+            </w:tcMar>
+            <w:tcBorders>
+              <w:top w:val="single" w:sz="4" w:color="D0D0D0" w:space="0"/>
+              <w:left w:val="single" w:sz="4" w:color="D0D0D0" w:space="0"/>
+              <w:bottom w:val="single" w:sz="4" w:color="D0D0D0" w:space="0"/>
+              <w:right w:val="single" w:sz="4" w:color="D0D0D0" w:space="0"/>
+            </w:tcBorders>
+          </w:tcPr>
+          <w:p>
+            <w:pPr>
+              <w:jc w:val="left"/>
+            </w:pPr>
+            <w:r>
+              <w:rPr>
+                <w:b w:val="0"/>
+                <w:i w:val="0"/>
+                <w:color w:val="222222"/>
+                <w:sz w:val="17"/>
+              </w:rPr>
+              <w:t>269 titik GBIF, 7 spesies endemik kunci, 6 provinsi observasi.</w:t>
+            </w:r>
+          </w:p>
+        </w:tc>
+      </w:tr>
+    </w:tbl>
+    <w:p>
+      <w:pPr>
+        <w:spacing w:before="40" w:after="80"/>
+      </w:pPr>
+    </w:p>
+    <w:p>
+      <w:pPr>
+        <w:spacing w:before="160" w:after="40"/>
+      </w:pPr>
+      <w:r>
+        <w:rPr>
+          <w:b/>
+          <w:i w:val="0"/>
+          <w:color w:val="2E7D32"/>
+          <w:sz w:val="19"/>
+        </w:rPr>
+        <w:t>C. Formulasi Matematis: Occurrence, Status Keterancaman, dan Mining Threat</w:t>
+      </w:r>
+    </w:p>
+    <w:p>
+      <w:pPr>
+        <w:spacing w:after="100"/>
+        <w:jc w:val="both"/>
+      </w:pPr>
+      <w:r>
+        <w:rPr>
+          <w:b w:val="0"/>
+          <w:i w:val="0"/>
+          <w:color w:val="222222"/>
+          <w:sz w:val="19"/>
+        </w:rPr>
+        <w:t>Kuantifikasi sebaran titik perjumpaan, komposisi status konservasi, dan ancaman pertambangan dihitung menggunakan sistem formulasi matematis berikut:</w:t>
+      </w:r>
+    </w:p>
+    <w:p>
+      <w:pPr>
+        <w:spacing w:before="120" w:after="20"/>
+      </w:pPr>
+      <w:r>
+        <w:rPr>
+          <w:b/>
+          <w:i/>
+          <w:color w:val="2E7D32"/>
+          <w:sz w:val="17"/>
+        </w:rPr>
+        <w:t>Persamaan: Agregasi Titik Perjumpaan GBIF per Spesies</w:t>
+      </w:r>
+    </w:p>
+    <w:p>
+      <w:pPr>
+        <w:spacing w:before="0" w:after="40"/>
+        <w:ind w:left="240"/>
+        <w:shd w:val="clear" w:color="auto" w:fill="EDF7EE"/>
+        <w:pBdr>
+          <w:top w:val="single" w:sz="4" w:space="4" w:color="A5D6A7"/>
+          <w:left w:val="single" w:sz="4" w:space="4" w:color="A5D6A7"/>
+          <w:bottom w:val="single" w:sz="4" w:space="4" w:color="A5D6A7"/>
+          <w:right w:val="single" w:sz="4" w:space="4" w:color="A5D6A7"/>
+        </w:pBdr>
+      </w:pPr>
+      <w:r>
+        <w:rPr>
+          <w:rFonts w:ascii="Courier New" w:hAnsi="Courier New"/>
+          <w:b w:val="0"/>
+          <w:i w:val="0"/>
+          <w:color w:val="1B5E20"/>
+          <w:sz w:val="17"/>
+        </w:rPr>
+        <w:t>O_s = Σ o_i, untuk setiap titik occurrence i yang memiliki spesies s</w:t>
+      </w:r>
+    </w:p>
+    <w:p>
+      <w:pPr>
+        <w:spacing w:before="40" w:after="120"/>
+        <w:ind w:left="280"/>
+      </w:pPr>
+      <w:r>
+        <w:rPr>
+          <w:b/>
+          <w:i/>
+          <w:color w:val="333333"/>
+          <w:sz w:val="16"/>
+        </w:rPr>
+        <w:t>Keterangan Variabel:</w:t>
+        <w:br/>
+      </w:r>
+      <w:r>
+        <w:rPr>
+          <w:b/>
+          <w:i w:val="0"/>
+          <w:color w:val="1B5E20"/>
+          <w:sz w:val="16"/>
+        </w:rPr>
+        <w:t xml:space="preserve">- O_s: </w:t>
+      </w:r>
+      <w:r>
+        <w:rPr>
+          <w:b w:val="0"/>
+          <w:i w:val="0"/>
+          <w:color w:val="444444"/>
+          <w:sz w:val="16"/>
+        </w:rPr>
+        <w:t>Jumlah titik koordinat perjumpaan GBIF untuk spesies s.</w:t>
+        <w:br/>
+      </w:r>
+      <w:r>
+        <w:rPr>
+          <w:b/>
+          <w:i w:val="0"/>
+          <w:color w:val="1B5E20"/>
+          <w:sz w:val="16"/>
+        </w:rPr>
+        <w:t xml:space="preserve">- o_i: </w:t>
+      </w:r>
+      <w:r>
+        <w:rPr>
+          <w:b w:val="0"/>
+          <w:i w:val="0"/>
+          <w:color w:val="444444"/>
+          <w:sz w:val="16"/>
+        </w:rPr>
+        <w:t>Indikator titik perjumpaan ke-i yang terasosiasi dengan spesies s.</w:t>
+        <w:br/>
+      </w:r>
+      <w:r>
+        <w:rPr>
+          <w:b/>
+          <w:i w:val="0"/>
+          <w:color w:val="1B5E20"/>
+          <w:sz w:val="16"/>
+        </w:rPr>
+        <w:t xml:space="preserve">- s: </w:t>
+      </w:r>
+      <w:r>
+        <w:rPr>
+          <w:b w:val="0"/>
+          <w:i w:val="0"/>
+          <w:color w:val="444444"/>
+          <w:sz w:val="16"/>
+        </w:rPr>
+        <w:t>Spesies endemik kunci yang dianalisis.</w:t>
+      </w:r>
+    </w:p>
+    <w:p>
+      <w:pPr>
+        <w:spacing w:before="120" w:after="20"/>
+      </w:pPr>
+      <w:r>
+        <w:rPr>
+          <w:b/>
+          <w:i/>
+          <w:color w:val="2E7D32"/>
+          <w:sz w:val="17"/>
+        </w:rPr>
+        <w:t>Persamaan: Proporsi Status Konservasi IUCN</w:t>
+      </w:r>
+    </w:p>
+    <w:p>
+      <w:pPr>
+        <w:spacing w:before="0" w:after="40"/>
+        <w:ind w:left="240"/>
+        <w:shd w:val="clear" w:color="auto" w:fill="EDF7EE"/>
+        <w:pBdr>
+          <w:top w:val="single" w:sz="4" w:space="4" w:color="A5D6A7"/>
+          <w:left w:val="single" w:sz="4" w:space="4" w:color="A5D6A7"/>
+          <w:bottom w:val="single" w:sz="4" w:space="4" w:color="A5D6A7"/>
+          <w:right w:val="single" w:sz="4" w:space="4" w:color="A5D6A7"/>
+        </w:pBdr>
+      </w:pPr>
+      <w:r>
+        <w:rPr>
+          <w:rFonts w:ascii="Courier New" w:hAnsi="Courier New"/>
+          <w:b w:val="0"/>
+          <w:i w:val="0"/>
+          <w:color w:val="1B5E20"/>
+          <w:sz w:val="17"/>
+        </w:rPr>
+        <w:t>P_k (%) = ( N_k / N_total ) × 100</w:t>
+      </w:r>
+    </w:p>
+    <w:p>
+      <w:pPr>
+        <w:spacing w:before="40" w:after="120"/>
+        <w:ind w:left="280"/>
+      </w:pPr>
+      <w:r>
+        <w:rPr>
+          <w:b/>
+          <w:i/>
+          <w:color w:val="333333"/>
+          <w:sz w:val="16"/>
+        </w:rPr>
+        <w:t>Keterangan Variabel:</w:t>
+        <w:br/>
+      </w:r>
+      <w:r>
+        <w:rPr>
+          <w:b/>
+          <w:i w:val="0"/>
+          <w:color w:val="1B5E20"/>
+          <w:sz w:val="16"/>
+        </w:rPr>
+        <w:t xml:space="preserve">- P_k (%): </w:t>
+      </w:r>
+      <w:r>
+        <w:rPr>
+          <w:b w:val="0"/>
+          <w:i w:val="0"/>
+          <w:color w:val="444444"/>
+          <w:sz w:val="16"/>
+        </w:rPr>
+        <w:t>Persentase spesies pada kategori status konservasi k.</w:t>
+        <w:br/>
+      </w:r>
+      <w:r>
+        <w:rPr>
+          <w:b/>
+          <w:i w:val="0"/>
+          <w:color w:val="1B5E20"/>
+          <w:sz w:val="16"/>
+        </w:rPr>
+        <w:t xml:space="preserve">- N_k: </w:t>
+      </w:r>
+      <w:r>
+        <w:rPr>
+          <w:b w:val="0"/>
+          <w:i w:val="0"/>
+          <w:color w:val="444444"/>
+          <w:sz w:val="16"/>
+        </w:rPr>
+        <w:t>Jumlah spesies pada kategori Critically Endangered, Endangered, atau Vulnerable.</w:t>
+        <w:br/>
+      </w:r>
+      <w:r>
+        <w:rPr>
+          <w:b/>
+          <w:i w:val="0"/>
+          <w:color w:val="1B5E20"/>
+          <w:sz w:val="16"/>
+        </w:rPr>
+        <w:t xml:space="preserve">- N_total: </w:t>
+      </w:r>
+      <w:r>
+        <w:rPr>
+          <w:b w:val="0"/>
+          <w:i w:val="0"/>
+          <w:color w:val="444444"/>
+          <w:sz w:val="16"/>
+        </w:rPr>
+        <w:t>Total spesies endemik kunci yang dianalisis (7 spesies).</w:t>
+      </w:r>
+    </w:p>
+    <w:p>
+      <w:pPr>
+        <w:spacing w:before="120" w:after="20"/>
+      </w:pPr>
+      <w:r>
+        <w:rPr>
+          <w:b/>
+          <w:i/>
+          <w:color w:val="2E7D32"/>
+          <w:sz w:val="17"/>
+        </w:rPr>
+        <w:t>Persamaan: Rasio Spesies dengan Mining Threat</w:t>
+      </w:r>
+    </w:p>
+    <w:p>
+      <w:pPr>
+        <w:spacing w:before="0" w:after="40"/>
+        <w:ind w:left="240"/>
+        <w:shd w:val="clear" w:color="auto" w:fill="EDF7EE"/>
+        <w:pBdr>
+          <w:top w:val="single" w:sz="4" w:space="4" w:color="A5D6A7"/>
+          <w:left w:val="single" w:sz="4" w:space="4" w:color="A5D6A7"/>
+          <w:bottom w:val="single" w:sz="4" w:space="4" w:color="A5D6A7"/>
+          <w:right w:val="single" w:sz="4" w:space="4" w:color="A5D6A7"/>
+        </w:pBdr>
+      </w:pPr>
+      <w:r>
+        <w:rPr>
+          <w:rFonts w:ascii="Courier New" w:hAnsi="Courier New"/>
+          <w:b w:val="0"/>
+          <w:i w:val="0"/>
+          <w:color w:val="1B5E20"/>
+          <w:sz w:val="17"/>
+        </w:rPr>
+        <w:t>R_m (%) = ( N_m / N_total ) × 100</w:t>
+      </w:r>
+    </w:p>
+    <w:p>
+      <w:pPr>
+        <w:spacing w:before="40" w:after="120"/>
+        <w:ind w:left="280"/>
+      </w:pPr>
+      <w:r>
+        <w:rPr>
+          <w:b/>
+          <w:i/>
+          <w:color w:val="333333"/>
+          <w:sz w:val="16"/>
+        </w:rPr>
+        <w:t>Keterangan Variabel:</w:t>
+        <w:br/>
+      </w:r>
+      <w:r>
+        <w:rPr>
+          <w:b/>
+          <w:i w:val="0"/>
+          <w:color w:val="1B5E20"/>
+          <w:sz w:val="16"/>
+        </w:rPr>
+        <w:t xml:space="preserve">- R_m (%): </w:t>
+      </w:r>
+      <w:r>
+        <w:rPr>
+          <w:b w:val="0"/>
+          <w:i w:val="0"/>
+          <w:color w:val="444444"/>
+          <w:sz w:val="16"/>
+        </w:rPr>
+        <w:t>Persentase spesies yang memiliki penanda ancaman pertambangan dalam data IUCN.</w:t>
+        <w:br/>
+      </w:r>
+      <w:r>
+        <w:rPr>
+          <w:b/>
+          <w:i w:val="0"/>
+          <w:color w:val="1B5E20"/>
+          <w:sz w:val="16"/>
+        </w:rPr>
+        <w:t xml:space="preserve">- N_m: </w:t>
+      </w:r>
+      <w:r>
+        <w:rPr>
+          <w:b w:val="0"/>
+          <w:i w:val="0"/>
+          <w:color w:val="444444"/>
+          <w:sz w:val="16"/>
+        </w:rPr>
+        <w:t>Jumlah spesies dengan Mining Threat = Yes (4 spesies).</w:t>
+      </w:r>
+    </w:p>
+    <w:p>
+      <w:pPr>
+        <w:spacing w:before="160" w:after="40"/>
+      </w:pPr>
+      <w:r>
+        <w:rPr>
+          <w:b/>
+          <w:i w:val="0"/>
+          <w:color w:val="2E7D32"/>
+          <w:sz w:val="19"/>
+        </w:rPr>
+        <w:t>D. Matriks Hasil Uji Empiris: Occurrence GBIF dan Status IUCN</w:t>
+      </w:r>
+    </w:p>
+    <w:p>
+      <w:pPr>
+        <w:spacing w:after="100"/>
+        <w:jc w:val="both"/>
+      </w:pPr>
+      <w:r>
+        <w:rPr>
+          <w:b w:val="0"/>
+          <w:i w:val="0"/>
+          <w:color w:val="222222"/>
+          <w:sz w:val="19"/>
+        </w:rPr>
+        <w:t xml:space="preserve">Rincian status konservasi, tren populasi, penanda ancaman pertambangan, dan jumlah titik occurrence GBIF per spesies disajikan pada </w:t>
+      </w:r>
+      <w:r>
+        <w:rPr>
+          <w:b/>
+          <w:i w:val="0"/>
+          <w:color w:val="222222"/>
+          <w:sz w:val="19"/>
+        </w:rPr>
+        <w:t>Tabel 2.9</w:t>
+      </w:r>
+      <w:r>
+        <w:rPr>
+          <w:b w:val="0"/>
+          <w:i w:val="0"/>
+          <w:color w:val="222222"/>
+          <w:sz w:val="19"/>
+        </w:rPr>
+        <w:t xml:space="preserve"> berikut:</w:t>
+      </w:r>
+    </w:p>
+    <w:p>
+      <w:pPr>
+        <w:spacing w:before="120" w:after="40"/>
+      </w:pPr>
+      <w:r>
+        <w:rPr>
+          <w:b/>
+          <w:i/>
+          <w:color w:val="2E7D32"/>
+          <w:sz w:val="17"/>
+        </w:rPr>
+        <w:t>Tabel 2.9: Matriks Spesies Endemik, Status IUCN, Mining Threat, dan Titik Occurrence GBIF</w:t>
+      </w:r>
+    </w:p>
+    <w:tbl>
+      <w:tblPr>
+        <w:tblStyle w:val="TableGrid"/>
+        <w:tblW w:type="auto" w:w="0"/>
+        <w:jc w:val="center"/>
+        <w:tblLayout w:type="fixed"/>
+        <w:tblLook w:firstColumn="1" w:firstRow="1" w:lastColumn="0" w:lastRow="0" w:noHBand="0" w:noVBand="1" w:val="04A0"/>
+      </w:tblPr>
+      <w:tblGrid>
+        <w:gridCol w:w="1606"/>
+        <w:gridCol w:w="1606"/>
+        <w:gridCol w:w="1606"/>
+        <w:gridCol w:w="1606"/>
+        <w:gridCol w:w="1606"/>
+        <w:gridCol w:w="1606"/>
+      </w:tblGrid>
+      <w:tr>
+        <w:tc>
+          <w:tcPr>
+            <w:tcW w:type="dxa" w:w="1814"/>
+            <w:shd w:val="clear" w:color="auto" w:fill="2E7D32"/>
+            <w:tcMar>
+              <w:top w:w="70" w:type="dxa"/>
+              <w:bottom w:w="70" w:type="dxa"/>
+              <w:left w:w="100" w:type="dxa"/>
+              <w:right w:w="100" w:type="dxa"/>
+            </w:tcMar>
+            <w:tcBorders>
+              <w:top w:val="single" w:sz="4" w:color="D0D0D0" w:space="0"/>
+              <w:left w:val="single" w:sz="4" w:color="D0D0D0" w:space="0"/>
+              <w:bottom w:val="single" w:sz="8" w:color="1B5E20" w:space="0"/>
+              <w:right w:val="single" w:sz="4" w:color="D0D0D0" w:space="0"/>
+            </w:tcBorders>
+          </w:tcPr>
+          <w:p>
+            <w:pPr>
+              <w:jc w:val="left"/>
+            </w:pPr>
+            <w:r>
+              <w:rPr>
+                <w:b/>
+                <w:i w:val="0"/>
+                <w:color w:val="FFFFFF"/>
+                <w:sz w:val="17"/>
+              </w:rPr>
+              <w:t>Scientific Name</w:t>
+            </w:r>
+          </w:p>
+        </w:tc>
+        <w:tc>
+          <w:tcPr>
+            <w:tcW w:type="dxa" w:w="1701"/>
+            <w:shd w:val="clear" w:color="auto" w:fill="2E7D32"/>
+            <w:tcMar>
+              <w:top w:w="70" w:type="dxa"/>
+              <w:bottom w:w="70" w:type="dxa"/>
+              <w:left w:w="100" w:type="dxa"/>
+              <w:right w:w="100" w:type="dxa"/>
+            </w:tcMar>
+            <w:tcBorders>
+              <w:top w:val="single" w:sz="4" w:color="D0D0D0" w:space="0"/>
+              <w:left w:val="single" w:sz="4" w:color="D0D0D0" w:space="0"/>
+              <w:bottom w:val="single" w:sz="8" w:color="1B5E20" w:space="0"/>
+              <w:right w:val="single" w:sz="4" w:color="D0D0D0" w:space="0"/>
+            </w:tcBorders>
+          </w:tcPr>
+          <w:p>
+            <w:pPr>
+              <w:jc w:val="left"/>
+            </w:pPr>
+            <w:r>
+              <w:rPr>
+                <w:b/>
+                <w:i w:val="0"/>
+                <w:color w:val="FFFFFF"/>
+                <w:sz w:val="17"/>
+              </w:rPr>
+              <w:t>Common Name</w:t>
+            </w:r>
+          </w:p>
+        </w:tc>
+        <w:tc>
+          <w:tcPr>
+            <w:tcW w:type="dxa" w:w="1587"/>
+            <w:shd w:val="clear" w:color="auto" w:fill="2E7D32"/>
+            <w:tcMar>
+              <w:top w:w="70" w:type="dxa"/>
+              <w:bottom w:w="70" w:type="dxa"/>
+              <w:left w:w="100" w:type="dxa"/>
+              <w:right w:w="100" w:type="dxa"/>
+            </w:tcMar>
+            <w:tcBorders>
+              <w:top w:val="single" w:sz="4" w:color="D0D0D0" w:space="0"/>
+              <w:left w:val="single" w:sz="4" w:color="D0D0D0" w:space="0"/>
+              <w:bottom w:val="single" w:sz="8" w:color="1B5E20" w:space="0"/>
+              <w:right w:val="single" w:sz="4" w:color="D0D0D0" w:space="0"/>
+            </w:tcBorders>
+          </w:tcPr>
+          <w:p>
+            <w:pPr>
+              <w:jc w:val="center"/>
+            </w:pPr>
+            <w:r>
+              <w:rPr>
+                <w:b/>
+                <w:i w:val="0"/>
+                <w:color w:val="FFFFFF"/>
+                <w:sz w:val="17"/>
+              </w:rPr>
+              <w:t>Status</w:t>
+            </w:r>
+          </w:p>
+        </w:tc>
+        <w:tc>
+          <w:tcPr>
+            <w:tcW w:type="dxa" w:w="1361"/>
+            <w:shd w:val="clear" w:color="auto" w:fill="2E7D32"/>
+            <w:tcMar>
+              <w:top w:w="70" w:type="dxa"/>
+              <w:bottom w:w="70" w:type="dxa"/>
+              <w:left w:w="100" w:type="dxa"/>
+              <w:right w:w="100" w:type="dxa"/>
+            </w:tcMar>
+            <w:tcBorders>
+              <w:top w:val="single" w:sz="4" w:color="D0D0D0" w:space="0"/>
+              <w:left w:val="single" w:sz="4" w:color="D0D0D0" w:space="0"/>
+              <w:bottom w:val="single" w:sz="8" w:color="1B5E20" w:space="0"/>
+              <w:right w:val="single" w:sz="4" w:color="D0D0D0" w:space="0"/>
+            </w:tcBorders>
+          </w:tcPr>
+          <w:p>
+            <w:pPr>
+              <w:jc w:val="center"/>
+            </w:pPr>
+            <w:r>
+              <w:rPr>
+                <w:b/>
+                <w:i w:val="0"/>
+                <w:color w:val="FFFFFF"/>
+                <w:sz w:val="17"/>
+              </w:rPr>
+              <w:t>Population Trend</w:t>
+            </w:r>
+          </w:p>
+        </w:tc>
+        <w:tc>
+          <w:tcPr>
+            <w:tcW w:type="dxa" w:w="1134"/>
+            <w:shd w:val="clear" w:color="auto" w:fill="2E7D32"/>
+            <w:tcMar>
+              <w:top w:w="70" w:type="dxa"/>
+              <w:bottom w:w="70" w:type="dxa"/>
+              <w:left w:w="100" w:type="dxa"/>
+              <w:right w:w="100" w:type="dxa"/>
+            </w:tcMar>
+            <w:tcBorders>
+              <w:top w:val="single" w:sz="4" w:color="D0D0D0" w:space="0"/>
+              <w:left w:val="single" w:sz="4" w:color="D0D0D0" w:space="0"/>
+              <w:bottom w:val="single" w:sz="8" w:color="1B5E20" w:space="0"/>
+              <w:right w:val="single" w:sz="4" w:color="D0D0D0" w:space="0"/>
+            </w:tcBorders>
+          </w:tcPr>
+          <w:p>
+            <w:pPr>
+              <w:jc w:val="center"/>
+            </w:pPr>
+            <w:r>
+              <w:rPr>
+                <w:b/>
+                <w:i w:val="0"/>
+                <w:color w:val="FFFFFF"/>
+                <w:sz w:val="17"/>
+              </w:rPr>
+              <w:t>Mining Threat</w:t>
+            </w:r>
+          </w:p>
+        </w:tc>
+        <w:tc>
+          <w:tcPr>
+            <w:tcW w:type="dxa" w:w="907"/>
+            <w:shd w:val="clear" w:color="auto" w:fill="2E7D32"/>
+            <w:tcMar>
+              <w:top w:w="70" w:type="dxa"/>
+              <w:bottom w:w="70" w:type="dxa"/>
+              <w:left w:w="100" w:type="dxa"/>
+              <w:right w:w="100" w:type="dxa"/>
+            </w:tcMar>
+            <w:tcBorders>
+              <w:top w:val="single" w:sz="4" w:color="D0D0D0" w:space="0"/>
+              <w:left w:val="single" w:sz="4" w:color="D0D0D0" w:space="0"/>
+              <w:bottom w:val="single" w:sz="8" w:color="1B5E20" w:space="0"/>
+              <w:right w:val="single" w:sz="4" w:color="D0D0D0" w:space="0"/>
+            </w:tcBorders>
+          </w:tcPr>
+          <w:p>
+            <w:pPr>
+              <w:jc w:val="center"/>
+            </w:pPr>
+            <w:r>
+              <w:rPr>
+                <w:b/>
+                <w:i w:val="0"/>
+                <w:color w:val="FFFFFF"/>
+                <w:sz w:val="17"/>
+              </w:rPr>
+              <w:t>Titik GBIF</w:t>
+            </w:r>
+          </w:p>
+        </w:tc>
+      </w:tr>
+      <w:tr>
+        <w:tc>
+          <w:tcPr>
+            <w:tcW w:type="dxa" w:w="1814"/>
+            <w:shd w:val="clear" w:color="auto" w:fill="F5FBF5"/>
+            <w:tcMar>
+              <w:top w:w="50" w:type="dxa"/>
+              <w:bottom w:w="50" w:type="dxa"/>
+              <w:left w:w="100" w:type="dxa"/>
+              <w:right w:w="100" w:type="dxa"/>
+            </w:tcMar>
+            <w:tcBorders>
+              <w:top w:val="single" w:sz="4" w:color="D0D0D0" w:space="0"/>
+              <w:left w:val="single" w:sz="4" w:color="D0D0D0" w:space="0"/>
+              <w:bottom w:val="single" w:sz="4" w:color="D0D0D0" w:space="0"/>
+              <w:right w:val="single" w:sz="4" w:color="D0D0D0" w:space="0"/>
+            </w:tcBorders>
+          </w:tcPr>
+          <w:p>
+            <w:pPr>
+              <w:jc w:val="left"/>
+            </w:pPr>
+            <w:r>
+              <w:rPr>
+                <w:b w:val="0"/>
+                <w:i w:val="0"/>
+                <w:color w:val="222222"/>
+                <w:sz w:val="17"/>
+              </w:rPr>
+              <w:t>Macaca nigra</w:t>
+            </w:r>
+          </w:p>
+        </w:tc>
+        <w:tc>
+          <w:tcPr>
+            <w:tcW w:type="dxa" w:w="1701"/>
+            <w:shd w:val="clear" w:color="auto" w:fill="F5FBF5"/>
+            <w:tcMar>
+              <w:top w:w="50" w:type="dxa"/>
+              <w:bottom w:w="50" w:type="dxa"/>
+              <w:left w:w="100" w:type="dxa"/>
+              <w:right w:w="100" w:type="dxa"/>
+            </w:tcMar>
+            <w:tcBorders>
+              <w:top w:val="single" w:sz="4" w:color="D0D0D0" w:space="0"/>
+              <w:left w:val="single" w:sz="4" w:color="D0D0D0" w:space="0"/>
+              <w:bottom w:val="single" w:sz="4" w:color="D0D0D0" w:space="0"/>
+              <w:right w:val="single" w:sz="4" w:color="D0D0D0" w:space="0"/>
+            </w:tcBorders>
+          </w:tcPr>
+          <w:p>
+            <w:pPr>
+              <w:jc w:val="left"/>
+            </w:pPr>
+            <w:r>
+              <w:rPr>
+                <w:b w:val="0"/>
+                <w:i w:val="0"/>
+                <w:color w:val="222222"/>
+                <w:sz w:val="17"/>
+              </w:rPr>
+              <w:t>Celebes Crested Macaque</w:t>
+            </w:r>
+          </w:p>
+        </w:tc>
+        <w:tc>
+          <w:tcPr>
+            <w:tcW w:type="dxa" w:w="1587"/>
+            <w:shd w:val="clear" w:color="auto" w:fill="F5FBF5"/>
+            <w:tcMar>
+              <w:top w:w="50" w:type="dxa"/>
+              <w:bottom w:w="50" w:type="dxa"/>
+              <w:left w:w="100" w:type="dxa"/>
+              <w:right w:w="100" w:type="dxa"/>
+            </w:tcMar>
+            <w:tcBorders>
+              <w:top w:val="single" w:sz="4" w:color="D0D0D0" w:space="0"/>
+              <w:left w:val="single" w:sz="4" w:color="D0D0D0" w:space="0"/>
+              <w:bottom w:val="single" w:sz="4" w:color="D0D0D0" w:space="0"/>
+              <w:right w:val="single" w:sz="4" w:color="D0D0D0" w:space="0"/>
+            </w:tcBorders>
+          </w:tcPr>
+          <w:p>
+            <w:pPr>
+              <w:jc w:val="center"/>
+            </w:pPr>
+            <w:r>
+              <w:rPr>
+                <w:b w:val="0"/>
+                <w:i w:val="0"/>
+                <w:color w:val="222222"/>
+                <w:sz w:val="17"/>
+              </w:rPr>
+              <w:t>Critically Endangered</w:t>
+            </w:r>
+          </w:p>
+        </w:tc>
+        <w:tc>
+          <w:tcPr>
+            <w:tcW w:type="dxa" w:w="1361"/>
+            <w:shd w:val="clear" w:color="auto" w:fill="F5FBF5"/>
+            <w:tcMar>
+              <w:top w:w="50" w:type="dxa"/>
+              <w:bottom w:w="50" w:type="dxa"/>
+              <w:left w:w="100" w:type="dxa"/>
+              <w:right w:w="100" w:type="dxa"/>
+            </w:tcMar>
+            <w:tcBorders>
+              <w:top w:val="single" w:sz="4" w:color="D0D0D0" w:space="0"/>
+              <w:left w:val="single" w:sz="4" w:color="D0D0D0" w:space="0"/>
+              <w:bottom w:val="single" w:sz="4" w:color="D0D0D0" w:space="0"/>
+              <w:right w:val="single" w:sz="4" w:color="D0D0D0" w:space="0"/>
+            </w:tcBorders>
+          </w:tcPr>
+          <w:p>
+            <w:pPr>
+              <w:jc w:val="center"/>
+            </w:pPr>
+            <w:r>
+              <w:rPr>
+                <w:b w:val="0"/>
+                <w:i w:val="0"/>
+                <w:color w:val="222222"/>
+                <w:sz w:val="17"/>
+              </w:rPr>
+              <w:t>Decreasing</w:t>
+            </w:r>
+          </w:p>
+        </w:tc>
+        <w:tc>
+          <w:tcPr>
+            <w:tcW w:type="dxa" w:w="1134"/>
+            <w:shd w:val="clear" w:color="auto" w:fill="F5FBF5"/>
+            <w:tcMar>
+              <w:top w:w="50" w:type="dxa"/>
+              <w:bottom w:w="50" w:type="dxa"/>
+              <w:left w:w="100" w:type="dxa"/>
+              <w:right w:w="100" w:type="dxa"/>
+            </w:tcMar>
+            <w:tcBorders>
+              <w:top w:val="single" w:sz="4" w:color="D0D0D0" w:space="0"/>
+              <w:left w:val="single" w:sz="4" w:color="D0D0D0" w:space="0"/>
+              <w:bottom w:val="single" w:sz="4" w:color="D0D0D0" w:space="0"/>
+              <w:right w:val="single" w:sz="4" w:color="D0D0D0" w:space="0"/>
+            </w:tcBorders>
+          </w:tcPr>
+          <w:p>
+            <w:pPr>
+              <w:jc w:val="center"/>
+            </w:pPr>
+            <w:r>
+              <w:rPr>
+                <w:b w:val="0"/>
+                <w:i w:val="0"/>
+                <w:color w:val="222222"/>
+                <w:sz w:val="17"/>
+              </w:rPr>
+              <w:t>Yes</w:t>
+            </w:r>
+          </w:p>
+        </w:tc>
+        <w:tc>
+          <w:tcPr>
+            <w:tcW w:type="dxa" w:w="907"/>
+            <w:shd w:val="clear" w:color="auto" w:fill="F5FBF5"/>
+            <w:tcMar>
+              <w:top w:w="50" w:type="dxa"/>
+              <w:bottom w:w="50" w:type="dxa"/>
+              <w:left w:w="100" w:type="dxa"/>
+              <w:right w:w="100" w:type="dxa"/>
+            </w:tcMar>
+            <w:tcBorders>
+              <w:top w:val="single" w:sz="4" w:color="D0D0D0" w:space="0"/>
+              <w:left w:val="single" w:sz="4" w:color="D0D0D0" w:space="0"/>
+              <w:bottom w:val="single" w:sz="4" w:color="D0D0D0" w:space="0"/>
+              <w:right w:val="single" w:sz="4" w:color="D0D0D0" w:space="0"/>
+            </w:tcBorders>
+          </w:tcPr>
+          <w:p>
+            <w:pPr>
+              <w:jc w:val="center"/>
+            </w:pPr>
+            <w:r>
+              <w:rPr>
+                <w:b w:val="0"/>
+                <w:i w:val="0"/>
+                <w:color w:val="222222"/>
+                <w:sz w:val="17"/>
+              </w:rPr>
+              <w:t>87</w:t>
+            </w:r>
+          </w:p>
+        </w:tc>
+      </w:tr>
+      <w:tr>
+        <w:tc>
+          <w:tcPr>
+            <w:tcW w:type="dxa" w:w="1814"/>
+            <w:shd w:val="clear" w:color="auto" w:fill="FFFFFF"/>
+            <w:tcMar>
+              <w:top w:w="50" w:type="dxa"/>
+              <w:bottom w:w="50" w:type="dxa"/>
+              <w:left w:w="100" w:type="dxa"/>
+              <w:right w:w="100" w:type="dxa"/>
+            </w:tcMar>
+            <w:tcBorders>
+              <w:top w:val="single" w:sz="4" w:color="D0D0D0" w:space="0"/>
+              <w:left w:val="single" w:sz="4" w:color="D0D0D0" w:space="0"/>
+              <w:bottom w:val="single" w:sz="4" w:color="D0D0D0" w:space="0"/>
+              <w:right w:val="single" w:sz="4" w:color="D0D0D0" w:space="0"/>
+            </w:tcBorders>
+          </w:tcPr>
+          <w:p>
+            <w:pPr>
+              <w:jc w:val="left"/>
+            </w:pPr>
+            <w:r>
+              <w:rPr>
+                <w:b w:val="0"/>
+                <w:i w:val="0"/>
+                <w:color w:val="222222"/>
+                <w:sz w:val="17"/>
+              </w:rPr>
+              <w:t>Macrocephalon maleo</w:t>
+            </w:r>
+          </w:p>
+        </w:tc>
+        <w:tc>
+          <w:tcPr>
+            <w:tcW w:type="dxa" w:w="1701"/>
+            <w:shd w:val="clear" w:color="auto" w:fill="FFFFFF"/>
+            <w:tcMar>
+              <w:top w:w="50" w:type="dxa"/>
+              <w:bottom w:w="50" w:type="dxa"/>
+              <w:left w:w="100" w:type="dxa"/>
+              <w:right w:w="100" w:type="dxa"/>
+            </w:tcMar>
+            <w:tcBorders>
+              <w:top w:val="single" w:sz="4" w:color="D0D0D0" w:space="0"/>
+              <w:left w:val="single" w:sz="4" w:color="D0D0D0" w:space="0"/>
+              <w:bottom w:val="single" w:sz="4" w:color="D0D0D0" w:space="0"/>
+              <w:right w:val="single" w:sz="4" w:color="D0D0D0" w:space="0"/>
+            </w:tcBorders>
+          </w:tcPr>
+          <w:p>
+            <w:pPr>
+              <w:jc w:val="left"/>
+            </w:pPr>
+            <w:r>
+              <w:rPr>
+                <w:b w:val="0"/>
+                <w:i w:val="0"/>
+                <w:color w:val="222222"/>
+                <w:sz w:val="17"/>
+              </w:rPr>
+              <w:t>Maleo</w:t>
+            </w:r>
+          </w:p>
+        </w:tc>
+        <w:tc>
+          <w:tcPr>
+            <w:tcW w:type="dxa" w:w="1587"/>
+            <w:shd w:val="clear" w:color="auto" w:fill="FFFFFF"/>
+            <w:tcMar>
+              <w:top w:w="50" w:type="dxa"/>
+              <w:bottom w:w="50" w:type="dxa"/>
+              <w:left w:w="100" w:type="dxa"/>
+              <w:right w:w="100" w:type="dxa"/>
+            </w:tcMar>
+            <w:tcBorders>
+              <w:top w:val="single" w:sz="4" w:color="D0D0D0" w:space="0"/>
+              <w:left w:val="single" w:sz="4" w:color="D0D0D0" w:space="0"/>
+              <w:bottom w:val="single" w:sz="4" w:color="D0D0D0" w:space="0"/>
+              <w:right w:val="single" w:sz="4" w:color="D0D0D0" w:space="0"/>
+            </w:tcBorders>
+          </w:tcPr>
+          <w:p>
+            <w:pPr>
+              <w:jc w:val="center"/>
+            </w:pPr>
+            <w:r>
+              <w:rPr>
+                <w:b w:val="0"/>
+                <w:i w:val="0"/>
+                <w:color w:val="222222"/>
+                <w:sz w:val="17"/>
+              </w:rPr>
+              <w:t>Critically Endangered</w:t>
+            </w:r>
+          </w:p>
+        </w:tc>
+        <w:tc>
+          <w:tcPr>
+            <w:tcW w:type="dxa" w:w="1361"/>
+            <w:shd w:val="clear" w:color="auto" w:fill="FFFFFF"/>
+            <w:tcMar>
+              <w:top w:w="50" w:type="dxa"/>
+              <w:bottom w:w="50" w:type="dxa"/>
+              <w:left w:w="100" w:type="dxa"/>
+              <w:right w:w="100" w:type="dxa"/>
+            </w:tcMar>
+            <w:tcBorders>
+              <w:top w:val="single" w:sz="4" w:color="D0D0D0" w:space="0"/>
+              <w:left w:val="single" w:sz="4" w:color="D0D0D0" w:space="0"/>
+              <w:bottom w:val="single" w:sz="4" w:color="D0D0D0" w:space="0"/>
+              <w:right w:val="single" w:sz="4" w:color="D0D0D0" w:space="0"/>
+            </w:tcBorders>
+          </w:tcPr>
+          <w:p>
+            <w:pPr>
+              <w:jc w:val="center"/>
+            </w:pPr>
+            <w:r>
+              <w:rPr>
+                <w:b w:val="0"/>
+                <w:i w:val="0"/>
+                <w:color w:val="222222"/>
+                <w:sz w:val="17"/>
+              </w:rPr>
+              <w:t>Decreasing</w:t>
+            </w:r>
+          </w:p>
+        </w:tc>
+        <w:tc>
+          <w:tcPr>
+            <w:tcW w:type="dxa" w:w="1134"/>
+            <w:shd w:val="clear" w:color="auto" w:fill="FFFFFF"/>
+            <w:tcMar>
+              <w:top w:w="50" w:type="dxa"/>
+              <w:bottom w:w="50" w:type="dxa"/>
+              <w:left w:w="100" w:type="dxa"/>
+              <w:right w:w="100" w:type="dxa"/>
+            </w:tcMar>
+            <w:tcBorders>
+              <w:top w:val="single" w:sz="4" w:color="D0D0D0" w:space="0"/>
+              <w:left w:val="single" w:sz="4" w:color="D0D0D0" w:space="0"/>
+              <w:bottom w:val="single" w:sz="4" w:color="D0D0D0" w:space="0"/>
+              <w:right w:val="single" w:sz="4" w:color="D0D0D0" w:space="0"/>
+            </w:tcBorders>
+          </w:tcPr>
+          <w:p>
+            <w:pPr>
+              <w:jc w:val="center"/>
+            </w:pPr>
+            <w:r>
+              <w:rPr>
+                <w:b w:val="0"/>
+                <w:i w:val="0"/>
+                <w:color w:val="222222"/>
+                <w:sz w:val="17"/>
+              </w:rPr>
+              <w:t>No</w:t>
+            </w:r>
+          </w:p>
+        </w:tc>
+        <w:tc>
+          <w:tcPr>
+            <w:tcW w:type="dxa" w:w="907"/>
+            <w:shd w:val="clear" w:color="auto" w:fill="FFFFFF"/>
+            <w:tcMar>
+              <w:top w:w="50" w:type="dxa"/>
+              <w:bottom w:w="50" w:type="dxa"/>
+              <w:left w:w="100" w:type="dxa"/>
+              <w:right w:w="100" w:type="dxa"/>
+            </w:tcMar>
+            <w:tcBorders>
+              <w:top w:val="single" w:sz="4" w:color="D0D0D0" w:space="0"/>
+              <w:left w:val="single" w:sz="4" w:color="D0D0D0" w:space="0"/>
+              <w:bottom w:val="single" w:sz="4" w:color="D0D0D0" w:space="0"/>
+              <w:right w:val="single" w:sz="4" w:color="D0D0D0" w:space="0"/>
+            </w:tcBorders>
+          </w:tcPr>
+          <w:p>
+            <w:pPr>
+              <w:jc w:val="center"/>
+            </w:pPr>
+            <w:r>
+              <w:rPr>
+                <w:b w:val="0"/>
+                <w:i w:val="0"/>
+                <w:color w:val="222222"/>
+                <w:sz w:val="17"/>
+              </w:rPr>
+              <w:t>95</w:t>
+            </w:r>
+          </w:p>
+        </w:tc>
+      </w:tr>
+      <w:tr>
+        <w:tc>
+          <w:tcPr>
+            <w:tcW w:type="dxa" w:w="1814"/>
+            <w:shd w:val="clear" w:color="auto" w:fill="F5FBF5"/>
+            <w:tcMar>
+              <w:top w:w="50" w:type="dxa"/>
+              <w:bottom w:w="50" w:type="dxa"/>
+              <w:left w:w="100" w:type="dxa"/>
+              <w:right w:w="100" w:type="dxa"/>
+            </w:tcMar>
+            <w:tcBorders>
+              <w:top w:val="single" w:sz="4" w:color="D0D0D0" w:space="0"/>
+              <w:left w:val="single" w:sz="4" w:color="D0D0D0" w:space="0"/>
+              <w:bottom w:val="single" w:sz="4" w:color="D0D0D0" w:space="0"/>
+              <w:right w:val="single" w:sz="4" w:color="D0D0D0" w:space="0"/>
+            </w:tcBorders>
+          </w:tcPr>
+          <w:p>
+            <w:pPr>
+              <w:jc w:val="left"/>
+            </w:pPr>
+            <w:r>
+              <w:rPr>
+                <w:b w:val="0"/>
+                <w:i w:val="0"/>
+                <w:color w:val="222222"/>
+                <w:sz w:val="17"/>
+              </w:rPr>
+              <w:t>Bubalus depressicornis</w:t>
+            </w:r>
+          </w:p>
+        </w:tc>
+        <w:tc>
+          <w:tcPr>
+            <w:tcW w:type="dxa" w:w="1701"/>
+            <w:shd w:val="clear" w:color="auto" w:fill="F5FBF5"/>
+            <w:tcMar>
+              <w:top w:w="50" w:type="dxa"/>
+              <w:bottom w:w="50" w:type="dxa"/>
+              <w:left w:w="100" w:type="dxa"/>
+              <w:right w:w="100" w:type="dxa"/>
+            </w:tcMar>
+            <w:tcBorders>
+              <w:top w:val="single" w:sz="4" w:color="D0D0D0" w:space="0"/>
+              <w:left w:val="single" w:sz="4" w:color="D0D0D0" w:space="0"/>
+              <w:bottom w:val="single" w:sz="4" w:color="D0D0D0" w:space="0"/>
+              <w:right w:val="single" w:sz="4" w:color="D0D0D0" w:space="0"/>
+            </w:tcBorders>
+          </w:tcPr>
+          <w:p>
+            <w:pPr>
+              <w:jc w:val="left"/>
+            </w:pPr>
+            <w:r>
+              <w:rPr>
+                <w:b w:val="0"/>
+                <w:i w:val="0"/>
+                <w:color w:val="222222"/>
+                <w:sz w:val="17"/>
+              </w:rPr>
+              <w:t>Lowland Anoa</w:t>
+            </w:r>
+          </w:p>
+        </w:tc>
+        <w:tc>
+          <w:tcPr>
+            <w:tcW w:type="dxa" w:w="1587"/>
+            <w:shd w:val="clear" w:color="auto" w:fill="F5FBF5"/>
+            <w:tcMar>
+              <w:top w:w="50" w:type="dxa"/>
+              <w:bottom w:w="50" w:type="dxa"/>
+              <w:left w:w="100" w:type="dxa"/>
+              <w:right w:w="100" w:type="dxa"/>
+            </w:tcMar>
+            <w:tcBorders>
+              <w:top w:val="single" w:sz="4" w:color="D0D0D0" w:space="0"/>
+              <w:left w:val="single" w:sz="4" w:color="D0D0D0" w:space="0"/>
+              <w:bottom w:val="single" w:sz="4" w:color="D0D0D0" w:space="0"/>
+              <w:right w:val="single" w:sz="4" w:color="D0D0D0" w:space="0"/>
+            </w:tcBorders>
+          </w:tcPr>
+          <w:p>
+            <w:pPr>
+              <w:jc w:val="center"/>
+            </w:pPr>
+            <w:r>
+              <w:rPr>
+                <w:b w:val="0"/>
+                <w:i w:val="0"/>
+                <w:color w:val="222222"/>
+                <w:sz w:val="17"/>
+              </w:rPr>
+              <w:t>Endangered</w:t>
+            </w:r>
+          </w:p>
+        </w:tc>
+        <w:tc>
+          <w:tcPr>
+            <w:tcW w:type="dxa" w:w="1361"/>
+            <w:shd w:val="clear" w:color="auto" w:fill="F5FBF5"/>
+            <w:tcMar>
+              <w:top w:w="50" w:type="dxa"/>
+              <w:bottom w:w="50" w:type="dxa"/>
+              <w:left w:w="100" w:type="dxa"/>
+              <w:right w:w="100" w:type="dxa"/>
+            </w:tcMar>
+            <w:tcBorders>
+              <w:top w:val="single" w:sz="4" w:color="D0D0D0" w:space="0"/>
+              <w:left w:val="single" w:sz="4" w:color="D0D0D0" w:space="0"/>
+              <w:bottom w:val="single" w:sz="4" w:color="D0D0D0" w:space="0"/>
+              <w:right w:val="single" w:sz="4" w:color="D0D0D0" w:space="0"/>
+            </w:tcBorders>
+          </w:tcPr>
+          <w:p>
+            <w:pPr>
+              <w:jc w:val="center"/>
+            </w:pPr>
+            <w:r>
+              <w:rPr>
+                <w:b w:val="0"/>
+                <w:i w:val="0"/>
+                <w:color w:val="222222"/>
+                <w:sz w:val="17"/>
+              </w:rPr>
+              <w:t>Decreasing</w:t>
+            </w:r>
+          </w:p>
+        </w:tc>
+        <w:tc>
+          <w:tcPr>
+            <w:tcW w:type="dxa" w:w="1134"/>
+            <w:shd w:val="clear" w:color="auto" w:fill="F5FBF5"/>
+            <w:tcMar>
+              <w:top w:w="50" w:type="dxa"/>
+              <w:bottom w:w="50" w:type="dxa"/>
+              <w:left w:w="100" w:type="dxa"/>
+              <w:right w:w="100" w:type="dxa"/>
+            </w:tcMar>
+            <w:tcBorders>
+              <w:top w:val="single" w:sz="4" w:color="D0D0D0" w:space="0"/>
+              <w:left w:val="single" w:sz="4" w:color="D0D0D0" w:space="0"/>
+              <w:bottom w:val="single" w:sz="4" w:color="D0D0D0" w:space="0"/>
+              <w:right w:val="single" w:sz="4" w:color="D0D0D0" w:space="0"/>
+            </w:tcBorders>
+          </w:tcPr>
+          <w:p>
+            <w:pPr>
+              <w:jc w:val="center"/>
+            </w:pPr>
+            <w:r>
+              <w:rPr>
+                <w:b w:val="0"/>
+                <w:i w:val="0"/>
+                <w:color w:val="222222"/>
+                <w:sz w:val="17"/>
+              </w:rPr>
+              <w:t>Yes</w:t>
+            </w:r>
+          </w:p>
+        </w:tc>
+        <w:tc>
+          <w:tcPr>
+            <w:tcW w:type="dxa" w:w="907"/>
+            <w:shd w:val="clear" w:color="auto" w:fill="F5FBF5"/>
+            <w:tcMar>
+              <w:top w:w="50" w:type="dxa"/>
+              <w:bottom w:w="50" w:type="dxa"/>
+              <w:left w:w="100" w:type="dxa"/>
+              <w:right w:w="100" w:type="dxa"/>
+            </w:tcMar>
+            <w:tcBorders>
+              <w:top w:val="single" w:sz="4" w:color="D0D0D0" w:space="0"/>
+              <w:left w:val="single" w:sz="4" w:color="D0D0D0" w:space="0"/>
+              <w:bottom w:val="single" w:sz="4" w:color="D0D0D0" w:space="0"/>
+              <w:right w:val="single" w:sz="4" w:color="D0D0D0" w:space="0"/>
+            </w:tcBorders>
+          </w:tcPr>
+          <w:p>
+            <w:pPr>
+              <w:jc w:val="center"/>
+            </w:pPr>
+            <w:r>
+              <w:rPr>
+                <w:b w:val="0"/>
+                <w:i w:val="0"/>
+                <w:color w:val="222222"/>
+                <w:sz w:val="17"/>
+              </w:rPr>
+              <w:t>18</w:t>
+            </w:r>
+          </w:p>
+        </w:tc>
+      </w:tr>
+      <w:tr>
+        <w:tc>
+          <w:tcPr>
+            <w:tcW w:type="dxa" w:w="1814"/>
+            <w:shd w:val="clear" w:color="auto" w:fill="FFFFFF"/>
+            <w:tcMar>
+              <w:top w:w="50" w:type="dxa"/>
+              <w:bottom w:w="50" w:type="dxa"/>
+              <w:left w:w="100" w:type="dxa"/>
+              <w:right w:w="100" w:type="dxa"/>
+            </w:tcMar>
+            <w:tcBorders>
+              <w:top w:val="single" w:sz="4" w:color="D0D0D0" w:space="0"/>
+              <w:left w:val="single" w:sz="4" w:color="D0D0D0" w:space="0"/>
+              <w:bottom w:val="single" w:sz="4" w:color="D0D0D0" w:space="0"/>
+              <w:right w:val="single" w:sz="4" w:color="D0D0D0" w:space="0"/>
+            </w:tcBorders>
+          </w:tcPr>
+          <w:p>
+            <w:pPr>
+              <w:jc w:val="left"/>
+            </w:pPr>
+            <w:r>
+              <w:rPr>
+                <w:b w:val="0"/>
+                <w:i w:val="0"/>
+                <w:color w:val="222222"/>
+                <w:sz w:val="17"/>
+              </w:rPr>
+              <w:t>Bubalus quarlesi</w:t>
+            </w:r>
+          </w:p>
+        </w:tc>
+        <w:tc>
+          <w:tcPr>
+            <w:tcW w:type="dxa" w:w="1701"/>
+            <w:shd w:val="clear" w:color="auto" w:fill="FFFFFF"/>
+            <w:tcMar>
+              <w:top w:w="50" w:type="dxa"/>
+              <w:bottom w:w="50" w:type="dxa"/>
+              <w:left w:w="100" w:type="dxa"/>
+              <w:right w:w="100" w:type="dxa"/>
+            </w:tcMar>
+            <w:tcBorders>
+              <w:top w:val="single" w:sz="4" w:color="D0D0D0" w:space="0"/>
+              <w:left w:val="single" w:sz="4" w:color="D0D0D0" w:space="0"/>
+              <w:bottom w:val="single" w:sz="4" w:color="D0D0D0" w:space="0"/>
+              <w:right w:val="single" w:sz="4" w:color="D0D0D0" w:space="0"/>
+            </w:tcBorders>
+          </w:tcPr>
+          <w:p>
+            <w:pPr>
+              <w:jc w:val="left"/>
+            </w:pPr>
+            <w:r>
+              <w:rPr>
+                <w:b w:val="0"/>
+                <w:i w:val="0"/>
+                <w:color w:val="222222"/>
+                <w:sz w:val="17"/>
+              </w:rPr>
+              <w:t>Mountain Anoa</w:t>
+            </w:r>
+          </w:p>
+        </w:tc>
+        <w:tc>
+          <w:tcPr>
+            <w:tcW w:type="dxa" w:w="1587"/>
+            <w:shd w:val="clear" w:color="auto" w:fill="FFFFFF"/>
+            <w:tcMar>
+              <w:top w:w="50" w:type="dxa"/>
+              <w:bottom w:w="50" w:type="dxa"/>
+              <w:left w:w="100" w:type="dxa"/>
+              <w:right w:w="100" w:type="dxa"/>
+            </w:tcMar>
+            <w:tcBorders>
+              <w:top w:val="single" w:sz="4" w:color="D0D0D0" w:space="0"/>
+              <w:left w:val="single" w:sz="4" w:color="D0D0D0" w:space="0"/>
+              <w:bottom w:val="single" w:sz="4" w:color="D0D0D0" w:space="0"/>
+              <w:right w:val="single" w:sz="4" w:color="D0D0D0" w:space="0"/>
+            </w:tcBorders>
+          </w:tcPr>
+          <w:p>
+            <w:pPr>
+              <w:jc w:val="center"/>
+            </w:pPr>
+            <w:r>
+              <w:rPr>
+                <w:b w:val="0"/>
+                <w:i w:val="0"/>
+                <w:color w:val="222222"/>
+                <w:sz w:val="17"/>
+              </w:rPr>
+              <w:t>Endangered</w:t>
+            </w:r>
+          </w:p>
+        </w:tc>
+        <w:tc>
+          <w:tcPr>
+            <w:tcW w:type="dxa" w:w="1361"/>
+            <w:shd w:val="clear" w:color="auto" w:fill="FFFFFF"/>
+            <w:tcMar>
+              <w:top w:w="50" w:type="dxa"/>
+              <w:bottom w:w="50" w:type="dxa"/>
+              <w:left w:w="100" w:type="dxa"/>
+              <w:right w:w="100" w:type="dxa"/>
+            </w:tcMar>
+            <w:tcBorders>
+              <w:top w:val="single" w:sz="4" w:color="D0D0D0" w:space="0"/>
+              <w:left w:val="single" w:sz="4" w:color="D0D0D0" w:space="0"/>
+              <w:bottom w:val="single" w:sz="4" w:color="D0D0D0" w:space="0"/>
+              <w:right w:val="single" w:sz="4" w:color="D0D0D0" w:space="0"/>
+            </w:tcBorders>
+          </w:tcPr>
+          <w:p>
+            <w:pPr>
+              <w:jc w:val="center"/>
+            </w:pPr>
+            <w:r>
+              <w:rPr>
+                <w:b w:val="0"/>
+                <w:i w:val="0"/>
+                <w:color w:val="222222"/>
+                <w:sz w:val="17"/>
+              </w:rPr>
+              <w:t>Decreasing</w:t>
+            </w:r>
+          </w:p>
+        </w:tc>
+        <w:tc>
+          <w:tcPr>
+            <w:tcW w:type="dxa" w:w="1134"/>
+            <w:shd w:val="clear" w:color="auto" w:fill="FFFFFF"/>
+            <w:tcMar>
+              <w:top w:w="50" w:type="dxa"/>
+              <w:bottom w:w="50" w:type="dxa"/>
+              <w:left w:w="100" w:type="dxa"/>
+              <w:right w:w="100" w:type="dxa"/>
+            </w:tcMar>
+            <w:tcBorders>
+              <w:top w:val="single" w:sz="4" w:color="D0D0D0" w:space="0"/>
+              <w:left w:val="single" w:sz="4" w:color="D0D0D0" w:space="0"/>
+              <w:bottom w:val="single" w:sz="4" w:color="D0D0D0" w:space="0"/>
+              <w:right w:val="single" w:sz="4" w:color="D0D0D0" w:space="0"/>
+            </w:tcBorders>
+          </w:tcPr>
+          <w:p>
+            <w:pPr>
+              <w:jc w:val="center"/>
+            </w:pPr>
+            <w:r>
+              <w:rPr>
+                <w:b w:val="0"/>
+                <w:i w:val="0"/>
+                <w:color w:val="222222"/>
+                <w:sz w:val="17"/>
+              </w:rPr>
+              <w:t>Yes</w:t>
+            </w:r>
+          </w:p>
+        </w:tc>
+        <w:tc>
+          <w:tcPr>
+            <w:tcW w:type="dxa" w:w="907"/>
+            <w:shd w:val="clear" w:color="auto" w:fill="FFFFFF"/>
+            <w:tcMar>
+              <w:top w:w="50" w:type="dxa"/>
+              <w:bottom w:w="50" w:type="dxa"/>
+              <w:left w:w="100" w:type="dxa"/>
+              <w:right w:w="100" w:type="dxa"/>
+            </w:tcMar>
+            <w:tcBorders>
+              <w:top w:val="single" w:sz="4" w:color="D0D0D0" w:space="0"/>
+              <w:left w:val="single" w:sz="4" w:color="D0D0D0" w:space="0"/>
+              <w:bottom w:val="single" w:sz="4" w:color="D0D0D0" w:space="0"/>
+              <w:right w:val="single" w:sz="4" w:color="D0D0D0" w:space="0"/>
+            </w:tcBorders>
+          </w:tcPr>
+          <w:p>
+            <w:pPr>
+              <w:jc w:val="center"/>
+            </w:pPr>
+            <w:r>
+              <w:rPr>
+                <w:b w:val="0"/>
+                <w:i w:val="0"/>
+                <w:color w:val="222222"/>
+                <w:sz w:val="17"/>
+              </w:rPr>
+              <w:t>10</w:t>
+            </w:r>
+          </w:p>
+        </w:tc>
+      </w:tr>
+      <w:tr>
+        <w:tc>
+          <w:tcPr>
+            <w:tcW w:type="dxa" w:w="1814"/>
+            <w:shd w:val="clear" w:color="auto" w:fill="F5FBF5"/>
+            <w:tcMar>
+              <w:top w:w="50" w:type="dxa"/>
+              <w:bottom w:w="50" w:type="dxa"/>
+              <w:left w:w="100" w:type="dxa"/>
+              <w:right w:w="100" w:type="dxa"/>
+            </w:tcMar>
+            <w:tcBorders>
+              <w:top w:val="single" w:sz="4" w:color="D0D0D0" w:space="0"/>
+              <w:left w:val="single" w:sz="4" w:color="D0D0D0" w:space="0"/>
+              <w:bottom w:val="single" w:sz="4" w:color="D0D0D0" w:space="0"/>
+              <w:right w:val="single" w:sz="4" w:color="D0D0D0" w:space="0"/>
+            </w:tcBorders>
+          </w:tcPr>
+          <w:p>
+            <w:pPr>
+              <w:jc w:val="left"/>
+            </w:pPr>
+            <w:r>
+              <w:rPr>
+                <w:b w:val="0"/>
+                <w:i w:val="0"/>
+                <w:color w:val="222222"/>
+                <w:sz w:val="17"/>
+              </w:rPr>
+              <w:t>Babyrousa celebensis</w:t>
+            </w:r>
+          </w:p>
+        </w:tc>
+        <w:tc>
+          <w:tcPr>
+            <w:tcW w:type="dxa" w:w="1701"/>
+            <w:shd w:val="clear" w:color="auto" w:fill="F5FBF5"/>
+            <w:tcMar>
+              <w:top w:w="50" w:type="dxa"/>
+              <w:bottom w:w="50" w:type="dxa"/>
+              <w:left w:w="100" w:type="dxa"/>
+              <w:right w:w="100" w:type="dxa"/>
+            </w:tcMar>
+            <w:tcBorders>
+              <w:top w:val="single" w:sz="4" w:color="D0D0D0" w:space="0"/>
+              <w:left w:val="single" w:sz="4" w:color="D0D0D0" w:space="0"/>
+              <w:bottom w:val="single" w:sz="4" w:color="D0D0D0" w:space="0"/>
+              <w:right w:val="single" w:sz="4" w:color="D0D0D0" w:space="0"/>
+            </w:tcBorders>
+          </w:tcPr>
+          <w:p>
+            <w:pPr>
+              <w:jc w:val="left"/>
+            </w:pPr>
+            <w:r>
+              <w:rPr>
+                <w:b w:val="0"/>
+                <w:i w:val="0"/>
+                <w:color w:val="222222"/>
+                <w:sz w:val="17"/>
+              </w:rPr>
+              <w:t>Sulawesi Babirusa</w:t>
+            </w:r>
+          </w:p>
+        </w:tc>
+        <w:tc>
+          <w:tcPr>
+            <w:tcW w:type="dxa" w:w="1587"/>
+            <w:shd w:val="clear" w:color="auto" w:fill="F5FBF5"/>
+            <w:tcMar>
+              <w:top w:w="50" w:type="dxa"/>
+              <w:bottom w:w="50" w:type="dxa"/>
+              <w:left w:w="100" w:type="dxa"/>
+              <w:right w:w="100" w:type="dxa"/>
+            </w:tcMar>
+            <w:tcBorders>
+              <w:top w:val="single" w:sz="4" w:color="D0D0D0" w:space="0"/>
+              <w:left w:val="single" w:sz="4" w:color="D0D0D0" w:space="0"/>
+              <w:bottom w:val="single" w:sz="4" w:color="D0D0D0" w:space="0"/>
+              <w:right w:val="single" w:sz="4" w:color="D0D0D0" w:space="0"/>
+            </w:tcBorders>
+          </w:tcPr>
+          <w:p>
+            <w:pPr>
+              <w:jc w:val="center"/>
+            </w:pPr>
+            <w:r>
+              <w:rPr>
+                <w:b w:val="0"/>
+                <w:i w:val="0"/>
+                <w:color w:val="222222"/>
+                <w:sz w:val="17"/>
+              </w:rPr>
+              <w:t>Vulnerable</w:t>
+            </w:r>
+          </w:p>
+        </w:tc>
+        <w:tc>
+          <w:tcPr>
+            <w:tcW w:type="dxa" w:w="1361"/>
+            <w:shd w:val="clear" w:color="auto" w:fill="F5FBF5"/>
+            <w:tcMar>
+              <w:top w:w="50" w:type="dxa"/>
+              <w:bottom w:w="50" w:type="dxa"/>
+              <w:left w:w="100" w:type="dxa"/>
+              <w:right w:w="100" w:type="dxa"/>
+            </w:tcMar>
+            <w:tcBorders>
+              <w:top w:val="single" w:sz="4" w:color="D0D0D0" w:space="0"/>
+              <w:left w:val="single" w:sz="4" w:color="D0D0D0" w:space="0"/>
+              <w:bottom w:val="single" w:sz="4" w:color="D0D0D0" w:space="0"/>
+              <w:right w:val="single" w:sz="4" w:color="D0D0D0" w:space="0"/>
+            </w:tcBorders>
+          </w:tcPr>
+          <w:p>
+            <w:pPr>
+              <w:jc w:val="center"/>
+            </w:pPr>
+            <w:r>
+              <w:rPr>
+                <w:b w:val="0"/>
+                <w:i w:val="0"/>
+                <w:color w:val="222222"/>
+                <w:sz w:val="17"/>
+              </w:rPr>
+              <w:t>Decreasing</w:t>
+            </w:r>
+          </w:p>
+        </w:tc>
+        <w:tc>
+          <w:tcPr>
+            <w:tcW w:type="dxa" w:w="1134"/>
+            <w:shd w:val="clear" w:color="auto" w:fill="F5FBF5"/>
+            <w:tcMar>
+              <w:top w:w="50" w:type="dxa"/>
+              <w:bottom w:w="50" w:type="dxa"/>
+              <w:left w:w="100" w:type="dxa"/>
+              <w:right w:w="100" w:type="dxa"/>
+            </w:tcMar>
+            <w:tcBorders>
+              <w:top w:val="single" w:sz="4" w:color="D0D0D0" w:space="0"/>
+              <w:left w:val="single" w:sz="4" w:color="D0D0D0" w:space="0"/>
+              <w:bottom w:val="single" w:sz="4" w:color="D0D0D0" w:space="0"/>
+              <w:right w:val="single" w:sz="4" w:color="D0D0D0" w:space="0"/>
+            </w:tcBorders>
+          </w:tcPr>
+          <w:p>
+            <w:pPr>
+              <w:jc w:val="center"/>
+            </w:pPr>
+            <w:r>
+              <w:rPr>
+                <w:b w:val="0"/>
+                <w:i w:val="0"/>
+                <w:color w:val="222222"/>
+                <w:sz w:val="17"/>
+              </w:rPr>
+              <w:t>Yes</w:t>
+            </w:r>
+          </w:p>
+        </w:tc>
+        <w:tc>
+          <w:tcPr>
+            <w:tcW w:type="dxa" w:w="907"/>
+            <w:shd w:val="clear" w:color="auto" w:fill="F5FBF5"/>
+            <w:tcMar>
+              <w:top w:w="50" w:type="dxa"/>
+              <w:bottom w:w="50" w:type="dxa"/>
+              <w:left w:w="100" w:type="dxa"/>
+              <w:right w:w="100" w:type="dxa"/>
+            </w:tcMar>
+            <w:tcBorders>
+              <w:top w:val="single" w:sz="4" w:color="D0D0D0" w:space="0"/>
+              <w:left w:val="single" w:sz="4" w:color="D0D0D0" w:space="0"/>
+              <w:bottom w:val="single" w:sz="4" w:color="D0D0D0" w:space="0"/>
+              <w:right w:val="single" w:sz="4" w:color="D0D0D0" w:space="0"/>
+            </w:tcBorders>
+          </w:tcPr>
+          <w:p>
+            <w:pPr>
+              <w:jc w:val="center"/>
+            </w:pPr>
+            <w:r>
+              <w:rPr>
+                <w:b w:val="0"/>
+                <w:i w:val="0"/>
+                <w:color w:val="222222"/>
+                <w:sz w:val="17"/>
+              </w:rPr>
+              <w:t>33</w:t>
+            </w:r>
+          </w:p>
+        </w:tc>
+      </w:tr>
+      <w:tr>
+        <w:tc>
+          <w:tcPr>
+            <w:tcW w:type="dxa" w:w="1814"/>
+            <w:shd w:val="clear" w:color="auto" w:fill="FFFFFF"/>
+            <w:tcMar>
+              <w:top w:w="50" w:type="dxa"/>
+              <w:bottom w:w="50" w:type="dxa"/>
+              <w:left w:w="100" w:type="dxa"/>
+              <w:right w:w="100" w:type="dxa"/>
+            </w:tcMar>
+            <w:tcBorders>
+              <w:top w:val="single" w:sz="4" w:color="D0D0D0" w:space="0"/>
+              <w:left w:val="single" w:sz="4" w:color="D0D0D0" w:space="0"/>
+              <w:bottom w:val="single" w:sz="4" w:color="D0D0D0" w:space="0"/>
+              <w:right w:val="single" w:sz="4" w:color="D0D0D0" w:space="0"/>
+            </w:tcBorders>
+          </w:tcPr>
+          <w:p>
+            <w:pPr>
+              <w:jc w:val="left"/>
+            </w:pPr>
+            <w:r>
+              <w:rPr>
+                <w:b w:val="0"/>
+                <w:i w:val="0"/>
+                <w:color w:val="222222"/>
+                <w:sz w:val="17"/>
+              </w:rPr>
+              <w:t>Babyrousa babyrussa</w:t>
+            </w:r>
+          </w:p>
+        </w:tc>
+        <w:tc>
+          <w:tcPr>
+            <w:tcW w:type="dxa" w:w="1701"/>
+            <w:shd w:val="clear" w:color="auto" w:fill="FFFFFF"/>
+            <w:tcMar>
+              <w:top w:w="50" w:type="dxa"/>
+              <w:bottom w:w="50" w:type="dxa"/>
+              <w:left w:w="100" w:type="dxa"/>
+              <w:right w:w="100" w:type="dxa"/>
+            </w:tcMar>
+            <w:tcBorders>
+              <w:top w:val="single" w:sz="4" w:color="D0D0D0" w:space="0"/>
+              <w:left w:val="single" w:sz="4" w:color="D0D0D0" w:space="0"/>
+              <w:bottom w:val="single" w:sz="4" w:color="D0D0D0" w:space="0"/>
+              <w:right w:val="single" w:sz="4" w:color="D0D0D0" w:space="0"/>
+            </w:tcBorders>
+          </w:tcPr>
+          <w:p>
+            <w:pPr>
+              <w:jc w:val="left"/>
+            </w:pPr>
+            <w:r>
+              <w:rPr>
+                <w:b w:val="0"/>
+                <w:i w:val="0"/>
+                <w:color w:val="222222"/>
+                <w:sz w:val="17"/>
+              </w:rPr>
+              <w:t>Hairy Babirusa</w:t>
+            </w:r>
+          </w:p>
+        </w:tc>
+        <w:tc>
+          <w:tcPr>
+            <w:tcW w:type="dxa" w:w="1587"/>
+            <w:shd w:val="clear" w:color="auto" w:fill="FFFFFF"/>
+            <w:tcMar>
+              <w:top w:w="50" w:type="dxa"/>
+              <w:bottom w:w="50" w:type="dxa"/>
+              <w:left w:w="100" w:type="dxa"/>
+              <w:right w:w="100" w:type="dxa"/>
+            </w:tcMar>
+            <w:tcBorders>
+              <w:top w:val="single" w:sz="4" w:color="D0D0D0" w:space="0"/>
+              <w:left w:val="single" w:sz="4" w:color="D0D0D0" w:space="0"/>
+              <w:bottom w:val="single" w:sz="4" w:color="D0D0D0" w:space="0"/>
+              <w:right w:val="single" w:sz="4" w:color="D0D0D0" w:space="0"/>
+            </w:tcBorders>
+          </w:tcPr>
+          <w:p>
+            <w:pPr>
+              <w:jc w:val="center"/>
+            </w:pPr>
+            <w:r>
+              <w:rPr>
+                <w:b w:val="0"/>
+                <w:i w:val="0"/>
+                <w:color w:val="222222"/>
+                <w:sz w:val="17"/>
+              </w:rPr>
+              <w:t>Vulnerable</w:t>
+            </w:r>
+          </w:p>
+        </w:tc>
+        <w:tc>
+          <w:tcPr>
+            <w:tcW w:type="dxa" w:w="1361"/>
+            <w:shd w:val="clear" w:color="auto" w:fill="FFFFFF"/>
+            <w:tcMar>
+              <w:top w:w="50" w:type="dxa"/>
+              <w:bottom w:w="50" w:type="dxa"/>
+              <w:left w:w="100" w:type="dxa"/>
+              <w:right w:w="100" w:type="dxa"/>
+            </w:tcMar>
+            <w:tcBorders>
+              <w:top w:val="single" w:sz="4" w:color="D0D0D0" w:space="0"/>
+              <w:left w:val="single" w:sz="4" w:color="D0D0D0" w:space="0"/>
+              <w:bottom w:val="single" w:sz="4" w:color="D0D0D0" w:space="0"/>
+              <w:right w:val="single" w:sz="4" w:color="D0D0D0" w:space="0"/>
+            </w:tcBorders>
+          </w:tcPr>
+          <w:p>
+            <w:pPr>
+              <w:jc w:val="center"/>
+            </w:pPr>
+            <w:r>
+              <w:rPr>
+                <w:b w:val="0"/>
+                <w:i w:val="0"/>
+                <w:color w:val="222222"/>
+                <w:sz w:val="17"/>
+              </w:rPr>
+              <w:t>Decreasing</w:t>
+            </w:r>
+          </w:p>
+        </w:tc>
+        <w:tc>
+          <w:tcPr>
+            <w:tcW w:type="dxa" w:w="1134"/>
+            <w:shd w:val="clear" w:color="auto" w:fill="FFFFFF"/>
+            <w:tcMar>
+              <w:top w:w="50" w:type="dxa"/>
+              <w:bottom w:w="50" w:type="dxa"/>
+              <w:left w:w="100" w:type="dxa"/>
+              <w:right w:w="100" w:type="dxa"/>
+            </w:tcMar>
+            <w:tcBorders>
+              <w:top w:val="single" w:sz="4" w:color="D0D0D0" w:space="0"/>
+              <w:left w:val="single" w:sz="4" w:color="D0D0D0" w:space="0"/>
+              <w:bottom w:val="single" w:sz="4" w:color="D0D0D0" w:space="0"/>
+              <w:right w:val="single" w:sz="4" w:color="D0D0D0" w:space="0"/>
+            </w:tcBorders>
+          </w:tcPr>
+          <w:p>
+            <w:pPr>
+              <w:jc w:val="center"/>
+            </w:pPr>
+            <w:r>
+              <w:rPr>
+                <w:b w:val="0"/>
+                <w:i w:val="0"/>
+                <w:color w:val="222222"/>
+                <w:sz w:val="17"/>
+              </w:rPr>
+              <w:t>No</w:t>
+            </w:r>
+          </w:p>
+        </w:tc>
+        <w:tc>
+          <w:tcPr>
+            <w:tcW w:type="dxa" w:w="907"/>
+            <w:shd w:val="clear" w:color="auto" w:fill="FFFFFF"/>
+            <w:tcMar>
+              <w:top w:w="50" w:type="dxa"/>
+              <w:bottom w:w="50" w:type="dxa"/>
+              <w:left w:w="100" w:type="dxa"/>
+              <w:right w:w="100" w:type="dxa"/>
+            </w:tcMar>
+            <w:tcBorders>
+              <w:top w:val="single" w:sz="4" w:color="D0D0D0" w:space="0"/>
+              <w:left w:val="single" w:sz="4" w:color="D0D0D0" w:space="0"/>
+              <w:bottom w:val="single" w:sz="4" w:color="D0D0D0" w:space="0"/>
+              <w:right w:val="single" w:sz="4" w:color="D0D0D0" w:space="0"/>
+            </w:tcBorders>
+          </w:tcPr>
+          <w:p>
+            <w:pPr>
+              <w:jc w:val="center"/>
+            </w:pPr>
+            <w:r>
+              <w:rPr>
+                <w:b w:val="0"/>
+                <w:i w:val="0"/>
+                <w:color w:val="222222"/>
+                <w:sz w:val="17"/>
+              </w:rPr>
+              <w:t>14</w:t>
+            </w:r>
+          </w:p>
+        </w:tc>
+      </w:tr>
+      <w:tr>
+        <w:tc>
+          <w:tcPr>
+            <w:tcW w:type="dxa" w:w="1814"/>
+            <w:shd w:val="clear" w:color="auto" w:fill="F5FBF5"/>
+            <w:tcMar>
+              <w:top w:w="50" w:type="dxa"/>
+              <w:bottom w:w="50" w:type="dxa"/>
+              <w:left w:w="100" w:type="dxa"/>
+              <w:right w:w="100" w:type="dxa"/>
+            </w:tcMar>
+            <w:tcBorders>
+              <w:top w:val="single" w:sz="4" w:color="D0D0D0" w:space="0"/>
+              <w:left w:val="single" w:sz="4" w:color="D0D0D0" w:space="0"/>
+              <w:bottom w:val="single" w:sz="4" w:color="D0D0D0" w:space="0"/>
+              <w:right w:val="single" w:sz="4" w:color="D0D0D0" w:space="0"/>
+            </w:tcBorders>
+          </w:tcPr>
+          <w:p>
+            <w:pPr>
+              <w:jc w:val="left"/>
+            </w:pPr>
+            <w:r>
+              <w:rPr>
+                <w:b w:val="0"/>
+                <w:i w:val="0"/>
+                <w:color w:val="222222"/>
+                <w:sz w:val="17"/>
+              </w:rPr>
+              <w:t>Tarsius tarsier</w:t>
+            </w:r>
+          </w:p>
+        </w:tc>
+        <w:tc>
+          <w:tcPr>
+            <w:tcW w:type="dxa" w:w="1701"/>
+            <w:shd w:val="clear" w:color="auto" w:fill="F5FBF5"/>
+            <w:tcMar>
+              <w:top w:w="50" w:type="dxa"/>
+              <w:bottom w:w="50" w:type="dxa"/>
+              <w:left w:w="100" w:type="dxa"/>
+              <w:right w:w="100" w:type="dxa"/>
+            </w:tcMar>
+            <w:tcBorders>
+              <w:top w:val="single" w:sz="4" w:color="D0D0D0" w:space="0"/>
+              <w:left w:val="single" w:sz="4" w:color="D0D0D0" w:space="0"/>
+              <w:bottom w:val="single" w:sz="4" w:color="D0D0D0" w:space="0"/>
+              <w:right w:val="single" w:sz="4" w:color="D0D0D0" w:space="0"/>
+            </w:tcBorders>
+          </w:tcPr>
+          <w:p>
+            <w:pPr>
+              <w:jc w:val="left"/>
+            </w:pPr>
+            <w:r>
+              <w:rPr>
+                <w:b w:val="0"/>
+                <w:i w:val="0"/>
+                <w:color w:val="222222"/>
+                <w:sz w:val="17"/>
+              </w:rPr>
+              <w:t>Spectral Tarsier</w:t>
+            </w:r>
+          </w:p>
+        </w:tc>
+        <w:tc>
+          <w:tcPr>
+            <w:tcW w:type="dxa" w:w="1587"/>
+            <w:shd w:val="clear" w:color="auto" w:fill="F5FBF5"/>
+            <w:tcMar>
+              <w:top w:w="50" w:type="dxa"/>
+              <w:bottom w:w="50" w:type="dxa"/>
+              <w:left w:w="100" w:type="dxa"/>
+              <w:right w:w="100" w:type="dxa"/>
+            </w:tcMar>
+            <w:tcBorders>
+              <w:top w:val="single" w:sz="4" w:color="D0D0D0" w:space="0"/>
+              <w:left w:val="single" w:sz="4" w:color="D0D0D0" w:space="0"/>
+              <w:bottom w:val="single" w:sz="4" w:color="D0D0D0" w:space="0"/>
+              <w:right w:val="single" w:sz="4" w:color="D0D0D0" w:space="0"/>
+            </w:tcBorders>
+          </w:tcPr>
+          <w:p>
+            <w:pPr>
+              <w:jc w:val="center"/>
+            </w:pPr>
+            <w:r>
+              <w:rPr>
+                <w:b w:val="0"/>
+                <w:i w:val="0"/>
+                <w:color w:val="222222"/>
+                <w:sz w:val="17"/>
+              </w:rPr>
+              <w:t>Vulnerable</w:t>
+            </w:r>
+          </w:p>
+        </w:tc>
+        <w:tc>
+          <w:tcPr>
+            <w:tcW w:type="dxa" w:w="1361"/>
+            <w:shd w:val="clear" w:color="auto" w:fill="F5FBF5"/>
+            <w:tcMar>
+              <w:top w:w="50" w:type="dxa"/>
+              <w:bottom w:w="50" w:type="dxa"/>
+              <w:left w:w="100" w:type="dxa"/>
+              <w:right w:w="100" w:type="dxa"/>
+            </w:tcMar>
+            <w:tcBorders>
+              <w:top w:val="single" w:sz="4" w:color="D0D0D0" w:space="0"/>
+              <w:left w:val="single" w:sz="4" w:color="D0D0D0" w:space="0"/>
+              <w:bottom w:val="single" w:sz="4" w:color="D0D0D0" w:space="0"/>
+              <w:right w:val="single" w:sz="4" w:color="D0D0D0" w:space="0"/>
+            </w:tcBorders>
+          </w:tcPr>
+          <w:p>
+            <w:pPr>
+              <w:jc w:val="center"/>
+            </w:pPr>
+            <w:r>
+              <w:rPr>
+                <w:b w:val="0"/>
+                <w:i w:val="0"/>
+                <w:color w:val="222222"/>
+                <w:sz w:val="17"/>
+              </w:rPr>
+              <w:t>Decreasing</w:t>
+            </w:r>
+          </w:p>
+        </w:tc>
+        <w:tc>
+          <w:tcPr>
+            <w:tcW w:type="dxa" w:w="1134"/>
+            <w:shd w:val="clear" w:color="auto" w:fill="F5FBF5"/>
+            <w:tcMar>
+              <w:top w:w="50" w:type="dxa"/>
+              <w:bottom w:w="50" w:type="dxa"/>
+              <w:left w:w="100" w:type="dxa"/>
+              <w:right w:w="100" w:type="dxa"/>
+            </w:tcMar>
+            <w:tcBorders>
+              <w:top w:val="single" w:sz="4" w:color="D0D0D0" w:space="0"/>
+              <w:left w:val="single" w:sz="4" w:color="D0D0D0" w:space="0"/>
+              <w:bottom w:val="single" w:sz="4" w:color="D0D0D0" w:space="0"/>
+              <w:right w:val="single" w:sz="4" w:color="D0D0D0" w:space="0"/>
+            </w:tcBorders>
+          </w:tcPr>
+          <w:p>
+            <w:pPr>
+              <w:jc w:val="center"/>
+            </w:pPr>
+            <w:r>
+              <w:rPr>
+                <w:b w:val="0"/>
+                <w:i w:val="0"/>
+                <w:color w:val="222222"/>
+                <w:sz w:val="17"/>
+              </w:rPr>
+              <w:t>No</w:t>
+            </w:r>
+          </w:p>
+        </w:tc>
+        <w:tc>
+          <w:tcPr>
+            <w:tcW w:type="dxa" w:w="907"/>
+            <w:shd w:val="clear" w:color="auto" w:fill="F5FBF5"/>
+            <w:tcMar>
+              <w:top w:w="50" w:type="dxa"/>
+              <w:bottom w:w="50" w:type="dxa"/>
+              <w:left w:w="100" w:type="dxa"/>
+              <w:right w:w="100" w:type="dxa"/>
+            </w:tcMar>
+            <w:tcBorders>
+              <w:top w:val="single" w:sz="4" w:color="D0D0D0" w:space="0"/>
+              <w:left w:val="single" w:sz="4" w:color="D0D0D0" w:space="0"/>
+              <w:bottom w:val="single" w:sz="4" w:color="D0D0D0" w:space="0"/>
+              <w:right w:val="single" w:sz="4" w:color="D0D0D0" w:space="0"/>
+            </w:tcBorders>
+          </w:tcPr>
+          <w:p>
+            <w:pPr>
+              <w:jc w:val="center"/>
+            </w:pPr>
+            <w:r>
+              <w:rPr>
+                <w:b w:val="0"/>
+                <w:i w:val="0"/>
+                <w:color w:val="222222"/>
+                <w:sz w:val="17"/>
+              </w:rPr>
+              <w:t>12</w:t>
+            </w:r>
+          </w:p>
+        </w:tc>
+      </w:tr>
+    </w:tbl>
+    <w:p>
+      <w:pPr>
+        <w:spacing w:before="40" w:after="80"/>
+      </w:pPr>
+    </w:p>
+    <w:p>
+      <w:pPr>
+        <w:spacing w:before="120" w:after="40"/>
+      </w:pPr>
+      <w:r>
+        <w:rPr>
+          <w:b/>
+          <w:i/>
+          <w:color w:val="2E7D32"/>
+          <w:sz w:val="17"/>
+        </w:rPr>
+        <w:t>Tabel 2.10: Ringkasan Status Konservasi IUCN Spesies Endemik Kunci</w:t>
+      </w:r>
+    </w:p>
+    <w:tbl>
+      <w:tblPr>
+        <w:tblStyle w:val="TableGrid"/>
+        <w:tblW w:type="auto" w:w="0"/>
+        <w:jc w:val="center"/>
+        <w:tblLayout w:type="fixed"/>
+        <w:tblLook w:firstColumn="1" w:firstRow="1" w:lastColumn="0" w:lastRow="0" w:noHBand="0" w:noVBand="1" w:val="04A0"/>
+      </w:tblPr>
+      <w:tblGrid>
+        <w:gridCol w:w="3213"/>
+        <w:gridCol w:w="3213"/>
+        <w:gridCol w:w="3213"/>
+      </w:tblGrid>
+      <w:tr>
+        <w:tc>
+          <w:tcPr>
+            <w:tcW w:type="dxa" w:w="2835"/>
+            <w:shd w:val="clear" w:color="auto" w:fill="2E7D32"/>
+            <w:tcMar>
+              <w:top w:w="70" w:type="dxa"/>
+              <w:bottom w:w="70" w:type="dxa"/>
+              <w:left w:w="100" w:type="dxa"/>
+              <w:right w:w="100" w:type="dxa"/>
+            </w:tcMar>
+            <w:tcBorders>
+              <w:top w:val="single" w:sz="4" w:color="D0D0D0" w:space="0"/>
+              <w:left w:val="single" w:sz="4" w:color="D0D0D0" w:space="0"/>
+              <w:bottom w:val="single" w:sz="8" w:color="1B5E20" w:space="0"/>
+              <w:right w:val="single" w:sz="4" w:color="D0D0D0" w:space="0"/>
+            </w:tcBorders>
+          </w:tcPr>
+          <w:p>
+            <w:pPr>
+              <w:jc w:val="left"/>
+            </w:pPr>
+            <w:r>
+              <w:rPr>
+                <w:b/>
+                <w:i w:val="0"/>
+                <w:color w:val="FFFFFF"/>
+                <w:sz w:val="17"/>
+              </w:rPr>
+              <w:t>Status IUCN</w:t>
+            </w:r>
+          </w:p>
+        </w:tc>
+        <w:tc>
+          <w:tcPr>
+            <w:tcW w:type="dxa" w:w="1701"/>
+            <w:shd w:val="clear" w:color="auto" w:fill="2E7D32"/>
+            <w:tcMar>
+              <w:top w:w="70" w:type="dxa"/>
+              <w:bottom w:w="70" w:type="dxa"/>
+              <w:left w:w="100" w:type="dxa"/>
+              <w:right w:w="100" w:type="dxa"/>
+            </w:tcMar>
+            <w:tcBorders>
+              <w:top w:val="single" w:sz="4" w:color="D0D0D0" w:space="0"/>
+              <w:left w:val="single" w:sz="4" w:color="D0D0D0" w:space="0"/>
+              <w:bottom w:val="single" w:sz="8" w:color="1B5E20" w:space="0"/>
+              <w:right w:val="single" w:sz="4" w:color="D0D0D0" w:space="0"/>
+            </w:tcBorders>
+          </w:tcPr>
+          <w:p>
+            <w:pPr>
+              <w:jc w:val="center"/>
+            </w:pPr>
+            <w:r>
+              <w:rPr>
+                <w:b/>
+                <w:i w:val="0"/>
+                <w:color w:val="FFFFFF"/>
+                <w:sz w:val="17"/>
+              </w:rPr>
+              <w:t>Jumlah Spesies</w:t>
+            </w:r>
+          </w:p>
+        </w:tc>
+        <w:tc>
+          <w:tcPr>
+            <w:tcW w:type="dxa" w:w="1701"/>
+            <w:shd w:val="clear" w:color="auto" w:fill="2E7D32"/>
+            <w:tcMar>
+              <w:top w:w="70" w:type="dxa"/>
+              <w:bottom w:w="70" w:type="dxa"/>
+              <w:left w:w="100" w:type="dxa"/>
+              <w:right w:w="100" w:type="dxa"/>
+            </w:tcMar>
+            <w:tcBorders>
+              <w:top w:val="single" w:sz="4" w:color="D0D0D0" w:space="0"/>
+              <w:left w:val="single" w:sz="4" w:color="D0D0D0" w:space="0"/>
+              <w:bottom w:val="single" w:sz="8" w:color="1B5E20" w:space="0"/>
+              <w:right w:val="single" w:sz="4" w:color="D0D0D0" w:space="0"/>
+            </w:tcBorders>
+          </w:tcPr>
+          <w:p>
+            <w:pPr>
+              <w:jc w:val="center"/>
+            </w:pPr>
+            <w:r>
+              <w:rPr>
+                <w:b/>
+                <w:i w:val="0"/>
+                <w:color w:val="FFFFFF"/>
+                <w:sz w:val="17"/>
+              </w:rPr>
+              <w:t>Proporsi</w:t>
+            </w:r>
+          </w:p>
+        </w:tc>
+      </w:tr>
+      <w:tr>
+        <w:tc>
+          <w:tcPr>
+            <w:tcW w:type="dxa" w:w="2835"/>
+            <w:shd w:val="clear" w:color="auto" w:fill="F5FBF5"/>
+            <w:tcMar>
+              <w:top w:w="50" w:type="dxa"/>
+              <w:bottom w:w="50" w:type="dxa"/>
+              <w:left w:w="100" w:type="dxa"/>
+              <w:right w:w="100" w:type="dxa"/>
+            </w:tcMar>
+            <w:tcBorders>
+              <w:top w:val="single" w:sz="4" w:color="D0D0D0" w:space="0"/>
+              <w:left w:val="single" w:sz="4" w:color="D0D0D0" w:space="0"/>
+              <w:bottom w:val="single" w:sz="4" w:color="D0D0D0" w:space="0"/>
+              <w:right w:val="single" w:sz="4" w:color="D0D0D0" w:space="0"/>
+            </w:tcBorders>
+          </w:tcPr>
+          <w:p>
+            <w:pPr>
+              <w:jc w:val="left"/>
+            </w:pPr>
+            <w:r>
+              <w:rPr>
+                <w:b w:val="0"/>
+                <w:i w:val="0"/>
+                <w:color w:val="222222"/>
+                <w:sz w:val="17"/>
+              </w:rPr>
+              <w:t>Critically Endangered</w:t>
+            </w:r>
+          </w:p>
+        </w:tc>
+        <w:tc>
+          <w:tcPr>
+            <w:tcW w:type="dxa" w:w="1701"/>
+            <w:shd w:val="clear" w:color="auto" w:fill="F5FBF5"/>
+            <w:tcMar>
+              <w:top w:w="50" w:type="dxa"/>
+              <w:bottom w:w="50" w:type="dxa"/>
+              <w:left w:w="100" w:type="dxa"/>
+              <w:right w:w="100" w:type="dxa"/>
+            </w:tcMar>
+            <w:tcBorders>
+              <w:top w:val="single" w:sz="4" w:color="D0D0D0" w:space="0"/>
+              <w:left w:val="single" w:sz="4" w:color="D0D0D0" w:space="0"/>
+              <w:bottom w:val="single" w:sz="4" w:color="D0D0D0" w:space="0"/>
+              <w:right w:val="single" w:sz="4" w:color="D0D0D0" w:space="0"/>
+            </w:tcBorders>
+          </w:tcPr>
+          <w:p>
+            <w:pPr>
+              <w:jc w:val="center"/>
+            </w:pPr>
+            <w:r>
+              <w:rPr>
+                <w:b w:val="0"/>
+                <w:i w:val="0"/>
+                <w:color w:val="222222"/>
+                <w:sz w:val="17"/>
+              </w:rPr>
+              <w:t>2</w:t>
+            </w:r>
+          </w:p>
+        </w:tc>
+        <w:tc>
+          <w:tcPr>
+            <w:tcW w:type="dxa" w:w="1701"/>
+            <w:shd w:val="clear" w:color="auto" w:fill="F5FBF5"/>
+            <w:tcMar>
+              <w:top w:w="50" w:type="dxa"/>
+              <w:bottom w:w="50" w:type="dxa"/>
+              <w:left w:w="100" w:type="dxa"/>
+              <w:right w:w="100" w:type="dxa"/>
+            </w:tcMar>
+            <w:tcBorders>
+              <w:top w:val="single" w:sz="4" w:color="D0D0D0" w:space="0"/>
+              <w:left w:val="single" w:sz="4" w:color="D0D0D0" w:space="0"/>
+              <w:bottom w:val="single" w:sz="4" w:color="D0D0D0" w:space="0"/>
+              <w:right w:val="single" w:sz="4" w:color="D0D0D0" w:space="0"/>
+            </w:tcBorders>
+          </w:tcPr>
+          <w:p>
+            <w:pPr>
+              <w:jc w:val="center"/>
+            </w:pPr>
+            <w:r>
+              <w:rPr>
+                <w:b w:val="0"/>
+                <w:i w:val="0"/>
+                <w:color w:val="222222"/>
+                <w:sz w:val="17"/>
+              </w:rPr>
+              <w:t>28.6%</w:t>
+            </w:r>
+          </w:p>
+        </w:tc>
+      </w:tr>
+      <w:tr>
+        <w:tc>
+          <w:tcPr>
+            <w:tcW w:type="dxa" w:w="2835"/>
+            <w:shd w:val="clear" w:color="auto" w:fill="FFFFFF"/>
+            <w:tcMar>
+              <w:top w:w="50" w:type="dxa"/>
+              <w:bottom w:w="50" w:type="dxa"/>
+              <w:left w:w="100" w:type="dxa"/>
+              <w:right w:w="100" w:type="dxa"/>
+            </w:tcMar>
+            <w:tcBorders>
+              <w:top w:val="single" w:sz="4" w:color="D0D0D0" w:space="0"/>
+              <w:left w:val="single" w:sz="4" w:color="D0D0D0" w:space="0"/>
+              <w:bottom w:val="single" w:sz="4" w:color="D0D0D0" w:space="0"/>
+              <w:right w:val="single" w:sz="4" w:color="D0D0D0" w:space="0"/>
+            </w:tcBorders>
+          </w:tcPr>
+          <w:p>
+            <w:pPr>
+              <w:jc w:val="left"/>
+            </w:pPr>
+            <w:r>
+              <w:rPr>
+                <w:b w:val="0"/>
+                <w:i w:val="0"/>
+                <w:color w:val="222222"/>
+                <w:sz w:val="17"/>
+              </w:rPr>
+              <w:t>Endangered</w:t>
+            </w:r>
+          </w:p>
+        </w:tc>
+        <w:tc>
+          <w:tcPr>
+            <w:tcW w:type="dxa" w:w="1701"/>
+            <w:shd w:val="clear" w:color="auto" w:fill="FFFFFF"/>
+            <w:tcMar>
+              <w:top w:w="50" w:type="dxa"/>
+              <w:bottom w:w="50" w:type="dxa"/>
+              <w:left w:w="100" w:type="dxa"/>
+              <w:right w:w="100" w:type="dxa"/>
+            </w:tcMar>
+            <w:tcBorders>
+              <w:top w:val="single" w:sz="4" w:color="D0D0D0" w:space="0"/>
+              <w:left w:val="single" w:sz="4" w:color="D0D0D0" w:space="0"/>
+              <w:bottom w:val="single" w:sz="4" w:color="D0D0D0" w:space="0"/>
+              <w:right w:val="single" w:sz="4" w:color="D0D0D0" w:space="0"/>
+            </w:tcBorders>
+          </w:tcPr>
+          <w:p>
+            <w:pPr>
+              <w:jc w:val="center"/>
+            </w:pPr>
+            <w:r>
+              <w:rPr>
+                <w:b w:val="0"/>
+                <w:i w:val="0"/>
+                <w:color w:val="222222"/>
+                <w:sz w:val="17"/>
+              </w:rPr>
+              <w:t>2</w:t>
+            </w:r>
+          </w:p>
+        </w:tc>
+        <w:tc>
+          <w:tcPr>
+            <w:tcW w:type="dxa" w:w="1701"/>
+            <w:shd w:val="clear" w:color="auto" w:fill="FFFFFF"/>
+            <w:tcMar>
+              <w:top w:w="50" w:type="dxa"/>
+              <w:bottom w:w="50" w:type="dxa"/>
+              <w:left w:w="100" w:type="dxa"/>
+              <w:right w:w="100" w:type="dxa"/>
+            </w:tcMar>
+            <w:tcBorders>
+              <w:top w:val="single" w:sz="4" w:color="D0D0D0" w:space="0"/>
+              <w:left w:val="single" w:sz="4" w:color="D0D0D0" w:space="0"/>
+              <w:bottom w:val="single" w:sz="4" w:color="D0D0D0" w:space="0"/>
+              <w:right w:val="single" w:sz="4" w:color="D0D0D0" w:space="0"/>
+            </w:tcBorders>
+          </w:tcPr>
+          <w:p>
+            <w:pPr>
+              <w:jc w:val="center"/>
+            </w:pPr>
+            <w:r>
+              <w:rPr>
+                <w:b w:val="0"/>
+                <w:i w:val="0"/>
+                <w:color w:val="222222"/>
+                <w:sz w:val="17"/>
+              </w:rPr>
+              <w:t>28.6%</w:t>
+            </w:r>
+          </w:p>
+        </w:tc>
+      </w:tr>
+      <w:tr>
+        <w:tc>
+          <w:tcPr>
+            <w:tcW w:type="dxa" w:w="2835"/>
+            <w:shd w:val="clear" w:color="auto" w:fill="F5FBF5"/>
+            <w:tcMar>
+              <w:top w:w="50" w:type="dxa"/>
+              <w:bottom w:w="50" w:type="dxa"/>
+              <w:left w:w="100" w:type="dxa"/>
+              <w:right w:w="100" w:type="dxa"/>
+            </w:tcMar>
+            <w:tcBorders>
+              <w:top w:val="single" w:sz="4" w:color="D0D0D0" w:space="0"/>
+              <w:left w:val="single" w:sz="4" w:color="D0D0D0" w:space="0"/>
+              <w:bottom w:val="single" w:sz="4" w:color="D0D0D0" w:space="0"/>
+              <w:right w:val="single" w:sz="4" w:color="D0D0D0" w:space="0"/>
+            </w:tcBorders>
+          </w:tcPr>
+          <w:p>
+            <w:pPr>
+              <w:jc w:val="left"/>
+            </w:pPr>
+            <w:r>
+              <w:rPr>
+                <w:b w:val="0"/>
+                <w:i w:val="0"/>
+                <w:color w:val="222222"/>
+                <w:sz w:val="17"/>
+              </w:rPr>
+              <w:t>Vulnerable</w:t>
+            </w:r>
+          </w:p>
+        </w:tc>
+        <w:tc>
+          <w:tcPr>
+            <w:tcW w:type="dxa" w:w="1701"/>
+            <w:shd w:val="clear" w:color="auto" w:fill="F5FBF5"/>
+            <w:tcMar>
+              <w:top w:w="50" w:type="dxa"/>
+              <w:bottom w:w="50" w:type="dxa"/>
+              <w:left w:w="100" w:type="dxa"/>
+              <w:right w:w="100" w:type="dxa"/>
+            </w:tcMar>
+            <w:tcBorders>
+              <w:top w:val="single" w:sz="4" w:color="D0D0D0" w:space="0"/>
+              <w:left w:val="single" w:sz="4" w:color="D0D0D0" w:space="0"/>
+              <w:bottom w:val="single" w:sz="4" w:color="D0D0D0" w:space="0"/>
+              <w:right w:val="single" w:sz="4" w:color="D0D0D0" w:space="0"/>
+            </w:tcBorders>
+          </w:tcPr>
+          <w:p>
+            <w:pPr>
+              <w:jc w:val="center"/>
+            </w:pPr>
+            <w:r>
+              <w:rPr>
+                <w:b w:val="0"/>
+                <w:i w:val="0"/>
+                <w:color w:val="222222"/>
+                <w:sz w:val="17"/>
+              </w:rPr>
+              <w:t>3</w:t>
+            </w:r>
+          </w:p>
+        </w:tc>
+        <w:tc>
+          <w:tcPr>
+            <w:tcW w:type="dxa" w:w="1701"/>
+            <w:shd w:val="clear" w:color="auto" w:fill="F5FBF5"/>
+            <w:tcMar>
+              <w:top w:w="50" w:type="dxa"/>
+              <w:bottom w:w="50" w:type="dxa"/>
+              <w:left w:w="100" w:type="dxa"/>
+              <w:right w:w="100" w:type="dxa"/>
+            </w:tcMar>
+            <w:tcBorders>
+              <w:top w:val="single" w:sz="4" w:color="D0D0D0" w:space="0"/>
+              <w:left w:val="single" w:sz="4" w:color="D0D0D0" w:space="0"/>
+              <w:bottom w:val="single" w:sz="4" w:color="D0D0D0" w:space="0"/>
+              <w:right w:val="single" w:sz="4" w:color="D0D0D0" w:space="0"/>
+            </w:tcBorders>
+          </w:tcPr>
+          <w:p>
+            <w:pPr>
+              <w:jc w:val="center"/>
+            </w:pPr>
+            <w:r>
+              <w:rPr>
+                <w:b w:val="0"/>
+                <w:i w:val="0"/>
+                <w:color w:val="222222"/>
+                <w:sz w:val="17"/>
+              </w:rPr>
+              <w:t>42.9%</w:t>
+            </w:r>
+          </w:p>
+        </w:tc>
+      </w:tr>
+    </w:tbl>
+    <w:p>
+      <w:pPr>
+        <w:spacing w:before="40" w:after="80"/>
+      </w:pPr>
+    </w:p>
+    <w:p>
+      <w:pPr>
+        <w:spacing w:before="160" w:after="40"/>
+      </w:pPr>
+      <w:r>
+        <w:rPr>
+          <w:b/>
+          <w:i w:val="0"/>
+          <w:color w:val="2E7D32"/>
+          <w:sz w:val="19"/>
+        </w:rPr>
+        <w:t>E. Analisis Temuan Empiris: Fragmentasi Habitat dan Ancaman Kepunahan</w:t>
+      </w:r>
+    </w:p>
+    <w:p>
+      <w:pPr>
+        <w:spacing w:after="100"/>
+        <w:jc w:val="both"/>
+      </w:pPr>
+      <w:r>
+        <w:rPr>
+          <w:b w:val="0"/>
+          <w:i w:val="0"/>
+          <w:color w:val="222222"/>
+          <w:sz w:val="19"/>
+        </w:rPr>
+        <w:t>Pembacaan spatial mapping GBIF dan validasi IUCN Red List menunjukkan bahwa ekspansi industri ekstraktif tidak hanya menekan kualitas air, udara, dan tutupan hutan, tetapi juga mempersempit ruang hidup spesies endemik Wallacea. Titik occurrence GBIF memberikan bukti spasial keberadaan satwa, sedangkan status IUCN dan penanda Mining Threat memperkuat pembacaan bahwa tekanan pertambangan masuk dalam daftar ancaman konservasi spesies.</w:t>
       </w:r>
     </w:p>
     <w:sectPr>

</xml_diff>

<commit_message>
fix: synchronise Emisi CO2 per Driver data source and precision with Dashboard
</commit_message>
<xml_diff>
--- a/tools/report_metodologi/bab_2/Metodologi_Bab2_Kualitas_Lingkungan.docx
+++ b/tools/report_metodologi/bab_2/Metodologi_Bab2_Kualitas_Lingkungan.docx
@@ -5206,13 +5206,14 @@
         <w:tblLook w:firstColumn="1" w:firstRow="1" w:lastColumn="0" w:lastRow="0" w:noHBand="0" w:noVBand="1" w:val="04A0"/>
       </w:tblPr>
       <w:tblGrid>
-        <w:gridCol w:w="4819"/>
-        <w:gridCol w:w="4819"/>
+        <w:gridCol w:w="3213"/>
+        <w:gridCol w:w="3213"/>
+        <w:gridCol w:w="3213"/>
       </w:tblGrid>
       <w:tr>
         <w:tc>
           <w:tcPr>
-            <w:tcW w:type="dxa" w:w="3969"/>
+            <w:tcW w:type="dxa" w:w="2551"/>
             <w:shd w:val="clear" w:color="auto" w:fill="2E7D32"/>
             <w:tcMar>
               <w:top w:w="70" w:type="dxa"/>
@@ -5244,7 +5245,39 @@
         </w:tc>
         <w:tc>
           <w:tcPr>
-            <w:tcW w:type="dxa" w:w="3969"/>
+            <w:tcW w:type="dxa" w:w="2551"/>
+            <w:shd w:val="clear" w:color="auto" w:fill="2E7D32"/>
+            <w:tcMar>
+              <w:top w:w="70" w:type="dxa"/>
+              <w:bottom w:w="70" w:type="dxa"/>
+              <w:left w:w="100" w:type="dxa"/>
+              <w:right w:w="100" w:type="dxa"/>
+            </w:tcMar>
+            <w:tcBorders>
+              <w:top w:val="single" w:sz="4" w:color="D0D0D0" w:space="0"/>
+              <w:left w:val="single" w:sz="4" w:color="D0D0D0" w:space="0"/>
+              <w:bottom w:val="single" w:sz="8" w:color="1B5E20" w:space="0"/>
+              <w:right w:val="single" w:sz="4" w:color="D0D0D0" w:space="0"/>
+            </w:tcBorders>
+          </w:tcPr>
+          <w:p>
+            <w:pPr>
+              <w:jc w:val="center"/>
+            </w:pPr>
+            <w:r>
+              <w:rPr>
+                <w:b/>
+                <w:i w:val="0"/>
+                <w:color w:val="FFFFFF"/>
+                <w:sz w:val="17"/>
+              </w:rPr>
+              <w:t>Total Deforestasi (Ha)</w:t>
+            </w:r>
+          </w:p>
+        </w:tc>
+        <w:tc>
+          <w:tcPr>
+            <w:tcW w:type="dxa" w:w="2835"/>
             <w:shd w:val="clear" w:color="auto" w:fill="2E7D32"/>
             <w:tcMar>
               <w:top w:w="70" w:type="dxa"/>
@@ -5278,7 +5311,7 @@
       <w:tr>
         <w:tc>
           <w:tcPr>
-            <w:tcW w:type="dxa" w:w="3969"/>
+            <w:tcW w:type="dxa" w:w="2551"/>
             <w:shd w:val="clear" w:color="auto" w:fill="F5FBF5"/>
             <w:tcMar>
               <w:top w:w="50" w:type="dxa"/>
@@ -5310,7 +5343,7 @@
         </w:tc>
         <w:tc>
           <w:tcPr>
-            <w:tcW w:type="dxa" w:w="3969"/>
+            <w:tcW w:type="dxa" w:w="2551"/>
             <w:shd w:val="clear" w:color="auto" w:fill="F5FBF5"/>
             <w:tcMar>
               <w:top w:w="50" w:type="dxa"/>
@@ -5336,7 +5369,39 @@
                 <w:color w:val="222222"/>
                 <w:sz w:val="17"/>
               </w:rPr>
-              <w:t>482.7</w:t>
+              <w:t>1,001,654.2585</w:t>
+            </w:r>
+          </w:p>
+        </w:tc>
+        <w:tc>
+          <w:tcPr>
+            <w:tcW w:type="dxa" w:w="2835"/>
+            <w:shd w:val="clear" w:color="auto" w:fill="F5FBF5"/>
+            <w:tcMar>
+              <w:top w:w="50" w:type="dxa"/>
+              <w:bottom w:w="50" w:type="dxa"/>
+              <w:left w:w="100" w:type="dxa"/>
+              <w:right w:w="100" w:type="dxa"/>
+            </w:tcMar>
+            <w:tcBorders>
+              <w:top w:val="single" w:sz="4" w:color="D0D0D0" w:space="0"/>
+              <w:left w:val="single" w:sz="4" w:color="D0D0D0" w:space="0"/>
+              <w:bottom w:val="single" w:sz="4" w:color="D0D0D0" w:space="0"/>
+              <w:right w:val="single" w:sz="4" w:color="D0D0D0" w:space="0"/>
+            </w:tcBorders>
+          </w:tcPr>
+          <w:p>
+            <w:pPr>
+              <w:jc w:val="center"/>
+            </w:pPr>
+            <w:r>
+              <w:rPr>
+                <w:b w:val="0"/>
+                <w:i w:val="0"/>
+                <w:color w:val="222222"/>
+                <w:sz w:val="17"/>
+              </w:rPr>
+              <w:t>664.4729</w:t>
             </w:r>
           </w:p>
         </w:tc>
@@ -5344,7 +5409,7 @@
       <w:tr>
         <w:tc>
           <w:tcPr>
-            <w:tcW w:type="dxa" w:w="3969"/>
+            <w:tcW w:type="dxa" w:w="2551"/>
             <w:shd w:val="clear" w:color="auto" w:fill="FFFFFF"/>
             <w:tcMar>
               <w:top w:w="50" w:type="dxa"/>
@@ -5376,7 +5441,7 @@
         </w:tc>
         <w:tc>
           <w:tcPr>
-            <w:tcW w:type="dxa" w:w="3969"/>
+            <w:tcW w:type="dxa" w:w="2551"/>
             <w:shd w:val="clear" w:color="auto" w:fill="FFFFFF"/>
             <w:tcMar>
               <w:top w:w="50" w:type="dxa"/>
@@ -5402,7 +5467,39 @@
                 <w:color w:val="222222"/>
                 <w:sz w:val="17"/>
               </w:rPr>
-              <w:t>64.1</w:t>
+              <w:t>134,637.3514</w:t>
+            </w:r>
+          </w:p>
+        </w:tc>
+        <w:tc>
+          <w:tcPr>
+            <w:tcW w:type="dxa" w:w="2835"/>
+            <w:shd w:val="clear" w:color="auto" w:fill="FFFFFF"/>
+            <w:tcMar>
+              <w:top w:w="50" w:type="dxa"/>
+              <w:bottom w:w="50" w:type="dxa"/>
+              <w:left w:w="100" w:type="dxa"/>
+              <w:right w:w="100" w:type="dxa"/>
+            </w:tcMar>
+            <w:tcBorders>
+              <w:top w:val="single" w:sz="4" w:color="D0D0D0" w:space="0"/>
+              <w:left w:val="single" w:sz="4" w:color="D0D0D0" w:space="0"/>
+              <w:bottom w:val="single" w:sz="4" w:color="D0D0D0" w:space="0"/>
+              <w:right w:val="single" w:sz="4" w:color="D0D0D0" w:space="0"/>
+            </w:tcBorders>
+          </w:tcPr>
+          <w:p>
+            <w:pPr>
+              <w:jc w:val="center"/>
+            </w:pPr>
+            <w:r>
+              <w:rPr>
+                <w:b w:val="0"/>
+                <w:i w:val="0"/>
+                <w:color w:val="222222"/>
+                <w:sz w:val="17"/>
+              </w:rPr>
+              <w:t>87.1380</w:t>
             </w:r>
           </w:p>
         </w:tc>
@@ -5410,7 +5507,7 @@
       <w:tr>
         <w:tc>
           <w:tcPr>
-            <w:tcW w:type="dxa" w:w="3969"/>
+            <w:tcW w:type="dxa" w:w="2551"/>
             <w:shd w:val="clear" w:color="auto" w:fill="F5FBF5"/>
             <w:tcMar>
               <w:top w:w="50" w:type="dxa"/>
@@ -5436,13 +5533,13 @@
                 <w:color w:val="222222"/>
                 <w:sz w:val="17"/>
               </w:rPr>
-              <w:t>Pertanian Berpindah</w:t>
+              <w:t>Pertanian Berpindah (Masyarakat)</w:t>
             </w:r>
           </w:p>
         </w:tc>
         <w:tc>
           <w:tcPr>
-            <w:tcW w:type="dxa" w:w="3969"/>
+            <w:tcW w:type="dxa" w:w="2551"/>
             <w:shd w:val="clear" w:color="auto" w:fill="F5FBF5"/>
             <w:tcMar>
               <w:top w:w="50" w:type="dxa"/>
@@ -5468,7 +5565,39 @@
                 <w:color w:val="222222"/>
                 <w:sz w:val="17"/>
               </w:rPr>
-              <w:t>29.1</w:t>
+              <w:t>55,905.1723</w:t>
+            </w:r>
+          </w:p>
+        </w:tc>
+        <w:tc>
+          <w:tcPr>
+            <w:tcW w:type="dxa" w:w="2835"/>
+            <w:shd w:val="clear" w:color="auto" w:fill="F5FBF5"/>
+            <w:tcMar>
+              <w:top w:w="50" w:type="dxa"/>
+              <w:bottom w:w="50" w:type="dxa"/>
+              <w:left w:w="100" w:type="dxa"/>
+              <w:right w:w="100" w:type="dxa"/>
+            </w:tcMar>
+            <w:tcBorders>
+              <w:top w:val="single" w:sz="4" w:color="D0D0D0" w:space="0"/>
+              <w:left w:val="single" w:sz="4" w:color="D0D0D0" w:space="0"/>
+              <w:bottom w:val="single" w:sz="4" w:color="D0D0D0" w:space="0"/>
+              <w:right w:val="single" w:sz="4" w:color="D0D0D0" w:space="0"/>
+            </w:tcBorders>
+          </w:tcPr>
+          <w:p>
+            <w:pPr>
+              <w:jc w:val="center"/>
+            </w:pPr>
+            <w:r>
+              <w:rPr>
+                <w:b w:val="0"/>
+                <w:i w:val="0"/>
+                <w:color w:val="222222"/>
+                <w:sz w:val="17"/>
+              </w:rPr>
+              <w:t>38.2156</w:t>
             </w:r>
           </w:p>
         </w:tc>
@@ -5476,7 +5605,7 @@
       <w:tr>
         <w:tc>
           <w:tcPr>
-            <w:tcW w:type="dxa" w:w="3969"/>
+            <w:tcW w:type="dxa" w:w="2551"/>
             <w:shd w:val="clear" w:color="auto" w:fill="FFFFFF"/>
             <w:tcMar>
               <w:top w:w="50" w:type="dxa"/>
@@ -5508,7 +5637,7 @@
         </w:tc>
         <w:tc>
           <w:tcPr>
-            <w:tcW w:type="dxa" w:w="3969"/>
+            <w:tcW w:type="dxa" w:w="2551"/>
             <w:shd w:val="clear" w:color="auto" w:fill="FFFFFF"/>
             <w:tcMar>
               <w:top w:w="50" w:type="dxa"/>
@@ -5534,7 +5663,39 @@
                 <w:color w:val="222222"/>
                 <w:sz w:val="17"/>
               </w:rPr>
-              <w:t>10.3</w:t>
+              <w:t>25,737.8929</w:t>
+            </w:r>
+          </w:p>
+        </w:tc>
+        <w:tc>
+          <w:tcPr>
+            <w:tcW w:type="dxa" w:w="2835"/>
+            <w:shd w:val="clear" w:color="auto" w:fill="FFFFFF"/>
+            <w:tcMar>
+              <w:top w:w="50" w:type="dxa"/>
+              <w:bottom w:w="50" w:type="dxa"/>
+              <w:left w:w="100" w:type="dxa"/>
+              <w:right w:w="100" w:type="dxa"/>
+            </w:tcMar>
+            <w:tcBorders>
+              <w:top w:val="single" w:sz="4" w:color="D0D0D0" w:space="0"/>
+              <w:left w:val="single" w:sz="4" w:color="D0D0D0" w:space="0"/>
+              <w:bottom w:val="single" w:sz="4" w:color="D0D0D0" w:space="0"/>
+              <w:right w:val="single" w:sz="4" w:color="D0D0D0" w:space="0"/>
+            </w:tcBorders>
+          </w:tcPr>
+          <w:p>
+            <w:pPr>
+              <w:jc w:val="center"/>
+            </w:pPr>
+            <w:r>
+              <w:rPr>
+                <w:b w:val="0"/>
+                <w:i w:val="0"/>
+                <w:color w:val="222222"/>
+                <w:sz w:val="17"/>
+              </w:rPr>
+              <w:t>14.2253</w:t>
             </w:r>
           </w:p>
         </w:tc>

</xml_diff>